<commit_message>
Multiplexer MUX ly thuyet
</commit_message>
<xml_diff>
--- a/Doc/OnTap/3_Verilog Mạch tổ hợp (Combinational Circuit).docx
+++ b/Doc/OnTap/3_Verilog Mạch tổ hợp (Combinational Circuit).docx
@@ -2741,8 +2741,8 @@
       </w:tblPr>
       <w:tblGrid>
         <w:gridCol w:w="733"/>
-        <w:gridCol w:w="732"/>
-        <w:gridCol w:w="743"/>
+        <w:gridCol w:w="731"/>
+        <w:gridCol w:w="744"/>
         <w:gridCol w:w="1445"/>
         <w:gridCol w:w="1082"/>
         <w:gridCol w:w="1239"/>
@@ -2779,7 +2779,7 @@
         </w:tc>
         <w:tc>
           <w:tcPr>
-            <w:tcW w:w="732" w:type="dxa"/>
+            <w:tcW w:w="731" w:type="dxa"/>
             <w:tcBorders>
               <w:top w:val="single" w:sz="4" w:space="0" w:color="000000"/>
               <w:start w:val="single" w:sz="4" w:space="0" w:color="000000"/>
@@ -2806,7 +2806,7 @@
         </w:tc>
         <w:tc>
           <w:tcPr>
-            <w:tcW w:w="743" w:type="dxa"/>
+            <w:tcW w:w="744" w:type="dxa"/>
             <w:tcBorders>
               <w:top w:val="single" w:sz="4" w:space="0" w:color="000000"/>
               <w:start w:val="single" w:sz="4" w:space="0" w:color="000000"/>
@@ -2997,7 +2997,7 @@
         </w:tc>
         <w:tc>
           <w:tcPr>
-            <w:tcW w:w="732" w:type="dxa"/>
+            <w:tcW w:w="731" w:type="dxa"/>
             <w:tcBorders>
               <w:start w:val="single" w:sz="4" w:space="0" w:color="000000"/>
               <w:bottom w:val="single" w:sz="4" w:space="0" w:color="000000"/>
@@ -3016,7 +3016,7 @@
         </w:tc>
         <w:tc>
           <w:tcPr>
-            <w:tcW w:w="743" w:type="dxa"/>
+            <w:tcW w:w="744" w:type="dxa"/>
             <w:tcBorders>
               <w:start w:val="single" w:sz="4" w:space="0" w:color="000000"/>
               <w:bottom w:val="single" w:sz="4" w:space="0" w:color="000000"/>
@@ -3134,7 +3134,7 @@
         </w:tc>
         <w:tc>
           <w:tcPr>
-            <w:tcW w:w="732" w:type="dxa"/>
+            <w:tcW w:w="731" w:type="dxa"/>
             <w:tcBorders>
               <w:start w:val="single" w:sz="4" w:space="0" w:color="000000"/>
               <w:bottom w:val="single" w:sz="4" w:space="0" w:color="000000"/>
@@ -3153,7 +3153,7 @@
         </w:tc>
         <w:tc>
           <w:tcPr>
-            <w:tcW w:w="743" w:type="dxa"/>
+            <w:tcW w:w="744" w:type="dxa"/>
             <w:tcBorders>
               <w:start w:val="single" w:sz="4" w:space="0" w:color="000000"/>
               <w:bottom w:val="single" w:sz="4" w:space="0" w:color="000000"/>
@@ -3271,7 +3271,7 @@
         </w:tc>
         <w:tc>
           <w:tcPr>
-            <w:tcW w:w="732" w:type="dxa"/>
+            <w:tcW w:w="731" w:type="dxa"/>
             <w:tcBorders>
               <w:start w:val="single" w:sz="4" w:space="0" w:color="000000"/>
               <w:bottom w:val="single" w:sz="4" w:space="0" w:color="000000"/>
@@ -3290,7 +3290,7 @@
         </w:tc>
         <w:tc>
           <w:tcPr>
-            <w:tcW w:w="743" w:type="dxa"/>
+            <w:tcW w:w="744" w:type="dxa"/>
             <w:tcBorders>
               <w:start w:val="single" w:sz="4" w:space="0" w:color="000000"/>
               <w:bottom w:val="single" w:sz="4" w:space="0" w:color="000000"/>
@@ -3408,7 +3408,7 @@
         </w:tc>
         <w:tc>
           <w:tcPr>
-            <w:tcW w:w="732" w:type="dxa"/>
+            <w:tcW w:w="731" w:type="dxa"/>
             <w:tcBorders>
               <w:start w:val="single" w:sz="4" w:space="0" w:color="000000"/>
               <w:bottom w:val="single" w:sz="4" w:space="0" w:color="000000"/>
@@ -3427,7 +3427,7 @@
         </w:tc>
         <w:tc>
           <w:tcPr>
-            <w:tcW w:w="743" w:type="dxa"/>
+            <w:tcW w:w="744" w:type="dxa"/>
             <w:tcBorders>
               <w:start w:val="single" w:sz="4" w:space="0" w:color="000000"/>
               <w:bottom w:val="single" w:sz="4" w:space="0" w:color="000000"/>
@@ -3545,7 +3545,7 @@
         </w:tc>
         <w:tc>
           <w:tcPr>
-            <w:tcW w:w="732" w:type="dxa"/>
+            <w:tcW w:w="731" w:type="dxa"/>
             <w:tcBorders>
               <w:start w:val="single" w:sz="4" w:space="0" w:color="000000"/>
               <w:bottom w:val="single" w:sz="4" w:space="0" w:color="000000"/>
@@ -3564,7 +3564,7 @@
         </w:tc>
         <w:tc>
           <w:tcPr>
-            <w:tcW w:w="743" w:type="dxa"/>
+            <w:tcW w:w="744" w:type="dxa"/>
             <w:tcBorders>
               <w:start w:val="single" w:sz="4" w:space="0" w:color="000000"/>
               <w:bottom w:val="single" w:sz="4" w:space="0" w:color="000000"/>
@@ -3682,7 +3682,7 @@
         </w:tc>
         <w:tc>
           <w:tcPr>
-            <w:tcW w:w="732" w:type="dxa"/>
+            <w:tcW w:w="731" w:type="dxa"/>
             <w:tcBorders>
               <w:start w:val="single" w:sz="4" w:space="0" w:color="000000"/>
               <w:bottom w:val="single" w:sz="4" w:space="0" w:color="000000"/>
@@ -3701,7 +3701,7 @@
         </w:tc>
         <w:tc>
           <w:tcPr>
-            <w:tcW w:w="743" w:type="dxa"/>
+            <w:tcW w:w="744" w:type="dxa"/>
             <w:tcBorders>
               <w:start w:val="single" w:sz="4" w:space="0" w:color="000000"/>
               <w:bottom w:val="single" w:sz="4" w:space="0" w:color="000000"/>
@@ -3819,7 +3819,7 @@
         </w:tc>
         <w:tc>
           <w:tcPr>
-            <w:tcW w:w="732" w:type="dxa"/>
+            <w:tcW w:w="731" w:type="dxa"/>
             <w:tcBorders>
               <w:start w:val="single" w:sz="4" w:space="0" w:color="000000"/>
               <w:bottom w:val="single" w:sz="4" w:space="0" w:color="000000"/>
@@ -3838,7 +3838,7 @@
         </w:tc>
         <w:tc>
           <w:tcPr>
-            <w:tcW w:w="743" w:type="dxa"/>
+            <w:tcW w:w="744" w:type="dxa"/>
             <w:tcBorders>
               <w:start w:val="single" w:sz="4" w:space="0" w:color="000000"/>
               <w:bottom w:val="single" w:sz="4" w:space="0" w:color="000000"/>
@@ -3956,7 +3956,7 @@
         </w:tc>
         <w:tc>
           <w:tcPr>
-            <w:tcW w:w="732" w:type="dxa"/>
+            <w:tcW w:w="731" w:type="dxa"/>
             <w:tcBorders>
               <w:start w:val="single" w:sz="4" w:space="0" w:color="000000"/>
               <w:bottom w:val="single" w:sz="4" w:space="0" w:color="000000"/>
@@ -3975,7 +3975,7 @@
         </w:tc>
         <w:tc>
           <w:tcPr>
-            <w:tcW w:w="743" w:type="dxa"/>
+            <w:tcW w:w="744" w:type="dxa"/>
             <w:tcBorders>
               <w:start w:val="single" w:sz="4" w:space="0" w:color="000000"/>
               <w:bottom w:val="single" w:sz="4" w:space="0" w:color="000000"/>
@@ -5434,8 +5434,890 @@
       </w:pPr>
       <w:r>
         <w:rPr/>
-        <w:t>To do</w:t>
-      </w:r>
+        <w:t xml:space="preserve">Đây là </w:t>
+      </w:r>
+      <w:r>
+        <w:rPr>
+          <w:rStyle w:val="Strong"/>
+        </w:rPr>
+        <w:t>mạch chọn dữ liệu</w:t>
+      </w:r>
+      <w:r>
+        <w:rPr/>
+        <w:t>.</w:t>
+      </w:r>
+    </w:p>
+    <w:p>
+      <w:pPr>
+        <w:pStyle w:val="Heading2"/>
+        <w:ind w:hanging="0" w:start="0"/>
+        <w:rPr/>
+      </w:pPr>
+      <w:r>
+        <w:rPr/>
+        <w:t>Mạch mutiplexer 2:1</w:t>
+      </w:r>
+    </w:p>
+    <w:p>
+      <w:pPr>
+        <w:pStyle w:val="BodyText"/>
+        <w:rPr/>
+      </w:pPr>
+      <w:r>
+        <w:rPr/>
+      </w:r>
+    </w:p>
+    <w:p>
+      <w:pPr>
+        <w:pStyle w:val="BodyText"/>
+        <w:rPr/>
+      </w:pPr>
+      <w:r>
+        <w:rPr/>
+      </w:r>
+    </w:p>
+    <w:p>
+      <w:pPr>
+        <w:pStyle w:val="BodyText"/>
+        <w:rPr/>
+      </w:pPr>
+      <w:r>
+        <w:rPr/>
+        <w:drawing>
+          <wp:anchor behindDoc="0" distT="0" distB="0" distL="0" distR="0" simplePos="0" locked="0" layoutInCell="0" allowOverlap="1" relativeHeight="7">
+            <wp:simplePos x="0" y="0"/>
+            <wp:positionH relativeFrom="column">
+              <wp:posOffset>180975</wp:posOffset>
+            </wp:positionH>
+            <wp:positionV relativeFrom="paragraph">
+              <wp:posOffset>-86360</wp:posOffset>
+            </wp:positionV>
+            <wp:extent cx="5829935" cy="4167505"/>
+            <wp:effectExtent l="0" t="0" r="0" b="0"/>
+            <wp:wrapSquare wrapText="largest"/>
+            <wp:docPr id="6" name="Image6" descr="" title=""/>
+            <wp:cNvGraphicFramePr>
+              <a:graphicFrameLocks xmlns:a="http://schemas.openxmlformats.org/drawingml/2006/main" noChangeAspect="1"/>
+            </wp:cNvGraphicFramePr>
+            <a:graphic xmlns:a="http://schemas.openxmlformats.org/drawingml/2006/main">
+              <a:graphicData uri="http://schemas.openxmlformats.org/drawingml/2006/picture">
+                <pic:pic xmlns:pic="http://schemas.openxmlformats.org/drawingml/2006/picture">
+                  <pic:nvPicPr>
+                    <pic:cNvPr id="6" name="Image6" descr="" title=""/>
+                    <pic:cNvPicPr>
+                      <a:picLocks noChangeAspect="1" noChangeArrowheads="1"/>
+                    </pic:cNvPicPr>
+                  </pic:nvPicPr>
+                  <pic:blipFill>
+                    <a:blip r:embed="rId7"/>
+                    <a:stretch>
+                      <a:fillRect/>
+                    </a:stretch>
+                  </pic:blipFill>
+                  <pic:spPr bwMode="auto">
+                    <a:xfrm>
+                      <a:off x="0" y="0"/>
+                      <a:ext cx="5829935" cy="4167505"/>
+                    </a:xfrm>
+                    <a:prstGeom prst="rect">
+                      <a:avLst/>
+                    </a:prstGeom>
+                  </pic:spPr>
+                </pic:pic>
+              </a:graphicData>
+            </a:graphic>
+          </wp:anchor>
+        </w:drawing>
+      </w:r>
+    </w:p>
+    <w:p>
+      <w:pPr>
+        <w:pStyle w:val="BodyText"/>
+        <w:rPr/>
+      </w:pPr>
+      <w:r>
+        <w:rPr/>
+        <w:t>Có nghĩa là:</w:t>
+      </w:r>
+    </w:p>
+    <w:p>
+      <w:pPr>
+        <w:sectPr>
+          <w:type w:val="continuous"/>
+          <w:pgSz w:w="11906" w:h="16838"/>
+          <w:pgMar w:left="1134" w:right="1134" w:gutter="0" w:header="0" w:top="1134" w:footer="0" w:bottom="1134"/>
+          <w:formProt w:val="false"/>
+          <w:textDirection w:val="lrTb"/>
+          <w:docGrid w:type="default" w:linePitch="100" w:charSpace="0"/>
+        </w:sectPr>
+      </w:pPr>
+    </w:p>
+    <w:p>
+      <w:pPr>
+        <w:pStyle w:val="PreformattedText"/>
+        <w:ind w:hanging="0" w:start="0" w:end="0"/>
+        <w:rPr/>
+      </w:pPr>
+      <w:r>
+        <w:rPr>
+          <w:rStyle w:val="SourceText"/>
+        </w:rPr>
+        <w:t>S = 0  →  Y = A</w:t>
+      </w:r>
+    </w:p>
+    <w:p>
+      <w:pPr>
+        <w:pStyle w:val="PreformattedText"/>
+        <w:spacing w:before="0" w:after="283"/>
+        <w:rPr/>
+      </w:pPr>
+      <w:r>
+        <w:rPr>
+          <w:rStyle w:val="SourceText"/>
+        </w:rPr>
+        <w:t>S = 1  →  Y = B</w:t>
+      </w:r>
+    </w:p>
+    <w:p>
+      <w:pPr>
+        <w:sectPr>
+          <w:type w:val="continuous"/>
+          <w:pgSz w:w="11906" w:h="16838"/>
+          <w:pgMar w:left="1134" w:right="1134" w:gutter="0" w:header="0" w:top="1134" w:footer="0" w:bottom="1134"/>
+          <w:formProt w:val="false"/>
+          <w:textDirection w:val="lrTb"/>
+          <w:docGrid w:type="default" w:linePitch="100" w:charSpace="0"/>
+        </w:sectPr>
+      </w:pPr>
+    </w:p>
+    <w:p>
+      <w:pPr>
+        <w:pStyle w:val="BodyText"/>
+        <w:rPr/>
+      </w:pPr>
+      <w:r>
+        <w:rPr/>
+        <w:t>Hay viết bằng Verilog:</w:t>
+      </w:r>
+    </w:p>
+    <w:p>
+      <w:pPr>
+        <w:sectPr>
+          <w:type w:val="continuous"/>
+          <w:pgSz w:w="11906" w:h="16838"/>
+          <w:pgMar w:left="1134" w:right="1134" w:gutter="0" w:header="0" w:top="1134" w:footer="0" w:bottom="1134"/>
+          <w:formProt w:val="false"/>
+          <w:textDirection w:val="lrTb"/>
+          <w:docGrid w:type="default" w:linePitch="100" w:charSpace="0"/>
+        </w:sectPr>
+      </w:pPr>
+    </w:p>
+    <w:p>
+      <w:pPr>
+        <w:pStyle w:val="PreformattedText"/>
+        <w:spacing w:before="0" w:after="283"/>
+        <w:ind w:hanging="0" w:start="0" w:end="0"/>
+        <w:rPr/>
+      </w:pPr>
+      <w:bookmarkStart w:id="20" w:name="code-block-viewer_Copy_3"/>
+      <w:bookmarkEnd w:id="20"/>
+      <w:r>
+        <w:rPr>
+          <w:rStyle w:val="SourceText"/>
+        </w:rPr>
+        <w:t>assign y = s ? b : a;</w:t>
+      </w:r>
+    </w:p>
+    <w:p>
+      <w:pPr>
+        <w:sectPr>
+          <w:type w:val="continuous"/>
+          <w:pgSz w:w="11906" w:h="16838"/>
+          <w:pgMar w:left="1134" w:right="1134" w:gutter="0" w:header="0" w:top="1134" w:footer="0" w:bottom="1134"/>
+          <w:formProt w:val="false"/>
+          <w:textDirection w:val="lrTb"/>
+          <w:docGrid w:type="default" w:linePitch="100" w:charSpace="0"/>
+        </w:sectPr>
+      </w:pPr>
+    </w:p>
+    <w:p>
+      <w:pPr>
+        <w:pStyle w:val="BodyText"/>
+        <w:rPr/>
+      </w:pPr>
+      <w:r>
+        <w:rPr/>
+        <w:t>hoặc</w:t>
+      </w:r>
+    </w:p>
+    <w:p>
+      <w:pPr>
+        <w:sectPr>
+          <w:type w:val="continuous"/>
+          <w:pgSz w:w="11906" w:h="16838"/>
+          <w:pgMar w:left="1134" w:right="1134" w:gutter="0" w:header="0" w:top="1134" w:footer="0" w:bottom="1134"/>
+          <w:formProt w:val="false"/>
+          <w:textDirection w:val="lrTb"/>
+          <w:docGrid w:type="default" w:linePitch="100" w:charSpace="0"/>
+        </w:sectPr>
+      </w:pPr>
+    </w:p>
+    <w:p>
+      <w:pPr>
+        <w:pStyle w:val="PreformattedText"/>
+        <w:spacing w:before="0" w:after="283"/>
+        <w:ind w:hanging="0" w:start="0" w:end="0"/>
+        <w:rPr/>
+      </w:pPr>
+      <w:bookmarkStart w:id="21" w:name="code-block-viewer_Copy_4"/>
+      <w:bookmarkEnd w:id="21"/>
+      <w:r>
+        <w:rPr>
+          <w:rStyle w:val="SourceText"/>
+        </w:rPr>
+        <w:t>assign y = (~s &amp; a) | (s &amp; b);</w:t>
+      </w:r>
+    </w:p>
+    <w:p>
+      <w:pPr>
+        <w:sectPr>
+          <w:type w:val="continuous"/>
+          <w:pgSz w:w="11906" w:h="16838"/>
+          <w:pgMar w:left="1134" w:right="1134" w:gutter="0" w:header="0" w:top="1134" w:footer="0" w:bottom="1134"/>
+          <w:formProt w:val="false"/>
+          <w:textDirection w:val="lrTb"/>
+          <w:docGrid w:type="default" w:linePitch="100" w:charSpace="0"/>
+        </w:sectPr>
+      </w:pPr>
+    </w:p>
+    <w:p>
+      <w:pPr>
+        <w:pStyle w:val="Heading2"/>
+        <w:ind w:hanging="0" w:start="0"/>
+        <w:rPr/>
+      </w:pPr>
+      <w:r>
+        <w:rPr/>
+        <w:t>Tại sao TCAM cần MUX?</w:t>
+      </w:r>
+    </w:p>
+    <w:p>
+      <w:pPr>
+        <w:pStyle w:val="BodyText"/>
+        <w:rPr/>
+      </w:pPr>
+      <w:r>
+        <w:rPr/>
+        <w:t>Ví dụ SRAM có nhiều bank.</w:t>
+      </w:r>
+    </w:p>
+    <w:p>
+      <w:pPr>
+        <w:sectPr>
+          <w:type w:val="continuous"/>
+          <w:pgSz w:w="11906" w:h="16838"/>
+          <w:pgMar w:left="1134" w:right="1134" w:gutter="0" w:header="0" w:top="1134" w:footer="0" w:bottom="1134"/>
+          <w:formProt w:val="false"/>
+          <w:textDirection w:val="lrTb"/>
+          <w:docGrid w:type="default" w:linePitch="100" w:charSpace="0"/>
+        </w:sectPr>
+      </w:pPr>
+    </w:p>
+    <w:p>
+      <w:pPr>
+        <w:pStyle w:val="PreformattedText"/>
+        <w:ind w:hanging="0" w:start="0" w:end="0"/>
+        <w:rPr/>
+      </w:pPr>
+      <w:bookmarkStart w:id="22" w:name="code-block-viewer_Copy_5"/>
+      <w:bookmarkEnd w:id="22"/>
+      <w:r>
+        <w:rPr>
+          <w:rStyle w:val="SourceText"/>
+        </w:rPr>
+        <w:t>SRAM0</w:t>
+      </w:r>
+    </w:p>
+    <w:p>
+      <w:pPr>
+        <w:pStyle w:val="PreformattedText"/>
+        <w:rPr/>
+      </w:pPr>
+      <w:r>
+        <w:rPr>
+          <w:rStyle w:val="SourceText"/>
+        </w:rPr>
+        <w:t>SRAM1</w:t>
+      </w:r>
+    </w:p>
+    <w:p>
+      <w:pPr>
+        <w:pStyle w:val="PreformattedText"/>
+        <w:rPr/>
+      </w:pPr>
+      <w:r>
+        <w:rPr>
+          <w:rStyle w:val="SourceText"/>
+        </w:rPr>
+        <w:t>SRAM2</w:t>
+      </w:r>
+    </w:p>
+    <w:p>
+      <w:pPr>
+        <w:pStyle w:val="PreformattedText"/>
+        <w:spacing w:before="0" w:after="283"/>
+        <w:rPr/>
+      </w:pPr>
+      <w:r>
+        <w:rPr>
+          <w:rStyle w:val="SourceText"/>
+        </w:rPr>
+        <w:t>SRAM3</w:t>
+      </w:r>
+    </w:p>
+    <w:p>
+      <w:pPr>
+        <w:sectPr>
+          <w:type w:val="continuous"/>
+          <w:pgSz w:w="11906" w:h="16838"/>
+          <w:pgMar w:left="1134" w:right="1134" w:gutter="0" w:header="0" w:top="1134" w:footer="0" w:bottom="1134"/>
+          <w:formProt w:val="false"/>
+          <w:textDirection w:val="lrTb"/>
+          <w:docGrid w:type="default" w:linePitch="100" w:charSpace="0"/>
+        </w:sectPr>
+      </w:pPr>
+    </w:p>
+    <w:p>
+      <w:pPr>
+        <w:pStyle w:val="BodyText"/>
+        <w:rPr/>
+      </w:pPr>
+      <w:r>
+        <w:rPr/>
+        <w:t xml:space="preserve">CPU hoặc Search Engine chỉ muốn đọc </w:t>
+      </w:r>
+      <w:r>
+        <w:rPr>
+          <w:rStyle w:val="Strong"/>
+        </w:rPr>
+        <w:t>một bank</w:t>
+      </w:r>
+      <w:r>
+        <w:rPr/>
+        <w:t>.</w:t>
+      </w:r>
+    </w:p>
+    <w:p>
+      <w:pPr>
+        <w:pStyle w:val="BodyText"/>
+        <w:rPr/>
+      </w:pPr>
+      <w:r>
+        <w:rPr/>
+        <w:t>MUX sẽ chọn.</w:t>
+      </w:r>
+    </w:p>
+    <w:p>
+      <w:pPr>
+        <w:sectPr>
+          <w:type w:val="continuous"/>
+          <w:pgSz w:w="11906" w:h="16838"/>
+          <w:pgMar w:left="1134" w:right="1134" w:gutter="0" w:header="0" w:top="1134" w:footer="0" w:bottom="1134"/>
+          <w:formProt w:val="false"/>
+          <w:textDirection w:val="lrTb"/>
+          <w:docGrid w:type="default" w:linePitch="100" w:charSpace="0"/>
+        </w:sectPr>
+      </w:pPr>
+    </w:p>
+    <w:p>
+      <w:pPr>
+        <w:pStyle w:val="PreformattedText"/>
+        <w:ind w:hanging="0" w:start="0" w:end="0"/>
+        <w:rPr/>
+      </w:pPr>
+      <w:bookmarkStart w:id="23" w:name="code-block-viewer_Copy_6"/>
+      <w:bookmarkEnd w:id="23"/>
+      <w:r>
+        <w:rPr>
+          <w:rStyle w:val="SourceText"/>
+        </w:rPr>
+        <w:t>address</w:t>
+      </w:r>
+    </w:p>
+    <w:p>
+      <w:pPr>
+        <w:pStyle w:val="PreformattedText"/>
+        <w:rPr/>
+      </w:pPr>
+      <w:r>
+        <w:rPr>
+          <w:rStyle w:val="SourceText"/>
+        </w:rPr>
+        <w:t xml:space="preserve">    │</w:t>
+      </w:r>
+    </w:p>
+    <w:p>
+      <w:pPr>
+        <w:pStyle w:val="PreformattedText"/>
+        <w:rPr/>
+      </w:pPr>
+      <w:r>
+        <w:rPr>
+          <w:rStyle w:val="SourceText"/>
+        </w:rPr>
+        <w:t xml:space="preserve">    ▼</w:t>
+      </w:r>
+    </w:p>
+    <w:p>
+      <w:pPr>
+        <w:pStyle w:val="PreformattedText"/>
+        <w:rPr/>
+      </w:pPr>
+      <w:r>
+        <w:rPr>
+          <w:rStyle w:val="SourceText"/>
+        </w:rPr>
+        <w:t>+---------+</w:t>
+      </w:r>
+    </w:p>
+    <w:p>
+      <w:pPr>
+        <w:pStyle w:val="PreformattedText"/>
+        <w:rPr/>
+      </w:pPr>
+      <w:r>
+        <w:rPr>
+          <w:rStyle w:val="SourceText"/>
+        </w:rPr>
+        <w:t>|   MUX   |</w:t>
+      </w:r>
+    </w:p>
+    <w:p>
+      <w:pPr>
+        <w:pStyle w:val="PreformattedText"/>
+        <w:rPr/>
+      </w:pPr>
+      <w:r>
+        <w:rPr>
+          <w:rStyle w:val="SourceText"/>
+        </w:rPr>
+        <w:t>+---------+</w:t>
+      </w:r>
+    </w:p>
+    <w:p>
+      <w:pPr>
+        <w:pStyle w:val="PreformattedText"/>
+        <w:rPr/>
+      </w:pPr>
+      <w:r>
+        <w:rPr>
+          <w:rStyle w:val="SourceText"/>
+        </w:rPr>
+        <w:t xml:space="preserve">    │</w:t>
+      </w:r>
+    </w:p>
+    <w:p>
+      <w:pPr>
+        <w:pStyle w:val="PreformattedText"/>
+        <w:spacing w:before="0" w:after="283"/>
+        <w:rPr/>
+      </w:pPr>
+      <w:r>
+        <w:rPr>
+          <w:rStyle w:val="SourceText"/>
+        </w:rPr>
+        <w:t>Selected SRAM</w:t>
+      </w:r>
+    </w:p>
+    <w:p>
+      <w:pPr>
+        <w:pStyle w:val="PreformattedText"/>
+        <w:spacing w:before="0" w:after="283"/>
+        <w:rPr>
+          <w:rStyle w:val="SourceText"/>
+        </w:rPr>
+      </w:pPr>
+      <w:r>
+        <w:rPr/>
+      </w:r>
+      <w:bookmarkStart w:id="24" w:name="code-block-viewer_Copy_7"/>
+      <w:bookmarkStart w:id="25" w:name="code-block-viewer_Copy_7"/>
+      <w:bookmarkEnd w:id="25"/>
+    </w:p>
+    <w:p>
+      <w:pPr>
+        <w:pStyle w:val="BodyText"/>
+        <w:rPr/>
+      </w:pPr>
+      <w:r>
+        <w:rPr>
+          <w:rStyle w:val="SourceText"/>
+        </w:rPr>
+        <w:t>Địa chỉ quyết định đọc bank nào.</w:t>
+      </w:r>
+    </w:p>
+    <w:p>
+      <w:pPr>
+        <w:pStyle w:val="BodyText"/>
+        <w:rPr/>
+      </w:pPr>
+      <w:r>
+        <w:rPr/>
+        <w:t xml:space="preserve">Thực chất bên trong chính là </w:t>
+      </w:r>
+      <w:r>
+        <w:rPr>
+          <w:rStyle w:val="Strong"/>
+        </w:rPr>
+        <w:t>MUX 4:1</w:t>
+      </w:r>
+      <w:r>
+        <w:rPr/>
+        <w:t>.</w:t>
+      </w:r>
+    </w:p>
+    <w:p>
+      <w:pPr>
+        <w:sectPr>
+          <w:type w:val="continuous"/>
+          <w:pgSz w:w="11906" w:h="16838"/>
+          <w:pgMar w:left="1134" w:right="1134" w:gutter="0" w:header="0" w:top="1134" w:footer="0" w:bottom="1134"/>
+          <w:formProt w:val="false"/>
+          <w:textDirection w:val="lrTb"/>
+          <w:docGrid w:type="default" w:linePitch="100" w:charSpace="0"/>
+        </w:sectPr>
+      </w:pPr>
+    </w:p>
+    <w:p>
+      <w:pPr>
+        <w:pStyle w:val="PreformattedText"/>
+        <w:ind w:hanging="0" w:start="0" w:end="0"/>
+        <w:rPr/>
+      </w:pPr>
+      <w:bookmarkStart w:id="26" w:name="code-block-viewer_Copy_8"/>
+      <w:bookmarkEnd w:id="26"/>
+      <w:r>
+        <w:rPr>
+          <w:rStyle w:val="SourceText"/>
+        </w:rPr>
+        <w:t>sel = 00 → Bank0</w:t>
+      </w:r>
+    </w:p>
+    <w:p>
+      <w:pPr>
+        <w:pStyle w:val="PreformattedText"/>
+        <w:rPr/>
+      </w:pPr>
+      <w:r>
+        <w:rPr>
+          <w:rStyle w:val="SourceText"/>
+        </w:rPr>
+        <w:t>sel = 01 → Bank1</w:t>
+      </w:r>
+    </w:p>
+    <w:p>
+      <w:pPr>
+        <w:pStyle w:val="PreformattedText"/>
+        <w:rPr/>
+      </w:pPr>
+      <w:r>
+        <w:rPr>
+          <w:rStyle w:val="SourceText"/>
+        </w:rPr>
+        <w:t>sel = 10 → Bank2</w:t>
+      </w:r>
+    </w:p>
+    <w:p>
+      <w:pPr>
+        <w:pStyle w:val="PreformattedText"/>
+        <w:spacing w:before="0" w:after="283"/>
+        <w:rPr/>
+      </w:pPr>
+      <w:r>
+        <w:rPr>
+          <w:rStyle w:val="SourceText"/>
+        </w:rPr>
+        <w:t>sel = 11 → Bank3</w:t>
+      </w:r>
+    </w:p>
+    <w:p>
+      <w:pPr>
+        <w:sectPr>
+          <w:type w:val="continuous"/>
+          <w:pgSz w:w="11906" w:h="16838"/>
+          <w:pgMar w:left="1134" w:right="1134" w:gutter="0" w:header="0" w:top="1134" w:footer="0" w:bottom="1134"/>
+          <w:formProt w:val="false"/>
+          <w:textDirection w:val="lrTb"/>
+          <w:docGrid w:type="default" w:linePitch="100" w:charSpace="0"/>
+        </w:sectPr>
+      </w:pPr>
+    </w:p>
+    <w:p>
+      <w:pPr>
+        <w:pStyle w:val="Heading2"/>
+        <w:ind w:hanging="0" w:start="0"/>
+        <w:rPr/>
+      </w:pPr>
+      <w:r>
+        <w:rPr>
+          <w:rStyle w:val="SourceText"/>
+        </w:rPr>
+        <w:t xml:space="preserve"> </w:t>
+      </w:r>
+      <w:r>
+        <w:rPr>
+          <w:rStyle w:val="SourceText"/>
+        </w:rPr>
+        <w:t>Chọn dữ liệu sau Comparator ⭐⭐⭐⭐</w:t>
+      </w:r>
+    </w:p>
+    <w:p>
+      <w:pPr>
+        <w:pStyle w:val="BodyText"/>
+        <w:rPr/>
+      </w:pPr>
+      <w:r>
+        <w:rPr/>
+        <w:t>Ví dụ có nhiều pipeline.</w:t>
+      </w:r>
+    </w:p>
+    <w:p>
+      <w:pPr>
+        <w:sectPr>
+          <w:type w:val="continuous"/>
+          <w:pgSz w:w="11906" w:h="16838"/>
+          <w:pgMar w:left="1134" w:right="1134" w:gutter="0" w:header="0" w:top="1134" w:footer="0" w:bottom="1134"/>
+          <w:formProt w:val="false"/>
+          <w:textDirection w:val="lrTb"/>
+          <w:docGrid w:type="default" w:linePitch="100" w:charSpace="0"/>
+        </w:sectPr>
+      </w:pPr>
+    </w:p>
+    <w:p>
+      <w:pPr>
+        <w:pStyle w:val="PreformattedText"/>
+        <w:ind w:hanging="0" w:start="0" w:end="0"/>
+        <w:rPr/>
+      </w:pPr>
+      <w:bookmarkStart w:id="27" w:name="code-block-viewer_Copy_9"/>
+      <w:bookmarkEnd w:id="27"/>
+      <w:r>
+        <w:rPr>
+          <w:rStyle w:val="SourceText"/>
+        </w:rPr>
+        <w:t>Comparator0</w:t>
+      </w:r>
+    </w:p>
+    <w:p>
+      <w:pPr>
+        <w:pStyle w:val="PreformattedText"/>
+        <w:rPr/>
+      </w:pPr>
+      <w:r>
+        <w:rPr>
+          <w:rStyle w:val="SourceText"/>
+        </w:rPr>
+        <w:t>Comparator1</w:t>
+      </w:r>
+    </w:p>
+    <w:p>
+      <w:pPr>
+        <w:pStyle w:val="PreformattedText"/>
+        <w:rPr/>
+      </w:pPr>
+      <w:r>
+        <w:rPr>
+          <w:rStyle w:val="SourceText"/>
+        </w:rPr>
+        <w:t>Comparator2</w:t>
+      </w:r>
+    </w:p>
+    <w:p>
+      <w:pPr>
+        <w:pStyle w:val="PreformattedText"/>
+        <w:spacing w:before="0" w:after="283"/>
+        <w:rPr/>
+      </w:pPr>
+      <w:r>
+        <w:rPr>
+          <w:rStyle w:val="SourceText"/>
+        </w:rPr>
+        <w:t>Comparator3</w:t>
+      </w:r>
+    </w:p>
+    <w:p>
+      <w:pPr>
+        <w:sectPr>
+          <w:type w:val="continuous"/>
+          <w:pgSz w:w="11906" w:h="16838"/>
+          <w:pgMar w:left="1134" w:right="1134" w:gutter="0" w:header="0" w:top="1134" w:footer="0" w:bottom="1134"/>
+          <w:formProt w:val="false"/>
+          <w:textDirection w:val="lrTb"/>
+          <w:docGrid w:type="default" w:linePitch="100" w:charSpace="0"/>
+        </w:sectPr>
+      </w:pPr>
+    </w:p>
+    <w:p>
+      <w:pPr>
+        <w:pStyle w:val="BodyText"/>
+        <w:rPr/>
+      </w:pPr>
+      <w:r>
+        <w:rPr/>
+        <w:t>Cuối cùng phải chọn một kết quả.</w:t>
+      </w:r>
+    </w:p>
+    <w:p>
+      <w:pPr>
+        <w:pStyle w:val="BodyText"/>
+        <w:rPr/>
+      </w:pPr>
+      <w:r>
+        <w:rPr/>
+        <w:t>Lại là MUX.</w:t>
+      </w:r>
+    </w:p>
+    <w:p>
+      <w:pPr>
+        <w:pStyle w:val="HorizontalLine"/>
+        <w:rPr/>
+      </w:pPr>
+      <w:r>
+        <w:rPr/>
+      </w:r>
+    </w:p>
+    <w:p>
+      <w:pPr>
+        <w:pStyle w:val="Heading2"/>
+        <w:ind w:hanging="0" w:start="0"/>
+        <w:rPr/>
+      </w:pPr>
+      <w:r>
+        <w:rPr/>
+        <w:t xml:space="preserve"> </w:t>
+      </w:r>
+      <w:r>
+        <w:rPr/>
+        <w:t>Chọn đường dữ liệu</w:t>
+      </w:r>
+    </w:p>
+    <w:p>
+      <w:pPr>
+        <w:pStyle w:val="BodyText"/>
+        <w:rPr/>
+      </w:pPr>
+      <w:r>
+        <w:rPr/>
+        <w:t>Ví dụ</w:t>
+      </w:r>
+    </w:p>
+    <w:p>
+      <w:pPr>
+        <w:sectPr>
+          <w:type w:val="continuous"/>
+          <w:pgSz w:w="11906" w:h="16838"/>
+          <w:pgMar w:left="1134" w:right="1134" w:gutter="0" w:header="0" w:top="1134" w:footer="0" w:bottom="1134"/>
+          <w:formProt w:val="false"/>
+          <w:textDirection w:val="lrTb"/>
+          <w:docGrid w:type="default" w:linePitch="100" w:charSpace="0"/>
+        </w:sectPr>
+      </w:pPr>
+    </w:p>
+    <w:p>
+      <w:pPr>
+        <w:pStyle w:val="PreformattedText"/>
+        <w:ind w:hanging="0" w:start="0" w:end="0"/>
+        <w:rPr/>
+      </w:pPr>
+      <w:bookmarkStart w:id="28" w:name="code-block-viewer_Copy_10"/>
+      <w:bookmarkEnd w:id="28"/>
+      <w:r>
+        <w:rPr>
+          <w:rStyle w:val="SourceText"/>
+        </w:rPr>
+        <w:t>CPU</w:t>
+      </w:r>
+    </w:p>
+    <w:p>
+      <w:pPr>
+        <w:pStyle w:val="PreformattedText"/>
+        <w:rPr/>
+      </w:pPr>
+      <w:r>
+        <w:rPr>
+          <w:rStyle w:val="SourceText"/>
+        </w:rPr>
+        <w:t>DMA</w:t>
+      </w:r>
+    </w:p>
+    <w:p>
+      <w:pPr>
+        <w:pStyle w:val="PreformattedText"/>
+        <w:spacing w:before="0" w:after="283"/>
+        <w:rPr/>
+      </w:pPr>
+      <w:r>
+        <w:rPr>
+          <w:rStyle w:val="SourceText"/>
+        </w:rPr>
+        <w:t>Debug</w:t>
+      </w:r>
+    </w:p>
+    <w:p>
+      <w:pPr>
+        <w:sectPr>
+          <w:type w:val="continuous"/>
+          <w:pgSz w:w="11906" w:h="16838"/>
+          <w:pgMar w:left="1134" w:right="1134" w:gutter="0" w:header="0" w:top="1134" w:footer="0" w:bottom="1134"/>
+          <w:formProt w:val="false"/>
+          <w:textDirection w:val="lrTb"/>
+          <w:docGrid w:type="default" w:linePitch="100" w:charSpace="0"/>
+        </w:sectPr>
+      </w:pPr>
+    </w:p>
+    <w:p>
+      <w:pPr>
+        <w:pStyle w:val="BodyText"/>
+        <w:rPr/>
+      </w:pPr>
+      <w:r>
+        <w:rPr/>
+        <w:t>đều muốn ghi SRAM.</w:t>
+      </w:r>
+    </w:p>
+    <w:p>
+      <w:pPr>
+        <w:pStyle w:val="BodyText"/>
+        <w:rPr/>
+      </w:pPr>
+      <w:r>
+        <w:rPr/>
+        <w:t>MUX sẽ chọn nguồn.</w:t>
+      </w:r>
+    </w:p>
+    <w:p>
+      <w:pPr>
+        <w:pStyle w:val="PreformattedText"/>
+        <w:spacing w:before="0" w:after="283"/>
+        <w:rPr>
+          <w:rStyle w:val="SourceText"/>
+        </w:rPr>
+      </w:pPr>
+      <w:r>
+        <w:rPr/>
+      </w:r>
+    </w:p>
+    <w:p>
+      <w:pPr>
+        <w:sectPr>
+          <w:type w:val="continuous"/>
+          <w:pgSz w:w="11906" w:h="16838"/>
+          <w:pgMar w:left="1134" w:right="1134" w:gutter="0" w:header="0" w:top="1134" w:footer="0" w:bottom="1134"/>
+          <w:formProt w:val="false"/>
+          <w:textDirection w:val="lrTb"/>
+          <w:docGrid w:type="default" w:linePitch="100" w:charSpace="0"/>
+        </w:sectPr>
+      </w:pPr>
     </w:p>
     <w:p>
       <w:pPr>
@@ -5547,6 +6429,7 @@
     </w:lvl>
     <w:lvl w:ilvl="2">
       <w:start w:val="1"/>
+      <w:pStyle w:val="Heading3"/>
       <w:numFmt w:val="none"/>
       <w:suff w:val="nothing"/>
       <w:lvlText w:val=""/>
@@ -6005,6 +6888,23 @@
       <w:bCs/>
       <w:sz w:val="32"/>
       <w:szCs w:val="32"/>
+    </w:rPr>
+  </w:style>
+  <w:style w:type="paragraph" w:styleId="Heading3">
+    <w:name w:val="Heading 3"/>
+    <w:basedOn w:val="Heading"/>
+    <w:next w:val="BodyText"/>
+    <w:qFormat/>
+    <w:pPr>
+      <w:spacing w:before="140" w:after="120"/>
+      <w:outlineLvl w:val="2"/>
+    </w:pPr>
+    <w:rPr>
+      <w:rFonts w:ascii="Liberation Serif" w:hAnsi="Liberation Serif" w:eastAsia="Noto Serif CJK SC" w:cs="Noto Sans Devanagari"/>
+      <w:b/>
+      <w:bCs/>
+      <w:sz w:val="28"/>
+      <w:szCs w:val="28"/>
     </w:rPr>
   </w:style>
   <w:style w:type="character" w:styleId="NumberingSymbols">

</xml_diff>

<commit_message>
MUX4 multiplexer 4:1 ly thuyet
</commit_message>
<xml_diff>
--- a/Doc/OnTap/3_Verilog Mạch tổ hợp (Combinational Circuit).docx
+++ b/Doc/OnTap/3_Verilog Mạch tổ hợp (Combinational Circuit).docx
@@ -5,6 +5,10 @@
     <w:p>
       <w:pPr>
         <w:pStyle w:val="Heading1"/>
+        <w:numPr>
+          <w:ilvl w:val="0"/>
+          <w:numId w:val="1"/>
+        </w:numPr>
         <w:spacing w:before="240" w:after="120"/>
         <w:ind w:hanging="0" w:start="0"/>
         <w:rPr/>
@@ -29,6 +33,10 @@
     <w:p>
       <w:pPr>
         <w:pStyle w:val="Heading1"/>
+        <w:numPr>
+          <w:ilvl w:val="0"/>
+          <w:numId w:val="1"/>
+        </w:numPr>
         <w:ind w:hanging="0" w:start="0"/>
         <w:rPr/>
       </w:pPr>
@@ -52,6 +60,10 @@
     <w:p>
       <w:pPr>
         <w:pStyle w:val="Heading1"/>
+        <w:numPr>
+          <w:ilvl w:val="0"/>
+          <w:numId w:val="1"/>
+        </w:numPr>
         <w:ind w:hanging="0" w:start="0"/>
         <w:rPr/>
       </w:pPr>
@@ -79,6 +91,10 @@
     <w:p>
       <w:pPr>
         <w:pStyle w:val="Heading1"/>
+        <w:numPr>
+          <w:ilvl w:val="0"/>
+          <w:numId w:val="1"/>
+        </w:numPr>
         <w:ind w:hanging="0" w:start="0"/>
         <w:jc w:val="start"/>
         <w:rPr/>
@@ -114,6 +130,10 @@
     <w:p>
       <w:pPr>
         <w:pStyle w:val="Heading1"/>
+        <w:numPr>
+          <w:ilvl w:val="0"/>
+          <w:numId w:val="1"/>
+        </w:numPr>
         <w:ind w:hanging="0" w:start="0"/>
         <w:rPr/>
       </w:pPr>
@@ -1189,6 +1209,10 @@
     <w:p>
       <w:pPr>
         <w:pStyle w:val="Heading2"/>
+        <w:numPr>
+          <w:ilvl w:val="1"/>
+          <w:numId w:val="1"/>
+        </w:numPr>
         <w:ind w:hanging="0" w:start="0"/>
         <w:rPr>
           <w:u w:val="single"/>
@@ -1514,6 +1538,10 @@
     <w:p>
       <w:pPr>
         <w:pStyle w:val="Heading1"/>
+        <w:numPr>
+          <w:ilvl w:val="0"/>
+          <w:numId w:val="1"/>
+        </w:numPr>
         <w:ind w:hanging="0" w:start="0"/>
         <w:rPr/>
       </w:pPr>
@@ -1696,6 +1724,10 @@
     <w:p>
       <w:pPr>
         <w:pStyle w:val="Heading2"/>
+        <w:numPr>
+          <w:ilvl w:val="1"/>
+          <w:numId w:val="1"/>
+        </w:numPr>
         <w:ind w:hanging="0" w:start="0"/>
         <w:rPr/>
       </w:pPr>
@@ -2741,8 +2773,8 @@
       </w:tblPr>
       <w:tblGrid>
         <w:gridCol w:w="733"/>
-        <w:gridCol w:w="731"/>
-        <w:gridCol w:w="744"/>
+        <w:gridCol w:w="730"/>
+        <w:gridCol w:w="745"/>
         <w:gridCol w:w="1445"/>
         <w:gridCol w:w="1082"/>
         <w:gridCol w:w="1239"/>
@@ -2779,7 +2811,7 @@
         </w:tc>
         <w:tc>
           <w:tcPr>
-            <w:tcW w:w="731" w:type="dxa"/>
+            <w:tcW w:w="730" w:type="dxa"/>
             <w:tcBorders>
               <w:top w:val="single" w:sz="4" w:space="0" w:color="000000"/>
               <w:start w:val="single" w:sz="4" w:space="0" w:color="000000"/>
@@ -2806,7 +2838,7 @@
         </w:tc>
         <w:tc>
           <w:tcPr>
-            <w:tcW w:w="744" w:type="dxa"/>
+            <w:tcW w:w="745" w:type="dxa"/>
             <w:tcBorders>
               <w:top w:val="single" w:sz="4" w:space="0" w:color="000000"/>
               <w:start w:val="single" w:sz="4" w:space="0" w:color="000000"/>
@@ -2997,7 +3029,7 @@
         </w:tc>
         <w:tc>
           <w:tcPr>
-            <w:tcW w:w="731" w:type="dxa"/>
+            <w:tcW w:w="730" w:type="dxa"/>
             <w:tcBorders>
               <w:start w:val="single" w:sz="4" w:space="0" w:color="000000"/>
               <w:bottom w:val="single" w:sz="4" w:space="0" w:color="000000"/>
@@ -3016,7 +3048,7 @@
         </w:tc>
         <w:tc>
           <w:tcPr>
-            <w:tcW w:w="744" w:type="dxa"/>
+            <w:tcW w:w="745" w:type="dxa"/>
             <w:tcBorders>
               <w:start w:val="single" w:sz="4" w:space="0" w:color="000000"/>
               <w:bottom w:val="single" w:sz="4" w:space="0" w:color="000000"/>
@@ -3134,7 +3166,7 @@
         </w:tc>
         <w:tc>
           <w:tcPr>
-            <w:tcW w:w="731" w:type="dxa"/>
+            <w:tcW w:w="730" w:type="dxa"/>
             <w:tcBorders>
               <w:start w:val="single" w:sz="4" w:space="0" w:color="000000"/>
               <w:bottom w:val="single" w:sz="4" w:space="0" w:color="000000"/>
@@ -3153,7 +3185,7 @@
         </w:tc>
         <w:tc>
           <w:tcPr>
-            <w:tcW w:w="744" w:type="dxa"/>
+            <w:tcW w:w="745" w:type="dxa"/>
             <w:tcBorders>
               <w:start w:val="single" w:sz="4" w:space="0" w:color="000000"/>
               <w:bottom w:val="single" w:sz="4" w:space="0" w:color="000000"/>
@@ -3271,7 +3303,7 @@
         </w:tc>
         <w:tc>
           <w:tcPr>
-            <w:tcW w:w="731" w:type="dxa"/>
+            <w:tcW w:w="730" w:type="dxa"/>
             <w:tcBorders>
               <w:start w:val="single" w:sz="4" w:space="0" w:color="000000"/>
               <w:bottom w:val="single" w:sz="4" w:space="0" w:color="000000"/>
@@ -3290,7 +3322,7 @@
         </w:tc>
         <w:tc>
           <w:tcPr>
-            <w:tcW w:w="744" w:type="dxa"/>
+            <w:tcW w:w="745" w:type="dxa"/>
             <w:tcBorders>
               <w:start w:val="single" w:sz="4" w:space="0" w:color="000000"/>
               <w:bottom w:val="single" w:sz="4" w:space="0" w:color="000000"/>
@@ -3408,7 +3440,7 @@
         </w:tc>
         <w:tc>
           <w:tcPr>
-            <w:tcW w:w="731" w:type="dxa"/>
+            <w:tcW w:w="730" w:type="dxa"/>
             <w:tcBorders>
               <w:start w:val="single" w:sz="4" w:space="0" w:color="000000"/>
               <w:bottom w:val="single" w:sz="4" w:space="0" w:color="000000"/>
@@ -3427,7 +3459,7 @@
         </w:tc>
         <w:tc>
           <w:tcPr>
-            <w:tcW w:w="744" w:type="dxa"/>
+            <w:tcW w:w="745" w:type="dxa"/>
             <w:tcBorders>
               <w:start w:val="single" w:sz="4" w:space="0" w:color="000000"/>
               <w:bottom w:val="single" w:sz="4" w:space="0" w:color="000000"/>
@@ -3545,7 +3577,7 @@
         </w:tc>
         <w:tc>
           <w:tcPr>
-            <w:tcW w:w="731" w:type="dxa"/>
+            <w:tcW w:w="730" w:type="dxa"/>
             <w:tcBorders>
               <w:start w:val="single" w:sz="4" w:space="0" w:color="000000"/>
               <w:bottom w:val="single" w:sz="4" w:space="0" w:color="000000"/>
@@ -3564,7 +3596,7 @@
         </w:tc>
         <w:tc>
           <w:tcPr>
-            <w:tcW w:w="744" w:type="dxa"/>
+            <w:tcW w:w="745" w:type="dxa"/>
             <w:tcBorders>
               <w:start w:val="single" w:sz="4" w:space="0" w:color="000000"/>
               <w:bottom w:val="single" w:sz="4" w:space="0" w:color="000000"/>
@@ -3682,7 +3714,7 @@
         </w:tc>
         <w:tc>
           <w:tcPr>
-            <w:tcW w:w="731" w:type="dxa"/>
+            <w:tcW w:w="730" w:type="dxa"/>
             <w:tcBorders>
               <w:start w:val="single" w:sz="4" w:space="0" w:color="000000"/>
               <w:bottom w:val="single" w:sz="4" w:space="0" w:color="000000"/>
@@ -3701,7 +3733,7 @@
         </w:tc>
         <w:tc>
           <w:tcPr>
-            <w:tcW w:w="744" w:type="dxa"/>
+            <w:tcW w:w="745" w:type="dxa"/>
             <w:tcBorders>
               <w:start w:val="single" w:sz="4" w:space="0" w:color="000000"/>
               <w:bottom w:val="single" w:sz="4" w:space="0" w:color="000000"/>
@@ -3819,7 +3851,7 @@
         </w:tc>
         <w:tc>
           <w:tcPr>
-            <w:tcW w:w="731" w:type="dxa"/>
+            <w:tcW w:w="730" w:type="dxa"/>
             <w:tcBorders>
               <w:start w:val="single" w:sz="4" w:space="0" w:color="000000"/>
               <w:bottom w:val="single" w:sz="4" w:space="0" w:color="000000"/>
@@ -3838,7 +3870,7 @@
         </w:tc>
         <w:tc>
           <w:tcPr>
-            <w:tcW w:w="744" w:type="dxa"/>
+            <w:tcW w:w="745" w:type="dxa"/>
             <w:tcBorders>
               <w:start w:val="single" w:sz="4" w:space="0" w:color="000000"/>
               <w:bottom w:val="single" w:sz="4" w:space="0" w:color="000000"/>
@@ -3956,7 +3988,7 @@
         </w:tc>
         <w:tc>
           <w:tcPr>
-            <w:tcW w:w="731" w:type="dxa"/>
+            <w:tcW w:w="730" w:type="dxa"/>
             <w:tcBorders>
               <w:start w:val="single" w:sz="4" w:space="0" w:color="000000"/>
               <w:bottom w:val="single" w:sz="4" w:space="0" w:color="000000"/>
@@ -3975,7 +4007,7 @@
         </w:tc>
         <w:tc>
           <w:tcPr>
-            <w:tcW w:w="744" w:type="dxa"/>
+            <w:tcW w:w="745" w:type="dxa"/>
             <w:tcBorders>
               <w:start w:val="single" w:sz="4" w:space="0" w:color="000000"/>
               <w:bottom w:val="single" w:sz="4" w:space="0" w:color="000000"/>
@@ -4083,6 +4115,10 @@
     <w:p>
       <w:pPr>
         <w:pStyle w:val="Heading2"/>
+        <w:numPr>
+          <w:ilvl w:val="1"/>
+          <w:numId w:val="1"/>
+        </w:numPr>
         <w:ind w:hanging="0" w:start="0"/>
         <w:rPr/>
       </w:pPr>
@@ -4094,6 +4130,10 @@
     <w:p>
       <w:pPr>
         <w:pStyle w:val="Heading2"/>
+        <w:numPr>
+          <w:ilvl w:val="1"/>
+          <w:numId w:val="1"/>
+        </w:numPr>
         <w:ind w:hanging="0" w:start="0"/>
         <w:rPr/>
       </w:pPr>
@@ -4174,6 +4214,10 @@
     <w:p>
       <w:pPr>
         <w:pStyle w:val="Heading2"/>
+        <w:numPr>
+          <w:ilvl w:val="1"/>
+          <w:numId w:val="1"/>
+        </w:numPr>
         <w:ind w:hanging="0" w:start="0"/>
         <w:rPr/>
       </w:pPr>
@@ -4831,6 +4875,10 @@
     <w:p>
       <w:pPr>
         <w:pStyle w:val="Heading2"/>
+        <w:numPr>
+          <w:ilvl w:val="1"/>
+          <w:numId w:val="1"/>
+        </w:numPr>
         <w:ind w:hanging="0" w:start="0"/>
         <w:rPr/>
       </w:pPr>
@@ -4994,6 +5042,10 @@
     <w:p>
       <w:pPr>
         <w:pStyle w:val="Heading2"/>
+        <w:numPr>
+          <w:ilvl w:val="1"/>
+          <w:numId w:val="1"/>
+        </w:numPr>
         <w:ind w:hanging="0" w:start="0"/>
         <w:rPr/>
       </w:pPr>
@@ -5419,6 +5471,10 @@
     <w:p>
       <w:pPr>
         <w:pStyle w:val="Heading1"/>
+        <w:numPr>
+          <w:ilvl w:val="0"/>
+          <w:numId w:val="1"/>
+        </w:numPr>
         <w:ind w:hanging="0" w:start="0"/>
         <w:rPr/>
       </w:pPr>
@@ -5450,12 +5506,20 @@
     <w:p>
       <w:pPr>
         <w:pStyle w:val="Heading2"/>
+        <w:numPr>
+          <w:ilvl w:val="1"/>
+          <w:numId w:val="1"/>
+        </w:numPr>
         <w:ind w:hanging="0" w:start="0"/>
         <w:rPr/>
       </w:pPr>
       <w:r>
         <w:rPr/>
-        <w:t>Mạch mutiplexer 2:1</w:t>
+        <w:t xml:space="preserve">Mạch mutiplexer 2:1 - </w:t>
+      </w:r>
+      <w:r>
+        <w:rPr/>
+        <w:t>MUX2</w:t>
       </w:r>
     </w:p>
     <w:p>
@@ -5619,7 +5683,7 @@
         <w:ind w:hanging="0" w:start="0" w:end="0"/>
         <w:rPr/>
       </w:pPr>
-      <w:bookmarkStart w:id="20" w:name="code-block-viewer_Copy_3"/>
+      <w:bookmarkStart w:id="20" w:name="code-block-viewer_Copy_3_Copy_1"/>
       <w:bookmarkEnd w:id="20"/>
       <w:r>
         <w:rPr>
@@ -5669,7 +5733,7 @@
         <w:ind w:hanging="0" w:start="0" w:end="0"/>
         <w:rPr/>
       </w:pPr>
-      <w:bookmarkStart w:id="21" w:name="code-block-viewer_Copy_4"/>
+      <w:bookmarkStart w:id="21" w:name="code-block-viewer_Copy_4_Copy_1"/>
       <w:bookmarkEnd w:id="21"/>
       <w:r>
         <w:rPr>
@@ -5693,6 +5757,10 @@
     <w:p>
       <w:pPr>
         <w:pStyle w:val="Heading2"/>
+        <w:numPr>
+          <w:ilvl w:val="1"/>
+          <w:numId w:val="1"/>
+        </w:numPr>
         <w:ind w:hanging="0" w:start="0"/>
         <w:rPr/>
       </w:pPr>
@@ -5729,7 +5797,7 @@
         <w:ind w:hanging="0" w:start="0" w:end="0"/>
         <w:rPr/>
       </w:pPr>
-      <w:bookmarkStart w:id="22" w:name="code-block-viewer_Copy_5"/>
+      <w:bookmarkStart w:id="22" w:name="code-block-viewer_Copy_5_Copy_1"/>
       <w:bookmarkEnd w:id="22"/>
       <w:r>
         <w:rPr>
@@ -5835,7 +5903,7 @@
         <w:ind w:hanging="0" w:start="0" w:end="0"/>
         <w:rPr/>
       </w:pPr>
-      <w:bookmarkStart w:id="23" w:name="code-block-viewer_Copy_6"/>
+      <w:bookmarkStart w:id="23" w:name="code-block-viewer_Copy_6_Copy_1"/>
       <w:bookmarkEnd w:id="23"/>
       <w:r>
         <w:rPr>
@@ -5940,8 +6008,8 @@
       <w:r>
         <w:rPr/>
       </w:r>
-      <w:bookmarkStart w:id="24" w:name="code-block-viewer_Copy_7"/>
-      <w:bookmarkStart w:id="25" w:name="code-block-viewer_Copy_7"/>
+      <w:bookmarkStart w:id="24" w:name="code-block-viewer_Copy_7_Copy_1"/>
+      <w:bookmarkStart w:id="25" w:name="code-block-viewer_Copy_7_Copy_1"/>
       <w:bookmarkEnd w:id="25"/>
     </w:p>
     <w:p>
@@ -5994,7 +6062,7 @@
         <w:ind w:hanging="0" w:start="0" w:end="0"/>
         <w:rPr/>
       </w:pPr>
-      <w:bookmarkStart w:id="26" w:name="code-block-viewer_Copy_8"/>
+      <w:bookmarkStart w:id="26" w:name="code-block-viewer_Copy_8_Copy_1"/>
       <w:bookmarkEnd w:id="26"/>
       <w:r>
         <w:rPr>
@@ -6055,6 +6123,10 @@
     <w:p>
       <w:pPr>
         <w:pStyle w:val="Heading2"/>
+        <w:numPr>
+          <w:ilvl w:val="1"/>
+          <w:numId w:val="1"/>
+        </w:numPr>
         <w:ind w:hanging="0" w:start="0"/>
         <w:rPr/>
       </w:pPr>
@@ -6099,7 +6171,7 @@
         <w:ind w:hanging="0" w:start="0" w:end="0"/>
         <w:rPr/>
       </w:pPr>
-      <w:bookmarkStart w:id="27" w:name="code-block-viewer_Copy_9"/>
+      <w:bookmarkStart w:id="27" w:name="code-block-viewer_Copy_9_Copy_1"/>
       <w:bookmarkEnd w:id="27"/>
       <w:r>
         <w:rPr>
@@ -6189,6 +6261,10 @@
     <w:p>
       <w:pPr>
         <w:pStyle w:val="Heading2"/>
+        <w:numPr>
+          <w:ilvl w:val="1"/>
+          <w:numId w:val="1"/>
+        </w:numPr>
         <w:ind w:hanging="0" w:start="0"/>
         <w:rPr/>
       </w:pPr>
@@ -6229,7 +6305,7 @@
         <w:ind w:hanging="0" w:start="0" w:end="0"/>
         <w:rPr/>
       </w:pPr>
-      <w:bookmarkStart w:id="28" w:name="code-block-viewer_Copy_10"/>
+      <w:bookmarkStart w:id="28" w:name="code-block-viewer_Copy_10_Copy_1"/>
       <w:bookmarkEnd w:id="28"/>
       <w:r>
         <w:rPr>
@@ -6297,14 +6373,190 @@
     </w:p>
     <w:p>
       <w:pPr>
-        <w:pStyle w:val="PreformattedText"/>
-        <w:spacing w:before="0" w:after="283"/>
-        <w:rPr>
-          <w:rStyle w:val="SourceText"/>
-        </w:rPr>
-      </w:pPr>
-      <w:r>
-        <w:rPr/>
+        <w:pStyle w:val="Heading2"/>
+        <w:numPr>
+          <w:ilvl w:val="1"/>
+          <w:numId w:val="1"/>
+        </w:numPr>
+        <w:ind w:hanging="0" w:start="0"/>
+        <w:rPr/>
+      </w:pPr>
+      <w:r>
+        <w:rPr>
+          <w:rStyle w:val="SourceText"/>
+        </w:rPr>
+        <w:t>Mutiplexer 4:1-MUX4</w:t>
+      </w:r>
+    </w:p>
+    <w:p>
+      <w:pPr>
+        <w:pStyle w:val="BodyText"/>
+        <w:rPr/>
+      </w:pPr>
+      <w:r>
+        <w:rPr>
+          <w:rStyle w:val="SourceText"/>
+        </w:rPr>
+        <w:t xml:space="preserve"> </w:t>
+      </w:r>
+      <w:r>
+        <w:rPr>
+          <w:rStyle w:val="SourceText"/>
+        </w:rPr>
+        <w:t>là kết hợp 3 thằng MUX2- multiplexer 2:1</w:t>
+      </w:r>
+    </w:p>
+    <w:p>
+      <w:pPr>
+        <w:pStyle w:val="BodyText"/>
+        <w:rPr>
+          <w:rStyle w:val="SourceText"/>
+        </w:rPr>
+      </w:pPr>
+      <w:r>
+        <w:rPr/>
+        <w:drawing>
+          <wp:anchor behindDoc="0" distT="0" distB="0" distL="0" distR="0" simplePos="0" locked="0" layoutInCell="0" allowOverlap="1" relativeHeight="8">
+            <wp:simplePos x="0" y="0"/>
+            <wp:positionH relativeFrom="column">
+              <wp:posOffset>181610</wp:posOffset>
+            </wp:positionH>
+            <wp:positionV relativeFrom="paragraph">
+              <wp:posOffset>-19050</wp:posOffset>
+            </wp:positionV>
+            <wp:extent cx="5300345" cy="3485515"/>
+            <wp:effectExtent l="0" t="0" r="0" b="0"/>
+            <wp:wrapTopAndBottom/>
+            <wp:docPr id="7" name="Image7" descr="" title=""/>
+            <wp:cNvGraphicFramePr>
+              <a:graphicFrameLocks xmlns:a="http://schemas.openxmlformats.org/drawingml/2006/main" noChangeAspect="1"/>
+            </wp:cNvGraphicFramePr>
+            <a:graphic xmlns:a="http://schemas.openxmlformats.org/drawingml/2006/main">
+              <a:graphicData uri="http://schemas.openxmlformats.org/drawingml/2006/picture">
+                <pic:pic xmlns:pic="http://schemas.openxmlformats.org/drawingml/2006/picture">
+                  <pic:nvPicPr>
+                    <pic:cNvPr id="7" name="Image7" descr="" title=""/>
+                    <pic:cNvPicPr>
+                      <a:picLocks noChangeAspect="1" noChangeArrowheads="1"/>
+                    </pic:cNvPicPr>
+                  </pic:nvPicPr>
+                  <pic:blipFill>
+                    <a:blip r:embed="rId8"/>
+                    <a:stretch>
+                      <a:fillRect/>
+                    </a:stretch>
+                  </pic:blipFill>
+                  <pic:spPr bwMode="auto">
+                    <a:xfrm>
+                      <a:off x="0" y="0"/>
+                      <a:ext cx="5300345" cy="3485515"/>
+                    </a:xfrm>
+                    <a:prstGeom prst="rect">
+                      <a:avLst/>
+                    </a:prstGeom>
+                  </pic:spPr>
+                </pic:pic>
+              </a:graphicData>
+            </a:graphic>
+          </wp:anchor>
+        </w:drawing>
+      </w:r>
+    </w:p>
+    <w:p>
+      <w:pPr>
+        <w:pStyle w:val="BodyText"/>
+        <w:rPr/>
+      </w:pPr>
+      <w:r>
+        <w:rPr/>
+        <w:t xml:space="preserve">Bảng chân trị 2^6 </w:t>
+      </w:r>
+      <w:r>
+        <w:rPr/>
+        <w:t>(4 input + 2 quyết định ) =64 trường hợp thôi tự vẽ nha bà con</w:t>
+      </w:r>
+    </w:p>
+    <w:p>
+      <w:pPr>
+        <w:pStyle w:val="Heading3"/>
+        <w:rPr>
+          <w:u w:val="single"/>
+        </w:rPr>
+      </w:pPr>
+      <w:r>
+        <w:rPr>
+          <w:u w:val="single"/>
+        </w:rPr>
+        <w:t>MUX2 thứ nhất</w:t>
+      </w:r>
+    </w:p>
+    <w:p>
+      <w:pPr>
+        <w:pStyle w:val="BodyText"/>
+        <w:numPr>
+          <w:ilvl w:val="0"/>
+          <w:numId w:val="4"/>
+        </w:numPr>
+        <w:tabs>
+          <w:tab w:val="clear" w:pos="709"/>
+          <w:tab w:val="left" w:pos="0" w:leader="none"/>
+        </w:tabs>
+        <w:spacing w:before="0" w:after="0"/>
+        <w:ind w:hanging="283" w:start="709"/>
+        <w:rPr/>
+      </w:pPr>
+      <w:r>
+        <w:rPr/>
+        <w:t xml:space="preserve">Input: A, B </w:t>
+      </w:r>
+    </w:p>
+    <w:p>
+      <w:pPr>
+        <w:pStyle w:val="BodyText"/>
+        <w:numPr>
+          <w:ilvl w:val="0"/>
+          <w:numId w:val="4"/>
+        </w:numPr>
+        <w:tabs>
+          <w:tab w:val="clear" w:pos="709"/>
+          <w:tab w:val="left" w:pos="0" w:leader="none"/>
+        </w:tabs>
+        <w:spacing w:before="0" w:after="0"/>
+        <w:ind w:hanging="283" w:start="709"/>
+        <w:rPr/>
+      </w:pPr>
+      <w:r>
+        <w:rPr/>
+        <w:t xml:space="preserve">Chân chọn: </w:t>
+      </w:r>
+      <w:r>
+        <w:rPr>
+          <w:rStyle w:val="Strong"/>
+        </w:rPr>
+        <w:t>S0</w:t>
+      </w:r>
+      <w:r>
+        <w:rPr/>
+        <w:t xml:space="preserve"> </w:t>
+      </w:r>
+    </w:p>
+    <w:p>
+      <w:pPr>
+        <w:pStyle w:val="BodyText"/>
+        <w:numPr>
+          <w:ilvl w:val="0"/>
+          <w:numId w:val="4"/>
+        </w:numPr>
+        <w:tabs>
+          <w:tab w:val="clear" w:pos="709"/>
+          <w:tab w:val="left" w:pos="0" w:leader="none"/>
+        </w:tabs>
+        <w:ind w:hanging="283" w:start="709"/>
+        <w:rPr/>
+      </w:pPr>
+      <w:r>
+        <w:rPr/>
+        <w:t xml:space="preserve">Output: T1 </w:t>
       </w:r>
     </w:p>
     <w:p>
@@ -6321,7 +6573,332 @@
     </w:p>
     <w:p>
       <w:pPr>
+        <w:pStyle w:val="PreformattedText"/>
+        <w:spacing w:before="0" w:after="283"/>
+        <w:ind w:hanging="0" w:start="0" w:end="0"/>
+        <w:rPr/>
+      </w:pPr>
+      <w:r>
+        <w:rPr/>
+        <w:t>T</w:t>
+      </w:r>
+      <w:r>
+        <w:rPr>
+          <w:rStyle w:val="SourceText"/>
+        </w:rPr>
+        <w:t>1 = (S0 = 0) ? A : B</w:t>
+      </w:r>
+    </w:p>
+    <w:p>
+      <w:pPr>
+        <w:sectPr>
+          <w:type w:val="continuous"/>
+          <w:pgSz w:w="11906" w:h="16838"/>
+          <w:pgMar w:left="1134" w:right="1134" w:gutter="0" w:header="0" w:top="1134" w:footer="0" w:bottom="1134"/>
+          <w:formProt w:val="false"/>
+          <w:textDirection w:val="lrTb"/>
+          <w:docGrid w:type="default" w:linePitch="100" w:charSpace="0"/>
+        </w:sectPr>
+      </w:pPr>
+    </w:p>
+    <w:p>
+      <w:pPr>
+        <w:pStyle w:val="Heading3"/>
+        <w:rPr>
+          <w:u w:val="single"/>
+        </w:rPr>
+      </w:pPr>
+      <w:r>
+        <w:rPr>
+          <w:u w:val="single"/>
+        </w:rPr>
+        <w:t>MUX2 thứ hai</w:t>
+      </w:r>
+    </w:p>
+    <w:p>
+      <w:pPr>
+        <w:pStyle w:val="BodyText"/>
+        <w:numPr>
+          <w:ilvl w:val="0"/>
+          <w:numId w:val="5"/>
+        </w:numPr>
+        <w:tabs>
+          <w:tab w:val="clear" w:pos="709"/>
+          <w:tab w:val="left" w:pos="0" w:leader="none"/>
+        </w:tabs>
+        <w:spacing w:before="0" w:after="0"/>
+        <w:ind w:hanging="283" w:start="709"/>
+        <w:rPr/>
+      </w:pPr>
+      <w:r>
+        <w:rPr/>
+        <w:t xml:space="preserve">Input: C, D </w:t>
+      </w:r>
+    </w:p>
+    <w:p>
+      <w:pPr>
+        <w:pStyle w:val="BodyText"/>
+        <w:numPr>
+          <w:ilvl w:val="0"/>
+          <w:numId w:val="5"/>
+        </w:numPr>
+        <w:tabs>
+          <w:tab w:val="clear" w:pos="709"/>
+          <w:tab w:val="left" w:pos="0" w:leader="none"/>
+        </w:tabs>
+        <w:spacing w:before="0" w:after="0"/>
+        <w:ind w:hanging="283" w:start="709"/>
+        <w:rPr/>
+      </w:pPr>
+      <w:r>
+        <w:rPr/>
+        <w:t xml:space="preserve">Chân chọn: </w:t>
+      </w:r>
+      <w:r>
+        <w:rPr>
+          <w:rStyle w:val="Strong"/>
+        </w:rPr>
+        <w:t>S0</w:t>
+      </w:r>
+      <w:r>
+        <w:rPr/>
+        <w:t xml:space="preserve"> </w:t>
+      </w:r>
+    </w:p>
+    <w:p>
+      <w:pPr>
+        <w:pStyle w:val="BodyText"/>
+        <w:numPr>
+          <w:ilvl w:val="0"/>
+          <w:numId w:val="5"/>
+        </w:numPr>
+        <w:tabs>
+          <w:tab w:val="clear" w:pos="709"/>
+          <w:tab w:val="left" w:pos="0" w:leader="none"/>
+        </w:tabs>
+        <w:ind w:hanging="283" w:start="709"/>
+        <w:rPr/>
+      </w:pPr>
+      <w:r>
+        <w:rPr/>
+        <w:t xml:space="preserve">Output: T2 </w:t>
+      </w:r>
+    </w:p>
+    <w:p>
+      <w:pPr>
+        <w:sectPr>
+          <w:type w:val="continuous"/>
+          <w:pgSz w:w="11906" w:h="16838"/>
+          <w:pgMar w:left="1134" w:right="1134" w:gutter="0" w:header="0" w:top="1134" w:footer="0" w:bottom="1134"/>
+          <w:formProt w:val="false"/>
+          <w:textDirection w:val="lrTb"/>
+          <w:docGrid w:type="default" w:linePitch="100" w:charSpace="0"/>
+        </w:sectPr>
+      </w:pPr>
+    </w:p>
+    <w:p>
+      <w:pPr>
+        <w:pStyle w:val="PreformattedText"/>
+        <w:spacing w:before="0" w:after="283"/>
+        <w:ind w:hanging="0" w:start="0" w:end="0"/>
+        <w:rPr/>
+      </w:pPr>
+      <w:r>
+        <w:rPr/>
+        <w:t>T</w:t>
+      </w:r>
+      <w:r>
+        <w:rPr>
+          <w:rStyle w:val="SourceText"/>
+        </w:rPr>
+        <w:t>2 = (S0 = 0) ? C : D</w:t>
+      </w:r>
+    </w:p>
+    <w:p>
+      <w:pPr>
+        <w:sectPr>
+          <w:type w:val="continuous"/>
+          <w:pgSz w:w="11906" w:h="16838"/>
+          <w:pgMar w:left="1134" w:right="1134" w:gutter="0" w:header="0" w:top="1134" w:footer="0" w:bottom="1134"/>
+          <w:formProt w:val="false"/>
+          <w:textDirection w:val="lrTb"/>
+          <w:docGrid w:type="default" w:linePitch="100" w:charSpace="0"/>
+        </w:sectPr>
+      </w:pPr>
+    </w:p>
+    <w:p>
+      <w:pPr>
+        <w:pStyle w:val="Heading3"/>
+        <w:rPr>
+          <w:u w:val="single"/>
+        </w:rPr>
+      </w:pPr>
+      <w:r>
+        <w:rPr>
+          <w:u w:val="single"/>
+        </w:rPr>
+        <w:t>MUX2 thứ ba</w:t>
+      </w:r>
+    </w:p>
+    <w:p>
+      <w:pPr>
+        <w:pStyle w:val="BodyText"/>
+        <w:numPr>
+          <w:ilvl w:val="0"/>
+          <w:numId w:val="6"/>
+        </w:numPr>
+        <w:tabs>
+          <w:tab w:val="clear" w:pos="709"/>
+          <w:tab w:val="left" w:pos="0" w:leader="none"/>
+        </w:tabs>
+        <w:spacing w:before="0" w:after="0"/>
+        <w:ind w:hanging="283" w:start="709"/>
+        <w:rPr/>
+      </w:pPr>
+      <w:r>
+        <w:rPr/>
+        <w:t xml:space="preserve">Input: T1, T2 </w:t>
+      </w:r>
+    </w:p>
+    <w:p>
+      <w:pPr>
+        <w:pStyle w:val="BodyText"/>
+        <w:numPr>
+          <w:ilvl w:val="0"/>
+          <w:numId w:val="6"/>
+        </w:numPr>
+        <w:tabs>
+          <w:tab w:val="clear" w:pos="709"/>
+          <w:tab w:val="left" w:pos="0" w:leader="none"/>
+        </w:tabs>
+        <w:spacing w:before="0" w:after="0"/>
+        <w:ind w:hanging="283" w:start="709"/>
+        <w:rPr/>
+      </w:pPr>
+      <w:r>
+        <w:rPr/>
+        <w:t xml:space="preserve">Chân chọn: </w:t>
+      </w:r>
+      <w:r>
+        <w:rPr>
+          <w:rStyle w:val="Strong"/>
+        </w:rPr>
+        <w:t>S1</w:t>
+      </w:r>
+      <w:r>
+        <w:rPr/>
+        <w:t xml:space="preserve"> </w:t>
+      </w:r>
+    </w:p>
+    <w:p>
+      <w:pPr>
+        <w:pStyle w:val="BodyText"/>
+        <w:numPr>
+          <w:ilvl w:val="0"/>
+          <w:numId w:val="6"/>
+        </w:numPr>
+        <w:tabs>
+          <w:tab w:val="clear" w:pos="709"/>
+          <w:tab w:val="left" w:pos="0" w:leader="none"/>
+        </w:tabs>
+        <w:ind w:hanging="283" w:start="709"/>
+        <w:rPr/>
+      </w:pPr>
+      <w:r>
+        <w:rPr/>
+        <w:t xml:space="preserve">Output: Y </w:t>
+      </w:r>
+    </w:p>
+    <w:p>
+      <w:pPr>
+        <w:sectPr>
+          <w:type w:val="continuous"/>
+          <w:pgSz w:w="11906" w:h="16838"/>
+          <w:pgMar w:left="1134" w:right="1134" w:gutter="0" w:header="0" w:top="1134" w:footer="0" w:bottom="1134"/>
+          <w:formProt w:val="false"/>
+          <w:textDirection w:val="lrTb"/>
+          <w:docGrid w:type="default" w:linePitch="100" w:charSpace="0"/>
+        </w:sectPr>
+      </w:pPr>
+    </w:p>
+    <w:p>
+      <w:pPr>
+        <w:pStyle w:val="PreformattedText"/>
+        <w:spacing w:before="0" w:after="283"/>
+        <w:ind w:hanging="0" w:start="0" w:end="0"/>
+        <w:rPr/>
+      </w:pPr>
+      <w:bookmarkStart w:id="29" w:name="code-block-viewer_Copy_2"/>
+      <w:bookmarkEnd w:id="29"/>
+      <w:r>
+        <w:rPr>
+          <w:rStyle w:val="SourceText"/>
+        </w:rPr>
+        <w:t>Y = (S1 = 0) ? T1 : T2</w:t>
+      </w:r>
+    </w:p>
+    <w:p>
+      <w:pPr>
+        <w:sectPr>
+          <w:type w:val="continuous"/>
+          <w:pgSz w:w="11906" w:h="16838"/>
+          <w:pgMar w:left="1134" w:right="1134" w:gutter="0" w:header="0" w:top="1134" w:footer="0" w:bottom="1134"/>
+          <w:formProt w:val="false"/>
+          <w:textDirection w:val="lrTb"/>
+          <w:docGrid w:type="default" w:linePitch="100" w:charSpace="0"/>
+        </w:sectPr>
+      </w:pPr>
+    </w:p>
+    <w:p>
+      <w:pPr>
+        <w:pStyle w:val="BodyText"/>
+        <w:rPr/>
+      </w:pPr>
+      <w:r>
+        <w:rPr/>
+      </w:r>
+    </w:p>
+    <w:p>
+      <w:pPr>
+        <w:pStyle w:val="BodyText"/>
+        <w:rPr>
+          <w:rStyle w:val="SourceText"/>
+        </w:rPr>
+      </w:pPr>
+      <w:r>
+        <w:rPr/>
+      </w:r>
+    </w:p>
+    <w:p>
+      <w:pPr>
+        <w:pStyle w:val="BodyText"/>
+        <w:rPr>
+          <w:rStyle w:val="SourceText"/>
+        </w:rPr>
+      </w:pPr>
+      <w:r>
+        <w:rPr/>
+      </w:r>
+    </w:p>
+    <w:p>
+      <w:pPr>
+        <w:sectPr>
+          <w:type w:val="continuous"/>
+          <w:pgSz w:w="11906" w:h="16838"/>
+          <w:pgMar w:left="1134" w:right="1134" w:gutter="0" w:header="0" w:top="1134" w:footer="0" w:bottom="1134"/>
+          <w:formProt w:val="false"/>
+          <w:textDirection w:val="lrTb"/>
+          <w:docGrid w:type="default" w:linePitch="100" w:charSpace="0"/>
+        </w:sectPr>
+      </w:pPr>
+    </w:p>
+    <w:p>
+      <w:pPr>
         <w:pStyle w:val="Heading1"/>
+        <w:numPr>
+          <w:ilvl w:val="0"/>
+          <w:numId w:val="1"/>
+        </w:numPr>
         <w:ind w:hanging="0" w:start="0"/>
         <w:rPr/>
       </w:pPr>
@@ -6343,6 +6920,10 @@
     <w:p>
       <w:pPr>
         <w:pStyle w:val="Heading1"/>
+        <w:numPr>
+          <w:ilvl w:val="0"/>
+          <w:numId w:val="1"/>
+        </w:numPr>
         <w:ind w:hanging="0" w:start="0"/>
         <w:rPr/>
       </w:pPr>
@@ -6364,6 +6945,10 @@
     <w:p>
       <w:pPr>
         <w:pStyle w:val="Heading1"/>
+        <w:numPr>
+          <w:ilvl w:val="0"/>
+          <w:numId w:val="1"/>
+        </w:numPr>
         <w:ind w:hanging="0" w:start="0"/>
         <w:rPr/>
       </w:pPr>
@@ -6400,7 +6985,6 @@
   <w:abstractNum w:abstractNumId="1">
     <w:lvl w:ilvl="0">
       <w:start w:val="1"/>
-      <w:pStyle w:val="Heading1"/>
       <w:numFmt w:val="decimal"/>
       <w:lvlText w:val="%1)"/>
       <w:lvlJc w:val="start"/>
@@ -6414,7 +6998,6 @@
     </w:lvl>
     <w:lvl w:ilvl="1">
       <w:start w:val="1"/>
-      <w:pStyle w:val="Heading2"/>
       <w:numFmt w:val="decimal"/>
       <w:suff w:val="nothing"/>
       <w:lvlText w:val="%2."/>
@@ -6429,7 +7012,6 @@
     </w:lvl>
     <w:lvl w:ilvl="2">
       <w:start w:val="1"/>
-      <w:pStyle w:val="Heading3"/>
       <w:numFmt w:val="none"/>
       <w:suff w:val="nothing"/>
       <w:lvlText w:val=""/>
@@ -6801,6 +7383,536 @@
       </w:rPr>
     </w:lvl>
   </w:abstractNum>
+  <w:abstractNum w:abstractNumId="4">
+    <w:lvl w:ilvl="0">
+      <w:start w:val="1"/>
+      <w:numFmt w:val="bullet"/>
+      <w:lvlText w:val=""/>
+      <w:lvlJc w:val="start"/>
+      <w:pPr>
+        <w:tabs>
+          <w:tab w:val="num" w:pos="709"/>
+        </w:tabs>
+        <w:ind w:start="709" w:hanging="283"/>
+      </w:pPr>
+      <w:rPr>
+        <w:rFonts w:ascii="Symbol" w:hAnsi="Symbol" w:cs="Symbol" w:hint="default"/>
+      </w:rPr>
+    </w:lvl>
+    <w:lvl w:ilvl="1">
+      <w:start w:val="1"/>
+      <w:numFmt w:val="bullet"/>
+      <w:lvlText w:val=""/>
+      <w:lvlJc w:val="start"/>
+      <w:pPr>
+        <w:tabs>
+          <w:tab w:val="num" w:pos="1418"/>
+        </w:tabs>
+        <w:ind w:start="1418" w:hanging="283"/>
+      </w:pPr>
+      <w:rPr>
+        <w:rFonts w:ascii="Symbol" w:hAnsi="Symbol" w:cs="Symbol" w:hint="default"/>
+      </w:rPr>
+    </w:lvl>
+    <w:lvl w:ilvl="2">
+      <w:start w:val="1"/>
+      <w:numFmt w:val="bullet"/>
+      <w:lvlText w:val=""/>
+      <w:lvlJc w:val="start"/>
+      <w:pPr>
+        <w:tabs>
+          <w:tab w:val="num" w:pos="2127"/>
+        </w:tabs>
+        <w:ind w:start="2127" w:hanging="283"/>
+      </w:pPr>
+      <w:rPr>
+        <w:rFonts w:ascii="Symbol" w:hAnsi="Symbol" w:cs="Symbol" w:hint="default"/>
+      </w:rPr>
+    </w:lvl>
+    <w:lvl w:ilvl="3">
+      <w:start w:val="1"/>
+      <w:numFmt w:val="bullet"/>
+      <w:lvlText w:val=""/>
+      <w:lvlJc w:val="start"/>
+      <w:pPr>
+        <w:tabs>
+          <w:tab w:val="num" w:pos="2836"/>
+        </w:tabs>
+        <w:ind w:start="2836" w:hanging="283"/>
+      </w:pPr>
+      <w:rPr>
+        <w:rFonts w:ascii="Symbol" w:hAnsi="Symbol" w:cs="Symbol" w:hint="default"/>
+      </w:rPr>
+    </w:lvl>
+    <w:lvl w:ilvl="4">
+      <w:start w:val="1"/>
+      <w:numFmt w:val="bullet"/>
+      <w:lvlText w:val=""/>
+      <w:lvlJc w:val="start"/>
+      <w:pPr>
+        <w:tabs>
+          <w:tab w:val="num" w:pos="3545"/>
+        </w:tabs>
+        <w:ind w:start="3545" w:hanging="283"/>
+      </w:pPr>
+      <w:rPr>
+        <w:rFonts w:ascii="Symbol" w:hAnsi="Symbol" w:cs="Symbol" w:hint="default"/>
+      </w:rPr>
+    </w:lvl>
+    <w:lvl w:ilvl="5">
+      <w:start w:val="1"/>
+      <w:numFmt w:val="bullet"/>
+      <w:lvlText w:val=""/>
+      <w:lvlJc w:val="start"/>
+      <w:pPr>
+        <w:tabs>
+          <w:tab w:val="num" w:pos="4254"/>
+        </w:tabs>
+        <w:ind w:start="4254" w:hanging="283"/>
+      </w:pPr>
+      <w:rPr>
+        <w:rFonts w:ascii="Symbol" w:hAnsi="Symbol" w:cs="Symbol" w:hint="default"/>
+      </w:rPr>
+    </w:lvl>
+    <w:lvl w:ilvl="6">
+      <w:start w:val="1"/>
+      <w:numFmt w:val="bullet"/>
+      <w:lvlText w:val=""/>
+      <w:lvlJc w:val="start"/>
+      <w:pPr>
+        <w:tabs>
+          <w:tab w:val="num" w:pos="4963"/>
+        </w:tabs>
+        <w:ind w:start="4963" w:hanging="283"/>
+      </w:pPr>
+      <w:rPr>
+        <w:rFonts w:ascii="Symbol" w:hAnsi="Symbol" w:cs="Symbol" w:hint="default"/>
+      </w:rPr>
+    </w:lvl>
+    <w:lvl w:ilvl="7">
+      <w:start w:val="1"/>
+      <w:numFmt w:val="bullet"/>
+      <w:lvlText w:val=""/>
+      <w:lvlJc w:val="start"/>
+      <w:pPr>
+        <w:tabs>
+          <w:tab w:val="num" w:pos="5672"/>
+        </w:tabs>
+        <w:ind w:start="5672" w:hanging="283"/>
+      </w:pPr>
+      <w:rPr>
+        <w:rFonts w:ascii="Symbol" w:hAnsi="Symbol" w:cs="Symbol" w:hint="default"/>
+      </w:rPr>
+    </w:lvl>
+    <w:lvl w:ilvl="8">
+      <w:start w:val="1"/>
+      <w:numFmt w:val="bullet"/>
+      <w:lvlText w:val=""/>
+      <w:lvlJc w:val="start"/>
+      <w:pPr>
+        <w:tabs>
+          <w:tab w:val="num" w:pos="6381"/>
+        </w:tabs>
+        <w:ind w:start="6381" w:hanging="283"/>
+      </w:pPr>
+      <w:rPr>
+        <w:rFonts w:ascii="Symbol" w:hAnsi="Symbol" w:cs="Symbol" w:hint="default"/>
+      </w:rPr>
+    </w:lvl>
+  </w:abstractNum>
+  <w:abstractNum w:abstractNumId="5">
+    <w:lvl w:ilvl="0">
+      <w:start w:val="1"/>
+      <w:numFmt w:val="bullet"/>
+      <w:lvlText w:val=""/>
+      <w:lvlJc w:val="start"/>
+      <w:pPr>
+        <w:tabs>
+          <w:tab w:val="num" w:pos="709"/>
+        </w:tabs>
+        <w:ind w:start="709" w:hanging="283"/>
+      </w:pPr>
+      <w:rPr>
+        <w:rFonts w:ascii="Symbol" w:hAnsi="Symbol" w:cs="Symbol" w:hint="default"/>
+      </w:rPr>
+    </w:lvl>
+    <w:lvl w:ilvl="1">
+      <w:start w:val="1"/>
+      <w:numFmt w:val="bullet"/>
+      <w:lvlText w:val=""/>
+      <w:lvlJc w:val="start"/>
+      <w:pPr>
+        <w:tabs>
+          <w:tab w:val="num" w:pos="1418"/>
+        </w:tabs>
+        <w:ind w:start="1418" w:hanging="283"/>
+      </w:pPr>
+      <w:rPr>
+        <w:rFonts w:ascii="Symbol" w:hAnsi="Symbol" w:cs="Symbol" w:hint="default"/>
+      </w:rPr>
+    </w:lvl>
+    <w:lvl w:ilvl="2">
+      <w:start w:val="1"/>
+      <w:numFmt w:val="bullet"/>
+      <w:lvlText w:val=""/>
+      <w:lvlJc w:val="start"/>
+      <w:pPr>
+        <w:tabs>
+          <w:tab w:val="num" w:pos="2127"/>
+        </w:tabs>
+        <w:ind w:start="2127" w:hanging="283"/>
+      </w:pPr>
+      <w:rPr>
+        <w:rFonts w:ascii="Symbol" w:hAnsi="Symbol" w:cs="Symbol" w:hint="default"/>
+      </w:rPr>
+    </w:lvl>
+    <w:lvl w:ilvl="3">
+      <w:start w:val="1"/>
+      <w:numFmt w:val="bullet"/>
+      <w:lvlText w:val=""/>
+      <w:lvlJc w:val="start"/>
+      <w:pPr>
+        <w:tabs>
+          <w:tab w:val="num" w:pos="2836"/>
+        </w:tabs>
+        <w:ind w:start="2836" w:hanging="283"/>
+      </w:pPr>
+      <w:rPr>
+        <w:rFonts w:ascii="Symbol" w:hAnsi="Symbol" w:cs="Symbol" w:hint="default"/>
+      </w:rPr>
+    </w:lvl>
+    <w:lvl w:ilvl="4">
+      <w:start w:val="1"/>
+      <w:numFmt w:val="bullet"/>
+      <w:lvlText w:val=""/>
+      <w:lvlJc w:val="start"/>
+      <w:pPr>
+        <w:tabs>
+          <w:tab w:val="num" w:pos="3545"/>
+        </w:tabs>
+        <w:ind w:start="3545" w:hanging="283"/>
+      </w:pPr>
+      <w:rPr>
+        <w:rFonts w:ascii="Symbol" w:hAnsi="Symbol" w:cs="Symbol" w:hint="default"/>
+      </w:rPr>
+    </w:lvl>
+    <w:lvl w:ilvl="5">
+      <w:start w:val="1"/>
+      <w:numFmt w:val="bullet"/>
+      <w:lvlText w:val=""/>
+      <w:lvlJc w:val="start"/>
+      <w:pPr>
+        <w:tabs>
+          <w:tab w:val="num" w:pos="4254"/>
+        </w:tabs>
+        <w:ind w:start="4254" w:hanging="283"/>
+      </w:pPr>
+      <w:rPr>
+        <w:rFonts w:ascii="Symbol" w:hAnsi="Symbol" w:cs="Symbol" w:hint="default"/>
+      </w:rPr>
+    </w:lvl>
+    <w:lvl w:ilvl="6">
+      <w:start w:val="1"/>
+      <w:numFmt w:val="bullet"/>
+      <w:lvlText w:val=""/>
+      <w:lvlJc w:val="start"/>
+      <w:pPr>
+        <w:tabs>
+          <w:tab w:val="num" w:pos="4963"/>
+        </w:tabs>
+        <w:ind w:start="4963" w:hanging="283"/>
+      </w:pPr>
+      <w:rPr>
+        <w:rFonts w:ascii="Symbol" w:hAnsi="Symbol" w:cs="Symbol" w:hint="default"/>
+      </w:rPr>
+    </w:lvl>
+    <w:lvl w:ilvl="7">
+      <w:start w:val="1"/>
+      <w:numFmt w:val="bullet"/>
+      <w:lvlText w:val=""/>
+      <w:lvlJc w:val="start"/>
+      <w:pPr>
+        <w:tabs>
+          <w:tab w:val="num" w:pos="5672"/>
+        </w:tabs>
+        <w:ind w:start="5672" w:hanging="283"/>
+      </w:pPr>
+      <w:rPr>
+        <w:rFonts w:ascii="Symbol" w:hAnsi="Symbol" w:cs="Symbol" w:hint="default"/>
+      </w:rPr>
+    </w:lvl>
+    <w:lvl w:ilvl="8">
+      <w:start w:val="1"/>
+      <w:numFmt w:val="bullet"/>
+      <w:lvlText w:val=""/>
+      <w:lvlJc w:val="start"/>
+      <w:pPr>
+        <w:tabs>
+          <w:tab w:val="num" w:pos="6381"/>
+        </w:tabs>
+        <w:ind w:start="6381" w:hanging="283"/>
+      </w:pPr>
+      <w:rPr>
+        <w:rFonts w:ascii="Symbol" w:hAnsi="Symbol" w:cs="Symbol" w:hint="default"/>
+      </w:rPr>
+    </w:lvl>
+  </w:abstractNum>
+  <w:abstractNum w:abstractNumId="6">
+    <w:lvl w:ilvl="0">
+      <w:start w:val="1"/>
+      <w:numFmt w:val="bullet"/>
+      <w:lvlText w:val=""/>
+      <w:lvlJc w:val="start"/>
+      <w:pPr>
+        <w:tabs>
+          <w:tab w:val="num" w:pos="709"/>
+        </w:tabs>
+        <w:ind w:start="709" w:hanging="283"/>
+      </w:pPr>
+      <w:rPr>
+        <w:rFonts w:ascii="Symbol" w:hAnsi="Symbol" w:cs="Symbol" w:hint="default"/>
+      </w:rPr>
+    </w:lvl>
+    <w:lvl w:ilvl="1">
+      <w:start w:val="1"/>
+      <w:numFmt w:val="bullet"/>
+      <w:lvlText w:val=""/>
+      <w:lvlJc w:val="start"/>
+      <w:pPr>
+        <w:tabs>
+          <w:tab w:val="num" w:pos="1418"/>
+        </w:tabs>
+        <w:ind w:start="1418" w:hanging="283"/>
+      </w:pPr>
+      <w:rPr>
+        <w:rFonts w:ascii="Symbol" w:hAnsi="Symbol" w:cs="Symbol" w:hint="default"/>
+      </w:rPr>
+    </w:lvl>
+    <w:lvl w:ilvl="2">
+      <w:start w:val="1"/>
+      <w:numFmt w:val="bullet"/>
+      <w:lvlText w:val=""/>
+      <w:lvlJc w:val="start"/>
+      <w:pPr>
+        <w:tabs>
+          <w:tab w:val="num" w:pos="2127"/>
+        </w:tabs>
+        <w:ind w:start="2127" w:hanging="283"/>
+      </w:pPr>
+      <w:rPr>
+        <w:rFonts w:ascii="Symbol" w:hAnsi="Symbol" w:cs="Symbol" w:hint="default"/>
+      </w:rPr>
+    </w:lvl>
+    <w:lvl w:ilvl="3">
+      <w:start w:val="1"/>
+      <w:numFmt w:val="bullet"/>
+      <w:lvlText w:val=""/>
+      <w:lvlJc w:val="start"/>
+      <w:pPr>
+        <w:tabs>
+          <w:tab w:val="num" w:pos="2836"/>
+        </w:tabs>
+        <w:ind w:start="2836" w:hanging="283"/>
+      </w:pPr>
+      <w:rPr>
+        <w:rFonts w:ascii="Symbol" w:hAnsi="Symbol" w:cs="Symbol" w:hint="default"/>
+      </w:rPr>
+    </w:lvl>
+    <w:lvl w:ilvl="4">
+      <w:start w:val="1"/>
+      <w:numFmt w:val="bullet"/>
+      <w:lvlText w:val=""/>
+      <w:lvlJc w:val="start"/>
+      <w:pPr>
+        <w:tabs>
+          <w:tab w:val="num" w:pos="3545"/>
+        </w:tabs>
+        <w:ind w:start="3545" w:hanging="283"/>
+      </w:pPr>
+      <w:rPr>
+        <w:rFonts w:ascii="Symbol" w:hAnsi="Symbol" w:cs="Symbol" w:hint="default"/>
+      </w:rPr>
+    </w:lvl>
+    <w:lvl w:ilvl="5">
+      <w:start w:val="1"/>
+      <w:numFmt w:val="bullet"/>
+      <w:lvlText w:val=""/>
+      <w:lvlJc w:val="start"/>
+      <w:pPr>
+        <w:tabs>
+          <w:tab w:val="num" w:pos="4254"/>
+        </w:tabs>
+        <w:ind w:start="4254" w:hanging="283"/>
+      </w:pPr>
+      <w:rPr>
+        <w:rFonts w:ascii="Symbol" w:hAnsi="Symbol" w:cs="Symbol" w:hint="default"/>
+      </w:rPr>
+    </w:lvl>
+    <w:lvl w:ilvl="6">
+      <w:start w:val="1"/>
+      <w:numFmt w:val="bullet"/>
+      <w:lvlText w:val=""/>
+      <w:lvlJc w:val="start"/>
+      <w:pPr>
+        <w:tabs>
+          <w:tab w:val="num" w:pos="4963"/>
+        </w:tabs>
+        <w:ind w:start="4963" w:hanging="283"/>
+      </w:pPr>
+      <w:rPr>
+        <w:rFonts w:ascii="Symbol" w:hAnsi="Symbol" w:cs="Symbol" w:hint="default"/>
+      </w:rPr>
+    </w:lvl>
+    <w:lvl w:ilvl="7">
+      <w:start w:val="1"/>
+      <w:numFmt w:val="bullet"/>
+      <w:lvlText w:val=""/>
+      <w:lvlJc w:val="start"/>
+      <w:pPr>
+        <w:tabs>
+          <w:tab w:val="num" w:pos="5672"/>
+        </w:tabs>
+        <w:ind w:start="5672" w:hanging="283"/>
+      </w:pPr>
+      <w:rPr>
+        <w:rFonts w:ascii="Symbol" w:hAnsi="Symbol" w:cs="Symbol" w:hint="default"/>
+      </w:rPr>
+    </w:lvl>
+    <w:lvl w:ilvl="8">
+      <w:start w:val="1"/>
+      <w:numFmt w:val="bullet"/>
+      <w:lvlText w:val=""/>
+      <w:lvlJc w:val="start"/>
+      <w:pPr>
+        <w:tabs>
+          <w:tab w:val="num" w:pos="6381"/>
+        </w:tabs>
+        <w:ind w:start="6381" w:hanging="283"/>
+      </w:pPr>
+      <w:rPr>
+        <w:rFonts w:ascii="Symbol" w:hAnsi="Symbol" w:cs="Symbol" w:hint="default"/>
+      </w:rPr>
+    </w:lvl>
+  </w:abstractNum>
+  <w:abstractNum w:abstractNumId="7">
+    <w:lvl w:ilvl="0">
+      <w:start w:val="1"/>
+      <w:numFmt w:val="none"/>
+      <w:suff w:val="nothing"/>
+      <w:lvlText w:val=""/>
+      <w:lvlJc w:val="start"/>
+      <w:pPr>
+        <w:tabs>
+          <w:tab w:val="num" w:pos="0"/>
+        </w:tabs>
+        <w:ind w:start="0" w:hanging="0"/>
+      </w:pPr>
+    </w:lvl>
+    <w:lvl w:ilvl="1">
+      <w:start w:val="1"/>
+      <w:numFmt w:val="none"/>
+      <w:suff w:val="nothing"/>
+      <w:lvlText w:val=""/>
+      <w:lvlJc w:val="start"/>
+      <w:pPr>
+        <w:tabs>
+          <w:tab w:val="num" w:pos="0"/>
+        </w:tabs>
+        <w:ind w:start="0" w:hanging="0"/>
+      </w:pPr>
+    </w:lvl>
+    <w:lvl w:ilvl="2">
+      <w:start w:val="1"/>
+      <w:numFmt w:val="none"/>
+      <w:suff w:val="nothing"/>
+      <w:lvlText w:val=""/>
+      <w:lvlJc w:val="start"/>
+      <w:pPr>
+        <w:tabs>
+          <w:tab w:val="num" w:pos="0"/>
+        </w:tabs>
+        <w:ind w:start="0" w:hanging="0"/>
+      </w:pPr>
+    </w:lvl>
+    <w:lvl w:ilvl="3">
+      <w:start w:val="1"/>
+      <w:numFmt w:val="none"/>
+      <w:suff w:val="nothing"/>
+      <w:lvlText w:val=""/>
+      <w:lvlJc w:val="start"/>
+      <w:pPr>
+        <w:tabs>
+          <w:tab w:val="num" w:pos="0"/>
+        </w:tabs>
+        <w:ind w:start="0" w:hanging="0"/>
+      </w:pPr>
+    </w:lvl>
+    <w:lvl w:ilvl="4">
+      <w:start w:val="1"/>
+      <w:numFmt w:val="none"/>
+      <w:suff w:val="nothing"/>
+      <w:lvlText w:val=""/>
+      <w:lvlJc w:val="start"/>
+      <w:pPr>
+        <w:tabs>
+          <w:tab w:val="num" w:pos="0"/>
+        </w:tabs>
+        <w:ind w:start="0" w:hanging="0"/>
+      </w:pPr>
+    </w:lvl>
+    <w:lvl w:ilvl="5">
+      <w:start w:val="1"/>
+      <w:numFmt w:val="none"/>
+      <w:suff w:val="nothing"/>
+      <w:lvlText w:val=""/>
+      <w:lvlJc w:val="start"/>
+      <w:pPr>
+        <w:tabs>
+          <w:tab w:val="num" w:pos="0"/>
+        </w:tabs>
+        <w:ind w:start="0" w:hanging="0"/>
+      </w:pPr>
+    </w:lvl>
+    <w:lvl w:ilvl="6">
+      <w:start w:val="1"/>
+      <w:numFmt w:val="none"/>
+      <w:suff w:val="nothing"/>
+      <w:lvlText w:val=""/>
+      <w:lvlJc w:val="start"/>
+      <w:pPr>
+        <w:tabs>
+          <w:tab w:val="num" w:pos="0"/>
+        </w:tabs>
+        <w:ind w:start="0" w:hanging="0"/>
+      </w:pPr>
+    </w:lvl>
+    <w:lvl w:ilvl="7">
+      <w:start w:val="1"/>
+      <w:numFmt w:val="none"/>
+      <w:suff w:val="nothing"/>
+      <w:lvlText w:val=""/>
+      <w:lvlJc w:val="start"/>
+      <w:pPr>
+        <w:tabs>
+          <w:tab w:val="num" w:pos="0"/>
+        </w:tabs>
+        <w:ind w:start="0" w:hanging="0"/>
+      </w:pPr>
+    </w:lvl>
+    <w:lvl w:ilvl="8">
+      <w:start w:val="1"/>
+      <w:numFmt w:val="none"/>
+      <w:suff w:val="nothing"/>
+      <w:lvlText w:val=""/>
+      <w:lvlJc w:val="start"/>
+      <w:pPr>
+        <w:tabs>
+          <w:tab w:val="num" w:pos="0"/>
+        </w:tabs>
+        <w:ind w:start="0" w:hanging="0"/>
+      </w:pPr>
+    </w:lvl>
+  </w:abstractNum>
   <w:num w:numId="1">
     <w:abstractNumId w:val="1"/>
   </w:num>
@@ -6809,6 +7921,18 @@
   </w:num>
   <w:num w:numId="3">
     <w:abstractNumId w:val="3"/>
+  </w:num>
+  <w:num w:numId="4">
+    <w:abstractNumId w:val="4"/>
+  </w:num>
+  <w:num w:numId="5">
+    <w:abstractNumId w:val="5"/>
+  </w:num>
+  <w:num w:numId="6">
+    <w:abstractNumId w:val="6"/>
+  </w:num>
+  <w:num w:numId="7">
+    <w:abstractNumId w:val="7"/>
   </w:num>
 </w:numbering>
 </file>

</xml_diff>

<commit_message>
multiplexer 4:1 MUX4 wave
</commit_message>
<xml_diff>
--- a/Doc/OnTap/3_Verilog Mạch tổ hợp (Combinational Circuit).docx
+++ b/Doc/OnTap/3_Verilog Mạch tổ hợp (Combinational Circuit).docx
@@ -5505,6 +5505,60 @@
     </w:p>
     <w:p>
       <w:pPr>
+        <w:pStyle w:val="BodyText"/>
+        <w:rPr/>
+      </w:pPr>
+      <w:r>
+        <w:rPr/>
+        <w:drawing>
+          <wp:anchor behindDoc="0" distT="0" distB="0" distL="0" distR="0" simplePos="0" locked="0" layoutInCell="0" allowOverlap="1" relativeHeight="9">
+            <wp:simplePos x="0" y="0"/>
+            <wp:positionH relativeFrom="column">
+              <wp:align>center</wp:align>
+            </wp:positionH>
+            <wp:positionV relativeFrom="paragraph">
+              <wp:posOffset>635</wp:posOffset>
+            </wp:positionV>
+            <wp:extent cx="6120130" cy="3002280"/>
+            <wp:effectExtent l="0" t="0" r="0" b="0"/>
+            <wp:wrapSquare wrapText="largest"/>
+            <wp:docPr id="6" name="Image8" descr="" title=""/>
+            <wp:cNvGraphicFramePr>
+              <a:graphicFrameLocks xmlns:a="http://schemas.openxmlformats.org/drawingml/2006/main" noChangeAspect="1"/>
+            </wp:cNvGraphicFramePr>
+            <a:graphic xmlns:a="http://schemas.openxmlformats.org/drawingml/2006/main">
+              <a:graphicData uri="http://schemas.openxmlformats.org/drawingml/2006/picture">
+                <pic:pic xmlns:pic="http://schemas.openxmlformats.org/drawingml/2006/picture">
+                  <pic:nvPicPr>
+                    <pic:cNvPr id="6" name="Image8" descr="" title=""/>
+                    <pic:cNvPicPr>
+                      <a:picLocks noChangeAspect="1" noChangeArrowheads="1"/>
+                    </pic:cNvPicPr>
+                  </pic:nvPicPr>
+                  <pic:blipFill>
+                    <a:blip r:embed="rId7"/>
+                    <a:stretch>
+                      <a:fillRect/>
+                    </a:stretch>
+                  </pic:blipFill>
+                  <pic:spPr bwMode="auto">
+                    <a:xfrm>
+                      <a:off x="0" y="0"/>
+                      <a:ext cx="6120130" cy="3002280"/>
+                    </a:xfrm>
+                    <a:prstGeom prst="rect">
+                      <a:avLst/>
+                    </a:prstGeom>
+                  </pic:spPr>
+                </pic:pic>
+              </a:graphicData>
+            </a:graphic>
+          </wp:anchor>
+        </w:drawing>
+      </w:r>
+    </w:p>
+    <w:p>
+      <w:pPr>
         <w:pStyle w:val="Heading2"/>
         <w:numPr>
           <w:ilvl w:val="1"/>
@@ -5515,11 +5569,7 @@
       </w:pPr>
       <w:r>
         <w:rPr/>
-        <w:t xml:space="preserve">Mạch mutiplexer 2:1 - </w:t>
-      </w:r>
-      <w:r>
-        <w:rPr/>
-        <w:t>MUX2</w:t>
+        <w:t>Mạch mutiplexer 2:1 - MUX2</w:t>
       </w:r>
     </w:p>
     <w:p>
@@ -5559,7 +5609,7 @@
             <wp:extent cx="5829935" cy="4167505"/>
             <wp:effectExtent l="0" t="0" r="0" b="0"/>
             <wp:wrapSquare wrapText="largest"/>
-            <wp:docPr id="6" name="Image6" descr="" title=""/>
+            <wp:docPr id="7" name="Image6" descr="" title=""/>
             <wp:cNvGraphicFramePr>
               <a:graphicFrameLocks xmlns:a="http://schemas.openxmlformats.org/drawingml/2006/main" noChangeAspect="1"/>
             </wp:cNvGraphicFramePr>
@@ -5567,13 +5617,13 @@
               <a:graphicData uri="http://schemas.openxmlformats.org/drawingml/2006/picture">
                 <pic:pic xmlns:pic="http://schemas.openxmlformats.org/drawingml/2006/picture">
                   <pic:nvPicPr>
-                    <pic:cNvPr id="6" name="Image6" descr="" title=""/>
+                    <pic:cNvPr id="7" name="Image6" descr="" title=""/>
                     <pic:cNvPicPr>
                       <a:picLocks noChangeAspect="1" noChangeArrowheads="1"/>
                     </pic:cNvPicPr>
                   </pic:nvPicPr>
                   <pic:blipFill>
-                    <a:blip r:embed="rId7"/>
+                    <a:blip r:embed="rId8"/>
                     <a:stretch>
                       <a:fillRect/>
                     </a:stretch>
@@ -5683,7 +5733,7 @@
         <w:ind w:hanging="0" w:start="0" w:end="0"/>
         <w:rPr/>
       </w:pPr>
-      <w:bookmarkStart w:id="20" w:name="code-block-viewer_Copy_3_Copy_1"/>
+      <w:bookmarkStart w:id="20" w:name="code-block-viewer_Copy_3_Copy_1_Copy_1"/>
       <w:bookmarkEnd w:id="20"/>
       <w:r>
         <w:rPr>
@@ -5797,7 +5847,7 @@
         <w:ind w:hanging="0" w:start="0" w:end="0"/>
         <w:rPr/>
       </w:pPr>
-      <w:bookmarkStart w:id="22" w:name="code-block-viewer_Copy_5_Copy_1"/>
+      <w:bookmarkStart w:id="22" w:name="code-block-viewer_Copy_5_Copy_1_Copy_1"/>
       <w:bookmarkEnd w:id="22"/>
       <w:r>
         <w:rPr>
@@ -6427,7 +6477,7 @@
             <wp:extent cx="5300345" cy="3485515"/>
             <wp:effectExtent l="0" t="0" r="0" b="0"/>
             <wp:wrapTopAndBottom/>
-            <wp:docPr id="7" name="Image7" descr="" title=""/>
+            <wp:docPr id="8" name="Image7" descr="" title=""/>
             <wp:cNvGraphicFramePr>
               <a:graphicFrameLocks xmlns:a="http://schemas.openxmlformats.org/drawingml/2006/main" noChangeAspect="1"/>
             </wp:cNvGraphicFramePr>
@@ -6435,13 +6485,13 @@
               <a:graphicData uri="http://schemas.openxmlformats.org/drawingml/2006/picture">
                 <pic:pic xmlns:pic="http://schemas.openxmlformats.org/drawingml/2006/picture">
                   <pic:nvPicPr>
-                    <pic:cNvPr id="7" name="Image7" descr="" title=""/>
+                    <pic:cNvPr id="8" name="Image7" descr="" title=""/>
                     <pic:cNvPicPr>
                       <a:picLocks noChangeAspect="1" noChangeArrowheads="1"/>
                     </pic:cNvPicPr>
                   </pic:nvPicPr>
                   <pic:blipFill>
-                    <a:blip r:embed="rId8"/>
+                    <a:blip r:embed="rId9"/>
                     <a:stretch>
                       <a:fillRect/>
                     </a:stretch>
@@ -6469,11 +6519,7 @@
       </w:pPr>
       <w:r>
         <w:rPr/>
-        <w:t xml:space="preserve">Bảng chân trị 2^6 </w:t>
-      </w:r>
-      <w:r>
-        <w:rPr/>
-        <w:t>(4 input + 2 quyết định ) =64 trường hợp thôi tự vẽ nha bà con</w:t>
+        <w:t>Bảng chân trị 2^6 (4 input + 2 quyết định ) =64 trường hợp thôi tự vẽ nha bà con</w:t>
       </w:r>
     </w:p>
     <w:p>
@@ -6828,7 +6874,7 @@
         <w:ind w:hanging="0" w:start="0" w:end="0"/>
         <w:rPr/>
       </w:pPr>
-      <w:bookmarkStart w:id="29" w:name="code-block-viewer_Copy_2"/>
+      <w:bookmarkStart w:id="29" w:name="code-block-viewer_Copy_2_Copy_1"/>
       <w:bookmarkEnd w:id="29"/>
       <w:r>
         <w:rPr>

</xml_diff>

<commit_message>
cap nhat tai lieu chu thich ve 1 so ky tu [1:0]sel , #10 ,sel=2'b00;
</commit_message>
<xml_diff>
--- a/Doc/OnTap/3_Verilog Mạch tổ hợp (Combinational Circuit).docx
+++ b/Doc/OnTap/3_Verilog Mạch tổ hợp (Combinational Circuit).docx
@@ -6874,7 +6874,7 @@
         <w:ind w:hanging="0" w:start="0" w:end="0"/>
         <w:rPr/>
       </w:pPr>
-      <w:bookmarkStart w:id="29" w:name="code-block-viewer_Copy_2_Copy_1"/>
+      <w:bookmarkStart w:id="29" w:name="code-block-viewer_Copy_2_Copy_1_Copy_1"/>
       <w:bookmarkEnd w:id="29"/>
       <w:r>
         <w:rPr>
@@ -6897,11 +6897,1024 @@
     </w:p>
     <w:p>
       <w:pPr>
-        <w:pStyle w:val="BodyText"/>
-        <w:rPr/>
-      </w:pPr>
-      <w:r>
-        <w:rPr/>
+        <w:pStyle w:val="Heading2"/>
+        <w:numPr>
+          <w:ilvl w:val="1"/>
+          <w:numId w:val="1"/>
+        </w:numPr>
+        <w:spacing w:before="200" w:after="120"/>
+        <w:rPr/>
+      </w:pPr>
+      <w:r>
+        <w:rPr/>
+        <w:t>Đoạn này hoạt động thế nào?</w:t>
+      </w:r>
+    </w:p>
+    <w:p>
+      <w:pPr>
+        <w:pStyle w:val="PreformattedText"/>
+        <w:rPr>
+          <w:rStyle w:val="SourceText"/>
+        </w:rPr>
+      </w:pPr>
+      <w:r>
+        <w:rPr>
+          <w:rStyle w:val="SourceText"/>
+        </w:rPr>
+        <w:t>a = 0;</w:t>
+      </w:r>
+    </w:p>
+    <w:p>
+      <w:pPr>
+        <w:sectPr>
+          <w:type w:val="continuous"/>
+          <w:pgSz w:w="11906" w:h="16838"/>
+          <w:pgMar w:left="1134" w:right="1134" w:gutter="0" w:header="0" w:top="1134" w:footer="0" w:bottom="1134"/>
+          <w:formProt w:val="false"/>
+          <w:textDirection w:val="lrTb"/>
+          <w:docGrid w:type="default" w:linePitch="100" w:charSpace="0"/>
+        </w:sectPr>
+      </w:pPr>
+    </w:p>
+    <w:p>
+      <w:pPr>
+        <w:pStyle w:val="PreformattedText"/>
+        <w:rPr/>
+      </w:pPr>
+      <w:r>
+        <w:rPr>
+          <w:rStyle w:val="SourceText"/>
+        </w:rPr>
+        <w:t>b = 0;</w:t>
+      </w:r>
+    </w:p>
+    <w:p>
+      <w:pPr>
+        <w:pStyle w:val="PreformattedText"/>
+        <w:rPr/>
+      </w:pPr>
+      <w:r>
+        <w:rPr>
+          <w:rStyle w:val="SourceText"/>
+        </w:rPr>
+        <w:t>c = 1;</w:t>
+      </w:r>
+    </w:p>
+    <w:p>
+      <w:pPr>
+        <w:pStyle w:val="PreformattedText"/>
+        <w:rPr/>
+      </w:pPr>
+      <w:r>
+        <w:rPr>
+          <w:rStyle w:val="SourceText"/>
+        </w:rPr>
+        <w:t>d = 1;</w:t>
+      </w:r>
+    </w:p>
+    <w:p>
+      <w:pPr>
+        <w:pStyle w:val="PreformattedText"/>
+        <w:rPr/>
+      </w:pPr>
+      <w:r>
+        <w:rPr>
+          <w:rStyle w:val="SourceText"/>
+        </w:rPr>
+        <w:t>sel = 2'b00; #10;</w:t>
+      </w:r>
+    </w:p>
+    <w:p>
+      <w:pPr>
+        <w:pStyle w:val="PreformattedText"/>
+        <w:rPr/>
+      </w:pPr>
+      <w:r>
+        <w:rPr>
+          <w:rStyle w:val="SourceText"/>
+        </w:rPr>
+        <w:t>sel = 2'b01; #10;</w:t>
+      </w:r>
+    </w:p>
+    <w:p>
+      <w:pPr>
+        <w:pStyle w:val="PreformattedText"/>
+        <w:rPr/>
+      </w:pPr>
+      <w:r>
+        <w:rPr>
+          <w:rStyle w:val="SourceText"/>
+        </w:rPr>
+        <w:t>sel = 2'b10; #10;</w:t>
+      </w:r>
+    </w:p>
+    <w:p>
+      <w:pPr>
+        <w:pStyle w:val="PreformattedText"/>
+        <w:spacing w:before="0" w:after="283"/>
+        <w:rPr/>
+      </w:pPr>
+      <w:r>
+        <w:rPr>
+          <w:rStyle w:val="SourceText"/>
+        </w:rPr>
+        <w:t>sel = 2'b11; #10;</w:t>
+      </w:r>
+    </w:p>
+    <w:p>
+      <w:pPr>
+        <w:sectPr>
+          <w:type w:val="continuous"/>
+          <w:pgSz w:w="11906" w:h="16838"/>
+          <w:pgMar w:left="1134" w:right="1134" w:gutter="0" w:header="0" w:top="1134" w:footer="0" w:bottom="1134"/>
+          <w:formProt w:val="false"/>
+          <w:textDirection w:val="lrTb"/>
+          <w:docGrid w:type="default" w:linePitch="100" w:charSpace="0"/>
+        </w:sectPr>
+      </w:pPr>
+    </w:p>
+    <w:p>
+      <w:pPr>
+        <w:pStyle w:val="BodyText"/>
+        <w:rPr/>
+      </w:pPr>
+      <w:r>
+        <w:rPr>
+          <w:rStyle w:val="SourceText"/>
+        </w:rPr>
+        <w:t>Ban đầu:</w:t>
+      </w:r>
+    </w:p>
+    <w:p>
+      <w:pPr>
+        <w:sectPr>
+          <w:type w:val="continuous"/>
+          <w:pgSz w:w="11906" w:h="16838"/>
+          <w:pgMar w:left="1134" w:right="1134" w:gutter="0" w:header="0" w:top="1134" w:footer="0" w:bottom="1134"/>
+          <w:formProt w:val="false"/>
+          <w:textDirection w:val="lrTb"/>
+          <w:docGrid w:type="default" w:linePitch="100" w:charSpace="0"/>
+        </w:sectPr>
+      </w:pPr>
+    </w:p>
+    <w:p>
+      <w:pPr>
+        <w:pStyle w:val="PreformattedText"/>
+        <w:ind w:hanging="0" w:start="0" w:end="0"/>
+        <w:rPr/>
+      </w:pPr>
+      <w:bookmarkStart w:id="30" w:name="code-block-viewer_Copy_1"/>
+      <w:bookmarkEnd w:id="30"/>
+      <w:r>
+        <w:rPr>
+          <w:rStyle w:val="SourceText"/>
+        </w:rPr>
+        <w:t>a = 0</w:t>
+      </w:r>
+    </w:p>
+    <w:p>
+      <w:pPr>
+        <w:pStyle w:val="PreformattedText"/>
+        <w:rPr/>
+      </w:pPr>
+      <w:r>
+        <w:rPr>
+          <w:rStyle w:val="SourceText"/>
+        </w:rPr>
+        <w:t>b = 0</w:t>
+      </w:r>
+    </w:p>
+    <w:p>
+      <w:pPr>
+        <w:pStyle w:val="PreformattedText"/>
+        <w:rPr/>
+      </w:pPr>
+      <w:r>
+        <w:rPr>
+          <w:rStyle w:val="SourceText"/>
+        </w:rPr>
+        <w:t>c = 1</w:t>
+      </w:r>
+    </w:p>
+    <w:p>
+      <w:pPr>
+        <w:pStyle w:val="PreformattedText"/>
+        <w:spacing w:before="0" w:after="283"/>
+        <w:rPr/>
+      </w:pPr>
+      <w:r>
+        <w:rPr>
+          <w:rStyle w:val="SourceText"/>
+        </w:rPr>
+        <w:t>d = 1</w:t>
+      </w:r>
+    </w:p>
+    <w:p>
+      <w:pPr>
+        <w:sectPr>
+          <w:type w:val="continuous"/>
+          <w:pgSz w:w="11906" w:h="16838"/>
+          <w:pgMar w:left="1134" w:right="1134" w:gutter="0" w:header="0" w:top="1134" w:footer="0" w:bottom="1134"/>
+          <w:formProt w:val="false"/>
+          <w:textDirection w:val="lrTb"/>
+          <w:docGrid w:type="default" w:linePitch="100" w:charSpace="0"/>
+        </w:sectPr>
+      </w:pPr>
+    </w:p>
+    <w:p>
+      <w:pPr>
+        <w:pStyle w:val="BodyText"/>
+        <w:rPr/>
+      </w:pPr>
+      <w:r>
+        <w:rPr/>
+        <w:t>Sau đó test từng trường hợp:</w:t>
+      </w:r>
+    </w:p>
+    <w:p>
+      <w:pPr>
+        <w:pStyle w:val="Heading3"/>
+        <w:rPr/>
+      </w:pPr>
+      <w:r>
+        <w:rPr/>
+        <w:t>Lần 1</w:t>
+      </w:r>
+    </w:p>
+    <w:p>
+      <w:pPr>
+        <w:sectPr>
+          <w:type w:val="continuous"/>
+          <w:pgSz w:w="11906" w:h="16838"/>
+          <w:pgMar w:left="1134" w:right="1134" w:gutter="0" w:header="0" w:top="1134" w:footer="0" w:bottom="1134"/>
+          <w:formProt w:val="false"/>
+          <w:textDirection w:val="lrTb"/>
+          <w:docGrid w:type="default" w:linePitch="100" w:charSpace="0"/>
+        </w:sectPr>
+      </w:pPr>
+    </w:p>
+    <w:p>
+      <w:pPr>
+        <w:pStyle w:val="PreformattedText"/>
+        <w:spacing w:before="0" w:after="283"/>
+        <w:ind w:hanging="0" w:start="0" w:end="0"/>
+        <w:rPr/>
+      </w:pPr>
+      <w:bookmarkStart w:id="31" w:name="code-block-viewer_Copy_2"/>
+      <w:bookmarkEnd w:id="31"/>
+      <w:r>
+        <w:rPr>
+          <w:rStyle w:val="SourceText"/>
+        </w:rPr>
+        <w:t>sel = 00</w:t>
+      </w:r>
+    </w:p>
+    <w:p>
+      <w:pPr>
+        <w:sectPr>
+          <w:type w:val="continuous"/>
+          <w:pgSz w:w="11906" w:h="16838"/>
+          <w:pgMar w:left="1134" w:right="1134" w:gutter="0" w:header="0" w:top="1134" w:footer="0" w:bottom="1134"/>
+          <w:formProt w:val="false"/>
+          <w:textDirection w:val="lrTb"/>
+          <w:docGrid w:type="default" w:linePitch="100" w:charSpace="0"/>
+        </w:sectPr>
+      </w:pPr>
+    </w:p>
+    <w:p>
+      <w:pPr>
+        <w:pStyle w:val="PreformattedText"/>
+        <w:ind w:hanging="0" w:start="0" w:end="0"/>
+        <w:rPr/>
+      </w:pPr>
+      <w:bookmarkStart w:id="32" w:name="code-block-viewer_Copy_3"/>
+      <w:bookmarkEnd w:id="32"/>
+      <w:r>
+        <w:rPr>
+          <w:rStyle w:val="SourceText"/>
+        </w:rPr>
+        <w:t>S1=0</w:t>
+      </w:r>
+    </w:p>
+    <w:p>
+      <w:pPr>
+        <w:pStyle w:val="PreformattedText"/>
+        <w:spacing w:before="0" w:after="283"/>
+        <w:rPr/>
+      </w:pPr>
+      <w:r>
+        <w:rPr>
+          <w:rStyle w:val="SourceText"/>
+        </w:rPr>
+        <w:t>S0=0</w:t>
+      </w:r>
+    </w:p>
+    <w:p>
+      <w:pPr>
+        <w:sectPr>
+          <w:type w:val="continuous"/>
+          <w:pgSz w:w="11906" w:h="16838"/>
+          <w:pgMar w:left="1134" w:right="1134" w:gutter="0" w:header="0" w:top="1134" w:footer="0" w:bottom="1134"/>
+          <w:formProt w:val="false"/>
+          <w:textDirection w:val="lrTb"/>
+          <w:docGrid w:type="default" w:linePitch="100" w:charSpace="0"/>
+        </w:sectPr>
+      </w:pPr>
+    </w:p>
+    <w:p>
+      <w:pPr>
+        <w:pStyle w:val="BodyText"/>
+        <w:rPr/>
+      </w:pPr>
+      <w:r>
+        <w:rPr/>
+        <w:t>MUX chọn</w:t>
+      </w:r>
+    </w:p>
+    <w:p>
+      <w:pPr>
+        <w:sectPr>
+          <w:type w:val="continuous"/>
+          <w:pgSz w:w="11906" w:h="16838"/>
+          <w:pgMar w:left="1134" w:right="1134" w:gutter="0" w:header="0" w:top="1134" w:footer="0" w:bottom="1134"/>
+          <w:formProt w:val="false"/>
+          <w:textDirection w:val="lrTb"/>
+          <w:docGrid w:type="default" w:linePitch="100" w:charSpace="0"/>
+        </w:sectPr>
+      </w:pPr>
+    </w:p>
+    <w:p>
+      <w:pPr>
+        <w:pStyle w:val="PreformattedText"/>
+        <w:spacing w:before="0" w:after="283"/>
+        <w:ind w:hanging="0" w:start="0" w:end="0"/>
+        <w:rPr/>
+      </w:pPr>
+      <w:bookmarkStart w:id="33" w:name="code-block-viewer_Copy_4"/>
+      <w:bookmarkEnd w:id="33"/>
+      <w:r>
+        <w:rPr>
+          <w:rStyle w:val="SourceText"/>
+        </w:rPr>
+        <w:t>out = a = 0</w:t>
+      </w:r>
+    </w:p>
+    <w:p>
+      <w:pPr>
+        <w:sectPr>
+          <w:type w:val="continuous"/>
+          <w:pgSz w:w="11906" w:h="16838"/>
+          <w:pgMar w:left="1134" w:right="1134" w:gutter="0" w:header="0" w:top="1134" w:footer="0" w:bottom="1134"/>
+          <w:formProt w:val="false"/>
+          <w:textDirection w:val="lrTb"/>
+          <w:docGrid w:type="default" w:linePitch="100" w:charSpace="0"/>
+        </w:sectPr>
+      </w:pPr>
+    </w:p>
+    <w:p>
+      <w:pPr>
+        <w:pStyle w:val="BodyText"/>
+        <w:rPr/>
+      </w:pPr>
+      <w:r>
+        <w:rPr/>
+        <w:t>đợi 10 ns.</w:t>
+      </w:r>
+    </w:p>
+    <w:p>
+      <w:pPr>
+        <w:pStyle w:val="HorizontalLine"/>
+        <w:rPr/>
+      </w:pPr>
+      <w:r>
+        <w:rPr/>
+      </w:r>
+    </w:p>
+    <w:p>
+      <w:pPr>
+        <w:pStyle w:val="Heading3"/>
+        <w:rPr/>
+      </w:pPr>
+      <w:r>
+        <w:rPr/>
+        <w:t>Lần 2</w:t>
+      </w:r>
+    </w:p>
+    <w:p>
+      <w:pPr>
+        <w:sectPr>
+          <w:type w:val="continuous"/>
+          <w:pgSz w:w="11906" w:h="16838"/>
+          <w:pgMar w:left="1134" w:right="1134" w:gutter="0" w:header="0" w:top="1134" w:footer="0" w:bottom="1134"/>
+          <w:formProt w:val="false"/>
+          <w:textDirection w:val="lrTb"/>
+          <w:docGrid w:type="default" w:linePitch="100" w:charSpace="0"/>
+        </w:sectPr>
+      </w:pPr>
+    </w:p>
+    <w:p>
+      <w:pPr>
+        <w:pStyle w:val="PreformattedText"/>
+        <w:spacing w:before="0" w:after="283"/>
+        <w:ind w:hanging="0" w:start="0" w:end="0"/>
+        <w:rPr/>
+      </w:pPr>
+      <w:bookmarkStart w:id="34" w:name="code-block-viewer_Copy_5"/>
+      <w:bookmarkEnd w:id="34"/>
+      <w:r>
+        <w:rPr>
+          <w:rStyle w:val="SourceText"/>
+        </w:rPr>
+        <w:t>sel = 01</w:t>
+      </w:r>
+    </w:p>
+    <w:p>
+      <w:pPr>
+        <w:sectPr>
+          <w:type w:val="continuous"/>
+          <w:pgSz w:w="11906" w:h="16838"/>
+          <w:pgMar w:left="1134" w:right="1134" w:gutter="0" w:header="0" w:top="1134" w:footer="0" w:bottom="1134"/>
+          <w:formProt w:val="false"/>
+          <w:textDirection w:val="lrTb"/>
+          <w:docGrid w:type="default" w:linePitch="100" w:charSpace="0"/>
+        </w:sectPr>
+      </w:pPr>
+    </w:p>
+    <w:p>
+      <w:pPr>
+        <w:pStyle w:val="PreformattedText"/>
+        <w:ind w:hanging="0" w:start="0" w:end="0"/>
+        <w:rPr/>
+      </w:pPr>
+      <w:bookmarkStart w:id="35" w:name="code-block-viewer_Copy_6"/>
+      <w:bookmarkEnd w:id="35"/>
+      <w:r>
+        <w:rPr>
+          <w:rStyle w:val="SourceText"/>
+        </w:rPr>
+        <w:t>S1=0</w:t>
+      </w:r>
+    </w:p>
+    <w:p>
+      <w:pPr>
+        <w:pStyle w:val="PreformattedText"/>
+        <w:spacing w:before="0" w:after="283"/>
+        <w:rPr/>
+      </w:pPr>
+      <w:r>
+        <w:rPr>
+          <w:rStyle w:val="SourceText"/>
+        </w:rPr>
+        <w:t>S0=1</w:t>
+      </w:r>
+    </w:p>
+    <w:p>
+      <w:pPr>
+        <w:sectPr>
+          <w:type w:val="continuous"/>
+          <w:pgSz w:w="11906" w:h="16838"/>
+          <w:pgMar w:left="1134" w:right="1134" w:gutter="0" w:header="0" w:top="1134" w:footer="0" w:bottom="1134"/>
+          <w:formProt w:val="false"/>
+          <w:textDirection w:val="lrTb"/>
+          <w:docGrid w:type="default" w:linePitch="100" w:charSpace="0"/>
+        </w:sectPr>
+      </w:pPr>
+    </w:p>
+    <w:p>
+      <w:pPr>
+        <w:pStyle w:val="BodyText"/>
+        <w:rPr/>
+      </w:pPr>
+      <w:r>
+        <w:rPr/>
+        <w:t>MUX chọn</w:t>
+      </w:r>
+    </w:p>
+    <w:p>
+      <w:pPr>
+        <w:sectPr>
+          <w:type w:val="continuous"/>
+          <w:pgSz w:w="11906" w:h="16838"/>
+          <w:pgMar w:left="1134" w:right="1134" w:gutter="0" w:header="0" w:top="1134" w:footer="0" w:bottom="1134"/>
+          <w:formProt w:val="false"/>
+          <w:textDirection w:val="lrTb"/>
+          <w:docGrid w:type="default" w:linePitch="100" w:charSpace="0"/>
+        </w:sectPr>
+      </w:pPr>
+    </w:p>
+    <w:p>
+      <w:pPr>
+        <w:pStyle w:val="PreformattedText"/>
+        <w:spacing w:before="0" w:after="283"/>
+        <w:ind w:hanging="0" w:start="0" w:end="0"/>
+        <w:rPr/>
+      </w:pPr>
+      <w:bookmarkStart w:id="36" w:name="code-block-viewer_Copy_7"/>
+      <w:bookmarkEnd w:id="36"/>
+      <w:r>
+        <w:rPr>
+          <w:rStyle w:val="SourceText"/>
+        </w:rPr>
+        <w:t>out = b = 0</w:t>
+      </w:r>
+    </w:p>
+    <w:p>
+      <w:pPr>
+        <w:sectPr>
+          <w:type w:val="continuous"/>
+          <w:pgSz w:w="11906" w:h="16838"/>
+          <w:pgMar w:left="1134" w:right="1134" w:gutter="0" w:header="0" w:top="1134" w:footer="0" w:bottom="1134"/>
+          <w:formProt w:val="false"/>
+          <w:textDirection w:val="lrTb"/>
+          <w:docGrid w:type="default" w:linePitch="100" w:charSpace="0"/>
+        </w:sectPr>
+      </w:pPr>
+    </w:p>
+    <w:p>
+      <w:pPr>
+        <w:pStyle w:val="BodyText"/>
+        <w:rPr/>
+      </w:pPr>
+      <w:r>
+        <w:rPr/>
+        <w:t>đợi 10 ns.</w:t>
+      </w:r>
+    </w:p>
+    <w:p>
+      <w:pPr>
+        <w:pStyle w:val="HorizontalLine"/>
+        <w:rPr/>
+      </w:pPr>
+      <w:r>
+        <w:rPr/>
+      </w:r>
+    </w:p>
+    <w:p>
+      <w:pPr>
+        <w:pStyle w:val="Heading3"/>
+        <w:rPr/>
+      </w:pPr>
+      <w:r>
+        <w:rPr/>
+        <w:t>Lần 3</w:t>
+      </w:r>
+    </w:p>
+    <w:p>
+      <w:pPr>
+        <w:sectPr>
+          <w:type w:val="continuous"/>
+          <w:pgSz w:w="11906" w:h="16838"/>
+          <w:pgMar w:left="1134" w:right="1134" w:gutter="0" w:header="0" w:top="1134" w:footer="0" w:bottom="1134"/>
+          <w:formProt w:val="false"/>
+          <w:textDirection w:val="lrTb"/>
+          <w:docGrid w:type="default" w:linePitch="100" w:charSpace="0"/>
+        </w:sectPr>
+      </w:pPr>
+    </w:p>
+    <w:p>
+      <w:pPr>
+        <w:pStyle w:val="PreformattedText"/>
+        <w:spacing w:before="0" w:after="283"/>
+        <w:ind w:hanging="0" w:start="0" w:end="0"/>
+        <w:rPr/>
+      </w:pPr>
+      <w:bookmarkStart w:id="37" w:name="code-block-viewer_Copy_8"/>
+      <w:bookmarkEnd w:id="37"/>
+      <w:r>
+        <w:rPr>
+          <w:rStyle w:val="SourceText"/>
+        </w:rPr>
+        <w:t>sel = 10</w:t>
+      </w:r>
+    </w:p>
+    <w:p>
+      <w:pPr>
+        <w:sectPr>
+          <w:type w:val="continuous"/>
+          <w:pgSz w:w="11906" w:h="16838"/>
+          <w:pgMar w:left="1134" w:right="1134" w:gutter="0" w:header="0" w:top="1134" w:footer="0" w:bottom="1134"/>
+          <w:formProt w:val="false"/>
+          <w:textDirection w:val="lrTb"/>
+          <w:docGrid w:type="default" w:linePitch="100" w:charSpace="0"/>
+        </w:sectPr>
+      </w:pPr>
+    </w:p>
+    <w:p>
+      <w:pPr>
+        <w:pStyle w:val="PreformattedText"/>
+        <w:ind w:hanging="0" w:start="0" w:end="0"/>
+        <w:rPr/>
+      </w:pPr>
+      <w:bookmarkStart w:id="38" w:name="code-block-viewer_Copy_9"/>
+      <w:bookmarkEnd w:id="38"/>
+      <w:r>
+        <w:rPr>
+          <w:rStyle w:val="SourceText"/>
+        </w:rPr>
+        <w:t>S1=1</w:t>
+      </w:r>
+    </w:p>
+    <w:p>
+      <w:pPr>
+        <w:pStyle w:val="PreformattedText"/>
+        <w:spacing w:before="0" w:after="283"/>
+        <w:rPr/>
+      </w:pPr>
+      <w:r>
+        <w:rPr>
+          <w:rStyle w:val="SourceText"/>
+        </w:rPr>
+        <w:t>S0=0</w:t>
+      </w:r>
+    </w:p>
+    <w:p>
+      <w:pPr>
+        <w:sectPr>
+          <w:type w:val="continuous"/>
+          <w:pgSz w:w="11906" w:h="16838"/>
+          <w:pgMar w:left="1134" w:right="1134" w:gutter="0" w:header="0" w:top="1134" w:footer="0" w:bottom="1134"/>
+          <w:formProt w:val="false"/>
+          <w:textDirection w:val="lrTb"/>
+          <w:docGrid w:type="default" w:linePitch="100" w:charSpace="0"/>
+        </w:sectPr>
+      </w:pPr>
+    </w:p>
+    <w:p>
+      <w:pPr>
+        <w:pStyle w:val="BodyText"/>
+        <w:rPr/>
+      </w:pPr>
+      <w:r>
+        <w:rPr/>
+        <w:t>MUX chọn</w:t>
+      </w:r>
+    </w:p>
+    <w:p>
+      <w:pPr>
+        <w:sectPr>
+          <w:type w:val="continuous"/>
+          <w:pgSz w:w="11906" w:h="16838"/>
+          <w:pgMar w:left="1134" w:right="1134" w:gutter="0" w:header="0" w:top="1134" w:footer="0" w:bottom="1134"/>
+          <w:formProt w:val="false"/>
+          <w:textDirection w:val="lrTb"/>
+          <w:docGrid w:type="default" w:linePitch="100" w:charSpace="0"/>
+        </w:sectPr>
+      </w:pPr>
+    </w:p>
+    <w:p>
+      <w:pPr>
+        <w:pStyle w:val="PreformattedText"/>
+        <w:spacing w:before="0" w:after="283"/>
+        <w:ind w:hanging="0" w:start="0" w:end="0"/>
+        <w:rPr/>
+      </w:pPr>
+      <w:bookmarkStart w:id="39" w:name="code-block-viewer_Copy_10"/>
+      <w:bookmarkEnd w:id="39"/>
+      <w:r>
+        <w:rPr>
+          <w:rStyle w:val="SourceText"/>
+        </w:rPr>
+        <w:t>out = c = 1</w:t>
+      </w:r>
+    </w:p>
+    <w:p>
+      <w:pPr>
+        <w:sectPr>
+          <w:type w:val="continuous"/>
+          <w:pgSz w:w="11906" w:h="16838"/>
+          <w:pgMar w:left="1134" w:right="1134" w:gutter="0" w:header="0" w:top="1134" w:footer="0" w:bottom="1134"/>
+          <w:formProt w:val="false"/>
+          <w:textDirection w:val="lrTb"/>
+          <w:docGrid w:type="default" w:linePitch="100" w:charSpace="0"/>
+        </w:sectPr>
+      </w:pPr>
+    </w:p>
+    <w:p>
+      <w:pPr>
+        <w:pStyle w:val="BodyText"/>
+        <w:rPr/>
+      </w:pPr>
+      <w:r>
+        <w:rPr/>
+        <w:t>đợi 10 ns.</w:t>
+      </w:r>
+    </w:p>
+    <w:p>
+      <w:pPr>
+        <w:pStyle w:val="HorizontalLine"/>
+        <w:rPr/>
+      </w:pPr>
+      <w:r>
+        <w:rPr/>
+      </w:r>
+    </w:p>
+    <w:p>
+      <w:pPr>
+        <w:pStyle w:val="Heading3"/>
+        <w:rPr/>
+      </w:pPr>
+      <w:r>
+        <w:rPr/>
+        <w:t>Lần 4</w:t>
+      </w:r>
+    </w:p>
+    <w:p>
+      <w:pPr>
+        <w:sectPr>
+          <w:type w:val="continuous"/>
+          <w:pgSz w:w="11906" w:h="16838"/>
+          <w:pgMar w:left="1134" w:right="1134" w:gutter="0" w:header="0" w:top="1134" w:footer="0" w:bottom="1134"/>
+          <w:formProt w:val="false"/>
+          <w:textDirection w:val="lrTb"/>
+          <w:docGrid w:type="default" w:linePitch="100" w:charSpace="0"/>
+        </w:sectPr>
+      </w:pPr>
+    </w:p>
+    <w:p>
+      <w:pPr>
+        <w:pStyle w:val="PreformattedText"/>
+        <w:spacing w:before="0" w:after="283"/>
+        <w:ind w:hanging="0" w:start="0" w:end="0"/>
+        <w:rPr/>
+      </w:pPr>
+      <w:bookmarkStart w:id="40" w:name="code-block-viewer_Copy_11"/>
+      <w:bookmarkEnd w:id="40"/>
+      <w:r>
+        <w:rPr>
+          <w:rStyle w:val="SourceText"/>
+        </w:rPr>
+        <w:t>sel = 11</w:t>
+      </w:r>
+    </w:p>
+    <w:p>
+      <w:pPr>
+        <w:sectPr>
+          <w:type w:val="continuous"/>
+          <w:pgSz w:w="11906" w:h="16838"/>
+          <w:pgMar w:left="1134" w:right="1134" w:gutter="0" w:header="0" w:top="1134" w:footer="0" w:bottom="1134"/>
+          <w:formProt w:val="false"/>
+          <w:textDirection w:val="lrTb"/>
+          <w:docGrid w:type="default" w:linePitch="100" w:charSpace="0"/>
+        </w:sectPr>
+      </w:pPr>
+    </w:p>
+    <w:p>
+      <w:pPr>
+        <w:pStyle w:val="PreformattedText"/>
+        <w:ind w:hanging="0" w:start="0" w:end="0"/>
+        <w:rPr/>
+      </w:pPr>
+      <w:bookmarkStart w:id="41" w:name="code-block-viewer_Copy_12"/>
+      <w:bookmarkEnd w:id="41"/>
+      <w:r>
+        <w:rPr>
+          <w:rStyle w:val="SourceText"/>
+        </w:rPr>
+        <w:t>S1=1</w:t>
+      </w:r>
+    </w:p>
+    <w:p>
+      <w:pPr>
+        <w:pStyle w:val="PreformattedText"/>
+        <w:spacing w:before="0" w:after="283"/>
+        <w:rPr/>
+      </w:pPr>
+      <w:r>
+        <w:rPr>
+          <w:rStyle w:val="SourceText"/>
+        </w:rPr>
+        <w:t>S0=1</w:t>
+      </w:r>
+    </w:p>
+    <w:p>
+      <w:pPr>
+        <w:sectPr>
+          <w:type w:val="continuous"/>
+          <w:pgSz w:w="11906" w:h="16838"/>
+          <w:pgMar w:left="1134" w:right="1134" w:gutter="0" w:header="0" w:top="1134" w:footer="0" w:bottom="1134"/>
+          <w:formProt w:val="false"/>
+          <w:textDirection w:val="lrTb"/>
+          <w:docGrid w:type="default" w:linePitch="100" w:charSpace="0"/>
+        </w:sectPr>
+      </w:pPr>
+    </w:p>
+    <w:p>
+      <w:pPr>
+        <w:pStyle w:val="BodyText"/>
+        <w:rPr/>
+      </w:pPr>
+      <w:r>
+        <w:rPr/>
+        <w:t>MUX chọn</w:t>
+      </w:r>
+    </w:p>
+    <w:p>
+      <w:pPr>
+        <w:sectPr>
+          <w:type w:val="continuous"/>
+          <w:pgSz w:w="11906" w:h="16838"/>
+          <w:pgMar w:left="1134" w:right="1134" w:gutter="0" w:header="0" w:top="1134" w:footer="0" w:bottom="1134"/>
+          <w:formProt w:val="false"/>
+          <w:textDirection w:val="lrTb"/>
+          <w:docGrid w:type="default" w:linePitch="100" w:charSpace="0"/>
+        </w:sectPr>
+      </w:pPr>
+    </w:p>
+    <w:p>
+      <w:pPr>
+        <w:pStyle w:val="PreformattedText"/>
+        <w:spacing w:before="0" w:after="283"/>
+        <w:ind w:hanging="0" w:start="0" w:end="0"/>
+        <w:rPr/>
+      </w:pPr>
+      <w:bookmarkStart w:id="42" w:name="code-block-viewer_Copy_13"/>
+      <w:bookmarkEnd w:id="42"/>
+      <w:r>
+        <w:rPr>
+          <w:rStyle w:val="SourceText"/>
+        </w:rPr>
+        <w:t>out = d = 1</w:t>
+      </w:r>
+    </w:p>
+    <w:p>
+      <w:pPr>
+        <w:sectPr>
+          <w:type w:val="continuous"/>
+          <w:pgSz w:w="11906" w:h="16838"/>
+          <w:pgMar w:left="1134" w:right="1134" w:gutter="0" w:header="0" w:top="1134" w:footer="0" w:bottom="1134"/>
+          <w:formProt w:val="false"/>
+          <w:textDirection w:val="lrTb"/>
+          <w:docGrid w:type="default" w:linePitch="100" w:charSpace="0"/>
+        </w:sectPr>
+      </w:pPr>
+    </w:p>
+    <w:p>
+      <w:pPr>
+        <w:pStyle w:val="BodyText"/>
+        <w:rPr/>
+      </w:pPr>
+      <w:r>
+        <w:rPr/>
+        <w:t>đợi 10 ns.</w:t>
+      </w:r>
+    </w:p>
+    <w:p>
+      <w:pPr>
+        <w:pStyle w:val="HorizontalLine"/>
+        <w:rPr/>
+      </w:pPr>
+      <w:r>
+        <w:rPr/>
+      </w:r>
+    </w:p>
+    <w:p>
+      <w:pPr>
+        <w:pStyle w:val="Heading3"/>
+        <w:rPr/>
+      </w:pPr>
+      <w:r>
+        <w:rPr/>
+        <w:t>Khi xem waveform sẽ thấy</w:t>
+      </w:r>
+    </w:p>
+    <w:p>
+      <w:pPr>
+        <w:sectPr>
+          <w:type w:val="continuous"/>
+          <w:pgSz w:w="11906" w:h="16838"/>
+          <w:pgMar w:left="1134" w:right="1134" w:gutter="0" w:header="0" w:top="1134" w:footer="0" w:bottom="1134"/>
+          <w:formProt w:val="false"/>
+          <w:textDirection w:val="lrTb"/>
+          <w:docGrid w:type="default" w:linePitch="100" w:charSpace="0"/>
+        </w:sectPr>
+      </w:pPr>
+    </w:p>
+    <w:p>
+      <w:pPr>
+        <w:pStyle w:val="PreformattedText"/>
+        <w:ind w:hanging="0" w:start="0" w:end="0"/>
+        <w:rPr/>
+      </w:pPr>
+      <w:bookmarkStart w:id="43" w:name="code-block-viewer_Copy_14"/>
+      <w:bookmarkEnd w:id="43"/>
+      <w:r>
+        <w:rPr>
+          <w:rStyle w:val="SourceText"/>
+        </w:rPr>
+        <w:t>Time(ns)</w:t>
+      </w:r>
+    </w:p>
+    <w:p>
+      <w:pPr>
+        <w:pStyle w:val="PreformattedText"/>
+        <w:rPr/>
+      </w:pPr>
+      <w:r>
+        <w:rPr>
+          <w:rStyle w:val="SourceText"/>
+        </w:rPr>
+        <w:t>0      10      20      30      40</w:t>
+      </w:r>
+    </w:p>
+    <w:p>
+      <w:pPr>
+        <w:pStyle w:val="PreformattedText"/>
+        <w:rPr/>
+      </w:pPr>
+      <w:r>
+        <w:rPr>
+          <w:rStyle w:val="SourceText"/>
+        </w:rPr>
+        <w:t>|-------|-------|-------|-------|</w:t>
+      </w:r>
+    </w:p>
+    <w:p>
+      <w:pPr>
+        <w:pStyle w:val="PreformattedText"/>
+        <w:rPr/>
+      </w:pPr>
+      <w:r>
+        <w:rPr>
+          <w:rStyle w:val="SourceText"/>
+        </w:rPr>
+        <w:t>sel</w:t>
+      </w:r>
+    </w:p>
+    <w:p>
+      <w:pPr>
+        <w:pStyle w:val="PreformattedText"/>
+        <w:rPr/>
+      </w:pPr>
+      <w:r>
+        <w:rPr>
+          <w:rStyle w:val="SourceText"/>
+        </w:rPr>
+        <w:t>00------01------10------11------</w:t>
+      </w:r>
+    </w:p>
+    <w:p>
+      <w:pPr>
+        <w:pStyle w:val="PreformattedText"/>
+        <w:rPr/>
+      </w:pPr>
+      <w:r>
+        <w:rPr>
+          <w:rStyle w:val="SourceText"/>
+        </w:rPr>
+        <w:t>out</w:t>
+      </w:r>
+    </w:p>
+    <w:p>
+      <w:pPr>
+        <w:pStyle w:val="PreformattedText"/>
+        <w:spacing w:before="0" w:after="283"/>
+        <w:rPr/>
+      </w:pPr>
+      <w:r>
+        <w:rPr>
+          <w:rStyle w:val="SourceText"/>
+        </w:rPr>
+        <w:t>0-------0-------1-------1-------</w:t>
+      </w:r>
+    </w:p>
+    <w:p>
+      <w:pPr>
+        <w:sectPr>
+          <w:type w:val="continuous"/>
+          <w:pgSz w:w="11906" w:h="16838"/>
+          <w:pgMar w:left="1134" w:right="1134" w:gutter="0" w:header="0" w:top="1134" w:footer="0" w:bottom="1134"/>
+          <w:formProt w:val="false"/>
+          <w:textDirection w:val="lrTb"/>
+          <w:docGrid w:type="default" w:linePitch="100" w:charSpace="0"/>
+        </w:sectPr>
+      </w:pPr>
+    </w:p>
+    <w:p>
+      <w:pPr>
+        <w:pStyle w:val="BodyText"/>
+        <w:rPr/>
+      </w:pPr>
+      <w:r>
+        <w:rPr/>
+        <w:t xml:space="preserve">Đây chính là cách test chuẩn: </w:t>
+      </w:r>
+      <w:r>
+        <w:rPr>
+          <w:rStyle w:val="Strong"/>
+        </w:rPr>
+        <w:t xml:space="preserve">giữ các input cố định, rồi lần lượt thay đổi </w:t>
+      </w:r>
+      <w:r>
+        <w:rPr>
+          <w:rStyle w:val="SourceText"/>
+        </w:rPr>
+        <w:t>sel</w:t>
+      </w:r>
+      <w:r>
+        <w:rPr>
+          <w:rStyle w:val="Strong"/>
+        </w:rPr>
+        <w:t xml:space="preserve"> để kiểm tra MUX có chọn đúng A, B, C, D hay không.</w:t>
       </w:r>
     </w:p>
     <w:p>

</xml_diff>

<commit_message>
encoder 8->3 ly thuyet
</commit_message>
<xml_diff>
--- a/Doc/OnTap/3_Verilog Mạch tổ hợp (Combinational Circuit).docx
+++ b/Doc/OnTap/3_Verilog Mạch tổ hợp (Combinational Circuit).docx
@@ -2,6 +2,755 @@
 <file path=word/document.xml><?xml version="1.0" encoding="utf-8"?>
 <w:document xmlns:o="urn:schemas-microsoft-com:office:office" xmlns:r="http://schemas.openxmlformats.org/officeDocument/2006/relationships" xmlns:v="urn:schemas-microsoft-com:vml" xmlns:w="http://schemas.openxmlformats.org/wordprocessingml/2006/main" xmlns:w10="urn:schemas-microsoft-com:office:word" xmlns:wp="http://schemas.openxmlformats.org/drawingml/2006/wordprocessingDrawing" xmlns:wps="http://schemas.microsoft.com/office/word/2010/wordprocessingShape" xmlns:wpg="http://schemas.microsoft.com/office/word/2010/wordprocessingGroup" xmlns:mc="http://schemas.openxmlformats.org/markup-compatibility/2006" xmlns:wp14="http://schemas.microsoft.com/office/word/2010/wordprocessingDrawing" xmlns:w14="http://schemas.microsoft.com/office/word/2010/wordml" xmlns:w15="http://schemas.microsoft.com/office/word/2012/wordml" mc:Ignorable="w14 wp14 w15">
   <w:body>
+    <w:sdt>
+      <w:sdtPr>
+        <w:docPartObj>
+          <w:docPartGallery w:val="Table of Contents"/>
+          <w:docPartUnique w:val="true"/>
+        </w:docPartObj>
+      </w:sdtPr>
+      <w:sdtContent>
+        <w:p>
+          <w:pPr>
+            <w:pStyle w:val="TOCHeading"/>
+            <w:suppressLineNumbers/>
+            <w:spacing w:before="240" w:after="120"/>
+            <w:ind w:hanging="0" w:start="0"/>
+            <w:rPr>
+              <w:b/>
+              <w:bCs/>
+              <w:sz w:val="32"/>
+              <w:szCs w:val="32"/>
+            </w:rPr>
+          </w:pPr>
+          <w:r>
+            <w:rPr>
+              <w:b/>
+              <w:bCs/>
+              <w:sz w:val="32"/>
+              <w:szCs w:val="32"/>
+            </w:rPr>
+            <w:t>Table of Contents</w:t>
+          </w:r>
+        </w:p>
+        <w:p>
+          <w:pPr>
+            <w:pStyle w:val="TOC1"/>
+            <w:tabs>
+              <w:tab w:val="clear" w:pos="9638"/>
+              <w:tab w:val="right" w:pos="9637" w:leader="dot"/>
+            </w:tabs>
+            <w:rPr/>
+          </w:pPr>
+          <w:r>
+            <w:fldChar w:fldCharType="begin"/>
+          </w:r>
+          <w:r>
+            <w:rPr>
+              <w:rStyle w:val="IndexLink"/>
+            </w:rPr>
+            <w:instrText xml:space="preserve"> TOC \f \o "1-9" \h</w:instrText>
+          </w:r>
+          <w:r>
+            <w:rPr>
+              <w:rStyle w:val="IndexLink"/>
+            </w:rPr>
+            <w:fldChar w:fldCharType="separate"/>
+          </w:r>
+          <w:hyperlink w:anchor="__RefHeading___Toc1333_1846826748">
+            <w:r>
+              <w:rPr>
+                <w:rStyle w:val="IndexLink"/>
+              </w:rPr>
+              <w:t>1) 1. AND module</w:t>
+              <w:tab/>
+              <w:t>1</w:t>
+            </w:r>
+          </w:hyperlink>
+        </w:p>
+        <w:p>
+          <w:pPr>
+            <w:pStyle w:val="TOC1"/>
+            <w:tabs>
+              <w:tab w:val="clear" w:pos="9638"/>
+              <w:tab w:val="right" w:pos="9637" w:leader="dot"/>
+            </w:tabs>
+            <w:rPr/>
+          </w:pPr>
+          <w:hyperlink w:anchor="__RefHeading___Toc1335_1846826748">
+            <w:r>
+              <w:rPr>
+                <w:rStyle w:val="IndexLink"/>
+              </w:rPr>
+              <w:t>2) 2. OR module</w:t>
+              <w:tab/>
+              <w:t>1</w:t>
+            </w:r>
+          </w:hyperlink>
+        </w:p>
+        <w:p>
+          <w:pPr>
+            <w:pStyle w:val="TOC1"/>
+            <w:tabs>
+              <w:tab w:val="clear" w:pos="9638"/>
+              <w:tab w:val="right" w:pos="9637" w:leader="dot"/>
+            </w:tabs>
+            <w:rPr/>
+          </w:pPr>
+          <w:hyperlink w:anchor="__RefHeading___Toc1337_1846826748">
+            <w:r>
+              <w:rPr>
+                <w:rStyle w:val="IndexLink"/>
+              </w:rPr>
+              <w:t>3)  NOT module</w:t>
+              <w:tab/>
+              <w:t>1</w:t>
+            </w:r>
+          </w:hyperlink>
+        </w:p>
+        <w:p>
+          <w:pPr>
+            <w:pStyle w:val="TOC1"/>
+            <w:tabs>
+              <w:tab w:val="clear" w:pos="9638"/>
+              <w:tab w:val="right" w:pos="9637" w:leader="dot"/>
+            </w:tabs>
+            <w:rPr/>
+          </w:pPr>
+          <w:hyperlink w:anchor="__RefHeading___Toc1339_1846826748">
+            <w:r>
+              <w:rPr>
+                <w:rStyle w:val="IndexLink"/>
+              </w:rPr>
+              <w:t>4) Mạch logic bất kỳ (vd: y = (a&amp;b)|(~c))</w:t>
+              <w:tab/>
+              <w:t>2</w:t>
+            </w:r>
+          </w:hyperlink>
+        </w:p>
+        <w:p>
+          <w:pPr>
+            <w:pStyle w:val="TOC1"/>
+            <w:tabs>
+              <w:tab w:val="clear" w:pos="9638"/>
+              <w:tab w:val="right" w:pos="9637" w:leader="dot"/>
+            </w:tabs>
+            <w:rPr/>
+          </w:pPr>
+          <w:hyperlink w:anchor="__RefHeading___Toc1341_1846826748">
+            <w:r>
+              <w:rPr>
+                <w:rStyle w:val="IndexLink"/>
+              </w:rPr>
+              <w:t>5) Half Adder</w:t>
+              <w:tab/>
+              <w:t>2</w:t>
+            </w:r>
+          </w:hyperlink>
+        </w:p>
+        <w:p>
+          <w:pPr>
+            <w:pStyle w:val="TOC2"/>
+            <w:tabs>
+              <w:tab w:val="clear" w:pos="9355"/>
+              <w:tab w:val="right" w:pos="9637" w:leader="dot"/>
+            </w:tabs>
+            <w:rPr/>
+          </w:pPr>
+          <w:hyperlink w:anchor="__RefHeading___Toc1343_1846826748">
+            <w:r>
+              <w:rPr>
+                <w:rStyle w:val="IndexLink"/>
+              </w:rPr>
+              <w:t>1. Tại sao gọi là "Half" (nửa)?</w:t>
+              <w:tab/>
+              <w:t>3</w:t>
+            </w:r>
+          </w:hyperlink>
+        </w:p>
+        <w:p>
+          <w:pPr>
+            <w:pStyle w:val="TOC1"/>
+            <w:tabs>
+              <w:tab w:val="clear" w:pos="9638"/>
+              <w:tab w:val="right" w:pos="9637" w:leader="dot"/>
+            </w:tabs>
+            <w:rPr/>
+          </w:pPr>
+          <w:hyperlink w:anchor="__RefHeading___Toc1345_1846826748">
+            <w:r>
+              <w:rPr>
+                <w:rStyle w:val="IndexLink"/>
+              </w:rPr>
+              <w:t>6) Full Adder</w:t>
+              <w:tab/>
+              <w:t>3</w:t>
+            </w:r>
+          </w:hyperlink>
+        </w:p>
+        <w:p>
+          <w:pPr>
+            <w:pStyle w:val="TOC2"/>
+            <w:tabs>
+              <w:tab w:val="clear" w:pos="9355"/>
+              <w:tab w:val="right" w:pos="9637" w:leader="dot"/>
+            </w:tabs>
+            <w:rPr/>
+          </w:pPr>
+          <w:hyperlink w:anchor="__RefHeading___Toc1347_1846826748">
+            <w:r>
+              <w:rPr>
+                <w:rStyle w:val="IndexLink"/>
+              </w:rPr>
+              <w:t>1. Tại sao cần Full Adder?</w:t>
+              <w:tab/>
+              <w:t>3</w:t>
+            </w:r>
+          </w:hyperlink>
+        </w:p>
+        <w:p>
+          <w:pPr>
+            <w:pStyle w:val="TOC2"/>
+            <w:tabs>
+              <w:tab w:val="clear" w:pos="9355"/>
+              <w:tab w:val="right" w:pos="9637" w:leader="dot"/>
+            </w:tabs>
+            <w:rPr/>
+          </w:pPr>
+          <w:hyperlink w:anchor="__RefHeading___Toc1349_1846826748">
+            <w:r>
+              <w:rPr>
+                <w:rStyle w:val="IndexLink"/>
+              </w:rPr>
+              <w:t>2. Công thức Boolean</w:t>
+              <w:tab/>
+              <w:t>5</w:t>
+            </w:r>
+          </w:hyperlink>
+        </w:p>
+        <w:p>
+          <w:pPr>
+            <w:pStyle w:val="TOC2"/>
+            <w:tabs>
+              <w:tab w:val="clear" w:pos="9355"/>
+              <w:tab w:val="right" w:pos="9637" w:leader="dot"/>
+            </w:tabs>
+            <w:rPr/>
+          </w:pPr>
+          <w:hyperlink w:anchor="__RefHeading___Toc1351_1846826748">
+            <w:r>
+              <w:rPr>
+                <w:rStyle w:val="IndexLink"/>
+              </w:rPr>
+              <w:t>3. Sum</w:t>
+              <w:tab/>
+              <w:t>5</w:t>
+            </w:r>
+          </w:hyperlink>
+        </w:p>
+        <w:p>
+          <w:pPr>
+            <w:pStyle w:val="TOC2"/>
+            <w:tabs>
+              <w:tab w:val="clear" w:pos="9355"/>
+              <w:tab w:val="right" w:pos="9637" w:leader="dot"/>
+            </w:tabs>
+            <w:rPr/>
+          </w:pPr>
+          <w:hyperlink w:anchor="__RefHeading___Toc1353_1846826748">
+            <w:r>
+              <w:rPr>
+                <w:rStyle w:val="IndexLink"/>
+              </w:rPr>
+              <w:t>4. Carry Out</w:t>
+              <w:tab/>
+              <w:t>5</w:t>
+            </w:r>
+          </w:hyperlink>
+        </w:p>
+        <w:p>
+          <w:pPr>
+            <w:pStyle w:val="TOC2"/>
+            <w:tabs>
+              <w:tab w:val="clear" w:pos="9355"/>
+              <w:tab w:val="right" w:pos="9637" w:leader="dot"/>
+            </w:tabs>
+            <w:rPr/>
+          </w:pPr>
+          <w:hyperlink w:anchor="__RefHeading___Toc1355_1846826748">
+            <w:r>
+              <w:rPr>
+                <w:rStyle w:val="IndexLink"/>
+              </w:rPr>
+              <w:t>5.  Mạch logic cách 2 : Ghép từ 2 Half Adder (đây là cách sách giáo trình hay dùng)</w:t>
+              <w:tab/>
+              <w:t>7</w:t>
+            </w:r>
+          </w:hyperlink>
+        </w:p>
+        <w:p>
+          <w:pPr>
+            <w:pStyle w:val="TOC2"/>
+            <w:tabs>
+              <w:tab w:val="clear" w:pos="9355"/>
+              <w:tab w:val="right" w:pos="9637" w:leader="dot"/>
+            </w:tabs>
+            <w:rPr/>
+          </w:pPr>
+          <w:hyperlink w:anchor="__RefHeading___Toc1357_1846826748">
+            <w:r>
+              <w:rPr>
+                <w:rStyle w:val="IndexLink"/>
+              </w:rPr>
+              <w:t>6. Thử kiểm tra</w:t>
+              <w:tab/>
+              <w:t>8</w:t>
+            </w:r>
+          </w:hyperlink>
+        </w:p>
+        <w:p>
+          <w:pPr>
+            <w:pStyle w:val="TOC1"/>
+            <w:tabs>
+              <w:tab w:val="clear" w:pos="9638"/>
+              <w:tab w:val="right" w:pos="9637" w:leader="dot"/>
+            </w:tabs>
+            <w:rPr/>
+          </w:pPr>
+          <w:hyperlink w:anchor="__RefHeading___Toc1359_1846826748">
+            <w:r>
+              <w:rPr>
+                <w:rStyle w:val="IndexLink"/>
+              </w:rPr>
+              <w:t>7) Multiplexer (MUX)</w:t>
+              <w:tab/>
+              <w:t>9</w:t>
+            </w:r>
+          </w:hyperlink>
+        </w:p>
+        <w:p>
+          <w:pPr>
+            <w:pStyle w:val="TOC2"/>
+            <w:tabs>
+              <w:tab w:val="clear" w:pos="9355"/>
+              <w:tab w:val="right" w:pos="9637" w:leader="dot"/>
+            </w:tabs>
+            <w:rPr/>
+          </w:pPr>
+          <w:hyperlink w:anchor="__RefHeading___Toc1361_1846826748">
+            <w:r>
+              <w:rPr>
+                <w:rStyle w:val="IndexLink"/>
+              </w:rPr>
+              <w:t>1. Mạch mutiplexer 2:1 - MUX2</w:t>
+              <w:tab/>
+              <w:t>9</w:t>
+            </w:r>
+          </w:hyperlink>
+        </w:p>
+        <w:p>
+          <w:pPr>
+            <w:pStyle w:val="TOC2"/>
+            <w:tabs>
+              <w:tab w:val="clear" w:pos="9355"/>
+              <w:tab w:val="right" w:pos="9637" w:leader="dot"/>
+            </w:tabs>
+            <w:rPr/>
+          </w:pPr>
+          <w:hyperlink w:anchor="__RefHeading___Toc1363_1846826748">
+            <w:r>
+              <w:rPr>
+                <w:rStyle w:val="IndexLink"/>
+              </w:rPr>
+              <w:t>2. Tại sao TCAM cần MUX?</w:t>
+              <w:tab/>
+              <w:t>10</w:t>
+            </w:r>
+          </w:hyperlink>
+        </w:p>
+        <w:p>
+          <w:pPr>
+            <w:pStyle w:val="TOC2"/>
+            <w:tabs>
+              <w:tab w:val="clear" w:pos="9355"/>
+              <w:tab w:val="right" w:pos="9637" w:leader="dot"/>
+            </w:tabs>
+            <w:rPr/>
+          </w:pPr>
+          <w:hyperlink w:anchor="__RefHeading___Toc1365_1846826748">
+            <w:r>
+              <w:rPr>
+                <w:rStyle w:val="IndexLink"/>
+              </w:rPr>
+              <w:t>3.  Chọn dữ liệu sau Comparator ⭐⭐⭐⭐</w:t>
+              <w:tab/>
+              <w:t>11</w:t>
+            </w:r>
+          </w:hyperlink>
+        </w:p>
+        <w:p>
+          <w:pPr>
+            <w:pStyle w:val="TOC2"/>
+            <w:tabs>
+              <w:tab w:val="clear" w:pos="9355"/>
+              <w:tab w:val="right" w:pos="9637" w:leader="dot"/>
+            </w:tabs>
+            <w:rPr/>
+          </w:pPr>
+          <w:hyperlink w:anchor="__RefHeading___Toc1367_1846826748">
+            <w:r>
+              <w:rPr>
+                <w:rStyle w:val="IndexLink"/>
+              </w:rPr>
+              <w:t>4.  Chọn đường dữ liệu</w:t>
+              <w:tab/>
+              <w:t>11</w:t>
+            </w:r>
+          </w:hyperlink>
+        </w:p>
+        <w:p>
+          <w:pPr>
+            <w:pStyle w:val="TOC2"/>
+            <w:tabs>
+              <w:tab w:val="clear" w:pos="9355"/>
+              <w:tab w:val="right" w:pos="9637" w:leader="dot"/>
+            </w:tabs>
+            <w:rPr/>
+          </w:pPr>
+          <w:hyperlink w:anchor="__RefHeading___Toc1369_1846826748">
+            <w:r>
+              <w:rPr>
+                <w:rStyle w:val="IndexLink"/>
+              </w:rPr>
+              <w:t>5. Mutiplexer 4:1-MUX4</w:t>
+              <w:tab/>
+              <w:t>11</w:t>
+            </w:r>
+          </w:hyperlink>
+        </w:p>
+        <w:p>
+          <w:pPr>
+            <w:pStyle w:val="TOC3"/>
+            <w:tabs>
+              <w:tab w:val="clear" w:pos="9071"/>
+              <w:tab w:val="right" w:pos="9637" w:leader="dot"/>
+            </w:tabs>
+            <w:rPr/>
+          </w:pPr>
+          <w:hyperlink w:anchor="__RefHeading___Toc1371_1846826748">
+            <w:r>
+              <w:rPr>
+                <w:rStyle w:val="IndexLink"/>
+              </w:rPr>
+              <w:t>MUX2 thứ nhất</w:t>
+              <w:tab/>
+              <w:t>12</w:t>
+            </w:r>
+          </w:hyperlink>
+        </w:p>
+        <w:p>
+          <w:pPr>
+            <w:pStyle w:val="TOC3"/>
+            <w:tabs>
+              <w:tab w:val="clear" w:pos="9071"/>
+              <w:tab w:val="right" w:pos="9637" w:leader="dot"/>
+            </w:tabs>
+            <w:rPr/>
+          </w:pPr>
+          <w:hyperlink w:anchor="__RefHeading___Toc1373_1846826748">
+            <w:r>
+              <w:rPr>
+                <w:rStyle w:val="IndexLink"/>
+              </w:rPr>
+              <w:t>MUX2 thứ hai</w:t>
+              <w:tab/>
+              <w:t>12</w:t>
+            </w:r>
+          </w:hyperlink>
+        </w:p>
+        <w:p>
+          <w:pPr>
+            <w:pStyle w:val="TOC3"/>
+            <w:tabs>
+              <w:tab w:val="clear" w:pos="9071"/>
+              <w:tab w:val="right" w:pos="9637" w:leader="dot"/>
+            </w:tabs>
+            <w:rPr/>
+          </w:pPr>
+          <w:hyperlink w:anchor="__RefHeading___Toc1375_1846826748">
+            <w:r>
+              <w:rPr>
+                <w:rStyle w:val="IndexLink"/>
+              </w:rPr>
+              <w:t>MUX2 thứ ba</w:t>
+              <w:tab/>
+              <w:t>12</w:t>
+            </w:r>
+          </w:hyperlink>
+        </w:p>
+        <w:p>
+          <w:pPr>
+            <w:pStyle w:val="TOC2"/>
+            <w:tabs>
+              <w:tab w:val="clear" w:pos="9355"/>
+              <w:tab w:val="right" w:pos="9637" w:leader="dot"/>
+            </w:tabs>
+            <w:rPr/>
+          </w:pPr>
+          <w:hyperlink w:anchor="__RefHeading___Toc1377_1846826748">
+            <w:r>
+              <w:rPr>
+                <w:rStyle w:val="IndexLink"/>
+              </w:rPr>
+              <w:t>6. Đoạn này hoạt động thế nào?</w:t>
+              <w:tab/>
+              <w:t>12</w:t>
+            </w:r>
+          </w:hyperlink>
+        </w:p>
+        <w:p>
+          <w:pPr>
+            <w:pStyle w:val="TOC3"/>
+            <w:tabs>
+              <w:tab w:val="clear" w:pos="9071"/>
+              <w:tab w:val="right" w:pos="9637" w:leader="dot"/>
+            </w:tabs>
+            <w:rPr/>
+          </w:pPr>
+          <w:hyperlink w:anchor="__RefHeading___Toc1379_1846826748">
+            <w:r>
+              <w:rPr>
+                <w:rStyle w:val="IndexLink"/>
+              </w:rPr>
+              <w:t>Lần 1</w:t>
+              <w:tab/>
+              <w:t>13</w:t>
+            </w:r>
+          </w:hyperlink>
+        </w:p>
+        <w:p>
+          <w:pPr>
+            <w:pStyle w:val="TOC3"/>
+            <w:tabs>
+              <w:tab w:val="clear" w:pos="9071"/>
+              <w:tab w:val="right" w:pos="9637" w:leader="dot"/>
+            </w:tabs>
+            <w:rPr/>
+          </w:pPr>
+          <w:hyperlink w:anchor="__RefHeading___Toc1381_1846826748">
+            <w:r>
+              <w:rPr>
+                <w:rStyle w:val="IndexLink"/>
+              </w:rPr>
+              <w:t>Lần 2</w:t>
+              <w:tab/>
+              <w:t>13</w:t>
+            </w:r>
+          </w:hyperlink>
+        </w:p>
+        <w:p>
+          <w:pPr>
+            <w:pStyle w:val="TOC3"/>
+            <w:tabs>
+              <w:tab w:val="clear" w:pos="9071"/>
+              <w:tab w:val="right" w:pos="9637" w:leader="dot"/>
+            </w:tabs>
+            <w:rPr/>
+          </w:pPr>
+          <w:hyperlink w:anchor="__RefHeading___Toc1383_1846826748">
+            <w:r>
+              <w:rPr>
+                <w:rStyle w:val="IndexLink"/>
+              </w:rPr>
+              <w:t>Lần 3</w:t>
+              <w:tab/>
+              <w:t>13</w:t>
+            </w:r>
+          </w:hyperlink>
+        </w:p>
+        <w:p>
+          <w:pPr>
+            <w:pStyle w:val="TOC3"/>
+            <w:tabs>
+              <w:tab w:val="clear" w:pos="9071"/>
+              <w:tab w:val="right" w:pos="9637" w:leader="dot"/>
+            </w:tabs>
+            <w:rPr/>
+          </w:pPr>
+          <w:hyperlink w:anchor="__RefHeading___Toc1385_1846826748">
+            <w:r>
+              <w:rPr>
+                <w:rStyle w:val="IndexLink"/>
+              </w:rPr>
+              <w:t>Lần 4</w:t>
+              <w:tab/>
+              <w:t>14</w:t>
+            </w:r>
+          </w:hyperlink>
+        </w:p>
+        <w:p>
+          <w:pPr>
+            <w:pStyle w:val="TOC3"/>
+            <w:tabs>
+              <w:tab w:val="clear" w:pos="9071"/>
+              <w:tab w:val="right" w:pos="9637" w:leader="dot"/>
+            </w:tabs>
+            <w:rPr/>
+          </w:pPr>
+          <w:hyperlink w:anchor="__RefHeading___Toc1387_1846826748">
+            <w:r>
+              <w:rPr>
+                <w:rStyle w:val="IndexLink"/>
+              </w:rPr>
+              <w:t>Khi xem waveform sẽ thấy</w:t>
+              <w:tab/>
+              <w:t>14</w:t>
+            </w:r>
+          </w:hyperlink>
+        </w:p>
+        <w:p>
+          <w:pPr>
+            <w:pStyle w:val="TOC1"/>
+            <w:tabs>
+              <w:tab w:val="clear" w:pos="9638"/>
+              <w:tab w:val="right" w:pos="9637" w:leader="dot"/>
+            </w:tabs>
+            <w:rPr/>
+          </w:pPr>
+          <w:hyperlink w:anchor="__RefHeading___Toc1389_1846826748">
+            <w:r>
+              <w:rPr>
+                <w:rStyle w:val="IndexLink"/>
+              </w:rPr>
+              <w:t>8) Decoder</w:t>
+              <w:tab/>
+              <w:t>14</w:t>
+            </w:r>
+          </w:hyperlink>
+        </w:p>
+        <w:p>
+          <w:pPr>
+            <w:pStyle w:val="TOC2"/>
+            <w:tabs>
+              <w:tab w:val="clear" w:pos="9355"/>
+              <w:tab w:val="right" w:pos="9637" w:leader="dot"/>
+            </w:tabs>
+            <w:rPr/>
+          </w:pPr>
+          <w:hyperlink w:anchor="__RefHeading___Toc1391_1846826748">
+            <w:r>
+              <w:rPr>
+                <w:rStyle w:val="IndexLink"/>
+              </w:rPr>
+              <w:t>1. Viết bằng assign</w:t>
+              <w:tab/>
+              <w:t>15</w:t>
+            </w:r>
+          </w:hyperlink>
+        </w:p>
+        <w:p>
+          <w:pPr>
+            <w:pStyle w:val="TOC2"/>
+            <w:tabs>
+              <w:tab w:val="clear" w:pos="9355"/>
+              <w:tab w:val="right" w:pos="9637" w:leader="dot"/>
+            </w:tabs>
+            <w:rPr/>
+          </w:pPr>
+          <w:hyperlink w:anchor="__RefHeading___Toc1393_1846826748">
+            <w:r>
+              <w:rPr>
+                <w:rStyle w:val="IndexLink"/>
+              </w:rPr>
+              <w:t>2. Viết bằng always</w:t>
+              <w:tab/>
+              <w:t>15</w:t>
+            </w:r>
+          </w:hyperlink>
+        </w:p>
+        <w:p>
+          <w:pPr>
+            <w:pStyle w:val="TOC2"/>
+            <w:tabs>
+              <w:tab w:val="clear" w:pos="9355"/>
+              <w:tab w:val="right" w:pos="9637" w:leader="dot"/>
+            </w:tabs>
+            <w:rPr/>
+          </w:pPr>
+          <w:hyperlink w:anchor="__RefHeading___Toc1395_1846826748">
+            <w:r>
+              <w:rPr>
+                <w:rStyle w:val="IndexLink"/>
+              </w:rPr>
+              <w:t>3. Decoder có Enable</w:t>
+              <w:tab/>
+              <w:t>15</w:t>
+            </w:r>
+          </w:hyperlink>
+        </w:p>
+        <w:p>
+          <w:pPr>
+            <w:pStyle w:val="TOC1"/>
+            <w:tabs>
+              <w:tab w:val="clear" w:pos="9638"/>
+              <w:tab w:val="right" w:pos="9637" w:leader="dot"/>
+            </w:tabs>
+            <w:rPr/>
+          </w:pPr>
+          <w:hyperlink w:anchor="__RefHeading___Toc1397_1846826748">
+            <w:r>
+              <w:rPr>
+                <w:rStyle w:val="IndexLink"/>
+              </w:rPr>
+              <w:t>9) Encoder</w:t>
+              <w:tab/>
+              <w:t>16</w:t>
+            </w:r>
+          </w:hyperlink>
+        </w:p>
+        <w:p>
+          <w:pPr>
+            <w:pStyle w:val="TOC1"/>
+            <w:tabs>
+              <w:tab w:val="clear" w:pos="9638"/>
+              <w:tab w:val="right" w:pos="9637" w:leader="dot"/>
+            </w:tabs>
+            <w:rPr/>
+          </w:pPr>
+          <w:hyperlink w:anchor="__RefHeading___Toc1399_1846826748">
+            <w:r>
+              <w:rPr>
+                <w:rStyle w:val="IndexLink"/>
+              </w:rPr>
+              <w:t>10) Comparator</w:t>
+              <w:tab/>
+              <w:t>17</w:t>
+            </w:r>
+          </w:hyperlink>
+          <w:r>
+            <w:rPr>
+              <w:rStyle w:val="IndexLink"/>
+            </w:rPr>
+            <w:fldChar w:fldCharType="end"/>
+          </w:r>
+        </w:p>
+      </w:sdtContent>
+    </w:sdt>
+    <w:p>
+      <w:pPr>
+        <w:pStyle w:val="Heading1"/>
+        <w:numPr>
+          <w:ilvl w:val="0"/>
+          <w:numId w:val="0"/>
+        </w:numPr>
+        <w:spacing w:before="240" w:after="120"/>
+        <w:ind w:hanging="0" w:start="0"/>
+        <w:rPr/>
+      </w:pPr>
+      <w:r>
+        <w:rPr/>
+      </w:r>
+    </w:p>
     <w:p>
       <w:pPr>
         <w:pStyle w:val="Heading1"/>
@@ -13,6 +762,8 @@
         <w:ind w:hanging="0" w:start="0"/>
         <w:rPr/>
       </w:pPr>
+      <w:bookmarkStart w:id="0" w:name="__RefHeading___Toc1333_1846826748"/>
+      <w:bookmarkEnd w:id="0"/>
       <w:r>
         <w:rPr/>
         <w:t>1. AND module</w:t>
@@ -40,6 +791,8 @@
         <w:ind w:hanging="0" w:start="0"/>
         <w:rPr/>
       </w:pPr>
+      <w:bookmarkStart w:id="1" w:name="__RefHeading___Toc1335_1846826748"/>
+      <w:bookmarkEnd w:id="1"/>
       <w:r>
         <w:rPr/>
         <w:t>2. OR module</w:t>
@@ -67,6 +820,8 @@
         <w:ind w:hanging="0" w:start="0"/>
         <w:rPr/>
       </w:pPr>
+      <w:bookmarkStart w:id="2" w:name="__RefHeading___Toc1337_1846826748"/>
+      <w:bookmarkEnd w:id="2"/>
       <w:r>
         <w:rPr/>
         <w:t xml:space="preserve"> </w:t>
@@ -99,6 +854,8 @@
         <w:jc w:val="start"/>
         <w:rPr/>
       </w:pPr>
+      <w:bookmarkStart w:id="3" w:name="__RefHeading___Toc1339_1846826748"/>
+      <w:bookmarkEnd w:id="3"/>
       <w:r>
         <w:rPr/>
         <w:t>Mạch logic bất kỳ (vd: y = (a&amp;b)|(~c))</w:t>
@@ -137,6 +894,8 @@
         <w:ind w:hanging="0" w:start="0"/>
         <w:rPr/>
       </w:pPr>
+      <w:bookmarkStart w:id="4" w:name="__RefHeading___Toc1341_1846826748"/>
+      <w:bookmarkEnd w:id="4"/>
       <w:r>
         <w:rPr/>
         <w:t>Half Adder</w:t>
@@ -181,9 +940,10 @@
     <w:p>
       <w:pPr>
         <w:sectPr>
+          <w:footerReference w:type="default" r:id="rId2"/>
           <w:type w:val="nextPage"/>
           <w:pgSz w:w="11906" w:h="16838"/>
-          <w:pgMar w:left="1134" w:right="1134" w:gutter="0" w:header="0" w:top="1134" w:footer="0" w:bottom="1134"/>
+          <w:pgMar w:left="1134" w:right="1134" w:gutter="0" w:header="0" w:top="1134" w:footer="1134" w:bottom="1693"/>
           <w:pgNumType w:fmt="decimal"/>
           <w:formProt w:val="false"/>
           <w:textDirection w:val="lrTb"/>
@@ -222,7 +982,7 @@
         <w:sectPr>
           <w:type w:val="continuous"/>
           <w:pgSz w:w="11906" w:h="16838"/>
-          <w:pgMar w:left="1134" w:right="1134" w:gutter="0" w:header="0" w:top="1134" w:footer="0" w:bottom="1134"/>
+          <w:pgMar w:left="1134" w:right="1134" w:gutter="0" w:header="0" w:top="1134" w:footer="1134" w:bottom="1693"/>
           <w:formProt w:val="false"/>
           <w:textDirection w:val="lrTb"/>
           <w:docGrid w:type="default" w:linePitch="100" w:charSpace="0"/>
@@ -244,7 +1004,7 @@
         <w:sectPr>
           <w:type w:val="continuous"/>
           <w:pgSz w:w="11906" w:h="16838"/>
-          <w:pgMar w:left="1134" w:right="1134" w:gutter="0" w:header="0" w:top="1134" w:footer="0" w:bottom="1134"/>
+          <w:pgMar w:left="1134" w:right="1134" w:gutter="0" w:header="0" w:top="1134" w:footer="1134" w:bottom="1693"/>
           <w:formProt w:val="false"/>
           <w:textDirection w:val="lrTb"/>
           <w:docGrid w:type="default" w:linePitch="100" w:charSpace="0"/>
@@ -257,8 +1017,8 @@
         <w:ind w:hanging="0" w:start="0" w:end="0"/>
         <w:rPr/>
       </w:pPr>
-      <w:bookmarkStart w:id="0" w:name="code-block-viewer"/>
-      <w:bookmarkEnd w:id="0"/>
+      <w:bookmarkStart w:id="6" w:name="code-block-viewer"/>
+      <w:bookmarkEnd w:id="6"/>
       <w:r>
         <w:rPr>
           <w:rStyle w:val="SourceText"/>
@@ -284,7 +1044,7 @@
         <w:sectPr>
           <w:type w:val="continuous"/>
           <w:pgSz w:w="11906" w:h="16838"/>
-          <w:pgMar w:left="1134" w:right="1134" w:gutter="0" w:header="0" w:top="1134" w:footer="0" w:bottom="1134"/>
+          <w:pgMar w:left="1134" w:right="1134" w:gutter="0" w:header="0" w:top="1134" w:footer="1134" w:bottom="1693"/>
           <w:formProt w:val="false"/>
           <w:textDirection w:val="lrTb"/>
           <w:docGrid w:type="default" w:linePitch="100" w:charSpace="0"/>
@@ -306,7 +1066,7 @@
         <w:sectPr>
           <w:type w:val="continuous"/>
           <w:pgSz w:w="11906" w:h="16838"/>
-          <w:pgMar w:left="1134" w:right="1134" w:gutter="0" w:header="0" w:top="1134" w:footer="0" w:bottom="1134"/>
+          <w:pgMar w:left="1134" w:right="1134" w:gutter="0" w:header="0" w:top="1134" w:footer="1134" w:bottom="1693"/>
           <w:formProt w:val="false"/>
           <w:textDirection w:val="lrTb"/>
           <w:docGrid w:type="default" w:linePitch="100" w:charSpace="0"/>
@@ -319,8 +1079,8 @@
         <w:ind w:hanging="0" w:start="0" w:end="0"/>
         <w:rPr/>
       </w:pPr>
-      <w:bookmarkStart w:id="1" w:name="code-block-viewer_Copy_1"/>
-      <w:bookmarkEnd w:id="1"/>
+      <w:bookmarkStart w:id="7" w:name="code-block-viewer_Copy_1"/>
+      <w:bookmarkEnd w:id="7"/>
       <w:r>
         <w:rPr>
           <w:rStyle w:val="SourceText"/>
@@ -394,7 +1154,7 @@
         <w:sectPr>
           <w:type w:val="continuous"/>
           <w:pgSz w:w="11906" w:h="16838"/>
-          <w:pgMar w:left="1134" w:right="1134" w:gutter="0" w:header="0" w:top="1134" w:footer="0" w:bottom="1134"/>
+          <w:pgMar w:left="1134" w:right="1134" w:gutter="0" w:header="0" w:top="1134" w:footer="1134" w:bottom="1693"/>
           <w:formProt w:val="false"/>
           <w:textDirection w:val="lrTb"/>
           <w:docGrid w:type="default" w:linePitch="100" w:charSpace="0"/>
@@ -416,7 +1176,7 @@
         <w:sectPr>
           <w:type w:val="continuous"/>
           <w:pgSz w:w="11906" w:h="16838"/>
-          <w:pgMar w:left="1134" w:right="1134" w:gutter="0" w:header="0" w:top="1134" w:footer="0" w:bottom="1134"/>
+          <w:pgMar w:left="1134" w:right="1134" w:gutter="0" w:header="0" w:top="1134" w:footer="1134" w:bottom="1693"/>
           <w:formProt w:val="false"/>
           <w:textDirection w:val="lrTb"/>
           <w:docGrid w:type="default" w:linePitch="100" w:charSpace="0"/>
@@ -430,8 +1190,8 @@
         <w:ind w:hanging="0" w:start="0" w:end="0"/>
         <w:rPr/>
       </w:pPr>
-      <w:bookmarkStart w:id="2" w:name="code-block-viewer_Copy_2"/>
-      <w:bookmarkEnd w:id="2"/>
+      <w:bookmarkStart w:id="8" w:name="code-block-viewer_Copy_2"/>
+      <w:bookmarkEnd w:id="8"/>
       <w:r>
         <w:rPr>
           <w:rStyle w:val="SourceText"/>
@@ -444,7 +1204,7 @@
         <w:sectPr>
           <w:type w:val="continuous"/>
           <w:pgSz w:w="11906" w:h="16838"/>
-          <w:pgMar w:left="1134" w:right="1134" w:gutter="0" w:header="0" w:top="1134" w:footer="0" w:bottom="1134"/>
+          <w:pgMar w:left="1134" w:right="1134" w:gutter="0" w:header="0" w:top="1134" w:footer="1134" w:bottom="1693"/>
           <w:formProt w:val="false"/>
           <w:textDirection w:val="lrTb"/>
           <w:docGrid w:type="default" w:linePitch="100" w:charSpace="0"/>
@@ -466,7 +1226,7 @@
         <w:sectPr>
           <w:type w:val="continuous"/>
           <w:pgSz w:w="11906" w:h="16838"/>
-          <w:pgMar w:left="1134" w:right="1134" w:gutter="0" w:header="0" w:top="1134" w:footer="0" w:bottom="1134"/>
+          <w:pgMar w:left="1134" w:right="1134" w:gutter="0" w:header="0" w:top="1134" w:footer="1134" w:bottom="1693"/>
           <w:formProt w:val="false"/>
           <w:textDirection w:val="lrTb"/>
           <w:docGrid w:type="default" w:linePitch="100" w:charSpace="0"/>
@@ -479,8 +1239,8 @@
         <w:ind w:hanging="0" w:start="0" w:end="0"/>
         <w:rPr/>
       </w:pPr>
-      <w:bookmarkStart w:id="3" w:name="code-block-viewer_Copy_3"/>
-      <w:bookmarkEnd w:id="3"/>
+      <w:bookmarkStart w:id="9" w:name="code-block-viewer_Copy_3"/>
+      <w:bookmarkEnd w:id="9"/>
       <w:r>
         <w:rPr>
           <w:rStyle w:val="SourceText"/>
@@ -506,7 +1266,7 @@
         <w:sectPr>
           <w:type w:val="continuous"/>
           <w:pgSz w:w="11906" w:h="16838"/>
-          <w:pgMar w:left="1134" w:right="1134" w:gutter="0" w:header="0" w:top="1134" w:footer="0" w:bottom="1134"/>
+          <w:pgMar w:left="1134" w:right="1134" w:gutter="0" w:header="0" w:top="1134" w:footer="1134" w:bottom="1693"/>
           <w:formProt w:val="false"/>
           <w:textDirection w:val="lrTb"/>
           <w:docGrid w:type="default" w:linePitch="100" w:charSpace="0"/>
@@ -1015,7 +1775,7 @@
         <w:sectPr>
           <w:type w:val="continuous"/>
           <w:pgSz w:w="11906" w:h="16838"/>
-          <w:pgMar w:left="1134" w:right="1134" w:gutter="0" w:header="0" w:top="1134" w:footer="0" w:bottom="1134"/>
+          <w:pgMar w:left="1134" w:right="1134" w:gutter="0" w:header="0" w:top="1134" w:footer="1134" w:bottom="1693"/>
           <w:formProt w:val="false"/>
           <w:textDirection w:val="lrTb"/>
           <w:docGrid w:type="default" w:linePitch="100" w:charSpace="0"/>
@@ -1028,8 +1788,8 @@
         <w:ind w:hanging="0" w:start="0" w:end="0"/>
         <w:rPr/>
       </w:pPr>
-      <w:bookmarkStart w:id="4" w:name="code-block-viewer_Copy_5"/>
-      <w:bookmarkEnd w:id="4"/>
+      <w:bookmarkStart w:id="10" w:name="code-block-viewer_Copy_5"/>
+      <w:bookmarkEnd w:id="10"/>
       <w:r>
         <w:rPr>
           <w:rStyle w:val="SourceText"/>
@@ -1199,7 +1959,7 @@
         <w:sectPr>
           <w:type w:val="continuous"/>
           <w:pgSz w:w="11906" w:h="16838"/>
-          <w:pgMar w:left="1134" w:right="1134" w:gutter="0" w:header="0" w:top="1134" w:footer="0" w:bottom="1134"/>
+          <w:pgMar w:left="1134" w:right="1134" w:gutter="0" w:header="0" w:top="1134" w:footer="1134" w:bottom="1693"/>
           <w:formProt w:val="false"/>
           <w:textDirection w:val="lrTb"/>
           <w:docGrid w:type="default" w:linePitch="100" w:charSpace="0"/>
@@ -1218,6 +1978,8 @@
           <w:u w:val="single"/>
         </w:rPr>
       </w:pPr>
+      <w:bookmarkStart w:id="11" w:name="__RefHeading___Toc1343_1846826748"/>
+      <w:bookmarkEnd w:id="11"/>
       <w:r>
         <w:rPr>
           <w:u w:val="single"/>
@@ -1280,7 +2042,7 @@
         <w:sectPr>
           <w:type w:val="continuous"/>
           <w:pgSz w:w="11906" w:h="16838"/>
-          <w:pgMar w:left="1134" w:right="1134" w:gutter="0" w:header="0" w:top="1134" w:footer="0" w:bottom="1134"/>
+          <w:pgMar w:left="1134" w:right="1134" w:gutter="0" w:header="0" w:top="1134" w:footer="1134" w:bottom="1693"/>
           <w:formProt w:val="false"/>
           <w:textDirection w:val="lrTb"/>
           <w:docGrid w:type="default" w:linePitch="100" w:charSpace="0"/>
@@ -1348,7 +2110,7 @@
         <w:sectPr>
           <w:type w:val="continuous"/>
           <w:pgSz w:w="11906" w:h="16838"/>
-          <w:pgMar w:left="1134" w:right="1134" w:gutter="0" w:header="0" w:top="1134" w:footer="0" w:bottom="1134"/>
+          <w:pgMar w:left="1134" w:right="1134" w:gutter="0" w:header="0" w:top="1134" w:footer="1134" w:bottom="1693"/>
           <w:formProt w:val="false"/>
           <w:textDirection w:val="lrTb"/>
           <w:docGrid w:type="default" w:linePitch="100" w:charSpace="0"/>
@@ -1380,7 +2142,7 @@
         <w:sectPr>
           <w:type w:val="continuous"/>
           <w:pgSz w:w="11906" w:h="16838"/>
-          <w:pgMar w:left="1134" w:right="1134" w:gutter="0" w:header="0" w:top="1134" w:footer="0" w:bottom="1134"/>
+          <w:pgMar w:left="1134" w:right="1134" w:gutter="0" w:header="0" w:top="1134" w:footer="1134" w:bottom="1693"/>
           <w:formProt w:val="false"/>
           <w:textDirection w:val="lrTb"/>
           <w:docGrid w:type="default" w:linePitch="100" w:charSpace="0"/>
@@ -1393,8 +2155,8 @@
         <w:ind w:hanging="0" w:start="0" w:end="0"/>
         <w:rPr/>
       </w:pPr>
-      <w:bookmarkStart w:id="5" w:name="code-block-viewer_Copy_1_Copy_1"/>
-      <w:bookmarkEnd w:id="5"/>
+      <w:bookmarkStart w:id="12" w:name="code-block-viewer_Copy_1_Copy_1"/>
+      <w:bookmarkEnd w:id="12"/>
       <w:r>
         <w:rPr>
           <w:rStyle w:val="SourceText"/>
@@ -1432,7 +2194,7 @@
         <w:sectPr>
           <w:type w:val="continuous"/>
           <w:pgSz w:w="11906" w:h="16838"/>
-          <w:pgMar w:left="1134" w:right="1134" w:gutter="0" w:header="0" w:top="1134" w:footer="0" w:bottom="1134"/>
+          <w:pgMar w:left="1134" w:right="1134" w:gutter="0" w:header="0" w:top="1134" w:footer="1134" w:bottom="1693"/>
           <w:formProt w:val="false"/>
           <w:textDirection w:val="lrTb"/>
           <w:docGrid w:type="default" w:linePitch="100" w:charSpace="0"/>
@@ -1454,7 +2216,7 @@
         <w:sectPr>
           <w:type w:val="continuous"/>
           <w:pgSz w:w="11906" w:h="16838"/>
-          <w:pgMar w:left="1134" w:right="1134" w:gutter="0" w:header="0" w:top="1134" w:footer="0" w:bottom="1134"/>
+          <w:pgMar w:left="1134" w:right="1134" w:gutter="0" w:header="0" w:top="1134" w:footer="1134" w:bottom="1693"/>
           <w:formProt w:val="false"/>
           <w:textDirection w:val="lrTb"/>
           <w:docGrid w:type="default" w:linePitch="100" w:charSpace="0"/>
@@ -1468,8 +2230,8 @@
         <w:ind w:hanging="0" w:start="0" w:end="0"/>
         <w:rPr/>
       </w:pPr>
-      <w:bookmarkStart w:id="6" w:name="code-block-viewer_Copy_2_Copy_1"/>
-      <w:bookmarkEnd w:id="6"/>
+      <w:bookmarkStart w:id="13" w:name="code-block-viewer_Copy_2_Copy_1"/>
+      <w:bookmarkEnd w:id="13"/>
       <w:r>
         <w:rPr>
           <w:rStyle w:val="SourceText"/>
@@ -1482,7 +2244,7 @@
         <w:sectPr>
           <w:type w:val="continuous"/>
           <w:pgSz w:w="11906" w:h="16838"/>
-          <w:pgMar w:left="1134" w:right="1134" w:gutter="0" w:header="0" w:top="1134" w:footer="0" w:bottom="1134"/>
+          <w:pgMar w:left="1134" w:right="1134" w:gutter="0" w:header="0" w:top="1134" w:footer="1134" w:bottom="1693"/>
           <w:formProt w:val="false"/>
           <w:textDirection w:val="lrTb"/>
           <w:docGrid w:type="default" w:linePitch="100" w:charSpace="0"/>
@@ -1545,6 +2307,8 @@
         <w:ind w:hanging="0" w:start="0"/>
         <w:rPr/>
       </w:pPr>
+      <w:bookmarkStart w:id="14" w:name="__RefHeading___Toc1345_1846826748"/>
+      <w:bookmarkEnd w:id="14"/>
       <w:r>
         <w:rPr/>
         <w:t>Full Adder</w:t>
@@ -1591,7 +2355,7 @@
         <w:sectPr>
           <w:type w:val="continuous"/>
           <w:pgSz w:w="11906" w:h="16838"/>
-          <w:pgMar w:left="1134" w:right="1134" w:gutter="0" w:header="0" w:top="1134" w:footer="0" w:bottom="1134"/>
+          <w:pgMar w:left="1134" w:right="1134" w:gutter="0" w:header="0" w:top="1134" w:footer="1134" w:bottom="1693"/>
           <w:formProt w:val="false"/>
           <w:textDirection w:val="lrTb"/>
           <w:docGrid w:type="default" w:linePitch="100" w:charSpace="0"/>
@@ -1604,8 +2368,8 @@
         <w:ind w:hanging="0" w:start="0" w:end="0"/>
         <w:rPr/>
       </w:pPr>
-      <w:bookmarkStart w:id="7" w:name="code-block-viewer_Copy_3_Copy_1"/>
-      <w:bookmarkEnd w:id="7"/>
+      <w:bookmarkStart w:id="15" w:name="code-block-viewer_Copy_3_Copy_1"/>
+      <w:bookmarkEnd w:id="15"/>
       <w:r>
         <w:rPr>
           <w:rStyle w:val="SourceText"/>
@@ -1643,7 +2407,7 @@
         <w:sectPr>
           <w:type w:val="continuous"/>
           <w:pgSz w:w="11906" w:h="16838"/>
-          <w:pgMar w:left="1134" w:right="1134" w:gutter="0" w:header="0" w:top="1134" w:footer="0" w:bottom="1134"/>
+          <w:pgMar w:left="1134" w:right="1134" w:gutter="0" w:header="0" w:top="1134" w:footer="1134" w:bottom="1693"/>
           <w:formProt w:val="false"/>
           <w:textDirection w:val="lrTb"/>
           <w:docGrid w:type="default" w:linePitch="100" w:charSpace="0"/>
@@ -1665,7 +2429,7 @@
         <w:sectPr>
           <w:type w:val="continuous"/>
           <w:pgSz w:w="11906" w:h="16838"/>
-          <w:pgMar w:left="1134" w:right="1134" w:gutter="0" w:header="0" w:top="1134" w:footer="0" w:bottom="1134"/>
+          <w:pgMar w:left="1134" w:right="1134" w:gutter="0" w:header="0" w:top="1134" w:footer="1134" w:bottom="1693"/>
           <w:formProt w:val="false"/>
           <w:textDirection w:val="lrTb"/>
           <w:docGrid w:type="default" w:linePitch="100" w:charSpace="0"/>
@@ -1678,8 +2442,8 @@
         <w:ind w:hanging="0" w:start="0" w:end="0"/>
         <w:rPr/>
       </w:pPr>
-      <w:bookmarkStart w:id="8" w:name="code-block-viewer_Copy_4"/>
-      <w:bookmarkEnd w:id="8"/>
+      <w:bookmarkStart w:id="16" w:name="code-block-viewer_Copy_4"/>
+      <w:bookmarkEnd w:id="16"/>
       <w:r>
         <w:rPr>
           <w:rStyle w:val="SourceText"/>
@@ -1705,7 +2469,7 @@
         <w:sectPr>
           <w:type w:val="continuous"/>
           <w:pgSz w:w="11906" w:h="16838"/>
-          <w:pgMar w:left="1134" w:right="1134" w:gutter="0" w:header="0" w:top="1134" w:footer="0" w:bottom="1134"/>
+          <w:pgMar w:left="1134" w:right="1134" w:gutter="0" w:header="0" w:top="1134" w:footer="1134" w:bottom="1693"/>
           <w:formProt w:val="false"/>
           <w:textDirection w:val="lrTb"/>
           <w:docGrid w:type="default" w:linePitch="100" w:charSpace="0"/>
@@ -1731,6 +2495,8 @@
         <w:ind w:hanging="0" w:start="0"/>
         <w:rPr/>
       </w:pPr>
+      <w:bookmarkStart w:id="17" w:name="__RefHeading___Toc1347_1846826748"/>
+      <w:bookmarkEnd w:id="17"/>
       <w:r>
         <w:rPr/>
         <w:t>Tại sao cần Full Adder?</w:t>
@@ -1751,7 +2517,7 @@
         <w:sectPr>
           <w:type w:val="continuous"/>
           <w:pgSz w:w="11906" w:h="16838"/>
-          <w:pgMar w:left="1134" w:right="1134" w:gutter="0" w:header="0" w:top="1134" w:footer="0" w:bottom="1134"/>
+          <w:pgMar w:left="1134" w:right="1134" w:gutter="0" w:header="0" w:top="1134" w:footer="1134" w:bottom="1693"/>
           <w:formProt w:val="false"/>
           <w:textDirection w:val="lrTb"/>
           <w:docGrid w:type="default" w:linePitch="100" w:charSpace="0"/>
@@ -1764,8 +2530,8 @@
         <w:ind w:hanging="0" w:start="0" w:end="0"/>
         <w:rPr/>
       </w:pPr>
-      <w:bookmarkStart w:id="9" w:name="code-block-viewer_Copy_5_Copy_1"/>
-      <w:bookmarkEnd w:id="9"/>
+      <w:bookmarkStart w:id="18" w:name="code-block-viewer_Copy_5_Copy_1"/>
+      <w:bookmarkEnd w:id="18"/>
       <w:r>
         <w:rPr>
           <w:rStyle w:val="SourceText"/>
@@ -1803,7 +2569,7 @@
         <w:sectPr>
           <w:type w:val="continuous"/>
           <w:pgSz w:w="11906" w:h="16838"/>
-          <w:pgMar w:left="1134" w:right="1134" w:gutter="0" w:header="0" w:top="1134" w:footer="0" w:bottom="1134"/>
+          <w:pgMar w:left="1134" w:right="1134" w:gutter="0" w:header="0" w:top="1134" w:footer="1134" w:bottom="1693"/>
           <w:formProt w:val="false"/>
           <w:textDirection w:val="lrTb"/>
           <w:docGrid w:type="default" w:linePitch="100" w:charSpace="0"/>
@@ -1835,7 +2601,7 @@
         <w:sectPr>
           <w:type w:val="continuous"/>
           <w:pgSz w:w="11906" w:h="16838"/>
-          <w:pgMar w:left="1134" w:right="1134" w:gutter="0" w:header="0" w:top="1134" w:footer="0" w:bottom="1134"/>
+          <w:pgMar w:left="1134" w:right="1134" w:gutter="0" w:header="0" w:top="1134" w:footer="1134" w:bottom="1693"/>
           <w:formProt w:val="false"/>
           <w:textDirection w:val="lrTb"/>
           <w:docGrid w:type="default" w:linePitch="100" w:charSpace="0"/>
@@ -1849,8 +2615,8 @@
         <w:ind w:hanging="0" w:start="0" w:end="0"/>
         <w:rPr/>
       </w:pPr>
-      <w:bookmarkStart w:id="10" w:name="code-block-viewer_Copy_6"/>
-      <w:bookmarkEnd w:id="10"/>
+      <w:bookmarkStart w:id="19" w:name="code-block-viewer_Copy_6"/>
+      <w:bookmarkEnd w:id="19"/>
       <w:r>
         <w:rPr>
           <w:rStyle w:val="SourceText"/>
@@ -1863,7 +2629,7 @@
         <w:sectPr>
           <w:type w:val="continuous"/>
           <w:pgSz w:w="11906" w:h="16838"/>
-          <w:pgMar w:left="1134" w:right="1134" w:gutter="0" w:header="0" w:top="1134" w:footer="0" w:bottom="1134"/>
+          <w:pgMar w:left="1134" w:right="1134" w:gutter="0" w:header="0" w:top="1134" w:footer="1134" w:bottom="1693"/>
           <w:formProt w:val="false"/>
           <w:textDirection w:val="lrTb"/>
           <w:docGrid w:type="default" w:linePitch="100" w:charSpace="0"/>
@@ -1895,7 +2661,7 @@
         <w:sectPr>
           <w:type w:val="continuous"/>
           <w:pgSz w:w="11906" w:h="16838"/>
-          <w:pgMar w:left="1134" w:right="1134" w:gutter="0" w:header="0" w:top="1134" w:footer="0" w:bottom="1134"/>
+          <w:pgMar w:left="1134" w:right="1134" w:gutter="0" w:header="0" w:top="1134" w:footer="1134" w:bottom="1693"/>
           <w:formProt w:val="false"/>
           <w:textDirection w:val="lrTb"/>
           <w:docGrid w:type="default" w:linePitch="100" w:charSpace="0"/>
@@ -1909,8 +2675,8 @@
         <w:ind w:hanging="0" w:start="0" w:end="0"/>
         <w:rPr/>
       </w:pPr>
-      <w:bookmarkStart w:id="11" w:name="code-block-viewer_Copy_7"/>
-      <w:bookmarkEnd w:id="11"/>
+      <w:bookmarkStart w:id="20" w:name="code-block-viewer_Copy_7"/>
+      <w:bookmarkEnd w:id="20"/>
       <w:r>
         <w:rPr>
           <w:rStyle w:val="SourceText"/>
@@ -1923,7 +2689,7 @@
         <w:sectPr>
           <w:type w:val="continuous"/>
           <w:pgSz w:w="11906" w:h="16838"/>
-          <w:pgMar w:left="1134" w:right="1134" w:gutter="0" w:header="0" w:top="1134" w:footer="0" w:bottom="1134"/>
+          <w:pgMar w:left="1134" w:right="1134" w:gutter="0" w:header="0" w:top="1134" w:footer="1134" w:bottom="1693"/>
           <w:formProt w:val="false"/>
           <w:textDirection w:val="lrTb"/>
           <w:docGrid w:type="default" w:linePitch="100" w:charSpace="0"/>
@@ -4122,6 +4888,8 @@
         <w:ind w:hanging="0" w:start="0"/>
         <w:rPr/>
       </w:pPr>
+      <w:bookmarkStart w:id="21" w:name="__RefHeading___Toc1349_1846826748"/>
+      <w:bookmarkEnd w:id="21"/>
       <w:r>
         <w:rPr/>
         <w:t>Công thức Boolean</w:t>
@@ -4137,6 +4905,8 @@
         <w:ind w:hanging="0" w:start="0"/>
         <w:rPr/>
       </w:pPr>
+      <w:bookmarkStart w:id="22" w:name="__RefHeading___Toc1351_1846826748"/>
+      <w:bookmarkEnd w:id="22"/>
       <w:r>
         <w:rPr/>
         <w:t>Sum</w:t>
@@ -4157,7 +4927,7 @@
         <w:sectPr>
           <w:type w:val="continuous"/>
           <w:pgSz w:w="11906" w:h="16838"/>
-          <w:pgMar w:left="1134" w:right="1134" w:gutter="0" w:header="0" w:top="1134" w:footer="0" w:bottom="1134"/>
+          <w:pgMar w:left="1134" w:right="1134" w:gutter="0" w:header="0" w:top="1134" w:footer="1134" w:bottom="1693"/>
           <w:formProt w:val="false"/>
           <w:textDirection w:val="lrTb"/>
           <w:docGrid w:type="default" w:linePitch="100" w:charSpace="0"/>
@@ -4171,8 +4941,8 @@
         <w:ind w:hanging="0" w:start="0" w:end="0"/>
         <w:rPr/>
       </w:pPr>
-      <w:bookmarkStart w:id="12" w:name="code-block-viewer_Copy_8"/>
-      <w:bookmarkEnd w:id="12"/>
+      <w:bookmarkStart w:id="23" w:name="code-block-viewer_Copy_8"/>
+      <w:bookmarkEnd w:id="23"/>
       <w:r>
         <w:rPr>
           <w:rStyle w:val="SourceText"/>
@@ -4185,7 +4955,7 @@
         <w:sectPr>
           <w:type w:val="continuous"/>
           <w:pgSz w:w="11906" w:h="16838"/>
-          <w:pgMar w:left="1134" w:right="1134" w:gutter="0" w:header="0" w:top="1134" w:footer="0" w:bottom="1134"/>
+          <w:pgMar w:left="1134" w:right="1134" w:gutter="0" w:header="0" w:top="1134" w:footer="1134" w:bottom="1693"/>
           <w:formProt w:val="false"/>
           <w:textDirection w:val="lrTb"/>
           <w:docGrid w:type="default" w:linePitch="100" w:charSpace="0"/>
@@ -4221,6 +4991,8 @@
         <w:ind w:hanging="0" w:start="0"/>
         <w:rPr/>
       </w:pPr>
+      <w:bookmarkStart w:id="24" w:name="__RefHeading___Toc1353_1846826748"/>
+      <w:bookmarkEnd w:id="24"/>
       <w:r>
         <w:rPr/>
         <w:t>Carry Out</w:t>
@@ -4261,7 +5033,7 @@
         <w:sectPr>
           <w:type w:val="continuous"/>
           <w:pgSz w:w="11906" w:h="16838"/>
-          <w:pgMar w:left="1134" w:right="1134" w:gutter="0" w:header="0" w:top="1134" w:footer="0" w:bottom="1134"/>
+          <w:pgMar w:left="1134" w:right="1134" w:gutter="0" w:header="0" w:top="1134" w:footer="1134" w:bottom="1693"/>
           <w:formProt w:val="false"/>
           <w:textDirection w:val="lrTb"/>
           <w:docGrid w:type="default" w:linePitch="100" w:charSpace="0"/>
@@ -4275,8 +5047,8 @@
         <w:ind w:hanging="0" w:start="0" w:end="0"/>
         <w:rPr/>
       </w:pPr>
-      <w:bookmarkStart w:id="13" w:name="code-block-viewer_Copy_9"/>
-      <w:bookmarkEnd w:id="13"/>
+      <w:bookmarkStart w:id="25" w:name="code-block-viewer_Copy_9"/>
+      <w:bookmarkEnd w:id="25"/>
       <w:r>
         <w:rPr>
           <w:rStyle w:val="SourceText"/>
@@ -4289,7 +5061,7 @@
         <w:sectPr>
           <w:type w:val="continuous"/>
           <w:pgSz w:w="11906" w:h="16838"/>
-          <w:pgMar w:left="1134" w:right="1134" w:gutter="0" w:header="0" w:top="1134" w:footer="0" w:bottom="1134"/>
+          <w:pgMar w:left="1134" w:right="1134" w:gutter="0" w:header="0" w:top="1134" w:footer="1134" w:bottom="1693"/>
           <w:formProt w:val="false"/>
           <w:textDirection w:val="lrTb"/>
           <w:docGrid w:type="default" w:linePitch="100" w:charSpace="0"/>
@@ -4405,7 +5177,7 @@
         <w:sectPr>
           <w:type w:val="continuous"/>
           <w:pgSz w:w="11906" w:h="16838"/>
-          <w:pgMar w:left="1134" w:right="1134" w:gutter="0" w:header="0" w:top="1134" w:footer="0" w:bottom="1134"/>
+          <w:pgMar w:left="1134" w:right="1134" w:gutter="0" w:header="0" w:top="1134" w:footer="1134" w:bottom="1693"/>
           <w:formProt w:val="false"/>
           <w:textDirection w:val="lrTb"/>
           <w:docGrid w:type="default" w:linePitch="100" w:charSpace="0"/>
@@ -4418,8 +5190,8 @@
         <w:ind w:hanging="0" w:start="0" w:end="0"/>
         <w:rPr/>
       </w:pPr>
-      <w:bookmarkStart w:id="14" w:name="code-block-viewer_Copy_10"/>
-      <w:bookmarkEnd w:id="14"/>
+      <w:bookmarkStart w:id="26" w:name="code-block-viewer_Copy_10"/>
+      <w:bookmarkEnd w:id="26"/>
       <w:r>
         <w:rPr>
           <w:rStyle w:val="SourceText"/>
@@ -4445,7 +5217,7 @@
         <w:sectPr>
           <w:type w:val="continuous"/>
           <w:pgSz w:w="11906" w:h="16838"/>
-          <w:pgMar w:left="1134" w:right="1134" w:gutter="0" w:header="0" w:top="1134" w:footer="0" w:bottom="1134"/>
+          <w:pgMar w:left="1134" w:right="1134" w:gutter="0" w:header="0" w:top="1134" w:footer="1134" w:bottom="1693"/>
           <w:formProt w:val="false"/>
           <w:textDirection w:val="lrTb"/>
           <w:docGrid w:type="default" w:linePitch="100" w:charSpace="0"/>
@@ -4495,7 +5267,7 @@
                     </pic:cNvPicPr>
                   </pic:nvPicPr>
                   <pic:blipFill>
-                    <a:blip r:embed="rId2"/>
+                    <a:blip r:embed="rId3"/>
                     <a:stretch>
                       <a:fillRect/>
                     </a:stretch>
@@ -4584,7 +5356,7 @@
         <w:sectPr>
           <w:type w:val="continuous"/>
           <w:pgSz w:w="11906" w:h="16838"/>
-          <w:pgMar w:left="1134" w:right="1134" w:gutter="0" w:header="0" w:top="1134" w:footer="0" w:bottom="1134"/>
+          <w:pgMar w:left="1134" w:right="1134" w:gutter="0" w:header="0" w:top="1134" w:footer="1134" w:bottom="1693"/>
           <w:formProt w:val="false"/>
           <w:textDirection w:val="lrTb"/>
           <w:docGrid w:type="default" w:linePitch="100" w:charSpace="0"/>
@@ -4650,7 +5422,7 @@
       <w:r>
         <w:rPr/>
         <w:drawing>
-          <wp:anchor behindDoc="0" distT="0" distB="0" distL="0" distR="0" simplePos="0" locked="0" layoutInCell="0" allowOverlap="1" relativeHeight="4">
+          <wp:anchor behindDoc="0" distT="0" distB="0" distL="0" distR="0" simplePos="0" locked="0" layoutInCell="0" allowOverlap="1" relativeHeight="5">
             <wp:simplePos x="0" y="0"/>
             <wp:positionH relativeFrom="column">
               <wp:align>center</wp:align>
@@ -4675,7 +5447,7 @@
                     </pic:cNvPicPr>
                   </pic:nvPicPr>
                   <pic:blipFill>
-                    <a:blip r:embed="rId3"/>
+                    <a:blip r:embed="rId4"/>
                     <a:stretch>
                       <a:fillRect/>
                     </a:stretch>
@@ -4719,7 +5491,7 @@
       <w:r>
         <w:rPr/>
         <w:drawing>
-          <wp:anchor behindDoc="0" distT="0" distB="0" distL="0" distR="0" simplePos="0" locked="0" layoutInCell="0" allowOverlap="1" relativeHeight="5">
+          <wp:anchor behindDoc="0" distT="0" distB="0" distL="0" distR="0" simplePos="0" locked="0" layoutInCell="0" allowOverlap="1" relativeHeight="4">
             <wp:simplePos x="0" y="0"/>
             <wp:positionH relativeFrom="column">
               <wp:align>center</wp:align>
@@ -4744,7 +5516,7 @@
                     </pic:cNvPicPr>
                   </pic:nvPicPr>
                   <pic:blipFill>
-                    <a:blip r:embed="rId4"/>
+                    <a:blip r:embed="rId5"/>
                     <a:stretch>
                       <a:fillRect/>
                     </a:stretch>
@@ -4782,7 +5554,7 @@
         <w:sectPr>
           <w:type w:val="continuous"/>
           <w:pgSz w:w="11906" w:h="16838"/>
-          <w:pgMar w:left="1134" w:right="1134" w:gutter="0" w:header="0" w:top="1134" w:footer="0" w:bottom="1134"/>
+          <w:pgMar w:left="1134" w:right="1134" w:gutter="0" w:header="0" w:top="1134" w:footer="1134" w:bottom="1693"/>
           <w:formProt w:val="false"/>
           <w:textDirection w:val="lrTb"/>
           <w:docGrid w:type="default" w:linePitch="100" w:charSpace="0"/>
@@ -4882,6 +5654,8 @@
         <w:ind w:hanging="0" w:start="0"/>
         <w:rPr/>
       </w:pPr>
+      <w:bookmarkStart w:id="27" w:name="__RefHeading___Toc1355_1846826748"/>
+      <w:bookmarkEnd w:id="27"/>
       <w:r>
         <w:rPr/>
         <w:t xml:space="preserve"> </w:t>
@@ -4933,7 +5707,7 @@
                     </pic:cNvPicPr>
                   </pic:nvPicPr>
                   <pic:blipFill>
-                    <a:blip r:embed="rId5"/>
+                    <a:blip r:embed="rId6"/>
                     <a:stretch>
                       <a:fillRect/>
                     </a:stretch>
@@ -4989,7 +5763,7 @@
                     </pic:cNvPicPr>
                   </pic:nvPicPr>
                   <pic:blipFill>
-                    <a:blip r:embed="rId6"/>
+                    <a:blip r:embed="rId7"/>
                     <a:stretch>
                       <a:fillRect/>
                     </a:stretch>
@@ -5049,6 +5823,8 @@
         <w:ind w:hanging="0" w:start="0"/>
         <w:rPr/>
       </w:pPr>
+      <w:bookmarkStart w:id="28" w:name="__RefHeading___Toc1357_1846826748"/>
+      <w:bookmarkEnd w:id="28"/>
       <w:r>
         <w:rPr/>
         <w:t>Thử kiểm tra</w:t>
@@ -5069,7 +5845,7 @@
         <w:sectPr>
           <w:type w:val="continuous"/>
           <w:pgSz w:w="11906" w:h="16838"/>
-          <w:pgMar w:left="1134" w:right="1134" w:gutter="0" w:header="0" w:top="1134" w:footer="0" w:bottom="1134"/>
+          <w:pgMar w:left="1134" w:right="1134" w:gutter="0" w:header="0" w:top="1134" w:footer="1134" w:bottom="1693"/>
           <w:formProt w:val="false"/>
           <w:textDirection w:val="lrTb"/>
           <w:docGrid w:type="default" w:linePitch="100" w:charSpace="0"/>
@@ -5082,8 +5858,8 @@
         <w:ind w:hanging="0" w:start="0" w:end="0"/>
         <w:rPr/>
       </w:pPr>
-      <w:bookmarkStart w:id="15" w:name="code-block-viewer_Copy_12"/>
-      <w:bookmarkEnd w:id="15"/>
+      <w:bookmarkStart w:id="29" w:name="code-block-viewer_Copy_12"/>
+      <w:bookmarkEnd w:id="29"/>
       <w:r>
         <w:rPr>
           <w:rStyle w:val="SourceText"/>
@@ -5121,7 +5897,7 @@
         <w:sectPr>
           <w:type w:val="continuous"/>
           <w:pgSz w:w="11906" w:h="16838"/>
-          <w:pgMar w:left="1134" w:right="1134" w:gutter="0" w:header="0" w:top="1134" w:footer="0" w:bottom="1134"/>
+          <w:pgMar w:left="1134" w:right="1134" w:gutter="0" w:header="0" w:top="1134" w:footer="1134" w:bottom="1693"/>
           <w:formProt w:val="false"/>
           <w:textDirection w:val="lrTb"/>
           <w:docGrid w:type="default" w:linePitch="100" w:charSpace="0"/>
@@ -5143,7 +5919,7 @@
         <w:sectPr>
           <w:type w:val="continuous"/>
           <w:pgSz w:w="11906" w:h="16838"/>
-          <w:pgMar w:left="1134" w:right="1134" w:gutter="0" w:header="0" w:top="1134" w:footer="0" w:bottom="1134"/>
+          <w:pgMar w:left="1134" w:right="1134" w:gutter="0" w:header="0" w:top="1134" w:footer="1134" w:bottom="1693"/>
           <w:formProt w:val="false"/>
           <w:textDirection w:val="lrTb"/>
           <w:docGrid w:type="default" w:linePitch="100" w:charSpace="0"/>
@@ -5156,8 +5932,8 @@
         <w:ind w:hanging="0" w:start="0" w:end="0"/>
         <w:rPr/>
       </w:pPr>
-      <w:bookmarkStart w:id="16" w:name="code-block-viewer_Copy_13"/>
-      <w:bookmarkEnd w:id="16"/>
+      <w:bookmarkStart w:id="30" w:name="code-block-viewer_Copy_13"/>
+      <w:bookmarkEnd w:id="30"/>
       <w:r>
         <w:rPr>
           <w:rStyle w:val="SourceText"/>
@@ -5183,7 +5959,7 @@
         <w:sectPr>
           <w:type w:val="continuous"/>
           <w:pgSz w:w="11906" w:h="16838"/>
-          <w:pgMar w:left="1134" w:right="1134" w:gutter="0" w:header="0" w:top="1134" w:footer="0" w:bottom="1134"/>
+          <w:pgMar w:left="1134" w:right="1134" w:gutter="0" w:header="0" w:top="1134" w:footer="1134" w:bottom="1693"/>
           <w:formProt w:val="false"/>
           <w:textDirection w:val="lrTb"/>
           <w:docGrid w:type="default" w:linePitch="100" w:charSpace="0"/>
@@ -5205,7 +5981,7 @@
         <w:sectPr>
           <w:type w:val="continuous"/>
           <w:pgSz w:w="11906" w:h="16838"/>
-          <w:pgMar w:left="1134" w:right="1134" w:gutter="0" w:header="0" w:top="1134" w:footer="0" w:bottom="1134"/>
+          <w:pgMar w:left="1134" w:right="1134" w:gutter="0" w:header="0" w:top="1134" w:footer="1134" w:bottom="1693"/>
           <w:formProt w:val="false"/>
           <w:textDirection w:val="lrTb"/>
           <w:docGrid w:type="default" w:linePitch="100" w:charSpace="0"/>
@@ -5218,8 +5994,8 @@
         <w:ind w:hanging="0" w:start="0" w:end="0"/>
         <w:rPr/>
       </w:pPr>
-      <w:bookmarkStart w:id="17" w:name="code-block-viewer_Copy_14"/>
-      <w:bookmarkEnd w:id="17"/>
+      <w:bookmarkStart w:id="31" w:name="code-block-viewer_Copy_14"/>
+      <w:bookmarkEnd w:id="31"/>
       <w:r>
         <w:rPr>
           <w:rStyle w:val="SourceText"/>
@@ -5245,7 +6021,7 @@
         <w:sectPr>
           <w:type w:val="continuous"/>
           <w:pgSz w:w="11906" w:h="16838"/>
-          <w:pgMar w:left="1134" w:right="1134" w:gutter="0" w:header="0" w:top="1134" w:footer="0" w:bottom="1134"/>
+          <w:pgMar w:left="1134" w:right="1134" w:gutter="0" w:header="0" w:top="1134" w:footer="1134" w:bottom="1693"/>
           <w:formProt w:val="false"/>
           <w:textDirection w:val="lrTb"/>
           <w:docGrid w:type="default" w:linePitch="100" w:charSpace="0"/>
@@ -5267,7 +6043,7 @@
         <w:sectPr>
           <w:type w:val="continuous"/>
           <w:pgSz w:w="11906" w:h="16838"/>
-          <w:pgMar w:left="1134" w:right="1134" w:gutter="0" w:header="0" w:top="1134" w:footer="0" w:bottom="1134"/>
+          <w:pgMar w:left="1134" w:right="1134" w:gutter="0" w:header="0" w:top="1134" w:footer="1134" w:bottom="1693"/>
           <w:formProt w:val="false"/>
           <w:textDirection w:val="lrTb"/>
           <w:docGrid w:type="default" w:linePitch="100" w:charSpace="0"/>
@@ -5281,8 +6057,8 @@
         <w:ind w:hanging="0" w:start="0" w:end="0"/>
         <w:rPr/>
       </w:pPr>
-      <w:bookmarkStart w:id="18" w:name="code-block-viewer_Copy_15"/>
-      <w:bookmarkEnd w:id="18"/>
+      <w:bookmarkStart w:id="32" w:name="code-block-viewer_Copy_15"/>
+      <w:bookmarkEnd w:id="32"/>
       <w:r>
         <w:rPr>
           <w:rStyle w:val="SourceText"/>
@@ -5295,7 +6071,7 @@
         <w:sectPr>
           <w:type w:val="continuous"/>
           <w:pgSz w:w="11906" w:h="16838"/>
-          <w:pgMar w:left="1134" w:right="1134" w:gutter="0" w:header="0" w:top="1134" w:footer="0" w:bottom="1134"/>
+          <w:pgMar w:left="1134" w:right="1134" w:gutter="0" w:header="0" w:top="1134" w:footer="1134" w:bottom="1693"/>
           <w:formProt w:val="false"/>
           <w:textDirection w:val="lrTb"/>
           <w:docGrid w:type="default" w:linePitch="100" w:charSpace="0"/>
@@ -5317,7 +6093,7 @@
         <w:sectPr>
           <w:type w:val="continuous"/>
           <w:pgSz w:w="11906" w:h="16838"/>
-          <w:pgMar w:left="1134" w:right="1134" w:gutter="0" w:header="0" w:top="1134" w:footer="0" w:bottom="1134"/>
+          <w:pgMar w:left="1134" w:right="1134" w:gutter="0" w:header="0" w:top="1134" w:footer="1134" w:bottom="1693"/>
           <w:formProt w:val="false"/>
           <w:textDirection w:val="lrTb"/>
           <w:docGrid w:type="default" w:linePitch="100" w:charSpace="0"/>
@@ -5330,8 +6106,8 @@
         <w:ind w:hanging="0" w:start="0" w:end="0"/>
         <w:rPr/>
       </w:pPr>
-      <w:bookmarkStart w:id="19" w:name="code-block-viewer_Copy_16"/>
-      <w:bookmarkEnd w:id="19"/>
+      <w:bookmarkStart w:id="33" w:name="code-block-viewer_Copy_16"/>
+      <w:bookmarkEnd w:id="33"/>
       <w:r>
         <w:rPr>
           <w:rStyle w:val="SourceText"/>
@@ -5369,7 +6145,7 @@
         <w:sectPr>
           <w:type w:val="continuous"/>
           <w:pgSz w:w="11906" w:h="16838"/>
-          <w:pgMar w:left="1134" w:right="1134" w:gutter="0" w:header="0" w:top="1134" w:footer="0" w:bottom="1134"/>
+          <w:pgMar w:left="1134" w:right="1134" w:gutter="0" w:header="0" w:top="1134" w:footer="1134" w:bottom="1693"/>
           <w:formProt w:val="false"/>
           <w:textDirection w:val="lrTb"/>
           <w:docGrid w:type="default" w:linePitch="100" w:charSpace="0"/>
@@ -5478,6 +6254,8 @@
         <w:ind w:hanging="0" w:start="0"/>
         <w:rPr/>
       </w:pPr>
+      <w:bookmarkStart w:id="34" w:name="__RefHeading___Toc1359_1846826748"/>
+      <w:bookmarkEnd w:id="34"/>
       <w:r>
         <w:rPr/>
         <w:t>Multiplexer (MUX)</w:t>
@@ -5536,7 +6314,7 @@
                     </pic:cNvPicPr>
                   </pic:nvPicPr>
                   <pic:blipFill>
-                    <a:blip r:embed="rId7"/>
+                    <a:blip r:embed="rId8"/>
                     <a:stretch>
                       <a:fillRect/>
                     </a:stretch>
@@ -5567,6 +6345,8 @@
         <w:ind w:hanging="0" w:start="0"/>
         <w:rPr/>
       </w:pPr>
+      <w:bookmarkStart w:id="35" w:name="__RefHeading___Toc1361_1846826748"/>
+      <w:bookmarkEnd w:id="35"/>
       <w:r>
         <w:rPr/>
         <w:t>Mạch mutiplexer 2:1 - MUX2</w:t>
@@ -5623,7 +6403,7 @@
                     </pic:cNvPicPr>
                   </pic:nvPicPr>
                   <pic:blipFill>
-                    <a:blip r:embed="rId8"/>
+                    <a:blip r:embed="rId9"/>
                     <a:stretch>
                       <a:fillRect/>
                     </a:stretch>
@@ -5659,7 +6439,7 @@
         <w:sectPr>
           <w:type w:val="continuous"/>
           <w:pgSz w:w="11906" w:h="16838"/>
-          <w:pgMar w:left="1134" w:right="1134" w:gutter="0" w:header="0" w:top="1134" w:footer="0" w:bottom="1134"/>
+          <w:pgMar w:left="1134" w:right="1134" w:gutter="0" w:header="0" w:top="1134" w:footer="1134" w:bottom="1693"/>
           <w:formProt w:val="false"/>
           <w:textDirection w:val="lrTb"/>
           <w:docGrid w:type="default" w:linePitch="100" w:charSpace="0"/>
@@ -5697,7 +6477,7 @@
         <w:sectPr>
           <w:type w:val="continuous"/>
           <w:pgSz w:w="11906" w:h="16838"/>
-          <w:pgMar w:left="1134" w:right="1134" w:gutter="0" w:header="0" w:top="1134" w:footer="0" w:bottom="1134"/>
+          <w:pgMar w:left="1134" w:right="1134" w:gutter="0" w:header="0" w:top="1134" w:footer="1134" w:bottom="1693"/>
           <w:formProt w:val="false"/>
           <w:textDirection w:val="lrTb"/>
           <w:docGrid w:type="default" w:linePitch="100" w:charSpace="0"/>
@@ -5719,7 +6499,7 @@
         <w:sectPr>
           <w:type w:val="continuous"/>
           <w:pgSz w:w="11906" w:h="16838"/>
-          <w:pgMar w:left="1134" w:right="1134" w:gutter="0" w:header="0" w:top="1134" w:footer="0" w:bottom="1134"/>
+          <w:pgMar w:left="1134" w:right="1134" w:gutter="0" w:header="0" w:top="1134" w:footer="1134" w:bottom="1693"/>
           <w:formProt w:val="false"/>
           <w:textDirection w:val="lrTb"/>
           <w:docGrid w:type="default" w:linePitch="100" w:charSpace="0"/>
@@ -5733,8 +6513,8 @@
         <w:ind w:hanging="0" w:start="0" w:end="0"/>
         <w:rPr/>
       </w:pPr>
-      <w:bookmarkStart w:id="20" w:name="code-block-viewer_Copy_3_Copy_1_Copy_1"/>
-      <w:bookmarkEnd w:id="20"/>
+      <w:bookmarkStart w:id="36" w:name="code-block-viewer_Copy_3_Copy_1_Copy_1"/>
+      <w:bookmarkEnd w:id="36"/>
       <w:r>
         <w:rPr>
           <w:rStyle w:val="SourceText"/>
@@ -5747,7 +6527,7 @@
         <w:sectPr>
           <w:type w:val="continuous"/>
           <w:pgSz w:w="11906" w:h="16838"/>
-          <w:pgMar w:left="1134" w:right="1134" w:gutter="0" w:header="0" w:top="1134" w:footer="0" w:bottom="1134"/>
+          <w:pgMar w:left="1134" w:right="1134" w:gutter="0" w:header="0" w:top="1134" w:footer="1134" w:bottom="1693"/>
           <w:formProt w:val="false"/>
           <w:textDirection w:val="lrTb"/>
           <w:docGrid w:type="default" w:linePitch="100" w:charSpace="0"/>
@@ -5769,7 +6549,7 @@
         <w:sectPr>
           <w:type w:val="continuous"/>
           <w:pgSz w:w="11906" w:h="16838"/>
-          <w:pgMar w:left="1134" w:right="1134" w:gutter="0" w:header="0" w:top="1134" w:footer="0" w:bottom="1134"/>
+          <w:pgMar w:left="1134" w:right="1134" w:gutter="0" w:header="0" w:top="1134" w:footer="1134" w:bottom="1693"/>
           <w:formProt w:val="false"/>
           <w:textDirection w:val="lrTb"/>
           <w:docGrid w:type="default" w:linePitch="100" w:charSpace="0"/>
@@ -5783,8 +6563,8 @@
         <w:ind w:hanging="0" w:start="0" w:end="0"/>
         <w:rPr/>
       </w:pPr>
-      <w:bookmarkStart w:id="21" w:name="code-block-viewer_Copy_4_Copy_1"/>
-      <w:bookmarkEnd w:id="21"/>
+      <w:bookmarkStart w:id="37" w:name="code-block-viewer_Copy_4_Copy_1"/>
+      <w:bookmarkEnd w:id="37"/>
       <w:r>
         <w:rPr>
           <w:rStyle w:val="SourceText"/>
@@ -5797,7 +6577,7 @@
         <w:sectPr>
           <w:type w:val="continuous"/>
           <w:pgSz w:w="11906" w:h="16838"/>
-          <w:pgMar w:left="1134" w:right="1134" w:gutter="0" w:header="0" w:top="1134" w:footer="0" w:bottom="1134"/>
+          <w:pgMar w:left="1134" w:right="1134" w:gutter="0" w:header="0" w:top="1134" w:footer="1134" w:bottom="1693"/>
           <w:formProt w:val="false"/>
           <w:textDirection w:val="lrTb"/>
           <w:docGrid w:type="default" w:linePitch="100" w:charSpace="0"/>
@@ -5814,6 +6594,8 @@
         <w:ind w:hanging="0" w:start="0"/>
         <w:rPr/>
       </w:pPr>
+      <w:bookmarkStart w:id="38" w:name="__RefHeading___Toc1363_1846826748"/>
+      <w:bookmarkEnd w:id="38"/>
       <w:r>
         <w:rPr/>
         <w:t>Tại sao TCAM cần MUX?</w:t>
@@ -5834,7 +6616,7 @@
         <w:sectPr>
           <w:type w:val="continuous"/>
           <w:pgSz w:w="11906" w:h="16838"/>
-          <w:pgMar w:left="1134" w:right="1134" w:gutter="0" w:header="0" w:top="1134" w:footer="0" w:bottom="1134"/>
+          <w:pgMar w:left="1134" w:right="1134" w:gutter="0" w:header="0" w:top="1134" w:footer="1134" w:bottom="1693"/>
           <w:formProt w:val="false"/>
           <w:textDirection w:val="lrTb"/>
           <w:docGrid w:type="default" w:linePitch="100" w:charSpace="0"/>
@@ -5847,8 +6629,8 @@
         <w:ind w:hanging="0" w:start="0" w:end="0"/>
         <w:rPr/>
       </w:pPr>
-      <w:bookmarkStart w:id="22" w:name="code-block-viewer_Copy_5_Copy_1_Copy_1"/>
-      <w:bookmarkEnd w:id="22"/>
+      <w:bookmarkStart w:id="39" w:name="code-block-viewer_Copy_5_Copy_1_Copy_1"/>
+      <w:bookmarkEnd w:id="39"/>
       <w:r>
         <w:rPr>
           <w:rStyle w:val="SourceText"/>
@@ -5898,7 +6680,7 @@
         <w:sectPr>
           <w:type w:val="continuous"/>
           <w:pgSz w:w="11906" w:h="16838"/>
-          <w:pgMar w:left="1134" w:right="1134" w:gutter="0" w:header="0" w:top="1134" w:footer="0" w:bottom="1134"/>
+          <w:pgMar w:left="1134" w:right="1134" w:gutter="0" w:header="0" w:top="1134" w:footer="1134" w:bottom="1693"/>
           <w:formProt w:val="false"/>
           <w:textDirection w:val="lrTb"/>
           <w:docGrid w:type="default" w:linePitch="100" w:charSpace="0"/>
@@ -5940,7 +6722,7 @@
         <w:sectPr>
           <w:type w:val="continuous"/>
           <w:pgSz w:w="11906" w:h="16838"/>
-          <w:pgMar w:left="1134" w:right="1134" w:gutter="0" w:header="0" w:top="1134" w:footer="0" w:bottom="1134"/>
+          <w:pgMar w:left="1134" w:right="1134" w:gutter="0" w:header="0" w:top="1134" w:footer="1134" w:bottom="1693"/>
           <w:formProt w:val="false"/>
           <w:textDirection w:val="lrTb"/>
           <w:docGrid w:type="default" w:linePitch="100" w:charSpace="0"/>
@@ -5953,8 +6735,8 @@
         <w:ind w:hanging="0" w:start="0" w:end="0"/>
         <w:rPr/>
       </w:pPr>
-      <w:bookmarkStart w:id="23" w:name="code-block-viewer_Copy_6_Copy_1"/>
-      <w:bookmarkEnd w:id="23"/>
+      <w:bookmarkStart w:id="40" w:name="code-block-viewer_Copy_6_Copy_1"/>
+      <w:bookmarkEnd w:id="40"/>
       <w:r>
         <w:rPr>
           <w:rStyle w:val="SourceText"/>
@@ -6058,9 +6840,9 @@
       <w:r>
         <w:rPr/>
       </w:r>
-      <w:bookmarkStart w:id="24" w:name="code-block-viewer_Copy_7_Copy_1"/>
-      <w:bookmarkStart w:id="25" w:name="code-block-viewer_Copy_7_Copy_1"/>
-      <w:bookmarkEnd w:id="25"/>
+      <w:bookmarkStart w:id="41" w:name="code-block-viewer_Copy_7_Copy_1"/>
+      <w:bookmarkStart w:id="42" w:name="code-block-viewer_Copy_7_Copy_1"/>
+      <w:bookmarkEnd w:id="42"/>
     </w:p>
     <w:p>
       <w:pPr>
@@ -6099,7 +6881,7 @@
         <w:sectPr>
           <w:type w:val="continuous"/>
           <w:pgSz w:w="11906" w:h="16838"/>
-          <w:pgMar w:left="1134" w:right="1134" w:gutter="0" w:header="0" w:top="1134" w:footer="0" w:bottom="1134"/>
+          <w:pgMar w:left="1134" w:right="1134" w:gutter="0" w:header="0" w:top="1134" w:footer="1134" w:bottom="1693"/>
           <w:formProt w:val="false"/>
           <w:textDirection w:val="lrTb"/>
           <w:docGrid w:type="default" w:linePitch="100" w:charSpace="0"/>
@@ -6112,8 +6894,8 @@
         <w:ind w:hanging="0" w:start="0" w:end="0"/>
         <w:rPr/>
       </w:pPr>
-      <w:bookmarkStart w:id="26" w:name="code-block-viewer_Copy_8_Copy_1"/>
-      <w:bookmarkEnd w:id="26"/>
+      <w:bookmarkStart w:id="43" w:name="code-block-viewer_Copy_8_Copy_1"/>
+      <w:bookmarkEnd w:id="43"/>
       <w:r>
         <w:rPr>
           <w:rStyle w:val="SourceText"/>
@@ -6163,7 +6945,7 @@
         <w:sectPr>
           <w:type w:val="continuous"/>
           <w:pgSz w:w="11906" w:h="16838"/>
-          <w:pgMar w:left="1134" w:right="1134" w:gutter="0" w:header="0" w:top="1134" w:footer="0" w:bottom="1134"/>
+          <w:pgMar w:left="1134" w:right="1134" w:gutter="0" w:header="0" w:top="1134" w:footer="1134" w:bottom="1693"/>
           <w:formProt w:val="false"/>
           <w:textDirection w:val="lrTb"/>
           <w:docGrid w:type="default" w:linePitch="100" w:charSpace="0"/>
@@ -6180,6 +6962,8 @@
         <w:ind w:hanging="0" w:start="0"/>
         <w:rPr/>
       </w:pPr>
+      <w:bookmarkStart w:id="44" w:name="__RefHeading___Toc1365_1846826748"/>
+      <w:bookmarkEnd w:id="44"/>
       <w:r>
         <w:rPr>
           <w:rStyle w:val="SourceText"/>
@@ -6208,7 +6992,7 @@
         <w:sectPr>
           <w:type w:val="continuous"/>
           <w:pgSz w:w="11906" w:h="16838"/>
-          <w:pgMar w:left="1134" w:right="1134" w:gutter="0" w:header="0" w:top="1134" w:footer="0" w:bottom="1134"/>
+          <w:pgMar w:left="1134" w:right="1134" w:gutter="0" w:header="0" w:top="1134" w:footer="1134" w:bottom="1693"/>
           <w:formProt w:val="false"/>
           <w:textDirection w:val="lrTb"/>
           <w:docGrid w:type="default" w:linePitch="100" w:charSpace="0"/>
@@ -6221,8 +7005,8 @@
         <w:ind w:hanging="0" w:start="0" w:end="0"/>
         <w:rPr/>
       </w:pPr>
-      <w:bookmarkStart w:id="27" w:name="code-block-viewer_Copy_9_Copy_1"/>
-      <w:bookmarkEnd w:id="27"/>
+      <w:bookmarkStart w:id="45" w:name="code-block-viewer_Copy_9_Copy_1"/>
+      <w:bookmarkEnd w:id="45"/>
       <w:r>
         <w:rPr>
           <w:rStyle w:val="SourceText"/>
@@ -6272,7 +7056,7 @@
         <w:sectPr>
           <w:type w:val="continuous"/>
           <w:pgSz w:w="11906" w:h="16838"/>
-          <w:pgMar w:left="1134" w:right="1134" w:gutter="0" w:header="0" w:top="1134" w:footer="0" w:bottom="1134"/>
+          <w:pgMar w:left="1134" w:right="1134" w:gutter="0" w:header="0" w:top="1134" w:footer="1134" w:bottom="1693"/>
           <w:formProt w:val="false"/>
           <w:textDirection w:val="lrTb"/>
           <w:docGrid w:type="default" w:linePitch="100" w:charSpace="0"/>
@@ -6318,6 +7102,8 @@
         <w:ind w:hanging="0" w:start="0"/>
         <w:rPr/>
       </w:pPr>
+      <w:bookmarkStart w:id="46" w:name="__RefHeading___Toc1367_1846826748"/>
+      <w:bookmarkEnd w:id="46"/>
       <w:r>
         <w:rPr/>
         <w:t xml:space="preserve"> </w:t>
@@ -6342,7 +7128,7 @@
         <w:sectPr>
           <w:type w:val="continuous"/>
           <w:pgSz w:w="11906" w:h="16838"/>
-          <w:pgMar w:left="1134" w:right="1134" w:gutter="0" w:header="0" w:top="1134" w:footer="0" w:bottom="1134"/>
+          <w:pgMar w:left="1134" w:right="1134" w:gutter="0" w:header="0" w:top="1134" w:footer="1134" w:bottom="1693"/>
           <w:formProt w:val="false"/>
           <w:textDirection w:val="lrTb"/>
           <w:docGrid w:type="default" w:linePitch="100" w:charSpace="0"/>
@@ -6355,8 +7141,8 @@
         <w:ind w:hanging="0" w:start="0" w:end="0"/>
         <w:rPr/>
       </w:pPr>
-      <w:bookmarkStart w:id="28" w:name="code-block-viewer_Copy_10_Copy_1"/>
-      <w:bookmarkEnd w:id="28"/>
+      <w:bookmarkStart w:id="47" w:name="code-block-viewer_Copy_10_Copy_1"/>
+      <w:bookmarkEnd w:id="47"/>
       <w:r>
         <w:rPr>
           <w:rStyle w:val="SourceText"/>
@@ -6394,7 +7180,7 @@
         <w:sectPr>
           <w:type w:val="continuous"/>
           <w:pgSz w:w="11906" w:h="16838"/>
-          <w:pgMar w:left="1134" w:right="1134" w:gutter="0" w:header="0" w:top="1134" w:footer="0" w:bottom="1134"/>
+          <w:pgMar w:left="1134" w:right="1134" w:gutter="0" w:header="0" w:top="1134" w:footer="1134" w:bottom="1693"/>
           <w:formProt w:val="false"/>
           <w:textDirection w:val="lrTb"/>
           <w:docGrid w:type="default" w:linePitch="100" w:charSpace="0"/>
@@ -6431,6 +7217,8 @@
         <w:ind w:hanging="0" w:start="0"/>
         <w:rPr/>
       </w:pPr>
+      <w:bookmarkStart w:id="48" w:name="__RefHeading___Toc1369_1846826748"/>
+      <w:bookmarkEnd w:id="48"/>
       <w:r>
         <w:rPr>
           <w:rStyle w:val="SourceText"/>
@@ -6491,7 +7279,7 @@
                     </pic:cNvPicPr>
                   </pic:nvPicPr>
                   <pic:blipFill>
-                    <a:blip r:embed="rId9"/>
+                    <a:blip r:embed="rId10"/>
                     <a:stretch>
                       <a:fillRect/>
                     </a:stretch>
@@ -6529,6 +7317,8 @@
           <w:u w:val="single"/>
         </w:rPr>
       </w:pPr>
+      <w:bookmarkStart w:id="49" w:name="__RefHeading___Toc1371_1846826748"/>
+      <w:bookmarkEnd w:id="49"/>
       <w:r>
         <w:rPr>
           <w:u w:val="single"/>
@@ -6610,7 +7400,7 @@
         <w:sectPr>
           <w:type w:val="continuous"/>
           <w:pgSz w:w="11906" w:h="16838"/>
-          <w:pgMar w:left="1134" w:right="1134" w:gutter="0" w:header="0" w:top="1134" w:footer="0" w:bottom="1134"/>
+          <w:pgMar w:left="1134" w:right="1134" w:gutter="0" w:header="0" w:top="1134" w:footer="1134" w:bottom="1693"/>
           <w:formProt w:val="false"/>
           <w:textDirection w:val="lrTb"/>
           <w:docGrid w:type="default" w:linePitch="100" w:charSpace="0"/>
@@ -6640,7 +7430,7 @@
         <w:sectPr>
           <w:type w:val="continuous"/>
           <w:pgSz w:w="11906" w:h="16838"/>
-          <w:pgMar w:left="1134" w:right="1134" w:gutter="0" w:header="0" w:top="1134" w:footer="0" w:bottom="1134"/>
+          <w:pgMar w:left="1134" w:right="1134" w:gutter="0" w:header="0" w:top="1134" w:footer="1134" w:bottom="1693"/>
           <w:formProt w:val="false"/>
           <w:textDirection w:val="lrTb"/>
           <w:docGrid w:type="default" w:linePitch="100" w:charSpace="0"/>
@@ -6654,6 +7444,8 @@
           <w:u w:val="single"/>
         </w:rPr>
       </w:pPr>
+      <w:bookmarkStart w:id="50" w:name="__RefHeading___Toc1373_1846826748"/>
+      <w:bookmarkEnd w:id="50"/>
       <w:r>
         <w:rPr>
           <w:u w:val="single"/>
@@ -6735,7 +7527,7 @@
         <w:sectPr>
           <w:type w:val="continuous"/>
           <w:pgSz w:w="11906" w:h="16838"/>
-          <w:pgMar w:left="1134" w:right="1134" w:gutter="0" w:header="0" w:top="1134" w:footer="0" w:bottom="1134"/>
+          <w:pgMar w:left="1134" w:right="1134" w:gutter="0" w:header="0" w:top="1134" w:footer="1134" w:bottom="1693"/>
           <w:formProt w:val="false"/>
           <w:textDirection w:val="lrTb"/>
           <w:docGrid w:type="default" w:linePitch="100" w:charSpace="0"/>
@@ -6765,7 +7557,7 @@
         <w:sectPr>
           <w:type w:val="continuous"/>
           <w:pgSz w:w="11906" w:h="16838"/>
-          <w:pgMar w:left="1134" w:right="1134" w:gutter="0" w:header="0" w:top="1134" w:footer="0" w:bottom="1134"/>
+          <w:pgMar w:left="1134" w:right="1134" w:gutter="0" w:header="0" w:top="1134" w:footer="1134" w:bottom="1693"/>
           <w:formProt w:val="false"/>
           <w:textDirection w:val="lrTb"/>
           <w:docGrid w:type="default" w:linePitch="100" w:charSpace="0"/>
@@ -6779,6 +7571,8 @@
           <w:u w:val="single"/>
         </w:rPr>
       </w:pPr>
+      <w:bookmarkStart w:id="51" w:name="__RefHeading___Toc1375_1846826748"/>
+      <w:bookmarkEnd w:id="51"/>
       <w:r>
         <w:rPr>
           <w:u w:val="single"/>
@@ -6860,7 +7654,7 @@
         <w:sectPr>
           <w:type w:val="continuous"/>
           <w:pgSz w:w="11906" w:h="16838"/>
-          <w:pgMar w:left="1134" w:right="1134" w:gutter="0" w:header="0" w:top="1134" w:footer="0" w:bottom="1134"/>
+          <w:pgMar w:left="1134" w:right="1134" w:gutter="0" w:header="0" w:top="1134" w:footer="1134" w:bottom="1693"/>
           <w:formProt w:val="false"/>
           <w:textDirection w:val="lrTb"/>
           <w:docGrid w:type="default" w:linePitch="100" w:charSpace="0"/>
@@ -6874,8 +7668,8 @@
         <w:ind w:hanging="0" w:start="0" w:end="0"/>
         <w:rPr/>
       </w:pPr>
-      <w:bookmarkStart w:id="29" w:name="code-block-viewer_Copy_2_Copy_1_Copy_1"/>
-      <w:bookmarkEnd w:id="29"/>
+      <w:bookmarkStart w:id="52" w:name="code-block-viewer_Copy_2_Copy_1_Copy_1"/>
+      <w:bookmarkEnd w:id="52"/>
       <w:r>
         <w:rPr>
           <w:rStyle w:val="SourceText"/>
@@ -6888,7 +7682,7 @@
         <w:sectPr>
           <w:type w:val="continuous"/>
           <w:pgSz w:w="11906" w:h="16838"/>
-          <w:pgMar w:left="1134" w:right="1134" w:gutter="0" w:header="0" w:top="1134" w:footer="0" w:bottom="1134"/>
+          <w:pgMar w:left="1134" w:right="1134" w:gutter="0" w:header="0" w:top="1134" w:footer="1134" w:bottom="1693"/>
           <w:formProt w:val="false"/>
           <w:textDirection w:val="lrTb"/>
           <w:docGrid w:type="default" w:linePitch="100" w:charSpace="0"/>
@@ -6905,6 +7699,8 @@
         <w:spacing w:before="200" w:after="120"/>
         <w:rPr/>
       </w:pPr>
+      <w:bookmarkStart w:id="53" w:name="__RefHeading___Toc1377_1846826748"/>
+      <w:bookmarkEnd w:id="53"/>
       <w:r>
         <w:rPr/>
         <w:t>Đoạn này hoạt động thế nào?</w:t>
@@ -6929,7 +7725,7 @@
         <w:sectPr>
           <w:type w:val="continuous"/>
           <w:pgSz w:w="11906" w:h="16838"/>
-          <w:pgMar w:left="1134" w:right="1134" w:gutter="0" w:header="0" w:top="1134" w:footer="0" w:bottom="1134"/>
+          <w:pgMar w:left="1134" w:right="1134" w:gutter="0" w:header="0" w:top="1134" w:footer="1134" w:bottom="1693"/>
           <w:formProt w:val="false"/>
           <w:textDirection w:val="lrTb"/>
           <w:docGrid w:type="default" w:linePitch="100" w:charSpace="0"/>
@@ -7026,7 +7822,7 @@
         <w:sectPr>
           <w:type w:val="continuous"/>
           <w:pgSz w:w="11906" w:h="16838"/>
-          <w:pgMar w:left="1134" w:right="1134" w:gutter="0" w:header="0" w:top="1134" w:footer="0" w:bottom="1134"/>
+          <w:pgMar w:left="1134" w:right="1134" w:gutter="0" w:header="0" w:top="1134" w:footer="1134" w:bottom="1693"/>
           <w:formProt w:val="false"/>
           <w:textDirection w:val="lrTb"/>
           <w:docGrid w:type="default" w:linePitch="100" w:charSpace="0"/>
@@ -7050,7 +7846,7 @@
         <w:sectPr>
           <w:type w:val="continuous"/>
           <w:pgSz w:w="11906" w:h="16838"/>
-          <w:pgMar w:left="1134" w:right="1134" w:gutter="0" w:header="0" w:top="1134" w:footer="0" w:bottom="1134"/>
+          <w:pgMar w:left="1134" w:right="1134" w:gutter="0" w:header="0" w:top="1134" w:footer="1134" w:bottom="1693"/>
           <w:formProt w:val="false"/>
           <w:textDirection w:val="lrTb"/>
           <w:docGrid w:type="default" w:linePitch="100" w:charSpace="0"/>
@@ -7063,8 +7859,8 @@
         <w:ind w:hanging="0" w:start="0" w:end="0"/>
         <w:rPr/>
       </w:pPr>
-      <w:bookmarkStart w:id="30" w:name="code-block-viewer_Copy_1_Copy_1"/>
-      <w:bookmarkEnd w:id="30"/>
+      <w:bookmarkStart w:id="54" w:name="code-block-viewer_Copy_1_Copy_1_Copy_1"/>
+      <w:bookmarkEnd w:id="54"/>
       <w:r>
         <w:rPr>
           <w:rStyle w:val="SourceText"/>
@@ -7114,7 +7910,7 @@
         <w:sectPr>
           <w:type w:val="continuous"/>
           <w:pgSz w:w="11906" w:h="16838"/>
-          <w:pgMar w:left="1134" w:right="1134" w:gutter="0" w:header="0" w:top="1134" w:footer="0" w:bottom="1134"/>
+          <w:pgMar w:left="1134" w:right="1134" w:gutter="0" w:header="0" w:top="1134" w:footer="1134" w:bottom="1693"/>
           <w:formProt w:val="false"/>
           <w:textDirection w:val="lrTb"/>
           <w:docGrid w:type="default" w:linePitch="100" w:charSpace="0"/>
@@ -7136,6 +7932,8 @@
         <w:pStyle w:val="Heading3"/>
         <w:rPr/>
       </w:pPr>
+      <w:bookmarkStart w:id="55" w:name="__RefHeading___Toc1379_1846826748"/>
+      <w:bookmarkEnd w:id="55"/>
       <w:r>
         <w:rPr/>
         <w:t>Lần 1</w:t>
@@ -7146,7 +7944,7 @@
         <w:sectPr>
           <w:type w:val="continuous"/>
           <w:pgSz w:w="11906" w:h="16838"/>
-          <w:pgMar w:left="1134" w:right="1134" w:gutter="0" w:header="0" w:top="1134" w:footer="0" w:bottom="1134"/>
+          <w:pgMar w:left="1134" w:right="1134" w:gutter="0" w:header="0" w:top="1134" w:footer="1134" w:bottom="1693"/>
           <w:formProt w:val="false"/>
           <w:textDirection w:val="lrTb"/>
           <w:docGrid w:type="default" w:linePitch="100" w:charSpace="0"/>
@@ -7160,8 +7958,8 @@
         <w:ind w:hanging="0" w:start="0" w:end="0"/>
         <w:rPr/>
       </w:pPr>
-      <w:bookmarkStart w:id="31" w:name="code-block-viewer_Copy_2_Copy_1"/>
-      <w:bookmarkEnd w:id="31"/>
+      <w:bookmarkStart w:id="56" w:name="code-block-viewer_Copy_2_Copy_1_Copy_1"/>
+      <w:bookmarkEnd w:id="56"/>
       <w:r>
         <w:rPr>
           <w:rStyle w:val="SourceText"/>
@@ -7174,7 +7972,7 @@
         <w:sectPr>
           <w:type w:val="continuous"/>
           <w:pgSz w:w="11906" w:h="16838"/>
-          <w:pgMar w:left="1134" w:right="1134" w:gutter="0" w:header="0" w:top="1134" w:footer="0" w:bottom="1134"/>
+          <w:pgMar w:left="1134" w:right="1134" w:gutter="0" w:header="0" w:top="1134" w:footer="1134" w:bottom="1693"/>
           <w:formProt w:val="false"/>
           <w:textDirection w:val="lrTb"/>
           <w:docGrid w:type="default" w:linePitch="100" w:charSpace="0"/>
@@ -7187,8 +7985,8 @@
         <w:ind w:hanging="0" w:start="0" w:end="0"/>
         <w:rPr/>
       </w:pPr>
-      <w:bookmarkStart w:id="32" w:name="code-block-viewer_Copy_3_Copy_1"/>
-      <w:bookmarkEnd w:id="32"/>
+      <w:bookmarkStart w:id="57" w:name="code-block-viewer_Copy_3_Copy_1_Copy_1"/>
+      <w:bookmarkEnd w:id="57"/>
       <w:r>
         <w:rPr>
           <w:rStyle w:val="SourceText"/>
@@ -7214,7 +8012,7 @@
         <w:sectPr>
           <w:type w:val="continuous"/>
           <w:pgSz w:w="11906" w:h="16838"/>
-          <w:pgMar w:left="1134" w:right="1134" w:gutter="0" w:header="0" w:top="1134" w:footer="0" w:bottom="1134"/>
+          <w:pgMar w:left="1134" w:right="1134" w:gutter="0" w:header="0" w:top="1134" w:footer="1134" w:bottom="1693"/>
           <w:formProt w:val="false"/>
           <w:textDirection w:val="lrTb"/>
           <w:docGrid w:type="default" w:linePitch="100" w:charSpace="0"/>
@@ -7236,7 +8034,7 @@
         <w:sectPr>
           <w:type w:val="continuous"/>
           <w:pgSz w:w="11906" w:h="16838"/>
-          <w:pgMar w:left="1134" w:right="1134" w:gutter="0" w:header="0" w:top="1134" w:footer="0" w:bottom="1134"/>
+          <w:pgMar w:left="1134" w:right="1134" w:gutter="0" w:header="0" w:top="1134" w:footer="1134" w:bottom="1693"/>
           <w:formProt w:val="false"/>
           <w:textDirection w:val="lrTb"/>
           <w:docGrid w:type="default" w:linePitch="100" w:charSpace="0"/>
@@ -7250,8 +8048,8 @@
         <w:ind w:hanging="0" w:start="0" w:end="0"/>
         <w:rPr/>
       </w:pPr>
-      <w:bookmarkStart w:id="33" w:name="code-block-viewer_Copy_4_Copy_1"/>
-      <w:bookmarkEnd w:id="33"/>
+      <w:bookmarkStart w:id="58" w:name="code-block-viewer_Copy_4_Copy_1_Copy_1"/>
+      <w:bookmarkEnd w:id="58"/>
       <w:r>
         <w:rPr>
           <w:rStyle w:val="SourceText"/>
@@ -7264,7 +8062,7 @@
         <w:sectPr>
           <w:type w:val="continuous"/>
           <w:pgSz w:w="11906" w:h="16838"/>
-          <w:pgMar w:left="1134" w:right="1134" w:gutter="0" w:header="0" w:top="1134" w:footer="0" w:bottom="1134"/>
+          <w:pgMar w:left="1134" w:right="1134" w:gutter="0" w:header="0" w:top="1134" w:footer="1134" w:bottom="1693"/>
           <w:formProt w:val="false"/>
           <w:textDirection w:val="lrTb"/>
           <w:docGrid w:type="default" w:linePitch="100" w:charSpace="0"/>
@@ -7295,6 +8093,8 @@
         <w:pStyle w:val="Heading3"/>
         <w:rPr/>
       </w:pPr>
+      <w:bookmarkStart w:id="59" w:name="__RefHeading___Toc1381_1846826748"/>
+      <w:bookmarkEnd w:id="59"/>
       <w:r>
         <w:rPr/>
         <w:t>Lần 2</w:t>
@@ -7305,7 +8105,7 @@
         <w:sectPr>
           <w:type w:val="continuous"/>
           <w:pgSz w:w="11906" w:h="16838"/>
-          <w:pgMar w:left="1134" w:right="1134" w:gutter="0" w:header="0" w:top="1134" w:footer="0" w:bottom="1134"/>
+          <w:pgMar w:left="1134" w:right="1134" w:gutter="0" w:header="0" w:top="1134" w:footer="1134" w:bottom="1693"/>
           <w:formProt w:val="false"/>
           <w:textDirection w:val="lrTb"/>
           <w:docGrid w:type="default" w:linePitch="100" w:charSpace="0"/>
@@ -7319,8 +8119,8 @@
         <w:ind w:hanging="0" w:start="0" w:end="0"/>
         <w:rPr/>
       </w:pPr>
-      <w:bookmarkStart w:id="34" w:name="code-block-viewer_Copy_5_Copy_1"/>
-      <w:bookmarkEnd w:id="34"/>
+      <w:bookmarkStart w:id="60" w:name="code-block-viewer_Copy_5_Copy_1_Copy_1"/>
+      <w:bookmarkEnd w:id="60"/>
       <w:r>
         <w:rPr>
           <w:rStyle w:val="SourceText"/>
@@ -7333,7 +8133,7 @@
         <w:sectPr>
           <w:type w:val="continuous"/>
           <w:pgSz w:w="11906" w:h="16838"/>
-          <w:pgMar w:left="1134" w:right="1134" w:gutter="0" w:header="0" w:top="1134" w:footer="0" w:bottom="1134"/>
+          <w:pgMar w:left="1134" w:right="1134" w:gutter="0" w:header="0" w:top="1134" w:footer="1134" w:bottom="1693"/>
           <w:formProt w:val="false"/>
           <w:textDirection w:val="lrTb"/>
           <w:docGrid w:type="default" w:linePitch="100" w:charSpace="0"/>
@@ -7346,8 +8146,8 @@
         <w:ind w:hanging="0" w:start="0" w:end="0"/>
         <w:rPr/>
       </w:pPr>
-      <w:bookmarkStart w:id="35" w:name="code-block-viewer_Copy_6_Copy_1"/>
-      <w:bookmarkEnd w:id="35"/>
+      <w:bookmarkStart w:id="61" w:name="code-block-viewer_Copy_6_Copy_1_Copy_1"/>
+      <w:bookmarkEnd w:id="61"/>
       <w:r>
         <w:rPr>
           <w:rStyle w:val="SourceText"/>
@@ -7373,7 +8173,7 @@
         <w:sectPr>
           <w:type w:val="continuous"/>
           <w:pgSz w:w="11906" w:h="16838"/>
-          <w:pgMar w:left="1134" w:right="1134" w:gutter="0" w:header="0" w:top="1134" w:footer="0" w:bottom="1134"/>
+          <w:pgMar w:left="1134" w:right="1134" w:gutter="0" w:header="0" w:top="1134" w:footer="1134" w:bottom="1693"/>
           <w:formProt w:val="false"/>
           <w:textDirection w:val="lrTb"/>
           <w:docGrid w:type="default" w:linePitch="100" w:charSpace="0"/>
@@ -7395,7 +8195,7 @@
         <w:sectPr>
           <w:type w:val="continuous"/>
           <w:pgSz w:w="11906" w:h="16838"/>
-          <w:pgMar w:left="1134" w:right="1134" w:gutter="0" w:header="0" w:top="1134" w:footer="0" w:bottom="1134"/>
+          <w:pgMar w:left="1134" w:right="1134" w:gutter="0" w:header="0" w:top="1134" w:footer="1134" w:bottom="1693"/>
           <w:formProt w:val="false"/>
           <w:textDirection w:val="lrTb"/>
           <w:docGrid w:type="default" w:linePitch="100" w:charSpace="0"/>
@@ -7409,8 +8209,8 @@
         <w:ind w:hanging="0" w:start="0" w:end="0"/>
         <w:rPr/>
       </w:pPr>
-      <w:bookmarkStart w:id="36" w:name="code-block-viewer_Copy_7_Copy_1"/>
-      <w:bookmarkEnd w:id="36"/>
+      <w:bookmarkStart w:id="62" w:name="code-block-viewer_Copy_7_Copy_1_Copy_1"/>
+      <w:bookmarkEnd w:id="62"/>
       <w:r>
         <w:rPr>
           <w:rStyle w:val="SourceText"/>
@@ -7423,7 +8223,7 @@
         <w:sectPr>
           <w:type w:val="continuous"/>
           <w:pgSz w:w="11906" w:h="16838"/>
-          <w:pgMar w:left="1134" w:right="1134" w:gutter="0" w:header="0" w:top="1134" w:footer="0" w:bottom="1134"/>
+          <w:pgMar w:left="1134" w:right="1134" w:gutter="0" w:header="0" w:top="1134" w:footer="1134" w:bottom="1693"/>
           <w:formProt w:val="false"/>
           <w:textDirection w:val="lrTb"/>
           <w:docGrid w:type="default" w:linePitch="100" w:charSpace="0"/>
@@ -7454,6 +8254,8 @@
         <w:pStyle w:val="Heading3"/>
         <w:rPr/>
       </w:pPr>
+      <w:bookmarkStart w:id="63" w:name="__RefHeading___Toc1383_1846826748"/>
+      <w:bookmarkEnd w:id="63"/>
       <w:r>
         <w:rPr/>
         <w:t>Lần 3</w:t>
@@ -7464,7 +8266,7 @@
         <w:sectPr>
           <w:type w:val="continuous"/>
           <w:pgSz w:w="11906" w:h="16838"/>
-          <w:pgMar w:left="1134" w:right="1134" w:gutter="0" w:header="0" w:top="1134" w:footer="0" w:bottom="1134"/>
+          <w:pgMar w:left="1134" w:right="1134" w:gutter="0" w:header="0" w:top="1134" w:footer="1134" w:bottom="1693"/>
           <w:formProt w:val="false"/>
           <w:textDirection w:val="lrTb"/>
           <w:docGrid w:type="default" w:linePitch="100" w:charSpace="0"/>
@@ -7478,8 +8280,8 @@
         <w:ind w:hanging="0" w:start="0" w:end="0"/>
         <w:rPr/>
       </w:pPr>
-      <w:bookmarkStart w:id="37" w:name="code-block-viewer_Copy_8_Copy_1"/>
-      <w:bookmarkEnd w:id="37"/>
+      <w:bookmarkStart w:id="64" w:name="code-block-viewer_Copy_8_Copy_1_Copy_1"/>
+      <w:bookmarkEnd w:id="64"/>
       <w:r>
         <w:rPr>
           <w:rStyle w:val="SourceText"/>
@@ -7492,7 +8294,7 @@
         <w:sectPr>
           <w:type w:val="continuous"/>
           <w:pgSz w:w="11906" w:h="16838"/>
-          <w:pgMar w:left="1134" w:right="1134" w:gutter="0" w:header="0" w:top="1134" w:footer="0" w:bottom="1134"/>
+          <w:pgMar w:left="1134" w:right="1134" w:gutter="0" w:header="0" w:top="1134" w:footer="1134" w:bottom="1693"/>
           <w:formProt w:val="false"/>
           <w:textDirection w:val="lrTb"/>
           <w:docGrid w:type="default" w:linePitch="100" w:charSpace="0"/>
@@ -7505,8 +8307,8 @@
         <w:ind w:hanging="0" w:start="0" w:end="0"/>
         <w:rPr/>
       </w:pPr>
-      <w:bookmarkStart w:id="38" w:name="code-block-viewer_Copy_9_Copy_1"/>
-      <w:bookmarkEnd w:id="38"/>
+      <w:bookmarkStart w:id="65" w:name="code-block-viewer_Copy_9_Copy_1_Copy_1"/>
+      <w:bookmarkEnd w:id="65"/>
       <w:r>
         <w:rPr>
           <w:rStyle w:val="SourceText"/>
@@ -7532,7 +8334,7 @@
         <w:sectPr>
           <w:type w:val="continuous"/>
           <w:pgSz w:w="11906" w:h="16838"/>
-          <w:pgMar w:left="1134" w:right="1134" w:gutter="0" w:header="0" w:top="1134" w:footer="0" w:bottom="1134"/>
+          <w:pgMar w:left="1134" w:right="1134" w:gutter="0" w:header="0" w:top="1134" w:footer="1134" w:bottom="1693"/>
           <w:formProt w:val="false"/>
           <w:textDirection w:val="lrTb"/>
           <w:docGrid w:type="default" w:linePitch="100" w:charSpace="0"/>
@@ -7554,7 +8356,7 @@
         <w:sectPr>
           <w:type w:val="continuous"/>
           <w:pgSz w:w="11906" w:h="16838"/>
-          <w:pgMar w:left="1134" w:right="1134" w:gutter="0" w:header="0" w:top="1134" w:footer="0" w:bottom="1134"/>
+          <w:pgMar w:left="1134" w:right="1134" w:gutter="0" w:header="0" w:top="1134" w:footer="1134" w:bottom="1693"/>
           <w:formProt w:val="false"/>
           <w:textDirection w:val="lrTb"/>
           <w:docGrid w:type="default" w:linePitch="100" w:charSpace="0"/>
@@ -7568,8 +8370,8 @@
         <w:ind w:hanging="0" w:start="0" w:end="0"/>
         <w:rPr/>
       </w:pPr>
-      <w:bookmarkStart w:id="39" w:name="code-block-viewer_Copy_10_Copy_1"/>
-      <w:bookmarkEnd w:id="39"/>
+      <w:bookmarkStart w:id="66" w:name="code-block-viewer_Copy_10_Copy_1_Copy_1"/>
+      <w:bookmarkEnd w:id="66"/>
       <w:r>
         <w:rPr>
           <w:rStyle w:val="SourceText"/>
@@ -7582,7 +8384,7 @@
         <w:sectPr>
           <w:type w:val="continuous"/>
           <w:pgSz w:w="11906" w:h="16838"/>
-          <w:pgMar w:left="1134" w:right="1134" w:gutter="0" w:header="0" w:top="1134" w:footer="0" w:bottom="1134"/>
+          <w:pgMar w:left="1134" w:right="1134" w:gutter="0" w:header="0" w:top="1134" w:footer="1134" w:bottom="1693"/>
           <w:formProt w:val="false"/>
           <w:textDirection w:val="lrTb"/>
           <w:docGrid w:type="default" w:linePitch="100" w:charSpace="0"/>
@@ -7613,6 +8415,8 @@
         <w:pStyle w:val="Heading3"/>
         <w:rPr/>
       </w:pPr>
+      <w:bookmarkStart w:id="67" w:name="__RefHeading___Toc1385_1846826748"/>
+      <w:bookmarkEnd w:id="67"/>
       <w:r>
         <w:rPr/>
         <w:t>Lần 4</w:t>
@@ -7623,7 +8427,7 @@
         <w:sectPr>
           <w:type w:val="continuous"/>
           <w:pgSz w:w="11906" w:h="16838"/>
-          <w:pgMar w:left="1134" w:right="1134" w:gutter="0" w:header="0" w:top="1134" w:footer="0" w:bottom="1134"/>
+          <w:pgMar w:left="1134" w:right="1134" w:gutter="0" w:header="0" w:top="1134" w:footer="1134" w:bottom="1693"/>
           <w:formProt w:val="false"/>
           <w:textDirection w:val="lrTb"/>
           <w:docGrid w:type="default" w:linePitch="100" w:charSpace="0"/>
@@ -7637,8 +8441,8 @@
         <w:ind w:hanging="0" w:start="0" w:end="0"/>
         <w:rPr/>
       </w:pPr>
-      <w:bookmarkStart w:id="40" w:name="code-block-viewer_Copy_11"/>
-      <w:bookmarkEnd w:id="40"/>
+      <w:bookmarkStart w:id="68" w:name="code-block-viewer_Copy_11"/>
+      <w:bookmarkEnd w:id="68"/>
       <w:r>
         <w:rPr>
           <w:rStyle w:val="SourceText"/>
@@ -7651,7 +8455,7 @@
         <w:sectPr>
           <w:type w:val="continuous"/>
           <w:pgSz w:w="11906" w:h="16838"/>
-          <w:pgMar w:left="1134" w:right="1134" w:gutter="0" w:header="0" w:top="1134" w:footer="0" w:bottom="1134"/>
+          <w:pgMar w:left="1134" w:right="1134" w:gutter="0" w:header="0" w:top="1134" w:footer="1134" w:bottom="1693"/>
           <w:formProt w:val="false"/>
           <w:textDirection w:val="lrTb"/>
           <w:docGrid w:type="default" w:linePitch="100" w:charSpace="0"/>
@@ -7664,8 +8468,8 @@
         <w:ind w:hanging="0" w:start="0" w:end="0"/>
         <w:rPr/>
       </w:pPr>
-      <w:bookmarkStart w:id="41" w:name="code-block-viewer_Copy_12_Copy_1"/>
-      <w:bookmarkEnd w:id="41"/>
+      <w:bookmarkStart w:id="69" w:name="code-block-viewer_Copy_12_Copy_1"/>
+      <w:bookmarkEnd w:id="69"/>
       <w:r>
         <w:rPr>
           <w:rStyle w:val="SourceText"/>
@@ -7691,7 +8495,7 @@
         <w:sectPr>
           <w:type w:val="continuous"/>
           <w:pgSz w:w="11906" w:h="16838"/>
-          <w:pgMar w:left="1134" w:right="1134" w:gutter="0" w:header="0" w:top="1134" w:footer="0" w:bottom="1134"/>
+          <w:pgMar w:left="1134" w:right="1134" w:gutter="0" w:header="0" w:top="1134" w:footer="1134" w:bottom="1693"/>
           <w:formProt w:val="false"/>
           <w:textDirection w:val="lrTb"/>
           <w:docGrid w:type="default" w:linePitch="100" w:charSpace="0"/>
@@ -7713,7 +8517,7 @@
         <w:sectPr>
           <w:type w:val="continuous"/>
           <w:pgSz w:w="11906" w:h="16838"/>
-          <w:pgMar w:left="1134" w:right="1134" w:gutter="0" w:header="0" w:top="1134" w:footer="0" w:bottom="1134"/>
+          <w:pgMar w:left="1134" w:right="1134" w:gutter="0" w:header="0" w:top="1134" w:footer="1134" w:bottom="1693"/>
           <w:formProt w:val="false"/>
           <w:textDirection w:val="lrTb"/>
           <w:docGrid w:type="default" w:linePitch="100" w:charSpace="0"/>
@@ -7727,8 +8531,8 @@
         <w:ind w:hanging="0" w:start="0" w:end="0"/>
         <w:rPr/>
       </w:pPr>
-      <w:bookmarkStart w:id="42" w:name="code-block-viewer_Copy_13_Copy_1"/>
-      <w:bookmarkEnd w:id="42"/>
+      <w:bookmarkStart w:id="70" w:name="code-block-viewer_Copy_13_Copy_1"/>
+      <w:bookmarkEnd w:id="70"/>
       <w:r>
         <w:rPr>
           <w:rStyle w:val="SourceText"/>
@@ -7741,7 +8545,7 @@
         <w:sectPr>
           <w:type w:val="continuous"/>
           <w:pgSz w:w="11906" w:h="16838"/>
-          <w:pgMar w:left="1134" w:right="1134" w:gutter="0" w:header="0" w:top="1134" w:footer="0" w:bottom="1134"/>
+          <w:pgMar w:left="1134" w:right="1134" w:gutter="0" w:header="0" w:top="1134" w:footer="1134" w:bottom="1693"/>
           <w:formProt w:val="false"/>
           <w:textDirection w:val="lrTb"/>
           <w:docGrid w:type="default" w:linePitch="100" w:charSpace="0"/>
@@ -7772,6 +8576,8 @@
         <w:pStyle w:val="Heading3"/>
         <w:rPr/>
       </w:pPr>
+      <w:bookmarkStart w:id="71" w:name="__RefHeading___Toc1387_1846826748"/>
+      <w:bookmarkEnd w:id="71"/>
       <w:r>
         <w:rPr/>
         <w:t>Khi xem waveform sẽ thấy</w:t>
@@ -7782,7 +8588,7 @@
         <w:sectPr>
           <w:type w:val="continuous"/>
           <w:pgSz w:w="11906" w:h="16838"/>
-          <w:pgMar w:left="1134" w:right="1134" w:gutter="0" w:header="0" w:top="1134" w:footer="0" w:bottom="1134"/>
+          <w:pgMar w:left="1134" w:right="1134" w:gutter="0" w:header="0" w:top="1134" w:footer="1134" w:bottom="1693"/>
           <w:formProt w:val="false"/>
           <w:textDirection w:val="lrTb"/>
           <w:docGrid w:type="default" w:linePitch="100" w:charSpace="0"/>
@@ -7795,8 +8601,8 @@
         <w:ind w:hanging="0" w:start="0" w:end="0"/>
         <w:rPr/>
       </w:pPr>
-      <w:bookmarkStart w:id="43" w:name="code-block-viewer_Copy_14_Copy_1"/>
-      <w:bookmarkEnd w:id="43"/>
+      <w:bookmarkStart w:id="72" w:name="code-block-viewer_Copy_14_Copy_1"/>
+      <w:bookmarkEnd w:id="72"/>
       <w:r>
         <w:rPr>
           <w:rStyle w:val="SourceText"/>
@@ -7882,7 +8688,7 @@
         <w:sectPr>
           <w:type w:val="continuous"/>
           <w:pgSz w:w="11906" w:h="16838"/>
-          <w:pgMar w:left="1134" w:right="1134" w:gutter="0" w:header="0" w:top="1134" w:footer="0" w:bottom="1134"/>
+          <w:pgMar w:left="1134" w:right="1134" w:gutter="0" w:header="0" w:top="1134" w:footer="1134" w:bottom="1693"/>
           <w:formProt w:val="false"/>
           <w:textDirection w:val="lrTb"/>
           <w:docGrid w:type="default" w:linePitch="100" w:charSpace="0"/>
@@ -7944,7 +8750,7 @@
         <w:sectPr>
           <w:type w:val="continuous"/>
           <w:pgSz w:w="11906" w:h="16838"/>
-          <w:pgMar w:left="1134" w:right="1134" w:gutter="0" w:header="0" w:top="1134" w:footer="0" w:bottom="1134"/>
+          <w:pgMar w:left="1134" w:right="1134" w:gutter="0" w:header="0" w:top="1134" w:footer="1134" w:bottom="1693"/>
           <w:formProt w:val="false"/>
           <w:textDirection w:val="lrTb"/>
           <w:docGrid w:type="default" w:linePitch="100" w:charSpace="0"/>
@@ -7961,6 +8767,8 @@
         <w:ind w:hanging="0" w:start="0"/>
         <w:rPr/>
       </w:pPr>
+      <w:bookmarkStart w:id="73" w:name="__RefHeading___Toc1389_1846826748"/>
+      <w:bookmarkEnd w:id="73"/>
       <w:r>
         <w:rPr/>
         <w:t>Decoder</w:t>
@@ -7973,7 +8781,48 @@
       </w:pPr>
       <w:r>
         <w:rPr/>
-        <w:t>là một trong những mạch tổ hợp cơ bản cần nắm.</w:t>
+        <w:t xml:space="preserve">là một trong những mạch tổ hợp cơ bản cần nắm. </w:t>
+      </w:r>
+      <w:r>
+        <w:rPr>
+          <w:b/>
+          <w:bCs/>
+        </w:rPr>
+        <w:t>Decoder nhận một mã nhị phân n bit và kích hoạt duy nhất một trong 2</w:t>
+      </w:r>
+      <w:r>
+        <w:rPr>
+          <w:b/>
+          <w:bCs/>
+        </w:rPr>
+        <w:t>^</w:t>
+      </w:r>
+      <w:r>
+        <w:rPr>
+          <w:b/>
+          <w:bCs/>
+        </w:rPr>
+        <w:t xml:space="preserve">n đầu ra. </w:t>
+      </w:r>
+      <w:r>
+        <w:rPr>
+          <w:b/>
+          <w:bCs/>
+        </w:rPr>
+        <w:t xml:space="preserve">tức là </w:t>
+      </w:r>
+      <w:r>
+        <w:rPr>
+          <w:rStyle w:val="Strong"/>
+        </w:rPr>
+        <w:t>3 bit địa chỉ → 8 đường chọn (one-hot)</w:t>
+      </w:r>
+      <w:r>
+        <w:rPr>
+          <w:b/>
+          <w:bCs/>
+        </w:rPr>
+        <w:t>.</w:t>
       </w:r>
     </w:p>
     <w:p>
@@ -8000,9 +8849,9 @@
         </w:tblCellMar>
       </w:tblPr>
       <w:tblGrid>
-        <w:gridCol w:w="695"/>
+        <w:gridCol w:w="694"/>
         <w:gridCol w:w="853"/>
-        <w:gridCol w:w="1624"/>
+        <w:gridCol w:w="1625"/>
       </w:tblGrid>
       <w:tr>
         <w:trPr>
@@ -8010,7 +8859,7 @@
         </w:trPr>
         <w:tc>
           <w:tcPr>
-            <w:tcW w:w="695" w:type="dxa"/>
+            <w:tcW w:w="694" w:type="dxa"/>
             <w:tcBorders/>
             <w:vAlign w:val="center"/>
           </w:tcPr>
@@ -8044,7 +8893,7 @@
         </w:tc>
         <w:tc>
           <w:tcPr>
-            <w:tcW w:w="1624" w:type="dxa"/>
+            <w:tcW w:w="1625" w:type="dxa"/>
             <w:tcBorders/>
             <w:vAlign w:val="center"/>
           </w:tcPr>
@@ -8064,7 +8913,7 @@
         <w:trPr/>
         <w:tc>
           <w:tcPr>
-            <w:tcW w:w="695" w:type="dxa"/>
+            <w:tcW w:w="694" w:type="dxa"/>
             <w:tcBorders/>
             <w:vAlign w:val="center"/>
           </w:tcPr>
@@ -8098,7 +8947,7 @@
         </w:tc>
         <w:tc>
           <w:tcPr>
-            <w:tcW w:w="1624" w:type="dxa"/>
+            <w:tcW w:w="1625" w:type="dxa"/>
             <w:tcBorders/>
             <w:vAlign w:val="center"/>
           </w:tcPr>
@@ -8118,7 +8967,7 @@
         <w:trPr/>
         <w:tc>
           <w:tcPr>
-            <w:tcW w:w="695" w:type="dxa"/>
+            <w:tcW w:w="694" w:type="dxa"/>
             <w:tcBorders/>
             <w:vAlign w:val="center"/>
           </w:tcPr>
@@ -8152,7 +9001,7 @@
         </w:tc>
         <w:tc>
           <w:tcPr>
-            <w:tcW w:w="1624" w:type="dxa"/>
+            <w:tcW w:w="1625" w:type="dxa"/>
             <w:tcBorders/>
             <w:vAlign w:val="center"/>
           </w:tcPr>
@@ -8172,7 +9021,7 @@
         <w:trPr/>
         <w:tc>
           <w:tcPr>
-            <w:tcW w:w="695" w:type="dxa"/>
+            <w:tcW w:w="694" w:type="dxa"/>
             <w:tcBorders/>
             <w:vAlign w:val="center"/>
           </w:tcPr>
@@ -8206,7 +9055,7 @@
         </w:tc>
         <w:tc>
           <w:tcPr>
-            <w:tcW w:w="1624" w:type="dxa"/>
+            <w:tcW w:w="1625" w:type="dxa"/>
             <w:tcBorders/>
             <w:vAlign w:val="center"/>
           </w:tcPr>
@@ -8226,7 +9075,7 @@
         <w:trPr/>
         <w:tc>
           <w:tcPr>
-            <w:tcW w:w="695" w:type="dxa"/>
+            <w:tcW w:w="694" w:type="dxa"/>
             <w:tcBorders/>
             <w:vAlign w:val="center"/>
           </w:tcPr>
@@ -8260,7 +9109,7 @@
         </w:tc>
         <w:tc>
           <w:tcPr>
-            <w:tcW w:w="1624" w:type="dxa"/>
+            <w:tcW w:w="1625" w:type="dxa"/>
             <w:tcBorders/>
             <w:vAlign w:val="center"/>
           </w:tcPr>
@@ -8280,7 +9129,7 @@
         <w:trPr/>
         <w:tc>
           <w:tcPr>
-            <w:tcW w:w="695" w:type="dxa"/>
+            <w:tcW w:w="694" w:type="dxa"/>
             <w:tcBorders/>
             <w:vAlign w:val="center"/>
           </w:tcPr>
@@ -8314,7 +9163,7 @@
         </w:tc>
         <w:tc>
           <w:tcPr>
-            <w:tcW w:w="1624" w:type="dxa"/>
+            <w:tcW w:w="1625" w:type="dxa"/>
             <w:tcBorders/>
             <w:vAlign w:val="center"/>
           </w:tcPr>
@@ -8385,10 +9234,10 @@
       <w:tblGrid>
         <w:gridCol w:w="1606"/>
         <w:gridCol w:w="1606"/>
+        <w:gridCol w:w="1606"/>
         <w:gridCol w:w="1607"/>
         <w:gridCol w:w="1606"/>
         <w:gridCol w:w="1606"/>
-        <w:gridCol w:w="1607"/>
       </w:tblGrid>
       <w:tr>
         <w:trPr/>
@@ -8434,6 +9283,26 @@
         </w:tc>
         <w:tc>
           <w:tcPr>
+            <w:tcW w:w="1606" w:type="dxa"/>
+            <w:tcBorders>
+              <w:top w:val="single" w:sz="4" w:space="0" w:color="000000"/>
+              <w:start w:val="single" w:sz="4" w:space="0" w:color="000000"/>
+              <w:bottom w:val="single" w:sz="4" w:space="0" w:color="000000"/>
+            </w:tcBorders>
+          </w:tcPr>
+          <w:p>
+            <w:pPr>
+              <w:pStyle w:val="TableHeading"/>
+              <w:rPr/>
+            </w:pPr>
+            <w:r>
+              <w:rPr/>
+              <w:t>Y3</w:t>
+            </w:r>
+          </w:p>
+        </w:tc>
+        <w:tc>
+          <w:tcPr>
             <w:tcW w:w="1607" w:type="dxa"/>
             <w:tcBorders>
               <w:top w:val="single" w:sz="4" w:space="0" w:color="000000"/>
@@ -8448,7 +9317,7 @@
             </w:pPr>
             <w:r>
               <w:rPr/>
-              <w:t>Y3</w:t>
+              <w:t>Y2</w:t>
             </w:r>
           </w:p>
         </w:tc>
@@ -8468,33 +9337,13 @@
             </w:pPr>
             <w:r>
               <w:rPr/>
-              <w:t>Y2</w:t>
+              <w:t>Y1</w:t>
             </w:r>
           </w:p>
         </w:tc>
         <w:tc>
           <w:tcPr>
             <w:tcW w:w="1606" w:type="dxa"/>
-            <w:tcBorders>
-              <w:top w:val="single" w:sz="4" w:space="0" w:color="000000"/>
-              <w:start w:val="single" w:sz="4" w:space="0" w:color="000000"/>
-              <w:bottom w:val="single" w:sz="4" w:space="0" w:color="000000"/>
-            </w:tcBorders>
-          </w:tcPr>
-          <w:p>
-            <w:pPr>
-              <w:pStyle w:val="TableHeading"/>
-              <w:rPr/>
-            </w:pPr>
-            <w:r>
-              <w:rPr/>
-              <w:t>Y1</w:t>
-            </w:r>
-          </w:p>
-        </w:tc>
-        <w:tc>
-          <w:tcPr>
-            <w:tcW w:w="1607" w:type="dxa"/>
             <w:tcBorders>
               <w:top w:val="single" w:sz="4" w:space="0" w:color="000000"/>
               <w:start w:val="single" w:sz="4" w:space="0" w:color="000000"/>
@@ -8556,6 +9405,25 @@
         </w:tc>
         <w:tc>
           <w:tcPr>
+            <w:tcW w:w="1606" w:type="dxa"/>
+            <w:tcBorders>
+              <w:start w:val="single" w:sz="4" w:space="0" w:color="000000"/>
+              <w:bottom w:val="single" w:sz="4" w:space="0" w:color="000000"/>
+            </w:tcBorders>
+          </w:tcPr>
+          <w:p>
+            <w:pPr>
+              <w:pStyle w:val="TableContents"/>
+              <w:rPr/>
+            </w:pPr>
+            <w:r>
+              <w:rPr/>
+              <w:t>0</w:t>
+            </w:r>
+          </w:p>
+        </w:tc>
+        <w:tc>
+          <w:tcPr>
             <w:tcW w:w="1607" w:type="dxa"/>
             <w:tcBorders>
               <w:start w:val="single" w:sz="4" w:space="0" w:color="000000"/>
@@ -8595,25 +9463,6 @@
         <w:tc>
           <w:tcPr>
             <w:tcW w:w="1606" w:type="dxa"/>
-            <w:tcBorders>
-              <w:start w:val="single" w:sz="4" w:space="0" w:color="000000"/>
-              <w:bottom w:val="single" w:sz="4" w:space="0" w:color="000000"/>
-            </w:tcBorders>
-          </w:tcPr>
-          <w:p>
-            <w:pPr>
-              <w:pStyle w:val="TableContents"/>
-              <w:rPr/>
-            </w:pPr>
-            <w:r>
-              <w:rPr/>
-              <w:t>0</w:t>
-            </w:r>
-          </w:p>
-        </w:tc>
-        <w:tc>
-          <w:tcPr>
-            <w:tcW w:w="1607" w:type="dxa"/>
             <w:tcBorders>
               <w:start w:val="single" w:sz="4" w:space="0" w:color="000000"/>
               <w:bottom w:val="single" w:sz="4" w:space="0" w:color="000000"/>
@@ -8674,6 +9523,25 @@
         </w:tc>
         <w:tc>
           <w:tcPr>
+            <w:tcW w:w="1606" w:type="dxa"/>
+            <w:tcBorders>
+              <w:start w:val="single" w:sz="4" w:space="0" w:color="000000"/>
+              <w:bottom w:val="single" w:sz="4" w:space="0" w:color="000000"/>
+            </w:tcBorders>
+          </w:tcPr>
+          <w:p>
+            <w:pPr>
+              <w:pStyle w:val="TableContents"/>
+              <w:rPr/>
+            </w:pPr>
+            <w:r>
+              <w:rPr/>
+              <w:t>0</w:t>
+            </w:r>
+          </w:p>
+        </w:tc>
+        <w:tc>
+          <w:tcPr>
             <w:tcW w:w="1607" w:type="dxa"/>
             <w:tcBorders>
               <w:start w:val="single" w:sz="4" w:space="0" w:color="000000"/>
@@ -8706,32 +9574,13 @@
             </w:pPr>
             <w:r>
               <w:rPr/>
-              <w:t>0</w:t>
+              <w:t>1</w:t>
             </w:r>
           </w:p>
         </w:tc>
         <w:tc>
           <w:tcPr>
             <w:tcW w:w="1606" w:type="dxa"/>
-            <w:tcBorders>
-              <w:start w:val="single" w:sz="4" w:space="0" w:color="000000"/>
-              <w:bottom w:val="single" w:sz="4" w:space="0" w:color="000000"/>
-            </w:tcBorders>
-          </w:tcPr>
-          <w:p>
-            <w:pPr>
-              <w:pStyle w:val="TableContents"/>
-              <w:rPr/>
-            </w:pPr>
-            <w:r>
-              <w:rPr/>
-              <w:t>1</w:t>
-            </w:r>
-          </w:p>
-        </w:tc>
-        <w:tc>
-          <w:tcPr>
-            <w:tcW w:w="1607" w:type="dxa"/>
             <w:tcBorders>
               <w:start w:val="single" w:sz="4" w:space="0" w:color="000000"/>
               <w:bottom w:val="single" w:sz="4" w:space="0" w:color="000000"/>
@@ -8792,6 +9641,25 @@
         </w:tc>
         <w:tc>
           <w:tcPr>
+            <w:tcW w:w="1606" w:type="dxa"/>
+            <w:tcBorders>
+              <w:start w:val="single" w:sz="4" w:space="0" w:color="000000"/>
+              <w:bottom w:val="single" w:sz="4" w:space="0" w:color="000000"/>
+            </w:tcBorders>
+          </w:tcPr>
+          <w:p>
+            <w:pPr>
+              <w:pStyle w:val="TableContents"/>
+              <w:rPr/>
+            </w:pPr>
+            <w:r>
+              <w:rPr/>
+              <w:t>0</w:t>
+            </w:r>
+          </w:p>
+        </w:tc>
+        <w:tc>
+          <w:tcPr>
             <w:tcW w:w="1607" w:type="dxa"/>
             <w:tcBorders>
               <w:start w:val="single" w:sz="4" w:space="0" w:color="000000"/>
@@ -8805,6 +9673,25 @@
             </w:pPr>
             <w:r>
               <w:rPr/>
+              <w:t>1</w:t>
+            </w:r>
+          </w:p>
+        </w:tc>
+        <w:tc>
+          <w:tcPr>
+            <w:tcW w:w="1606" w:type="dxa"/>
+            <w:tcBorders>
+              <w:start w:val="single" w:sz="4" w:space="0" w:color="000000"/>
+              <w:bottom w:val="single" w:sz="4" w:space="0" w:color="000000"/>
+            </w:tcBorders>
+          </w:tcPr>
+          <w:p>
+            <w:pPr>
+              <w:pStyle w:val="TableContents"/>
+              <w:rPr/>
+            </w:pPr>
+            <w:r>
+              <w:rPr/>
               <w:t>0</w:t>
             </w:r>
           </w:p>
@@ -8812,44 +9699,6 @@
         <w:tc>
           <w:tcPr>
             <w:tcW w:w="1606" w:type="dxa"/>
-            <w:tcBorders>
-              <w:start w:val="single" w:sz="4" w:space="0" w:color="000000"/>
-              <w:bottom w:val="single" w:sz="4" w:space="0" w:color="000000"/>
-            </w:tcBorders>
-          </w:tcPr>
-          <w:p>
-            <w:pPr>
-              <w:pStyle w:val="TableContents"/>
-              <w:rPr/>
-            </w:pPr>
-            <w:r>
-              <w:rPr/>
-              <w:t>1</w:t>
-            </w:r>
-          </w:p>
-        </w:tc>
-        <w:tc>
-          <w:tcPr>
-            <w:tcW w:w="1606" w:type="dxa"/>
-            <w:tcBorders>
-              <w:start w:val="single" w:sz="4" w:space="0" w:color="000000"/>
-              <w:bottom w:val="single" w:sz="4" w:space="0" w:color="000000"/>
-            </w:tcBorders>
-          </w:tcPr>
-          <w:p>
-            <w:pPr>
-              <w:pStyle w:val="TableContents"/>
-              <w:rPr/>
-            </w:pPr>
-            <w:r>
-              <w:rPr/>
-              <w:t>0</w:t>
-            </w:r>
-          </w:p>
-        </w:tc>
-        <w:tc>
-          <w:tcPr>
-            <w:tcW w:w="1607" w:type="dxa"/>
             <w:tcBorders>
               <w:start w:val="single" w:sz="4" w:space="0" w:color="000000"/>
               <w:bottom w:val="single" w:sz="4" w:space="0" w:color="000000"/>
@@ -8910,6 +9759,25 @@
         </w:tc>
         <w:tc>
           <w:tcPr>
+            <w:tcW w:w="1606" w:type="dxa"/>
+            <w:tcBorders>
+              <w:start w:val="single" w:sz="4" w:space="0" w:color="000000"/>
+              <w:bottom w:val="single" w:sz="4" w:space="0" w:color="000000"/>
+            </w:tcBorders>
+          </w:tcPr>
+          <w:p>
+            <w:pPr>
+              <w:pStyle w:val="TableContents"/>
+              <w:rPr/>
+            </w:pPr>
+            <w:r>
+              <w:rPr/>
+              <w:t>1</w:t>
+            </w:r>
+          </w:p>
+        </w:tc>
+        <w:tc>
+          <w:tcPr>
             <w:tcW w:w="1607" w:type="dxa"/>
             <w:tcBorders>
               <w:start w:val="single" w:sz="4" w:space="0" w:color="000000"/>
@@ -8923,7 +9791,7 @@
             </w:pPr>
             <w:r>
               <w:rPr/>
-              <w:t>1</w:t>
+              <w:t>0</w:t>
             </w:r>
           </w:p>
         </w:tc>
@@ -8949,25 +9817,6 @@
         <w:tc>
           <w:tcPr>
             <w:tcW w:w="1606" w:type="dxa"/>
-            <w:tcBorders>
-              <w:start w:val="single" w:sz="4" w:space="0" w:color="000000"/>
-              <w:bottom w:val="single" w:sz="4" w:space="0" w:color="000000"/>
-            </w:tcBorders>
-          </w:tcPr>
-          <w:p>
-            <w:pPr>
-              <w:pStyle w:val="TableContents"/>
-              <w:rPr/>
-            </w:pPr>
-            <w:r>
-              <w:rPr/>
-              <w:t>0</w:t>
-            </w:r>
-          </w:p>
-        </w:tc>
-        <w:tc>
-          <w:tcPr>
-            <w:tcW w:w="1607" w:type="dxa"/>
             <w:tcBorders>
               <w:start w:val="single" w:sz="4" w:space="0" w:color="000000"/>
               <w:bottom w:val="single" w:sz="4" w:space="0" w:color="000000"/>
@@ -9006,6 +9855,8 @@
         <w:spacing w:before="200" w:after="120"/>
         <w:rPr/>
       </w:pPr>
+      <w:bookmarkStart w:id="74" w:name="__RefHeading___Toc1391_1846826748"/>
+      <w:bookmarkEnd w:id="74"/>
       <w:r>
         <w:rPr/>
         <w:t xml:space="preserve">Viết bằng </w:t>
@@ -9022,7 +9873,7 @@
         <w:sectPr>
           <w:type w:val="continuous"/>
           <w:pgSz w:w="11906" w:h="16838"/>
-          <w:pgMar w:left="1134" w:right="1134" w:gutter="0" w:header="0" w:top="1134" w:footer="0" w:bottom="1134"/>
+          <w:pgMar w:left="1134" w:right="1134" w:gutter="0" w:header="0" w:top="1134" w:footer="1134" w:bottom="1693"/>
           <w:formProt w:val="false"/>
           <w:textDirection w:val="lrTb"/>
           <w:docGrid w:type="default" w:linePitch="100" w:charSpace="0"/>
@@ -9156,7 +10007,7 @@
         <w:sectPr>
           <w:type w:val="continuous"/>
           <w:pgSz w:w="11906" w:h="16838"/>
-          <w:pgMar w:left="1134" w:right="1134" w:gutter="0" w:header="0" w:top="1134" w:footer="0" w:bottom="1134"/>
+          <w:pgMar w:left="1134" w:right="1134" w:gutter="0" w:header="0" w:top="1134" w:footer="1134" w:bottom="1693"/>
           <w:formProt w:val="false"/>
           <w:textDirection w:val="lrTb"/>
           <w:docGrid w:type="default" w:linePitch="100" w:charSpace="0"/>
@@ -9182,6 +10033,8 @@
         <w:spacing w:before="200" w:after="120"/>
         <w:rPr/>
       </w:pPr>
+      <w:bookmarkStart w:id="75" w:name="__RefHeading___Toc1393_1846826748"/>
+      <w:bookmarkEnd w:id="75"/>
       <w:r>
         <w:rPr/>
         <w:t xml:space="preserve">Viết bằng </w:t>
@@ -9198,7 +10051,7 @@
         <w:sectPr>
           <w:type w:val="continuous"/>
           <w:pgSz w:w="11906" w:h="16838"/>
-          <w:pgMar w:left="1134" w:right="1134" w:gutter="0" w:header="0" w:top="1134" w:footer="0" w:bottom="1134"/>
+          <w:pgMar w:left="1134" w:right="1134" w:gutter="0" w:header="0" w:top="1134" w:footer="1134" w:bottom="1693"/>
           <w:formProt w:val="false"/>
           <w:textDirection w:val="lrTb"/>
           <w:docGrid w:type="default" w:linePitch="100" w:charSpace="0"/>
@@ -9211,8 +10064,8 @@
         <w:ind w:hanging="0" w:start="0" w:end="0"/>
         <w:rPr/>
       </w:pPr>
-      <w:bookmarkStart w:id="44" w:name="code-block-viewer_Copy_1"/>
-      <w:bookmarkEnd w:id="44"/>
+      <w:bookmarkStart w:id="76" w:name="code-block-viewer_Copy_1_Copy_1"/>
+      <w:bookmarkEnd w:id="76"/>
       <w:r>
         <w:rPr>
           <w:rStyle w:val="SourceText"/>
@@ -9436,7 +10289,7 @@
         <w:sectPr>
           <w:type w:val="continuous"/>
           <w:pgSz w:w="11906" w:h="16838"/>
-          <w:pgMar w:left="1134" w:right="1134" w:gutter="0" w:header="0" w:top="1134" w:footer="0" w:bottom="1134"/>
+          <w:pgMar w:left="1134" w:right="1134" w:gutter="0" w:header="0" w:top="1134" w:footer="1134" w:bottom="1693"/>
           <w:formProt w:val="false"/>
           <w:textDirection w:val="lrTb"/>
           <w:docGrid w:type="default" w:linePitch="100" w:charSpace="0"/>
@@ -9462,6 +10315,8 @@
         <w:spacing w:before="200" w:after="120"/>
         <w:rPr/>
       </w:pPr>
+      <w:bookmarkStart w:id="77" w:name="__RefHeading___Toc1395_1846826748"/>
+      <w:bookmarkEnd w:id="77"/>
       <w:r>
         <w:rPr/>
         <w:t>Decoder có Enable</w:t>
@@ -9482,7 +10337,7 @@
         <w:sectPr>
           <w:type w:val="continuous"/>
           <w:pgSz w:w="11906" w:h="16838"/>
-          <w:pgMar w:left="1134" w:right="1134" w:gutter="0" w:header="0" w:top="1134" w:footer="0" w:bottom="1134"/>
+          <w:pgMar w:left="1134" w:right="1134" w:gutter="0" w:header="0" w:top="1134" w:footer="1134" w:bottom="1693"/>
           <w:formProt w:val="false"/>
           <w:textDirection w:val="lrTb"/>
           <w:docGrid w:type="default" w:linePitch="100" w:charSpace="0"/>
@@ -9495,8 +10350,8 @@
         <w:ind w:hanging="0" w:start="0" w:end="0"/>
         <w:rPr/>
       </w:pPr>
-      <w:bookmarkStart w:id="45" w:name="code-block-viewer_Copy_2"/>
-      <w:bookmarkEnd w:id="45"/>
+      <w:bookmarkStart w:id="78" w:name="code-block-viewer_Copy_2_Copy_1"/>
+      <w:bookmarkEnd w:id="78"/>
       <w:r>
         <w:rPr>
           <w:rStyle w:val="SourceText"/>
@@ -9636,7 +10491,7 @@
         <w:sectPr>
           <w:type w:val="continuous"/>
           <w:pgSz w:w="11906" w:h="16838"/>
-          <w:pgMar w:left="1134" w:right="1134" w:gutter="0" w:header="0" w:top="1134" w:footer="0" w:bottom="1134"/>
+          <w:pgMar w:left="1134" w:right="1134" w:gutter="0" w:header="0" w:top="1134" w:footer="1134" w:bottom="1693"/>
           <w:formProt w:val="false"/>
           <w:textDirection w:val="lrTb"/>
           <w:docGrid w:type="default" w:linePitch="100" w:charSpace="0"/>
@@ -9692,6 +10547,8 @@
         <w:ind w:hanging="0" w:start="0"/>
         <w:rPr/>
       </w:pPr>
+      <w:bookmarkStart w:id="79" w:name="__RefHeading___Toc1397_1846826748"/>
+      <w:bookmarkEnd w:id="79"/>
       <w:r>
         <w:rPr/>
         <w:t>Encoder</w:t>
@@ -9704,7 +10561,974 @@
       </w:pPr>
       <w:r>
         <w:rPr/>
-        <w:t>To do</w:t>
+        <w:t xml:space="preserve">Encoder dùng để </w:t>
+      </w:r>
+      <w:r>
+        <w:rPr>
+          <w:rStyle w:val="Strong"/>
+        </w:rPr>
+        <w:t>mã hóa một tín hiệu one-hot thành mã nhị phân</w:t>
+      </w:r>
+      <w:r>
+        <w:rPr/>
+        <w:t>.</w:t>
+      </w:r>
+    </w:p>
+    <w:p>
+      <w:pPr>
+        <w:pStyle w:val="BodyText"/>
+        <w:rPr/>
+      </w:pPr>
+      <w:r>
+        <w:rPr/>
+        <w:t xml:space="preserve">Ví dụ </w:t>
+      </w:r>
+      <w:r>
+        <w:rPr>
+          <w:rStyle w:val="Strong"/>
+        </w:rPr>
+        <w:t>8-to-3 encoder</w:t>
+      </w:r>
+      <w:r>
+        <w:rPr/>
+        <w:t>:</w:t>
+      </w:r>
+    </w:p>
+    <w:tbl>
+      <w:tblPr>
+        <w:tblW w:w="1979" w:type="dxa"/>
+        <w:jc w:val="start"/>
+        <w:tblInd w:w="0" w:type="dxa"/>
+        <w:tblLayout w:type="fixed"/>
+        <w:tblCellMar>
+          <w:top w:w="28" w:type="dxa"/>
+          <w:start w:w="28" w:type="dxa"/>
+          <w:bottom w:w="28" w:type="dxa"/>
+          <w:end w:w="28" w:type="dxa"/>
+        </w:tblCellMar>
+      </w:tblPr>
+      <w:tblGrid>
+        <w:gridCol w:w="1081"/>
+        <w:gridCol w:w="898"/>
+      </w:tblGrid>
+      <w:tr>
+        <w:trPr>
+          <w:tblHeader w:val="true"/>
+        </w:trPr>
+        <w:tc>
+          <w:tcPr>
+            <w:tcW w:w="1081" w:type="dxa"/>
+            <w:tcBorders/>
+            <w:vAlign w:val="center"/>
+          </w:tcPr>
+          <w:p>
+            <w:pPr>
+              <w:pStyle w:val="TableHeading"/>
+              <w:rPr/>
+            </w:pPr>
+            <w:r>
+              <w:rPr/>
+              <w:t>Input</w:t>
+            </w:r>
+          </w:p>
+        </w:tc>
+        <w:tc>
+          <w:tcPr>
+            <w:tcW w:w="898" w:type="dxa"/>
+            <w:tcBorders/>
+            <w:vAlign w:val="center"/>
+          </w:tcPr>
+          <w:p>
+            <w:pPr>
+              <w:pStyle w:val="TableHeading"/>
+              <w:rPr/>
+            </w:pPr>
+            <w:r>
+              <w:rPr/>
+              <w:t>Output</w:t>
+            </w:r>
+          </w:p>
+        </w:tc>
+      </w:tr>
+      <w:tr>
+        <w:trPr/>
+        <w:tc>
+          <w:tcPr>
+            <w:tcW w:w="1081" w:type="dxa"/>
+            <w:tcBorders/>
+            <w:vAlign w:val="center"/>
+          </w:tcPr>
+          <w:p>
+            <w:pPr>
+              <w:pStyle w:val="TableContents"/>
+              <w:rPr/>
+            </w:pPr>
+            <w:r>
+              <w:rPr/>
+              <w:t>00000001</w:t>
+            </w:r>
+          </w:p>
+        </w:tc>
+        <w:tc>
+          <w:tcPr>
+            <w:tcW w:w="898" w:type="dxa"/>
+            <w:tcBorders/>
+            <w:vAlign w:val="center"/>
+          </w:tcPr>
+          <w:p>
+            <w:pPr>
+              <w:pStyle w:val="TableContents"/>
+              <w:rPr/>
+            </w:pPr>
+            <w:r>
+              <w:rPr/>
+              <w:t>000</w:t>
+            </w:r>
+          </w:p>
+        </w:tc>
+      </w:tr>
+      <w:tr>
+        <w:trPr/>
+        <w:tc>
+          <w:tcPr>
+            <w:tcW w:w="1081" w:type="dxa"/>
+            <w:tcBorders/>
+            <w:vAlign w:val="center"/>
+          </w:tcPr>
+          <w:p>
+            <w:pPr>
+              <w:pStyle w:val="TableContents"/>
+              <w:rPr/>
+            </w:pPr>
+            <w:r>
+              <w:rPr/>
+              <w:t>00000010</w:t>
+            </w:r>
+          </w:p>
+        </w:tc>
+        <w:tc>
+          <w:tcPr>
+            <w:tcW w:w="898" w:type="dxa"/>
+            <w:tcBorders/>
+            <w:vAlign w:val="center"/>
+          </w:tcPr>
+          <w:p>
+            <w:pPr>
+              <w:pStyle w:val="TableContents"/>
+              <w:rPr/>
+            </w:pPr>
+            <w:r>
+              <w:rPr/>
+              <w:t>001</w:t>
+            </w:r>
+          </w:p>
+        </w:tc>
+      </w:tr>
+      <w:tr>
+        <w:trPr/>
+        <w:tc>
+          <w:tcPr>
+            <w:tcW w:w="1081" w:type="dxa"/>
+            <w:tcBorders/>
+            <w:vAlign w:val="center"/>
+          </w:tcPr>
+          <w:p>
+            <w:pPr>
+              <w:pStyle w:val="TableContents"/>
+              <w:rPr/>
+            </w:pPr>
+            <w:r>
+              <w:rPr/>
+              <w:t>00000100</w:t>
+            </w:r>
+          </w:p>
+        </w:tc>
+        <w:tc>
+          <w:tcPr>
+            <w:tcW w:w="898" w:type="dxa"/>
+            <w:tcBorders/>
+            <w:vAlign w:val="center"/>
+          </w:tcPr>
+          <w:p>
+            <w:pPr>
+              <w:pStyle w:val="TableContents"/>
+              <w:rPr/>
+            </w:pPr>
+            <w:r>
+              <w:rPr/>
+              <w:t>010</w:t>
+            </w:r>
+          </w:p>
+        </w:tc>
+      </w:tr>
+      <w:tr>
+        <w:trPr/>
+        <w:tc>
+          <w:tcPr>
+            <w:tcW w:w="1081" w:type="dxa"/>
+            <w:tcBorders/>
+            <w:vAlign w:val="center"/>
+          </w:tcPr>
+          <w:p>
+            <w:pPr>
+              <w:pStyle w:val="TableContents"/>
+              <w:rPr/>
+            </w:pPr>
+            <w:r>
+              <w:rPr/>
+              <w:t>00001000</w:t>
+            </w:r>
+          </w:p>
+        </w:tc>
+        <w:tc>
+          <w:tcPr>
+            <w:tcW w:w="898" w:type="dxa"/>
+            <w:tcBorders/>
+            <w:vAlign w:val="center"/>
+          </w:tcPr>
+          <w:p>
+            <w:pPr>
+              <w:pStyle w:val="TableContents"/>
+              <w:rPr/>
+            </w:pPr>
+            <w:r>
+              <w:rPr/>
+              <w:t>011</w:t>
+            </w:r>
+          </w:p>
+        </w:tc>
+      </w:tr>
+      <w:tr>
+        <w:trPr/>
+        <w:tc>
+          <w:tcPr>
+            <w:tcW w:w="1081" w:type="dxa"/>
+            <w:tcBorders/>
+            <w:vAlign w:val="center"/>
+          </w:tcPr>
+          <w:p>
+            <w:pPr>
+              <w:pStyle w:val="TableContents"/>
+              <w:rPr/>
+            </w:pPr>
+            <w:r>
+              <w:rPr/>
+              <w:t>00010000</w:t>
+            </w:r>
+          </w:p>
+        </w:tc>
+        <w:tc>
+          <w:tcPr>
+            <w:tcW w:w="898" w:type="dxa"/>
+            <w:tcBorders/>
+            <w:vAlign w:val="center"/>
+          </w:tcPr>
+          <w:p>
+            <w:pPr>
+              <w:pStyle w:val="TableContents"/>
+              <w:rPr/>
+            </w:pPr>
+            <w:r>
+              <w:rPr/>
+              <w:t>100</w:t>
+            </w:r>
+          </w:p>
+        </w:tc>
+      </w:tr>
+      <w:tr>
+        <w:trPr/>
+        <w:tc>
+          <w:tcPr>
+            <w:tcW w:w="1081" w:type="dxa"/>
+            <w:tcBorders/>
+            <w:vAlign w:val="center"/>
+          </w:tcPr>
+          <w:p>
+            <w:pPr>
+              <w:pStyle w:val="TableContents"/>
+              <w:rPr/>
+            </w:pPr>
+            <w:r>
+              <w:rPr/>
+              <w:t>00100000</w:t>
+            </w:r>
+          </w:p>
+        </w:tc>
+        <w:tc>
+          <w:tcPr>
+            <w:tcW w:w="898" w:type="dxa"/>
+            <w:tcBorders/>
+            <w:vAlign w:val="center"/>
+          </w:tcPr>
+          <w:p>
+            <w:pPr>
+              <w:pStyle w:val="TableContents"/>
+              <w:rPr/>
+            </w:pPr>
+            <w:r>
+              <w:rPr/>
+              <w:t>101</w:t>
+            </w:r>
+          </w:p>
+        </w:tc>
+      </w:tr>
+      <w:tr>
+        <w:trPr/>
+        <w:tc>
+          <w:tcPr>
+            <w:tcW w:w="1081" w:type="dxa"/>
+            <w:tcBorders/>
+            <w:vAlign w:val="center"/>
+          </w:tcPr>
+          <w:p>
+            <w:pPr>
+              <w:pStyle w:val="TableContents"/>
+              <w:rPr/>
+            </w:pPr>
+            <w:r>
+              <w:rPr/>
+              <w:t>01000000</w:t>
+            </w:r>
+          </w:p>
+        </w:tc>
+        <w:tc>
+          <w:tcPr>
+            <w:tcW w:w="898" w:type="dxa"/>
+            <w:tcBorders/>
+            <w:vAlign w:val="center"/>
+          </w:tcPr>
+          <w:p>
+            <w:pPr>
+              <w:pStyle w:val="TableContents"/>
+              <w:rPr/>
+            </w:pPr>
+            <w:r>
+              <w:rPr/>
+              <w:t>110</w:t>
+            </w:r>
+          </w:p>
+        </w:tc>
+      </w:tr>
+      <w:tr>
+        <w:trPr/>
+        <w:tc>
+          <w:tcPr>
+            <w:tcW w:w="1081" w:type="dxa"/>
+            <w:tcBorders/>
+            <w:vAlign w:val="center"/>
+          </w:tcPr>
+          <w:p>
+            <w:pPr>
+              <w:pStyle w:val="TableContents"/>
+              <w:rPr/>
+            </w:pPr>
+            <w:r>
+              <w:rPr/>
+              <w:t>10000000</w:t>
+            </w:r>
+          </w:p>
+        </w:tc>
+        <w:tc>
+          <w:tcPr>
+            <w:tcW w:w="898" w:type="dxa"/>
+            <w:tcBorders/>
+            <w:vAlign w:val="center"/>
+          </w:tcPr>
+          <w:p>
+            <w:pPr>
+              <w:pStyle w:val="TableContents"/>
+              <w:rPr/>
+            </w:pPr>
+            <w:r>
+              <w:rPr/>
+              <w:t>111</w:t>
+            </w:r>
+          </w:p>
+        </w:tc>
+      </w:tr>
+    </w:tbl>
+    <w:p>
+      <w:pPr>
+        <w:pStyle w:val="BodyText"/>
+        <w:rPr/>
+      </w:pPr>
+      <w:r>
+        <w:rPr/>
+        <w:t xml:space="preserve">Nếu </w:t>
+      </w:r>
+      <w:r>
+        <w:rPr>
+          <w:rStyle w:val="SourceText"/>
+        </w:rPr>
+        <w:t>in = 8'b00100000</w:t>
+      </w:r>
+      <w:r>
+        <w:rPr/>
+        <w:t xml:space="preserve"> thì </w:t>
+      </w:r>
+      <w:r>
+        <w:rPr>
+          <w:rStyle w:val="SourceText"/>
+        </w:rPr>
+        <w:t>out = 3'b101</w:t>
+      </w:r>
+      <w:r>
+        <w:rPr/>
+        <w:t>.</w:t>
+      </w:r>
+    </w:p>
+    <w:p>
+      <w:pPr>
+        <w:pStyle w:val="Heading2"/>
+        <w:numPr>
+          <w:ilvl w:val="1"/>
+          <w:numId w:val="1"/>
+        </w:numPr>
+        <w:spacing w:before="200" w:after="120"/>
+        <w:rPr/>
+      </w:pPr>
+      <w:r>
+        <w:rPr/>
+        <w:t>Trong TCAM encoder dùng ở đâu?</w:t>
+      </w:r>
+    </w:p>
+    <w:p>
+      <w:pPr>
+        <w:pStyle w:val="BodyText"/>
+        <w:rPr/>
+      </w:pPr>
+      <w:r>
+        <w:rPr/>
+        <w:t xml:space="preserve">Giả sử TCAM có </w:t>
+      </w:r>
+      <w:r>
+        <w:rPr>
+          <w:rStyle w:val="Strong"/>
+        </w:rPr>
+        <w:t>8 dòng</w:t>
+      </w:r>
+      <w:r>
+        <w:rPr/>
+        <w:t>.</w:t>
+      </w:r>
+    </w:p>
+    <w:p>
+      <w:pPr>
+        <w:pStyle w:val="BodyText"/>
+        <w:rPr/>
+      </w:pPr>
+      <w:r>
+        <w:rPr/>
+        <w:t>Sau khi so sánh, ta thu được tín hiệu match:</w:t>
+      </w:r>
+    </w:p>
+    <w:p>
+      <w:pPr>
+        <w:sectPr>
+          <w:type w:val="continuous"/>
+          <w:pgSz w:w="11906" w:h="16838"/>
+          <w:pgMar w:left="1134" w:right="1134" w:gutter="0" w:header="0" w:top="1134" w:footer="1134" w:bottom="1693"/>
+          <w:formProt w:val="false"/>
+          <w:textDirection w:val="lrTb"/>
+          <w:docGrid w:type="default" w:linePitch="100" w:charSpace="0"/>
+        </w:sectPr>
+      </w:pPr>
+    </w:p>
+    <w:p>
+      <w:pPr>
+        <w:pStyle w:val="PreformattedText"/>
+        <w:spacing w:before="0" w:after="283"/>
+        <w:ind w:hanging="0" w:start="0" w:end="0"/>
+        <w:rPr/>
+      </w:pPr>
+      <w:r>
+        <w:rPr>
+          <w:rStyle w:val="SourceText"/>
+        </w:rPr>
+        <w:t>match = 00100000</w:t>
+      </w:r>
+    </w:p>
+    <w:p>
+      <w:pPr>
+        <w:sectPr>
+          <w:type w:val="continuous"/>
+          <w:pgSz w:w="11906" w:h="16838"/>
+          <w:pgMar w:left="1134" w:right="1134" w:gutter="0" w:header="0" w:top="1134" w:footer="1134" w:bottom="1693"/>
+          <w:formProt w:val="false"/>
+          <w:textDirection w:val="lrTb"/>
+          <w:docGrid w:type="default" w:linePitch="100" w:charSpace="0"/>
+        </w:sectPr>
+      </w:pPr>
+    </w:p>
+    <w:p>
+      <w:pPr>
+        <w:pStyle w:val="BodyText"/>
+        <w:rPr/>
+      </w:pPr>
+      <w:r>
+        <w:rPr/>
+        <w:t xml:space="preserve">Nghĩa là </w:t>
+      </w:r>
+      <w:r>
+        <w:rPr>
+          <w:rStyle w:val="Strong"/>
+        </w:rPr>
+        <w:t>dòng số 5</w:t>
+      </w:r>
+      <w:r>
+        <w:rPr/>
+        <w:t xml:space="preserve"> khớp.</w:t>
+      </w:r>
+    </w:p>
+    <w:p>
+      <w:pPr>
+        <w:pStyle w:val="BodyText"/>
+        <w:rPr/>
+      </w:pPr>
+      <w:r>
+        <w:rPr/>
+        <w:t xml:space="preserve">Lúc này cần một </w:t>
+      </w:r>
+      <w:r>
+        <w:rPr>
+          <w:rStyle w:val="Strong"/>
+        </w:rPr>
+        <w:t>encoder 8→3</w:t>
+      </w:r>
+      <w:r>
+        <w:rPr/>
+        <w:t xml:space="preserve"> để chuyển</w:t>
+      </w:r>
+    </w:p>
+    <w:p>
+      <w:pPr>
+        <w:sectPr>
+          <w:type w:val="continuous"/>
+          <w:pgSz w:w="11906" w:h="16838"/>
+          <w:pgMar w:left="1134" w:right="1134" w:gutter="0" w:header="0" w:top="1134" w:footer="1134" w:bottom="1693"/>
+          <w:formProt w:val="false"/>
+          <w:textDirection w:val="lrTb"/>
+          <w:docGrid w:type="default" w:linePitch="100" w:charSpace="0"/>
+        </w:sectPr>
+      </w:pPr>
+    </w:p>
+    <w:p>
+      <w:pPr>
+        <w:pStyle w:val="PreformattedText"/>
+        <w:spacing w:before="0" w:after="283"/>
+        <w:ind w:hanging="0" w:start="0" w:end="0"/>
+        <w:rPr/>
+      </w:pPr>
+      <w:bookmarkStart w:id="80" w:name="code-block-viewer_Copy_1"/>
+      <w:bookmarkEnd w:id="80"/>
+      <w:r>
+        <w:rPr>
+          <w:rStyle w:val="SourceText"/>
+        </w:rPr>
+        <w:t>00100000</w:t>
+      </w:r>
+    </w:p>
+    <w:p>
+      <w:pPr>
+        <w:sectPr>
+          <w:type w:val="continuous"/>
+          <w:pgSz w:w="11906" w:h="16838"/>
+          <w:pgMar w:left="1134" w:right="1134" w:gutter="0" w:header="0" w:top="1134" w:footer="1134" w:bottom="1693"/>
+          <w:formProt w:val="false"/>
+          <w:textDirection w:val="lrTb"/>
+          <w:docGrid w:type="default" w:linePitch="100" w:charSpace="0"/>
+        </w:sectPr>
+      </w:pPr>
+    </w:p>
+    <w:p>
+      <w:pPr>
+        <w:pStyle w:val="BodyText"/>
+        <w:rPr/>
+      </w:pPr>
+      <w:r>
+        <w:rPr/>
+        <w:t>thành</w:t>
+      </w:r>
+    </w:p>
+    <w:p>
+      <w:pPr>
+        <w:sectPr>
+          <w:type w:val="continuous"/>
+          <w:pgSz w:w="11906" w:h="16838"/>
+          <w:pgMar w:left="1134" w:right="1134" w:gutter="0" w:header="0" w:top="1134" w:footer="1134" w:bottom="1693"/>
+          <w:formProt w:val="false"/>
+          <w:textDirection w:val="lrTb"/>
+          <w:docGrid w:type="default" w:linePitch="100" w:charSpace="0"/>
+        </w:sectPr>
+      </w:pPr>
+    </w:p>
+    <w:p>
+      <w:pPr>
+        <w:pStyle w:val="PreformattedText"/>
+        <w:spacing w:before="0" w:after="283"/>
+        <w:ind w:hanging="0" w:start="0" w:end="0"/>
+        <w:rPr/>
+      </w:pPr>
+      <w:bookmarkStart w:id="81" w:name="code-block-viewer_Copy_2"/>
+      <w:bookmarkEnd w:id="81"/>
+      <w:r>
+        <w:rPr>
+          <w:rStyle w:val="SourceText"/>
+        </w:rPr>
+        <w:t>101</w:t>
+      </w:r>
+    </w:p>
+    <w:p>
+      <w:pPr>
+        <w:sectPr>
+          <w:type w:val="continuous"/>
+          <w:pgSz w:w="11906" w:h="16838"/>
+          <w:pgMar w:left="1134" w:right="1134" w:gutter="0" w:header="0" w:top="1134" w:footer="1134" w:bottom="1693"/>
+          <w:formProt w:val="false"/>
+          <w:textDirection w:val="lrTb"/>
+          <w:docGrid w:type="default" w:linePitch="100" w:charSpace="0"/>
+        </w:sectPr>
+      </w:pPr>
+    </w:p>
+    <w:p>
+      <w:pPr>
+        <w:pStyle w:val="BodyText"/>
+        <w:rPr/>
+      </w:pPr>
+      <w:r>
+        <w:rPr/>
+        <w:t xml:space="preserve">để CPU hoặc khối điều khiển biết </w:t>
+      </w:r>
+      <w:r>
+        <w:rPr>
+          <w:rStyle w:val="Strong"/>
+        </w:rPr>
+        <w:t>địa chỉ của dòng khớp</w:t>
+      </w:r>
+      <w:r>
+        <w:rPr/>
+        <w:t>.</w:t>
+      </w:r>
+    </w:p>
+    <w:p>
+      <w:pPr>
+        <w:pStyle w:val="BodyText"/>
+        <w:rPr/>
+      </w:pPr>
+      <w:r>
+        <w:rPr/>
+        <w:t>Đường dữ liệu sẽ là:</w:t>
+      </w:r>
+    </w:p>
+    <w:p>
+      <w:pPr>
+        <w:sectPr>
+          <w:type w:val="continuous"/>
+          <w:pgSz w:w="11906" w:h="16838"/>
+          <w:pgMar w:left="1134" w:right="1134" w:gutter="0" w:header="0" w:top="1134" w:footer="1134" w:bottom="1693"/>
+          <w:formProt w:val="false"/>
+          <w:textDirection w:val="lrTb"/>
+          <w:docGrid w:type="default" w:linePitch="100" w:charSpace="0"/>
+        </w:sectPr>
+      </w:pPr>
+    </w:p>
+    <w:p>
+      <w:pPr>
+        <w:pStyle w:val="PreformattedText"/>
+        <w:ind w:hanging="0" w:start="0" w:end="0"/>
+        <w:rPr/>
+      </w:pPr>
+      <w:bookmarkStart w:id="82" w:name="code-block-viewer_Copy_3"/>
+      <w:bookmarkEnd w:id="82"/>
+      <w:r>
+        <w:rPr>
+          <w:rStyle w:val="SourceText"/>
+        </w:rPr>
+        <w:t>Search key</w:t>
+      </w:r>
+    </w:p>
+    <w:p>
+      <w:pPr>
+        <w:pStyle w:val="PreformattedText"/>
+        <w:rPr/>
+      </w:pPr>
+      <w:r>
+        <w:rPr>
+          <w:rStyle w:val="SourceText"/>
+        </w:rPr>
+        <w:t xml:space="preserve">     │</w:t>
+      </w:r>
+    </w:p>
+    <w:p>
+      <w:pPr>
+        <w:pStyle w:val="PreformattedText"/>
+        <w:rPr/>
+      </w:pPr>
+      <w:r>
+        <w:rPr>
+          <w:rStyle w:val="SourceText"/>
+        </w:rPr>
+        <w:t xml:space="preserve">     ▼</w:t>
+      </w:r>
+    </w:p>
+    <w:p>
+      <w:pPr>
+        <w:pStyle w:val="PreformattedText"/>
+        <w:rPr/>
+      </w:pPr>
+      <w:r>
+        <w:rPr>
+          <w:rStyle w:val="SourceText"/>
+        </w:rPr>
+        <w:t>Comparator Array</w:t>
+      </w:r>
+    </w:p>
+    <w:p>
+      <w:pPr>
+        <w:pStyle w:val="PreformattedText"/>
+        <w:rPr/>
+      </w:pPr>
+      <w:r>
+        <w:rPr>
+          <w:rStyle w:val="SourceText"/>
+        </w:rPr>
+        <w:t xml:space="preserve">     │</w:t>
+      </w:r>
+    </w:p>
+    <w:p>
+      <w:pPr>
+        <w:pStyle w:val="PreformattedText"/>
+        <w:rPr>
+          <w:rStyle w:val="SourceText"/>
+        </w:rPr>
+      </w:pPr>
+      <w:r>
+        <w:rPr>
+          <w:rStyle w:val="SourceText"/>
+        </w:rPr>
+        <w:t xml:space="preserve">     ▼</w:t>
+      </w:r>
+    </w:p>
+    <w:p>
+      <w:pPr>
+        <w:pStyle w:val="PreformattedText"/>
+        <w:rPr/>
+      </w:pPr>
+      <w:r>
+        <w:rPr>
+          <w:rStyle w:val="SourceText"/>
+        </w:rPr>
+        <w:t>match[7:0]</w:t>
+      </w:r>
+    </w:p>
+    <w:p>
+      <w:pPr>
+        <w:pStyle w:val="PreformattedText"/>
+        <w:rPr/>
+      </w:pPr>
+      <w:r>
+        <w:rPr>
+          <w:rStyle w:val="SourceText"/>
+        </w:rPr>
+        <w:t xml:space="preserve">     │</w:t>
+      </w:r>
+    </w:p>
+    <w:p>
+      <w:pPr>
+        <w:pStyle w:val="PreformattedText"/>
+        <w:rPr/>
+      </w:pPr>
+      <w:r>
+        <w:rPr>
+          <w:rStyle w:val="SourceText"/>
+        </w:rPr>
+        <w:t xml:space="preserve">     ▼</w:t>
+      </w:r>
+    </w:p>
+    <w:p>
+      <w:pPr>
+        <w:pStyle w:val="PreformattedText"/>
+        <w:rPr/>
+      </w:pPr>
+      <w:r>
+        <w:rPr>
+          <w:rStyle w:val="SourceText"/>
+        </w:rPr>
+        <w:t>Priority Encoder</w:t>
+      </w:r>
+    </w:p>
+    <w:p>
+      <w:pPr>
+        <w:pStyle w:val="PreformattedText"/>
+        <w:rPr/>
+      </w:pPr>
+      <w:r>
+        <w:rPr>
+          <w:rStyle w:val="SourceText"/>
+        </w:rPr>
+        <w:t xml:space="preserve">     │</w:t>
+      </w:r>
+    </w:p>
+    <w:p>
+      <w:pPr>
+        <w:pStyle w:val="PreformattedText"/>
+        <w:rPr/>
+      </w:pPr>
+      <w:r>
+        <w:rPr>
+          <w:rStyle w:val="SourceText"/>
+        </w:rPr>
+        <w:t xml:space="preserve">     ▼</w:t>
+      </w:r>
+    </w:p>
+    <w:p>
+      <w:pPr>
+        <w:pStyle w:val="PreformattedText"/>
+        <w:spacing w:before="0" w:after="283"/>
+        <w:rPr/>
+      </w:pPr>
+      <w:r>
+        <w:rPr>
+          <w:rStyle w:val="SourceText"/>
+        </w:rPr>
+        <w:t>match_index[2:0]</w:t>
+      </w:r>
+    </w:p>
+    <w:p>
+      <w:pPr>
+        <w:sectPr>
+          <w:type w:val="continuous"/>
+          <w:pgSz w:w="11906" w:h="16838"/>
+          <w:pgMar w:left="1134" w:right="1134" w:gutter="0" w:header="0" w:top="1134" w:footer="1134" w:bottom="1693"/>
+          <w:formProt w:val="false"/>
+          <w:textDirection w:val="lrTb"/>
+          <w:docGrid w:type="default" w:linePitch="100" w:charSpace="0"/>
+        </w:sectPr>
+      </w:pPr>
+    </w:p>
+    <w:p>
+      <w:pPr>
+        <w:pStyle w:val="Heading2"/>
+        <w:numPr>
+          <w:ilvl w:val="1"/>
+          <w:numId w:val="1"/>
+        </w:numPr>
+        <w:spacing w:before="200" w:after="120"/>
+        <w:rPr/>
+      </w:pPr>
+      <w:r>
+        <w:rPr/>
+        <w:t>Encoder nào nên viết?</w:t>
+      </w:r>
+    </w:p>
+    <w:p>
+      <w:pPr>
+        <w:pStyle w:val="BodyText"/>
+        <w:rPr/>
+      </w:pPr>
+      <w:r>
+        <w:rPr/>
+        <w:t>Nên viết cả hai:</w:t>
+      </w:r>
+    </w:p>
+    <w:p>
+      <w:pPr>
+        <w:pStyle w:val="BodyText"/>
+        <w:numPr>
+          <w:ilvl w:val="0"/>
+          <w:numId w:val="7"/>
+        </w:numPr>
+        <w:tabs>
+          <w:tab w:val="clear" w:pos="709"/>
+          <w:tab w:val="left" w:pos="0" w:leader="none"/>
+        </w:tabs>
+        <w:spacing w:before="0" w:after="0"/>
+        <w:ind w:hanging="283" w:start="709"/>
+        <w:rPr/>
+      </w:pPr>
+      <w:r>
+        <w:rPr>
+          <w:rStyle w:val="Strong"/>
+        </w:rPr>
+        <w:t>Encoder 8→3</w:t>
+      </w:r>
+      <w:r>
+        <w:rPr/>
+        <w:t xml:space="preserve">: giả sử </w:t>
+      </w:r>
+      <w:r>
+        <w:rPr>
+          <w:rStyle w:val="Strong"/>
+        </w:rPr>
+        <w:t>chỉ có đúng 1 bit đầu vào bằng 1</w:t>
+      </w:r>
+      <w:r>
+        <w:rPr/>
+        <w:t xml:space="preserve">. </w:t>
+      </w:r>
+    </w:p>
+    <w:p>
+      <w:pPr>
+        <w:pStyle w:val="BodyText"/>
+        <w:numPr>
+          <w:ilvl w:val="0"/>
+          <w:numId w:val="7"/>
+        </w:numPr>
+        <w:tabs>
+          <w:tab w:val="clear" w:pos="709"/>
+          <w:tab w:val="left" w:pos="0" w:leader="none"/>
+        </w:tabs>
+        <w:ind w:hanging="283" w:start="709"/>
+        <w:rPr/>
+      </w:pPr>
+      <w:r>
+        <w:rPr>
+          <w:rStyle w:val="Strong"/>
+        </w:rPr>
+        <w:t>Priority Encoder 8→3</w:t>
+      </w:r>
+      <w:r>
+        <w:rPr/>
+        <w:t xml:space="preserve">: nếu có </w:t>
+      </w:r>
+      <w:r>
+        <w:rPr>
+          <w:rStyle w:val="Strong"/>
+        </w:rPr>
+        <w:t>nhiều bit cùng bằng 1</w:t>
+      </w:r>
+      <w:r>
+        <w:rPr/>
+        <w:t xml:space="preserve">, sẽ ưu tiên một bit (ví dụ ưu tiên bit có chỉ số lớn nhất hoặc nhỏ nhất). Đây là loại thường dùng trong TCAM để xử lý trường hợp nhiều dòng cùng khớp. </w:t>
+      </w:r>
+    </w:p>
+    <w:p>
+      <w:pPr>
+        <w:pStyle w:val="BodyText"/>
+        <w:rPr/>
+      </w:pPr>
+      <w:r>
+        <w:rPr/>
+        <w:t xml:space="preserve">Đối với dự án TCAM trên FPGA, </w:t>
+      </w:r>
+      <w:r>
+        <w:rPr>
+          <w:rStyle w:val="Strong"/>
+        </w:rPr>
+        <w:t>priority encoder</w:t>
+      </w:r>
+      <w:r>
+        <w:rPr/>
+        <w:t xml:space="preserve"> sẽ hữu ích hơn encoder thường vì kết quả so khớp có thể có nhiều dòng cùng match.</w:t>
+      </w:r>
+    </w:p>
+    <w:p>
+      <w:pPr>
+        <w:pStyle w:val="BodyText"/>
+        <w:rPr/>
+      </w:pPr>
+      <w:r>
+        <w:rPr/>
       </w:r>
     </w:p>
     <w:p>
@@ -9717,6 +11541,8 @@
         <w:ind w:hanging="0" w:start="0"/>
         <w:rPr/>
       </w:pPr>
+      <w:bookmarkStart w:id="83" w:name="__RefHeading___Toc1399_1846826748"/>
+      <w:bookmarkEnd w:id="83"/>
       <w:r>
         <w:rPr/>
         <w:t>Comparator</w:t>
@@ -9736,13 +11562,47 @@
     <w:sectPr>
       <w:type w:val="continuous"/>
       <w:pgSz w:w="11906" w:h="16838"/>
-      <w:pgMar w:left="1134" w:right="1134" w:gutter="0" w:header="0" w:top="1134" w:footer="0" w:bottom="1134"/>
+      <w:pgMar w:left="1134" w:right="1134" w:gutter="0" w:header="0" w:top="1134" w:footer="1134" w:bottom="1693"/>
       <w:formProt w:val="false"/>
       <w:textDirection w:val="lrTb"/>
       <w:docGrid w:type="default" w:linePitch="100" w:charSpace="0"/>
     </w:sectPr>
   </w:body>
 </w:document>
+</file>
+
+<file path=word/footer1.xml><?xml version="1.0" encoding="utf-8"?>
+<w:ftr xmlns:o="urn:schemas-microsoft-com:office:office" xmlns:r="http://schemas.openxmlformats.org/officeDocument/2006/relationships" xmlns:v="urn:schemas-microsoft-com:vml" xmlns:w="http://schemas.openxmlformats.org/wordprocessingml/2006/main" xmlns:w10="urn:schemas-microsoft-com:office:word" xmlns:wp="http://schemas.openxmlformats.org/drawingml/2006/wordprocessingDrawing" xmlns:wps="http://schemas.microsoft.com/office/word/2010/wordprocessingShape" xmlns:wpg="http://schemas.microsoft.com/office/word/2010/wordprocessingGroup" xmlns:mc="http://schemas.openxmlformats.org/markup-compatibility/2006" xmlns:wp14="http://schemas.microsoft.com/office/word/2010/wordprocessingDrawing" xmlns:w14="http://schemas.microsoft.com/office/word/2010/wordml" xmlns:w15="http://schemas.microsoft.com/office/word/2012/wordml" mc:Ignorable="w14 wp14 w15">
+  <w:p>
+    <w:pPr>
+      <w:pStyle w:val="Footer"/>
+      <w:jc w:val="center"/>
+      <w:rPr/>
+    </w:pPr>
+    <w:bookmarkStart w:id="5" w:name="PageNumWizard_FOOTER_Default_Page_Style1"/>
+    <w:r>
+      <w:rPr/>
+      <w:fldChar w:fldCharType="begin"/>
+    </w:r>
+    <w:r>
+      <w:rPr/>
+      <w:instrText xml:space="preserve"> PAGE </w:instrText>
+    </w:r>
+    <w:r>
+      <w:rPr/>
+      <w:fldChar w:fldCharType="separate"/>
+    </w:r>
+    <w:r>
+      <w:rPr/>
+      <w:t>17</w:t>
+    </w:r>
+    <w:r>
+      <w:rPr/>
+      <w:fldChar w:fldCharType="end"/>
+    </w:r>
+    <w:bookmarkEnd w:id="5"/>
+  </w:p>
+</w:ftr>
 </file>
 
 <file path=word/numbering.xml><?xml version="1.0" encoding="utf-8"?>
@@ -10560,6 +12420,143 @@
     </w:lvl>
   </w:abstractNum>
   <w:abstractNum w:abstractNumId="7">
+    <w:lvl w:ilvl="0">
+      <w:start w:val="1"/>
+      <w:numFmt w:val="bullet"/>
+      <w:lvlText w:val=""/>
+      <w:lvlJc w:val="start"/>
+      <w:pPr>
+        <w:tabs>
+          <w:tab w:val="num" w:pos="709"/>
+        </w:tabs>
+        <w:ind w:start="709" w:hanging="283"/>
+      </w:pPr>
+      <w:rPr>
+        <w:rFonts w:ascii="Symbol" w:hAnsi="Symbol" w:cs="Symbol" w:hint="default"/>
+      </w:rPr>
+    </w:lvl>
+    <w:lvl w:ilvl="1">
+      <w:start w:val="1"/>
+      <w:numFmt w:val="bullet"/>
+      <w:lvlText w:val=""/>
+      <w:lvlJc w:val="start"/>
+      <w:pPr>
+        <w:tabs>
+          <w:tab w:val="num" w:pos="1418"/>
+        </w:tabs>
+        <w:ind w:start="1418" w:hanging="283"/>
+      </w:pPr>
+      <w:rPr>
+        <w:rFonts w:ascii="Symbol" w:hAnsi="Symbol" w:cs="Symbol" w:hint="default"/>
+      </w:rPr>
+    </w:lvl>
+    <w:lvl w:ilvl="2">
+      <w:start w:val="1"/>
+      <w:numFmt w:val="bullet"/>
+      <w:lvlText w:val=""/>
+      <w:lvlJc w:val="start"/>
+      <w:pPr>
+        <w:tabs>
+          <w:tab w:val="num" w:pos="2127"/>
+        </w:tabs>
+        <w:ind w:start="2127" w:hanging="283"/>
+      </w:pPr>
+      <w:rPr>
+        <w:rFonts w:ascii="Symbol" w:hAnsi="Symbol" w:cs="Symbol" w:hint="default"/>
+      </w:rPr>
+    </w:lvl>
+    <w:lvl w:ilvl="3">
+      <w:start w:val="1"/>
+      <w:numFmt w:val="bullet"/>
+      <w:lvlText w:val=""/>
+      <w:lvlJc w:val="start"/>
+      <w:pPr>
+        <w:tabs>
+          <w:tab w:val="num" w:pos="2836"/>
+        </w:tabs>
+        <w:ind w:start="2836" w:hanging="283"/>
+      </w:pPr>
+      <w:rPr>
+        <w:rFonts w:ascii="Symbol" w:hAnsi="Symbol" w:cs="Symbol" w:hint="default"/>
+      </w:rPr>
+    </w:lvl>
+    <w:lvl w:ilvl="4">
+      <w:start w:val="1"/>
+      <w:numFmt w:val="bullet"/>
+      <w:lvlText w:val=""/>
+      <w:lvlJc w:val="start"/>
+      <w:pPr>
+        <w:tabs>
+          <w:tab w:val="num" w:pos="3545"/>
+        </w:tabs>
+        <w:ind w:start="3545" w:hanging="283"/>
+      </w:pPr>
+      <w:rPr>
+        <w:rFonts w:ascii="Symbol" w:hAnsi="Symbol" w:cs="Symbol" w:hint="default"/>
+      </w:rPr>
+    </w:lvl>
+    <w:lvl w:ilvl="5">
+      <w:start w:val="1"/>
+      <w:numFmt w:val="bullet"/>
+      <w:lvlText w:val=""/>
+      <w:lvlJc w:val="start"/>
+      <w:pPr>
+        <w:tabs>
+          <w:tab w:val="num" w:pos="4254"/>
+        </w:tabs>
+        <w:ind w:start="4254" w:hanging="283"/>
+      </w:pPr>
+      <w:rPr>
+        <w:rFonts w:ascii="Symbol" w:hAnsi="Symbol" w:cs="Symbol" w:hint="default"/>
+      </w:rPr>
+    </w:lvl>
+    <w:lvl w:ilvl="6">
+      <w:start w:val="1"/>
+      <w:numFmt w:val="bullet"/>
+      <w:lvlText w:val=""/>
+      <w:lvlJc w:val="start"/>
+      <w:pPr>
+        <w:tabs>
+          <w:tab w:val="num" w:pos="4963"/>
+        </w:tabs>
+        <w:ind w:start="4963" w:hanging="283"/>
+      </w:pPr>
+      <w:rPr>
+        <w:rFonts w:ascii="Symbol" w:hAnsi="Symbol" w:cs="Symbol" w:hint="default"/>
+      </w:rPr>
+    </w:lvl>
+    <w:lvl w:ilvl="7">
+      <w:start w:val="1"/>
+      <w:numFmt w:val="bullet"/>
+      <w:lvlText w:val=""/>
+      <w:lvlJc w:val="start"/>
+      <w:pPr>
+        <w:tabs>
+          <w:tab w:val="num" w:pos="5672"/>
+        </w:tabs>
+        <w:ind w:start="5672" w:hanging="283"/>
+      </w:pPr>
+      <w:rPr>
+        <w:rFonts w:ascii="Symbol" w:hAnsi="Symbol" w:cs="Symbol" w:hint="default"/>
+      </w:rPr>
+    </w:lvl>
+    <w:lvl w:ilvl="8">
+      <w:start w:val="1"/>
+      <w:numFmt w:val="bullet"/>
+      <w:lvlText w:val=""/>
+      <w:lvlJc w:val="start"/>
+      <w:pPr>
+        <w:tabs>
+          <w:tab w:val="num" w:pos="6381"/>
+        </w:tabs>
+        <w:ind w:start="6381" w:hanging="283"/>
+      </w:pPr>
+      <w:rPr>
+        <w:rFonts w:ascii="Symbol" w:hAnsi="Symbol" w:cs="Symbol" w:hint="default"/>
+      </w:rPr>
+    </w:lvl>
+  </w:abstractNum>
+  <w:abstractNum w:abstractNumId="8">
     <w:lvl w:ilvl="0">
       <w:start w:val="1"/>
       <w:numFmt w:val="none"/>
@@ -10698,6 +12695,9 @@
   </w:num>
   <w:num w:numId="7">
     <w:abstractNumId w:val="7"/>
+  </w:num>
+  <w:num w:numId="8">
+    <w:abstractNumId w:val="8"/>
   </w:num>
 </w:numbering>
 </file>
@@ -10822,6 +12822,18 @@
     <w:rPr>
       <w:rFonts w:ascii="OpenSymbol" w:hAnsi="OpenSymbol" w:eastAsia="OpenSymbol" w:cs="OpenSymbol"/>
     </w:rPr>
+  </w:style>
+  <w:style w:type="character" w:styleId="Hyperlink">
+    <w:name w:val="Hyperlink"/>
+    <w:rPr>
+      <w:color w:val="000080"/>
+      <w:u w:val="single"/>
+    </w:rPr>
+  </w:style>
+  <w:style w:type="character" w:styleId="IndexLink">
+    <w:name w:val="Index Link"/>
+    <w:qFormat/>
+    <w:rPr/>
   </w:style>
   <w:style w:type="paragraph" w:styleId="Heading">
     <w:name w:val="Heading"/>
@@ -10934,6 +12946,93 @@
       <w:bCs/>
     </w:rPr>
   </w:style>
+  <w:style w:type="paragraph" w:styleId="HeaderandFooter">
+    <w:name w:val="Header and Footer"/>
+    <w:basedOn w:val="Normal"/>
+    <w:qFormat/>
+    <w:pPr>
+      <w:suppressLineNumbers/>
+      <w:tabs>
+        <w:tab w:val="clear" w:pos="709"/>
+        <w:tab w:val="center" w:pos="4819" w:leader="none"/>
+        <w:tab w:val="right" w:pos="9638" w:leader="none"/>
+      </w:tabs>
+    </w:pPr>
+    <w:rPr/>
+  </w:style>
+  <w:style w:type="paragraph" w:styleId="Footer">
+    <w:name w:val="Footer"/>
+    <w:basedOn w:val="HeaderandFooter"/>
+    <w:pPr>
+      <w:suppressLineNumbers/>
+    </w:pPr>
+    <w:rPr/>
+  </w:style>
+  <w:style w:type="paragraph" w:styleId="IndexHeading">
+    <w:name w:val="Index Heading"/>
+    <w:basedOn w:val="Heading"/>
+    <w:pPr>
+      <w:suppressLineNumbers/>
+      <w:ind w:hanging="0" w:start="0"/>
+    </w:pPr>
+    <w:rPr>
+      <w:b/>
+      <w:bCs/>
+      <w:sz w:val="32"/>
+      <w:szCs w:val="32"/>
+    </w:rPr>
+  </w:style>
+  <w:style w:type="paragraph" w:styleId="TOCHeading">
+    <w:name w:val="TOC Heading"/>
+    <w:basedOn w:val="IndexHeading"/>
+    <w:qFormat/>
+    <w:pPr>
+      <w:suppressLineNumbers/>
+      <w:ind w:hanging="0" w:start="0"/>
+    </w:pPr>
+    <w:rPr>
+      <w:b/>
+      <w:bCs/>
+      <w:sz w:val="32"/>
+      <w:szCs w:val="32"/>
+    </w:rPr>
+  </w:style>
+  <w:style w:type="paragraph" w:styleId="TOC1">
+    <w:name w:val="TOC 1"/>
+    <w:basedOn w:val="Index"/>
+    <w:pPr>
+      <w:tabs>
+        <w:tab w:val="clear" w:pos="709"/>
+        <w:tab w:val="right" w:pos="9638" w:leader="dot"/>
+      </w:tabs>
+      <w:ind w:hanging="0" w:start="0"/>
+    </w:pPr>
+    <w:rPr/>
+  </w:style>
+  <w:style w:type="paragraph" w:styleId="TOC2">
+    <w:name w:val="TOC 2"/>
+    <w:basedOn w:val="Index"/>
+    <w:pPr>
+      <w:tabs>
+        <w:tab w:val="clear" w:pos="709"/>
+        <w:tab w:val="right" w:pos="9355" w:leader="dot"/>
+      </w:tabs>
+      <w:ind w:hanging="0" w:start="283"/>
+    </w:pPr>
+    <w:rPr/>
+  </w:style>
+  <w:style w:type="paragraph" w:styleId="TOC3">
+    <w:name w:val="TOC 3"/>
+    <w:basedOn w:val="Index"/>
+    <w:pPr>
+      <w:tabs>
+        <w:tab w:val="clear" w:pos="709"/>
+        <w:tab w:val="right" w:pos="9071" w:leader="dot"/>
+      </w:tabs>
+      <w:ind w:hanging="0" w:start="567"/>
+    </w:pPr>
+    <w:rPr/>
+  </w:style>
 </w:styles>
 </file>
 

</xml_diff>

<commit_message>
encoder only allow 1-ON trigger like 01000000 not 010100101
</commit_message>
<xml_diff>
--- a/Doc/OnTap/3_Verilog Mạch tổ hợp (Combinational Circuit).docx
+++ b/Doc/OnTap/3_Verilog Mạch tổ hợp (Combinational Circuit).docx
@@ -63,6 +63,11 @@
                 <w:rStyle w:val="IndexLink"/>
               </w:rPr>
               <w:t>1) 1. AND module</w:t>
+            </w:r>
+            <w:r>
+              <w:rPr>
+                <w:rStyle w:val="IndexLink"/>
+              </w:rPr>
               <w:tab/>
               <w:t>1</w:t>
             </w:r>
@@ -940,7 +945,9 @@
     <w:p>
       <w:pPr>
         <w:sectPr>
-          <w:footerReference w:type="default" r:id="rId2"/>
+          <w:footerReference w:type="even" r:id="rId2"/>
+          <w:footerReference w:type="default" r:id="rId3"/>
+          <w:footerReference w:type="first" r:id="rId4"/>
           <w:type w:val="nextPage"/>
           <w:pgSz w:w="11906" w:h="16838"/>
           <w:pgMar w:left="1134" w:right="1134" w:gutter="0" w:header="0" w:top="1134" w:footer="1134" w:bottom="1693"/>
@@ -1017,8 +1024,8 @@
         <w:ind w:hanging="0" w:start="0" w:end="0"/>
         <w:rPr/>
       </w:pPr>
-      <w:bookmarkStart w:id="6" w:name="code-block-viewer"/>
-      <w:bookmarkEnd w:id="6"/>
+      <w:bookmarkStart w:id="7" w:name="code-block-viewer"/>
+      <w:bookmarkEnd w:id="7"/>
       <w:r>
         <w:rPr>
           <w:rStyle w:val="SourceText"/>
@@ -1079,8 +1086,8 @@
         <w:ind w:hanging="0" w:start="0" w:end="0"/>
         <w:rPr/>
       </w:pPr>
-      <w:bookmarkStart w:id="7" w:name="code-block-viewer_Copy_1"/>
-      <w:bookmarkEnd w:id="7"/>
+      <w:bookmarkStart w:id="8" w:name="code-block-viewer_Copy_1"/>
+      <w:bookmarkEnd w:id="8"/>
       <w:r>
         <w:rPr>
           <w:rStyle w:val="SourceText"/>
@@ -1190,8 +1197,8 @@
         <w:ind w:hanging="0" w:start="0" w:end="0"/>
         <w:rPr/>
       </w:pPr>
-      <w:bookmarkStart w:id="8" w:name="code-block-viewer_Copy_2"/>
-      <w:bookmarkEnd w:id="8"/>
+      <w:bookmarkStart w:id="9" w:name="code-block-viewer_Copy_2"/>
+      <w:bookmarkEnd w:id="9"/>
       <w:r>
         <w:rPr>
           <w:rStyle w:val="SourceText"/>
@@ -1239,8 +1246,8 @@
         <w:ind w:hanging="0" w:start="0" w:end="0"/>
         <w:rPr/>
       </w:pPr>
-      <w:bookmarkStart w:id="9" w:name="code-block-viewer_Copy_3"/>
-      <w:bookmarkEnd w:id="9"/>
+      <w:bookmarkStart w:id="10" w:name="code-block-viewer_Copy_3"/>
+      <w:bookmarkEnd w:id="10"/>
       <w:r>
         <w:rPr>
           <w:rStyle w:val="SourceText"/>
@@ -1788,8 +1795,8 @@
         <w:ind w:hanging="0" w:start="0" w:end="0"/>
         <w:rPr/>
       </w:pPr>
-      <w:bookmarkStart w:id="10" w:name="code-block-viewer_Copy_5"/>
-      <w:bookmarkEnd w:id="10"/>
+      <w:bookmarkStart w:id="11" w:name="code-block-viewer_Copy_5"/>
+      <w:bookmarkEnd w:id="11"/>
       <w:r>
         <w:rPr>
           <w:rStyle w:val="SourceText"/>
@@ -1978,8 +1985,8 @@
           <w:u w:val="single"/>
         </w:rPr>
       </w:pPr>
-      <w:bookmarkStart w:id="11" w:name="__RefHeading___Toc1343_1846826748"/>
-      <w:bookmarkEnd w:id="11"/>
+      <w:bookmarkStart w:id="12" w:name="__RefHeading___Toc1343_1846826748"/>
+      <w:bookmarkEnd w:id="12"/>
       <w:r>
         <w:rPr>
           <w:u w:val="single"/>
@@ -2155,8 +2162,8 @@
         <w:ind w:hanging="0" w:start="0" w:end="0"/>
         <w:rPr/>
       </w:pPr>
-      <w:bookmarkStart w:id="12" w:name="code-block-viewer_Copy_1_Copy_1"/>
-      <w:bookmarkEnd w:id="12"/>
+      <w:bookmarkStart w:id="13" w:name="code-block-viewer_Copy_1_Copy_1"/>
+      <w:bookmarkEnd w:id="13"/>
       <w:r>
         <w:rPr>
           <w:rStyle w:val="SourceText"/>
@@ -2230,8 +2237,8 @@
         <w:ind w:hanging="0" w:start="0" w:end="0"/>
         <w:rPr/>
       </w:pPr>
-      <w:bookmarkStart w:id="13" w:name="code-block-viewer_Copy_2_Copy_1"/>
-      <w:bookmarkEnd w:id="13"/>
+      <w:bookmarkStart w:id="14" w:name="code-block-viewer_Copy_2_Copy_1"/>
+      <w:bookmarkEnd w:id="14"/>
       <w:r>
         <w:rPr>
           <w:rStyle w:val="SourceText"/>
@@ -2307,8 +2314,8 @@
         <w:ind w:hanging="0" w:start="0"/>
         <w:rPr/>
       </w:pPr>
-      <w:bookmarkStart w:id="14" w:name="__RefHeading___Toc1345_1846826748"/>
-      <w:bookmarkEnd w:id="14"/>
+      <w:bookmarkStart w:id="15" w:name="__RefHeading___Toc1345_1846826748"/>
+      <w:bookmarkEnd w:id="15"/>
       <w:r>
         <w:rPr/>
         <w:t>Full Adder</w:t>
@@ -2368,8 +2375,8 @@
         <w:ind w:hanging="0" w:start="0" w:end="0"/>
         <w:rPr/>
       </w:pPr>
-      <w:bookmarkStart w:id="15" w:name="code-block-viewer_Copy_3_Copy_1"/>
-      <w:bookmarkEnd w:id="15"/>
+      <w:bookmarkStart w:id="16" w:name="code-block-viewer_Copy_3_Copy_1"/>
+      <w:bookmarkEnd w:id="16"/>
       <w:r>
         <w:rPr>
           <w:rStyle w:val="SourceText"/>
@@ -2442,8 +2449,8 @@
         <w:ind w:hanging="0" w:start="0" w:end="0"/>
         <w:rPr/>
       </w:pPr>
-      <w:bookmarkStart w:id="16" w:name="code-block-viewer_Copy_4"/>
-      <w:bookmarkEnd w:id="16"/>
+      <w:bookmarkStart w:id="17" w:name="code-block-viewer_Copy_4"/>
+      <w:bookmarkEnd w:id="17"/>
       <w:r>
         <w:rPr>
           <w:rStyle w:val="SourceText"/>
@@ -2495,8 +2502,8 @@
         <w:ind w:hanging="0" w:start="0"/>
         <w:rPr/>
       </w:pPr>
-      <w:bookmarkStart w:id="17" w:name="__RefHeading___Toc1347_1846826748"/>
-      <w:bookmarkEnd w:id="17"/>
+      <w:bookmarkStart w:id="18" w:name="__RefHeading___Toc1347_1846826748"/>
+      <w:bookmarkEnd w:id="18"/>
       <w:r>
         <w:rPr/>
         <w:t>Tại sao cần Full Adder?</w:t>
@@ -2530,8 +2537,8 @@
         <w:ind w:hanging="0" w:start="0" w:end="0"/>
         <w:rPr/>
       </w:pPr>
-      <w:bookmarkStart w:id="18" w:name="code-block-viewer_Copy_5_Copy_1"/>
-      <w:bookmarkEnd w:id="18"/>
+      <w:bookmarkStart w:id="19" w:name="code-block-viewer_Copy_5_Copy_1"/>
+      <w:bookmarkEnd w:id="19"/>
       <w:r>
         <w:rPr>
           <w:rStyle w:val="SourceText"/>
@@ -2615,8 +2622,8 @@
         <w:ind w:hanging="0" w:start="0" w:end="0"/>
         <w:rPr/>
       </w:pPr>
-      <w:bookmarkStart w:id="19" w:name="code-block-viewer_Copy_6"/>
-      <w:bookmarkEnd w:id="19"/>
+      <w:bookmarkStart w:id="20" w:name="code-block-viewer_Copy_6"/>
+      <w:bookmarkEnd w:id="20"/>
       <w:r>
         <w:rPr>
           <w:rStyle w:val="SourceText"/>
@@ -2675,8 +2682,8 @@
         <w:ind w:hanging="0" w:start="0" w:end="0"/>
         <w:rPr/>
       </w:pPr>
-      <w:bookmarkStart w:id="20" w:name="code-block-viewer_Copy_7"/>
-      <w:bookmarkEnd w:id="20"/>
+      <w:bookmarkStart w:id="21" w:name="code-block-viewer_Copy_7"/>
+      <w:bookmarkEnd w:id="21"/>
       <w:r>
         <w:rPr>
           <w:rStyle w:val="SourceText"/>
@@ -4888,8 +4895,8 @@
         <w:ind w:hanging="0" w:start="0"/>
         <w:rPr/>
       </w:pPr>
-      <w:bookmarkStart w:id="21" w:name="__RefHeading___Toc1349_1846826748"/>
-      <w:bookmarkEnd w:id="21"/>
+      <w:bookmarkStart w:id="22" w:name="__RefHeading___Toc1349_1846826748"/>
+      <w:bookmarkEnd w:id="22"/>
       <w:r>
         <w:rPr/>
         <w:t>Công thức Boolean</w:t>
@@ -4905,8 +4912,8 @@
         <w:ind w:hanging="0" w:start="0"/>
         <w:rPr/>
       </w:pPr>
-      <w:bookmarkStart w:id="22" w:name="__RefHeading___Toc1351_1846826748"/>
-      <w:bookmarkEnd w:id="22"/>
+      <w:bookmarkStart w:id="23" w:name="__RefHeading___Toc1351_1846826748"/>
+      <w:bookmarkEnd w:id="23"/>
       <w:r>
         <w:rPr/>
         <w:t>Sum</w:t>
@@ -4941,8 +4948,8 @@
         <w:ind w:hanging="0" w:start="0" w:end="0"/>
         <w:rPr/>
       </w:pPr>
-      <w:bookmarkStart w:id="23" w:name="code-block-viewer_Copy_8"/>
-      <w:bookmarkEnd w:id="23"/>
+      <w:bookmarkStart w:id="24" w:name="code-block-viewer_Copy_8"/>
+      <w:bookmarkEnd w:id="24"/>
       <w:r>
         <w:rPr>
           <w:rStyle w:val="SourceText"/>
@@ -4991,8 +4998,8 @@
         <w:ind w:hanging="0" w:start="0"/>
         <w:rPr/>
       </w:pPr>
-      <w:bookmarkStart w:id="24" w:name="__RefHeading___Toc1353_1846826748"/>
-      <w:bookmarkEnd w:id="24"/>
+      <w:bookmarkStart w:id="25" w:name="__RefHeading___Toc1353_1846826748"/>
+      <w:bookmarkEnd w:id="25"/>
       <w:r>
         <w:rPr/>
         <w:t>Carry Out</w:t>
@@ -5047,8 +5054,8 @@
         <w:ind w:hanging="0" w:start="0" w:end="0"/>
         <w:rPr/>
       </w:pPr>
-      <w:bookmarkStart w:id="25" w:name="code-block-viewer_Copy_9"/>
-      <w:bookmarkEnd w:id="25"/>
+      <w:bookmarkStart w:id="26" w:name="code-block-viewer_Copy_9"/>
+      <w:bookmarkEnd w:id="26"/>
       <w:r>
         <w:rPr>
           <w:rStyle w:val="SourceText"/>
@@ -5190,8 +5197,8 @@
         <w:ind w:hanging="0" w:start="0" w:end="0"/>
         <w:rPr/>
       </w:pPr>
-      <w:bookmarkStart w:id="26" w:name="code-block-viewer_Copy_10"/>
-      <w:bookmarkEnd w:id="26"/>
+      <w:bookmarkStart w:id="27" w:name="code-block-viewer_Copy_10"/>
+      <w:bookmarkEnd w:id="27"/>
       <w:r>
         <w:rPr>
           <w:rStyle w:val="SourceText"/>
@@ -5267,7 +5274,7 @@
                     </pic:cNvPicPr>
                   </pic:nvPicPr>
                   <pic:blipFill>
-                    <a:blip r:embed="rId3"/>
+                    <a:blip r:embed="rId5"/>
                     <a:stretch>
                       <a:fillRect/>
                     </a:stretch>
@@ -5447,7 +5454,7 @@
                     </pic:cNvPicPr>
                   </pic:nvPicPr>
                   <pic:blipFill>
-                    <a:blip r:embed="rId4"/>
+                    <a:blip r:embed="rId6"/>
                     <a:stretch>
                       <a:fillRect/>
                     </a:stretch>
@@ -5516,7 +5523,7 @@
                     </pic:cNvPicPr>
                   </pic:nvPicPr>
                   <pic:blipFill>
-                    <a:blip r:embed="rId5"/>
+                    <a:blip r:embed="rId7"/>
                     <a:stretch>
                       <a:fillRect/>
                     </a:stretch>
@@ -5654,8 +5661,8 @@
         <w:ind w:hanging="0" w:start="0"/>
         <w:rPr/>
       </w:pPr>
-      <w:bookmarkStart w:id="27" w:name="__RefHeading___Toc1355_1846826748"/>
-      <w:bookmarkEnd w:id="27"/>
+      <w:bookmarkStart w:id="28" w:name="__RefHeading___Toc1355_1846826748"/>
+      <w:bookmarkEnd w:id="28"/>
       <w:r>
         <w:rPr/>
         <w:t xml:space="preserve"> </w:t>
@@ -5707,7 +5714,7 @@
                     </pic:cNvPicPr>
                   </pic:nvPicPr>
                   <pic:blipFill>
-                    <a:blip r:embed="rId6"/>
+                    <a:blip r:embed="rId8"/>
                     <a:stretch>
                       <a:fillRect/>
                     </a:stretch>
@@ -5763,7 +5770,7 @@
                     </pic:cNvPicPr>
                   </pic:nvPicPr>
                   <pic:blipFill>
-                    <a:blip r:embed="rId7"/>
+                    <a:blip r:embed="rId9"/>
                     <a:stretch>
                       <a:fillRect/>
                     </a:stretch>
@@ -5823,8 +5830,8 @@
         <w:ind w:hanging="0" w:start="0"/>
         <w:rPr/>
       </w:pPr>
-      <w:bookmarkStart w:id="28" w:name="__RefHeading___Toc1357_1846826748"/>
-      <w:bookmarkEnd w:id="28"/>
+      <w:bookmarkStart w:id="29" w:name="__RefHeading___Toc1357_1846826748"/>
+      <w:bookmarkEnd w:id="29"/>
       <w:r>
         <w:rPr/>
         <w:t>Thử kiểm tra</w:t>
@@ -5858,8 +5865,8 @@
         <w:ind w:hanging="0" w:start="0" w:end="0"/>
         <w:rPr/>
       </w:pPr>
-      <w:bookmarkStart w:id="29" w:name="code-block-viewer_Copy_12"/>
-      <w:bookmarkEnd w:id="29"/>
+      <w:bookmarkStart w:id="30" w:name="code-block-viewer_Copy_12"/>
+      <w:bookmarkEnd w:id="30"/>
       <w:r>
         <w:rPr>
           <w:rStyle w:val="SourceText"/>
@@ -5932,8 +5939,8 @@
         <w:ind w:hanging="0" w:start="0" w:end="0"/>
         <w:rPr/>
       </w:pPr>
-      <w:bookmarkStart w:id="30" w:name="code-block-viewer_Copy_13"/>
-      <w:bookmarkEnd w:id="30"/>
+      <w:bookmarkStart w:id="31" w:name="code-block-viewer_Copy_13"/>
+      <w:bookmarkEnd w:id="31"/>
       <w:r>
         <w:rPr>
           <w:rStyle w:val="SourceText"/>
@@ -5994,8 +6001,8 @@
         <w:ind w:hanging="0" w:start="0" w:end="0"/>
         <w:rPr/>
       </w:pPr>
-      <w:bookmarkStart w:id="31" w:name="code-block-viewer_Copy_14"/>
-      <w:bookmarkEnd w:id="31"/>
+      <w:bookmarkStart w:id="32" w:name="code-block-viewer_Copy_14"/>
+      <w:bookmarkEnd w:id="32"/>
       <w:r>
         <w:rPr>
           <w:rStyle w:val="SourceText"/>
@@ -6057,8 +6064,8 @@
         <w:ind w:hanging="0" w:start="0" w:end="0"/>
         <w:rPr/>
       </w:pPr>
-      <w:bookmarkStart w:id="32" w:name="code-block-viewer_Copy_15"/>
-      <w:bookmarkEnd w:id="32"/>
+      <w:bookmarkStart w:id="33" w:name="code-block-viewer_Copy_15"/>
+      <w:bookmarkEnd w:id="33"/>
       <w:r>
         <w:rPr>
           <w:rStyle w:val="SourceText"/>
@@ -6106,8 +6113,8 @@
         <w:ind w:hanging="0" w:start="0" w:end="0"/>
         <w:rPr/>
       </w:pPr>
-      <w:bookmarkStart w:id="33" w:name="code-block-viewer_Copy_16"/>
-      <w:bookmarkEnd w:id="33"/>
+      <w:bookmarkStart w:id="34" w:name="code-block-viewer_Copy_16"/>
+      <w:bookmarkEnd w:id="34"/>
       <w:r>
         <w:rPr>
           <w:rStyle w:val="SourceText"/>
@@ -6254,8 +6261,8 @@
         <w:ind w:hanging="0" w:start="0"/>
         <w:rPr/>
       </w:pPr>
-      <w:bookmarkStart w:id="34" w:name="__RefHeading___Toc1359_1846826748"/>
-      <w:bookmarkEnd w:id="34"/>
+      <w:bookmarkStart w:id="35" w:name="__RefHeading___Toc1359_1846826748"/>
+      <w:bookmarkEnd w:id="35"/>
       <w:r>
         <w:rPr/>
         <w:t>Multiplexer (MUX)</w:t>
@@ -6314,7 +6321,7 @@
                     </pic:cNvPicPr>
                   </pic:nvPicPr>
                   <pic:blipFill>
-                    <a:blip r:embed="rId8"/>
+                    <a:blip r:embed="rId10"/>
                     <a:stretch>
                       <a:fillRect/>
                     </a:stretch>
@@ -6345,8 +6352,8 @@
         <w:ind w:hanging="0" w:start="0"/>
         <w:rPr/>
       </w:pPr>
-      <w:bookmarkStart w:id="35" w:name="__RefHeading___Toc1361_1846826748"/>
-      <w:bookmarkEnd w:id="35"/>
+      <w:bookmarkStart w:id="36" w:name="__RefHeading___Toc1361_1846826748"/>
+      <w:bookmarkEnd w:id="36"/>
       <w:r>
         <w:rPr/>
         <w:t>Mạch mutiplexer 2:1 - MUX2</w:t>
@@ -6403,7 +6410,7 @@
                     </pic:cNvPicPr>
                   </pic:nvPicPr>
                   <pic:blipFill>
-                    <a:blip r:embed="rId9"/>
+                    <a:blip r:embed="rId11"/>
                     <a:stretch>
                       <a:fillRect/>
                     </a:stretch>
@@ -6513,8 +6520,8 @@
         <w:ind w:hanging="0" w:start="0" w:end="0"/>
         <w:rPr/>
       </w:pPr>
-      <w:bookmarkStart w:id="36" w:name="code-block-viewer_Copy_3_Copy_1_Copy_1"/>
-      <w:bookmarkEnd w:id="36"/>
+      <w:bookmarkStart w:id="37" w:name="code-block-viewer_Copy_3_Copy_1_Copy_1"/>
+      <w:bookmarkEnd w:id="37"/>
       <w:r>
         <w:rPr>
           <w:rStyle w:val="SourceText"/>
@@ -6563,8 +6570,8 @@
         <w:ind w:hanging="0" w:start="0" w:end="0"/>
         <w:rPr/>
       </w:pPr>
-      <w:bookmarkStart w:id="37" w:name="code-block-viewer_Copy_4_Copy_1"/>
-      <w:bookmarkEnd w:id="37"/>
+      <w:bookmarkStart w:id="38" w:name="code-block-viewer_Copy_4_Copy_1"/>
+      <w:bookmarkEnd w:id="38"/>
       <w:r>
         <w:rPr>
           <w:rStyle w:val="SourceText"/>
@@ -6594,8 +6601,8 @@
         <w:ind w:hanging="0" w:start="0"/>
         <w:rPr/>
       </w:pPr>
-      <w:bookmarkStart w:id="38" w:name="__RefHeading___Toc1363_1846826748"/>
-      <w:bookmarkEnd w:id="38"/>
+      <w:bookmarkStart w:id="39" w:name="__RefHeading___Toc1363_1846826748"/>
+      <w:bookmarkEnd w:id="39"/>
       <w:r>
         <w:rPr/>
         <w:t>Tại sao TCAM cần MUX?</w:t>
@@ -6629,8 +6636,8 @@
         <w:ind w:hanging="0" w:start="0" w:end="0"/>
         <w:rPr/>
       </w:pPr>
-      <w:bookmarkStart w:id="39" w:name="code-block-viewer_Copy_5_Copy_1_Copy_1"/>
-      <w:bookmarkEnd w:id="39"/>
+      <w:bookmarkStart w:id="40" w:name="code-block-viewer_Copy_5_Copy_1_Copy_1"/>
+      <w:bookmarkEnd w:id="40"/>
       <w:r>
         <w:rPr>
           <w:rStyle w:val="SourceText"/>
@@ -6735,8 +6742,8 @@
         <w:ind w:hanging="0" w:start="0" w:end="0"/>
         <w:rPr/>
       </w:pPr>
-      <w:bookmarkStart w:id="40" w:name="code-block-viewer_Copy_6_Copy_1"/>
-      <w:bookmarkEnd w:id="40"/>
+      <w:bookmarkStart w:id="41" w:name="code-block-viewer_Copy_6_Copy_1"/>
+      <w:bookmarkEnd w:id="41"/>
       <w:r>
         <w:rPr>
           <w:rStyle w:val="SourceText"/>
@@ -6840,9 +6847,9 @@
       <w:r>
         <w:rPr/>
       </w:r>
-      <w:bookmarkStart w:id="41" w:name="code-block-viewer_Copy_7_Copy_1"/>
       <w:bookmarkStart w:id="42" w:name="code-block-viewer_Copy_7_Copy_1"/>
-      <w:bookmarkEnd w:id="42"/>
+      <w:bookmarkStart w:id="43" w:name="code-block-viewer_Copy_7_Copy_1"/>
+      <w:bookmarkEnd w:id="43"/>
     </w:p>
     <w:p>
       <w:pPr>
@@ -6894,8 +6901,8 @@
         <w:ind w:hanging="0" w:start="0" w:end="0"/>
         <w:rPr/>
       </w:pPr>
-      <w:bookmarkStart w:id="43" w:name="code-block-viewer_Copy_8_Copy_1"/>
-      <w:bookmarkEnd w:id="43"/>
+      <w:bookmarkStart w:id="44" w:name="code-block-viewer_Copy_8_Copy_1"/>
+      <w:bookmarkEnd w:id="44"/>
       <w:r>
         <w:rPr>
           <w:rStyle w:val="SourceText"/>
@@ -6962,8 +6969,8 @@
         <w:ind w:hanging="0" w:start="0"/>
         <w:rPr/>
       </w:pPr>
-      <w:bookmarkStart w:id="44" w:name="__RefHeading___Toc1365_1846826748"/>
-      <w:bookmarkEnd w:id="44"/>
+      <w:bookmarkStart w:id="45" w:name="__RefHeading___Toc1365_1846826748"/>
+      <w:bookmarkEnd w:id="45"/>
       <w:r>
         <w:rPr>
           <w:rStyle w:val="SourceText"/>
@@ -7005,8 +7012,8 @@
         <w:ind w:hanging="0" w:start="0" w:end="0"/>
         <w:rPr/>
       </w:pPr>
-      <w:bookmarkStart w:id="45" w:name="code-block-viewer_Copy_9_Copy_1"/>
-      <w:bookmarkEnd w:id="45"/>
+      <w:bookmarkStart w:id="46" w:name="code-block-viewer_Copy_9_Copy_1"/>
+      <w:bookmarkEnd w:id="46"/>
       <w:r>
         <w:rPr>
           <w:rStyle w:val="SourceText"/>
@@ -7102,8 +7109,8 @@
         <w:ind w:hanging="0" w:start="0"/>
         <w:rPr/>
       </w:pPr>
-      <w:bookmarkStart w:id="46" w:name="__RefHeading___Toc1367_1846826748"/>
-      <w:bookmarkEnd w:id="46"/>
+      <w:bookmarkStart w:id="47" w:name="__RefHeading___Toc1367_1846826748"/>
+      <w:bookmarkEnd w:id="47"/>
       <w:r>
         <w:rPr/>
         <w:t xml:space="preserve"> </w:t>
@@ -7141,8 +7148,8 @@
         <w:ind w:hanging="0" w:start="0" w:end="0"/>
         <w:rPr/>
       </w:pPr>
-      <w:bookmarkStart w:id="47" w:name="code-block-viewer_Copy_10_Copy_1"/>
-      <w:bookmarkEnd w:id="47"/>
+      <w:bookmarkStart w:id="48" w:name="code-block-viewer_Copy_10_Copy_1"/>
+      <w:bookmarkEnd w:id="48"/>
       <w:r>
         <w:rPr>
           <w:rStyle w:val="SourceText"/>
@@ -7217,8 +7224,8 @@
         <w:ind w:hanging="0" w:start="0"/>
         <w:rPr/>
       </w:pPr>
-      <w:bookmarkStart w:id="48" w:name="__RefHeading___Toc1369_1846826748"/>
-      <w:bookmarkEnd w:id="48"/>
+      <w:bookmarkStart w:id="49" w:name="__RefHeading___Toc1369_1846826748"/>
+      <w:bookmarkEnd w:id="49"/>
       <w:r>
         <w:rPr>
           <w:rStyle w:val="SourceText"/>
@@ -7279,7 +7286,7 @@
                     </pic:cNvPicPr>
                   </pic:nvPicPr>
                   <pic:blipFill>
-                    <a:blip r:embed="rId10"/>
+                    <a:blip r:embed="rId12"/>
                     <a:stretch>
                       <a:fillRect/>
                     </a:stretch>
@@ -7317,8 +7324,8 @@
           <w:u w:val="single"/>
         </w:rPr>
       </w:pPr>
-      <w:bookmarkStart w:id="49" w:name="__RefHeading___Toc1371_1846826748"/>
-      <w:bookmarkEnd w:id="49"/>
+      <w:bookmarkStart w:id="50" w:name="__RefHeading___Toc1371_1846826748"/>
+      <w:bookmarkEnd w:id="50"/>
       <w:r>
         <w:rPr>
           <w:u w:val="single"/>
@@ -7444,8 +7451,8 @@
           <w:u w:val="single"/>
         </w:rPr>
       </w:pPr>
-      <w:bookmarkStart w:id="50" w:name="__RefHeading___Toc1373_1846826748"/>
-      <w:bookmarkEnd w:id="50"/>
+      <w:bookmarkStart w:id="51" w:name="__RefHeading___Toc1373_1846826748"/>
+      <w:bookmarkEnd w:id="51"/>
       <w:r>
         <w:rPr>
           <w:u w:val="single"/>
@@ -7571,8 +7578,8 @@
           <w:u w:val="single"/>
         </w:rPr>
       </w:pPr>
-      <w:bookmarkStart w:id="51" w:name="__RefHeading___Toc1375_1846826748"/>
-      <w:bookmarkEnd w:id="51"/>
+      <w:bookmarkStart w:id="52" w:name="__RefHeading___Toc1375_1846826748"/>
+      <w:bookmarkEnd w:id="52"/>
       <w:r>
         <w:rPr>
           <w:u w:val="single"/>
@@ -7668,8 +7675,8 @@
         <w:ind w:hanging="0" w:start="0" w:end="0"/>
         <w:rPr/>
       </w:pPr>
-      <w:bookmarkStart w:id="52" w:name="code-block-viewer_Copy_2_Copy_1_Copy_1"/>
-      <w:bookmarkEnd w:id="52"/>
+      <w:bookmarkStart w:id="53" w:name="code-block-viewer_Copy_2_Copy_1_Copy_1"/>
+      <w:bookmarkEnd w:id="53"/>
       <w:r>
         <w:rPr>
           <w:rStyle w:val="SourceText"/>
@@ -7699,8 +7706,8 @@
         <w:spacing w:before="200" w:after="120"/>
         <w:rPr/>
       </w:pPr>
-      <w:bookmarkStart w:id="53" w:name="__RefHeading___Toc1377_1846826748"/>
-      <w:bookmarkEnd w:id="53"/>
+      <w:bookmarkStart w:id="54" w:name="__RefHeading___Toc1377_1846826748"/>
+      <w:bookmarkEnd w:id="54"/>
       <w:r>
         <w:rPr/>
         <w:t>Đoạn này hoạt động thế nào?</w:t>
@@ -7859,8 +7866,8 @@
         <w:ind w:hanging="0" w:start="0" w:end="0"/>
         <w:rPr/>
       </w:pPr>
-      <w:bookmarkStart w:id="54" w:name="code-block-viewer_Copy_1_Copy_1_Copy_1"/>
-      <w:bookmarkEnd w:id="54"/>
+      <w:bookmarkStart w:id="55" w:name="code-block-viewer_Copy_1_Copy_1_Copy_1"/>
+      <w:bookmarkEnd w:id="55"/>
       <w:r>
         <w:rPr>
           <w:rStyle w:val="SourceText"/>
@@ -7932,8 +7939,8 @@
         <w:pStyle w:val="Heading3"/>
         <w:rPr/>
       </w:pPr>
-      <w:bookmarkStart w:id="55" w:name="__RefHeading___Toc1379_1846826748"/>
-      <w:bookmarkEnd w:id="55"/>
+      <w:bookmarkStart w:id="56" w:name="__RefHeading___Toc1379_1846826748"/>
+      <w:bookmarkEnd w:id="56"/>
       <w:r>
         <w:rPr/>
         <w:t>Lần 1</w:t>
@@ -7958,8 +7965,8 @@
         <w:ind w:hanging="0" w:start="0" w:end="0"/>
         <w:rPr/>
       </w:pPr>
-      <w:bookmarkStart w:id="56" w:name="code-block-viewer_Copy_2_Copy_1_Copy_1"/>
-      <w:bookmarkEnd w:id="56"/>
+      <w:bookmarkStart w:id="57" w:name="code-block-viewer_Copy_2_Copy_1_Copy_1_C"/>
+      <w:bookmarkEnd w:id="57"/>
       <w:r>
         <w:rPr>
           <w:rStyle w:val="SourceText"/>
@@ -7985,8 +7992,8 @@
         <w:ind w:hanging="0" w:start="0" w:end="0"/>
         <w:rPr/>
       </w:pPr>
-      <w:bookmarkStart w:id="57" w:name="code-block-viewer_Copy_3_Copy_1_Copy_1"/>
-      <w:bookmarkEnd w:id="57"/>
+      <w:bookmarkStart w:id="58" w:name="code-block-viewer_Copy_3_Copy_1_Copy_1_C"/>
+      <w:bookmarkEnd w:id="58"/>
       <w:r>
         <w:rPr>
           <w:rStyle w:val="SourceText"/>
@@ -8048,8 +8055,8 @@
         <w:ind w:hanging="0" w:start="0" w:end="0"/>
         <w:rPr/>
       </w:pPr>
-      <w:bookmarkStart w:id="58" w:name="code-block-viewer_Copy_4_Copy_1_Copy_1"/>
-      <w:bookmarkEnd w:id="58"/>
+      <w:bookmarkStart w:id="59" w:name="code-block-viewer_Copy_4_Copy_1_Copy_1"/>
+      <w:bookmarkEnd w:id="59"/>
       <w:r>
         <w:rPr>
           <w:rStyle w:val="SourceText"/>
@@ -8093,8 +8100,8 @@
         <w:pStyle w:val="Heading3"/>
         <w:rPr/>
       </w:pPr>
-      <w:bookmarkStart w:id="59" w:name="__RefHeading___Toc1381_1846826748"/>
-      <w:bookmarkEnd w:id="59"/>
+      <w:bookmarkStart w:id="60" w:name="__RefHeading___Toc1381_1846826748"/>
+      <w:bookmarkEnd w:id="60"/>
       <w:r>
         <w:rPr/>
         <w:t>Lần 2</w:t>
@@ -8119,8 +8126,8 @@
         <w:ind w:hanging="0" w:start="0" w:end="0"/>
         <w:rPr/>
       </w:pPr>
-      <w:bookmarkStart w:id="60" w:name="code-block-viewer_Copy_5_Copy_1_Copy_1"/>
-      <w:bookmarkEnd w:id="60"/>
+      <w:bookmarkStart w:id="61" w:name="code-block-viewer_Copy_5_Copy_1_Copy_1_C"/>
+      <w:bookmarkEnd w:id="61"/>
       <w:r>
         <w:rPr>
           <w:rStyle w:val="SourceText"/>
@@ -8146,8 +8153,8 @@
         <w:ind w:hanging="0" w:start="0" w:end="0"/>
         <w:rPr/>
       </w:pPr>
-      <w:bookmarkStart w:id="61" w:name="code-block-viewer_Copy_6_Copy_1_Copy_1"/>
-      <w:bookmarkEnd w:id="61"/>
+      <w:bookmarkStart w:id="62" w:name="code-block-viewer_Copy_6_Copy_1_Copy_1"/>
+      <w:bookmarkEnd w:id="62"/>
       <w:r>
         <w:rPr>
           <w:rStyle w:val="SourceText"/>
@@ -8209,8 +8216,8 @@
         <w:ind w:hanging="0" w:start="0" w:end="0"/>
         <w:rPr/>
       </w:pPr>
-      <w:bookmarkStart w:id="62" w:name="code-block-viewer_Copy_7_Copy_1_Copy_1"/>
-      <w:bookmarkEnd w:id="62"/>
+      <w:bookmarkStart w:id="63" w:name="code-block-viewer_Copy_7_Copy_1_Copy_1"/>
+      <w:bookmarkEnd w:id="63"/>
       <w:r>
         <w:rPr>
           <w:rStyle w:val="SourceText"/>
@@ -8254,8 +8261,8 @@
         <w:pStyle w:val="Heading3"/>
         <w:rPr/>
       </w:pPr>
-      <w:bookmarkStart w:id="63" w:name="__RefHeading___Toc1383_1846826748"/>
-      <w:bookmarkEnd w:id="63"/>
+      <w:bookmarkStart w:id="64" w:name="__RefHeading___Toc1383_1846826748"/>
+      <w:bookmarkEnd w:id="64"/>
       <w:r>
         <w:rPr/>
         <w:t>Lần 3</w:t>
@@ -8280,8 +8287,8 @@
         <w:ind w:hanging="0" w:start="0" w:end="0"/>
         <w:rPr/>
       </w:pPr>
-      <w:bookmarkStart w:id="64" w:name="code-block-viewer_Copy_8_Copy_1_Copy_1"/>
-      <w:bookmarkEnd w:id="64"/>
+      <w:bookmarkStart w:id="65" w:name="code-block-viewer_Copy_8_Copy_1_Copy_1"/>
+      <w:bookmarkEnd w:id="65"/>
       <w:r>
         <w:rPr>
           <w:rStyle w:val="SourceText"/>
@@ -8307,8 +8314,8 @@
         <w:ind w:hanging="0" w:start="0" w:end="0"/>
         <w:rPr/>
       </w:pPr>
-      <w:bookmarkStart w:id="65" w:name="code-block-viewer_Copy_9_Copy_1_Copy_1"/>
-      <w:bookmarkEnd w:id="65"/>
+      <w:bookmarkStart w:id="66" w:name="code-block-viewer_Copy_9_Copy_1_Copy_1"/>
+      <w:bookmarkEnd w:id="66"/>
       <w:r>
         <w:rPr>
           <w:rStyle w:val="SourceText"/>
@@ -8370,8 +8377,8 @@
         <w:ind w:hanging="0" w:start="0" w:end="0"/>
         <w:rPr/>
       </w:pPr>
-      <w:bookmarkStart w:id="66" w:name="code-block-viewer_Copy_10_Copy_1_Copy_1"/>
-      <w:bookmarkEnd w:id="66"/>
+      <w:bookmarkStart w:id="67" w:name="code-block-viewer_Copy_10_Copy_1_Copy_1"/>
+      <w:bookmarkEnd w:id="67"/>
       <w:r>
         <w:rPr>
           <w:rStyle w:val="SourceText"/>
@@ -8415,8 +8422,8 @@
         <w:pStyle w:val="Heading3"/>
         <w:rPr/>
       </w:pPr>
-      <w:bookmarkStart w:id="67" w:name="__RefHeading___Toc1385_1846826748"/>
-      <w:bookmarkEnd w:id="67"/>
+      <w:bookmarkStart w:id="68" w:name="__RefHeading___Toc1385_1846826748"/>
+      <w:bookmarkEnd w:id="68"/>
       <w:r>
         <w:rPr/>
         <w:t>Lần 4</w:t>
@@ -8441,8 +8448,8 @@
         <w:ind w:hanging="0" w:start="0" w:end="0"/>
         <w:rPr/>
       </w:pPr>
-      <w:bookmarkStart w:id="68" w:name="code-block-viewer_Copy_11"/>
-      <w:bookmarkEnd w:id="68"/>
+      <w:bookmarkStart w:id="69" w:name="code-block-viewer_Copy_11"/>
+      <w:bookmarkEnd w:id="69"/>
       <w:r>
         <w:rPr>
           <w:rStyle w:val="SourceText"/>
@@ -8468,8 +8475,8 @@
         <w:ind w:hanging="0" w:start="0" w:end="0"/>
         <w:rPr/>
       </w:pPr>
-      <w:bookmarkStart w:id="69" w:name="code-block-viewer_Copy_12_Copy_1"/>
-      <w:bookmarkEnd w:id="69"/>
+      <w:bookmarkStart w:id="70" w:name="code-block-viewer_Copy_12_Copy_1"/>
+      <w:bookmarkEnd w:id="70"/>
       <w:r>
         <w:rPr>
           <w:rStyle w:val="SourceText"/>
@@ -8531,8 +8538,8 @@
         <w:ind w:hanging="0" w:start="0" w:end="0"/>
         <w:rPr/>
       </w:pPr>
-      <w:bookmarkStart w:id="70" w:name="code-block-viewer_Copy_13_Copy_1"/>
-      <w:bookmarkEnd w:id="70"/>
+      <w:bookmarkStart w:id="71" w:name="code-block-viewer_Copy_13_Copy_1"/>
+      <w:bookmarkEnd w:id="71"/>
       <w:r>
         <w:rPr>
           <w:rStyle w:val="SourceText"/>
@@ -8576,8 +8583,8 @@
         <w:pStyle w:val="Heading3"/>
         <w:rPr/>
       </w:pPr>
-      <w:bookmarkStart w:id="71" w:name="__RefHeading___Toc1387_1846826748"/>
-      <w:bookmarkEnd w:id="71"/>
+      <w:bookmarkStart w:id="72" w:name="__RefHeading___Toc1387_1846826748"/>
+      <w:bookmarkEnd w:id="72"/>
       <w:r>
         <w:rPr/>
         <w:t>Khi xem waveform sẽ thấy</w:t>
@@ -8601,8 +8608,8 @@
         <w:ind w:hanging="0" w:start="0" w:end="0"/>
         <w:rPr/>
       </w:pPr>
-      <w:bookmarkStart w:id="72" w:name="code-block-viewer_Copy_14_Copy_1"/>
-      <w:bookmarkEnd w:id="72"/>
+      <w:bookmarkStart w:id="73" w:name="code-block-viewer_Copy_14_Copy_1"/>
+      <w:bookmarkEnd w:id="73"/>
       <w:r>
         <w:rPr>
           <w:rStyle w:val="SourceText"/>
@@ -8767,8 +8774,8 @@
         <w:ind w:hanging="0" w:start="0"/>
         <w:rPr/>
       </w:pPr>
-      <w:bookmarkStart w:id="73" w:name="__RefHeading___Toc1389_1846826748"/>
-      <w:bookmarkEnd w:id="73"/>
+      <w:bookmarkStart w:id="74" w:name="__RefHeading___Toc1389_1846826748"/>
+      <w:bookmarkEnd w:id="74"/>
       <w:r>
         <w:rPr/>
         <w:t>Decoder</w:t>
@@ -8788,28 +8795,7 @@
           <w:b/>
           <w:bCs/>
         </w:rPr>
-        <w:t>Decoder nhận một mã nhị phân n bit và kích hoạt duy nhất một trong 2</w:t>
-      </w:r>
-      <w:r>
-        <w:rPr>
-          <w:b/>
-          <w:bCs/>
-        </w:rPr>
-        <w:t>^</w:t>
-      </w:r>
-      <w:r>
-        <w:rPr>
-          <w:b/>
-          <w:bCs/>
-        </w:rPr>
-        <w:t xml:space="preserve">n đầu ra. </w:t>
-      </w:r>
-      <w:r>
-        <w:rPr>
-          <w:b/>
-          <w:bCs/>
-        </w:rPr>
-        <w:t xml:space="preserve">tức là </w:t>
+        <w:t xml:space="preserve">Decoder nhận một mã nhị phân n bit và kích hoạt duy nhất một trong 2^n đầu ra. tức là </w:t>
       </w:r>
       <w:r>
         <w:rPr>
@@ -8850,8 +8836,8 @@
       </w:tblPr>
       <w:tblGrid>
         <w:gridCol w:w="694"/>
-        <w:gridCol w:w="853"/>
-        <w:gridCol w:w="1625"/>
+        <w:gridCol w:w="852"/>
+        <w:gridCol w:w="1626"/>
       </w:tblGrid>
       <w:tr>
         <w:trPr>
@@ -8876,7 +8862,7 @@
         </w:tc>
         <w:tc>
           <w:tcPr>
-            <w:tcW w:w="853" w:type="dxa"/>
+            <w:tcW w:w="852" w:type="dxa"/>
             <w:tcBorders/>
             <w:vAlign w:val="center"/>
           </w:tcPr>
@@ -8893,7 +8879,7 @@
         </w:tc>
         <w:tc>
           <w:tcPr>
-            <w:tcW w:w="1625" w:type="dxa"/>
+            <w:tcW w:w="1626" w:type="dxa"/>
             <w:tcBorders/>
             <w:vAlign w:val="center"/>
           </w:tcPr>
@@ -8930,7 +8916,7 @@
         </w:tc>
         <w:tc>
           <w:tcPr>
-            <w:tcW w:w="853" w:type="dxa"/>
+            <w:tcW w:w="852" w:type="dxa"/>
             <w:tcBorders/>
             <w:vAlign w:val="center"/>
           </w:tcPr>
@@ -8947,7 +8933,7 @@
         </w:tc>
         <w:tc>
           <w:tcPr>
-            <w:tcW w:w="1625" w:type="dxa"/>
+            <w:tcW w:w="1626" w:type="dxa"/>
             <w:tcBorders/>
             <w:vAlign w:val="center"/>
           </w:tcPr>
@@ -8984,7 +8970,7 @@
         </w:tc>
         <w:tc>
           <w:tcPr>
-            <w:tcW w:w="853" w:type="dxa"/>
+            <w:tcW w:w="852" w:type="dxa"/>
             <w:tcBorders/>
             <w:vAlign w:val="center"/>
           </w:tcPr>
@@ -9001,7 +8987,7 @@
         </w:tc>
         <w:tc>
           <w:tcPr>
-            <w:tcW w:w="1625" w:type="dxa"/>
+            <w:tcW w:w="1626" w:type="dxa"/>
             <w:tcBorders/>
             <w:vAlign w:val="center"/>
           </w:tcPr>
@@ -9038,7 +9024,7 @@
         </w:tc>
         <w:tc>
           <w:tcPr>
-            <w:tcW w:w="853" w:type="dxa"/>
+            <w:tcW w:w="852" w:type="dxa"/>
             <w:tcBorders/>
             <w:vAlign w:val="center"/>
           </w:tcPr>
@@ -9055,7 +9041,7 @@
         </w:tc>
         <w:tc>
           <w:tcPr>
-            <w:tcW w:w="1625" w:type="dxa"/>
+            <w:tcW w:w="1626" w:type="dxa"/>
             <w:tcBorders/>
             <w:vAlign w:val="center"/>
           </w:tcPr>
@@ -9092,7 +9078,7 @@
         </w:tc>
         <w:tc>
           <w:tcPr>
-            <w:tcW w:w="853" w:type="dxa"/>
+            <w:tcW w:w="852" w:type="dxa"/>
             <w:tcBorders/>
             <w:vAlign w:val="center"/>
           </w:tcPr>
@@ -9109,7 +9095,7 @@
         </w:tc>
         <w:tc>
           <w:tcPr>
-            <w:tcW w:w="1625" w:type="dxa"/>
+            <w:tcW w:w="1626" w:type="dxa"/>
             <w:tcBorders/>
             <w:vAlign w:val="center"/>
           </w:tcPr>
@@ -9146,7 +9132,7 @@
         </w:tc>
         <w:tc>
           <w:tcPr>
-            <w:tcW w:w="853" w:type="dxa"/>
+            <w:tcW w:w="852" w:type="dxa"/>
             <w:tcBorders/>
             <w:vAlign w:val="center"/>
           </w:tcPr>
@@ -9163,7 +9149,7 @@
         </w:tc>
         <w:tc>
           <w:tcPr>
-            <w:tcW w:w="1625" w:type="dxa"/>
+            <w:tcW w:w="1626" w:type="dxa"/>
             <w:tcBorders/>
             <w:vAlign w:val="center"/>
           </w:tcPr>
@@ -9236,8 +9222,8 @@
         <w:gridCol w:w="1606"/>
         <w:gridCol w:w="1606"/>
         <w:gridCol w:w="1607"/>
-        <w:gridCol w:w="1606"/>
-        <w:gridCol w:w="1606"/>
+        <w:gridCol w:w="1607"/>
+        <w:gridCol w:w="1605"/>
       </w:tblGrid>
       <w:tr>
         <w:trPr/>
@@ -9323,7 +9309,7 @@
         </w:tc>
         <w:tc>
           <w:tcPr>
-            <w:tcW w:w="1606" w:type="dxa"/>
+            <w:tcW w:w="1607" w:type="dxa"/>
             <w:tcBorders>
               <w:top w:val="single" w:sz="4" w:space="0" w:color="000000"/>
               <w:start w:val="single" w:sz="4" w:space="0" w:color="000000"/>
@@ -9343,7 +9329,7 @@
         </w:tc>
         <w:tc>
           <w:tcPr>
-            <w:tcW w:w="1606" w:type="dxa"/>
+            <w:tcW w:w="1605" w:type="dxa"/>
             <w:tcBorders>
               <w:top w:val="single" w:sz="4" w:space="0" w:color="000000"/>
               <w:start w:val="single" w:sz="4" w:space="0" w:color="000000"/>
@@ -9443,6 +9429,48 @@
         </w:tc>
         <w:tc>
           <w:tcPr>
+            <w:tcW w:w="1607" w:type="dxa"/>
+            <w:tcBorders>
+              <w:start w:val="single" w:sz="4" w:space="0" w:color="000000"/>
+              <w:bottom w:val="single" w:sz="4" w:space="0" w:color="000000"/>
+            </w:tcBorders>
+          </w:tcPr>
+          <w:p>
+            <w:pPr>
+              <w:pStyle w:val="TableContents"/>
+              <w:rPr/>
+            </w:pPr>
+            <w:r>
+              <w:rPr/>
+              <w:t>0</w:t>
+            </w:r>
+          </w:p>
+        </w:tc>
+        <w:tc>
+          <w:tcPr>
+            <w:tcW w:w="1605" w:type="dxa"/>
+            <w:tcBorders>
+              <w:start w:val="single" w:sz="4" w:space="0" w:color="000000"/>
+              <w:bottom w:val="single" w:sz="4" w:space="0" w:color="000000"/>
+              <w:end w:val="single" w:sz="4" w:space="0" w:color="000000"/>
+            </w:tcBorders>
+          </w:tcPr>
+          <w:p>
+            <w:pPr>
+              <w:pStyle w:val="TableContents"/>
+              <w:rPr/>
+            </w:pPr>
+            <w:r>
+              <w:rPr/>
+              <w:t>1</w:t>
+            </w:r>
+          </w:p>
+        </w:tc>
+      </w:tr>
+      <w:tr>
+        <w:trPr/>
+        <w:tc>
+          <w:tcPr>
             <w:tcW w:w="1606" w:type="dxa"/>
             <w:tcBorders>
               <w:start w:val="single" w:sz="4" w:space="0" w:color="000000"/>
@@ -9466,7 +9494,6 @@
             <w:tcBorders>
               <w:start w:val="single" w:sz="4" w:space="0" w:color="000000"/>
               <w:bottom w:val="single" w:sz="4" w:space="0" w:color="000000"/>
-              <w:end w:val="single" w:sz="4" w:space="0" w:color="000000"/>
             </w:tcBorders>
           </w:tcPr>
           <w:p>
@@ -9480,9 +9507,6 @@
             </w:r>
           </w:p>
         </w:tc>
-      </w:tr>
-      <w:tr>
-        <w:trPr/>
         <w:tc>
           <w:tcPr>
             <w:tcW w:w="1606" w:type="dxa"/>
@@ -9504,6 +9528,67 @@
         </w:tc>
         <w:tc>
           <w:tcPr>
+            <w:tcW w:w="1607" w:type="dxa"/>
+            <w:tcBorders>
+              <w:start w:val="single" w:sz="4" w:space="0" w:color="000000"/>
+              <w:bottom w:val="single" w:sz="4" w:space="0" w:color="000000"/>
+            </w:tcBorders>
+          </w:tcPr>
+          <w:p>
+            <w:pPr>
+              <w:pStyle w:val="TableContents"/>
+              <w:rPr/>
+            </w:pPr>
+            <w:r>
+              <w:rPr/>
+              <w:t>0</w:t>
+            </w:r>
+          </w:p>
+        </w:tc>
+        <w:tc>
+          <w:tcPr>
+            <w:tcW w:w="1607" w:type="dxa"/>
+            <w:tcBorders>
+              <w:start w:val="single" w:sz="4" w:space="0" w:color="000000"/>
+              <w:bottom w:val="single" w:sz="4" w:space="0" w:color="000000"/>
+            </w:tcBorders>
+          </w:tcPr>
+          <w:p>
+            <w:pPr>
+              <w:pStyle w:val="TableContents"/>
+              <w:rPr/>
+            </w:pPr>
+            <w:r>
+              <w:rPr/>
+              <w:t>1</w:t>
+            </w:r>
+          </w:p>
+        </w:tc>
+        <w:tc>
+          <w:tcPr>
+            <w:tcW w:w="1605" w:type="dxa"/>
+            <w:tcBorders>
+              <w:start w:val="single" w:sz="4" w:space="0" w:color="000000"/>
+              <w:bottom w:val="single" w:sz="4" w:space="0" w:color="000000"/>
+              <w:end w:val="single" w:sz="4" w:space="0" w:color="000000"/>
+            </w:tcBorders>
+          </w:tcPr>
+          <w:p>
+            <w:pPr>
+              <w:pStyle w:val="TableContents"/>
+              <w:rPr/>
+            </w:pPr>
+            <w:r>
+              <w:rPr/>
+              <w:t>0</w:t>
+            </w:r>
+          </w:p>
+        </w:tc>
+      </w:tr>
+      <w:tr>
+        <w:trPr/>
+        <w:tc>
+          <w:tcPr>
             <w:tcW w:w="1606" w:type="dxa"/>
             <w:tcBorders>
               <w:start w:val="single" w:sz="4" w:space="0" w:color="000000"/>
@@ -9542,6 +9627,25 @@
         </w:tc>
         <w:tc>
           <w:tcPr>
+            <w:tcW w:w="1606" w:type="dxa"/>
+            <w:tcBorders>
+              <w:start w:val="single" w:sz="4" w:space="0" w:color="000000"/>
+              <w:bottom w:val="single" w:sz="4" w:space="0" w:color="000000"/>
+            </w:tcBorders>
+          </w:tcPr>
+          <w:p>
+            <w:pPr>
+              <w:pStyle w:val="TableContents"/>
+              <w:rPr/>
+            </w:pPr>
+            <w:r>
+              <w:rPr/>
+              <w:t>0</w:t>
+            </w:r>
+          </w:p>
+        </w:tc>
+        <w:tc>
+          <w:tcPr>
             <w:tcW w:w="1607" w:type="dxa"/>
             <w:tcBorders>
               <w:start w:val="single" w:sz="4" w:space="0" w:color="000000"/>
@@ -9555,10 +9659,52 @@
             </w:pPr>
             <w:r>
               <w:rPr/>
+              <w:t>1</w:t>
+            </w:r>
+          </w:p>
+        </w:tc>
+        <w:tc>
+          <w:tcPr>
+            <w:tcW w:w="1607" w:type="dxa"/>
+            <w:tcBorders>
+              <w:start w:val="single" w:sz="4" w:space="0" w:color="000000"/>
+              <w:bottom w:val="single" w:sz="4" w:space="0" w:color="000000"/>
+            </w:tcBorders>
+          </w:tcPr>
+          <w:p>
+            <w:pPr>
+              <w:pStyle w:val="TableContents"/>
+              <w:rPr/>
+            </w:pPr>
+            <w:r>
+              <w:rPr/>
               <w:t>0</w:t>
             </w:r>
           </w:p>
         </w:tc>
+        <w:tc>
+          <w:tcPr>
+            <w:tcW w:w="1605" w:type="dxa"/>
+            <w:tcBorders>
+              <w:start w:val="single" w:sz="4" w:space="0" w:color="000000"/>
+              <w:bottom w:val="single" w:sz="4" w:space="0" w:color="000000"/>
+              <w:end w:val="single" w:sz="4" w:space="0" w:color="000000"/>
+            </w:tcBorders>
+          </w:tcPr>
+          <w:p>
+            <w:pPr>
+              <w:pStyle w:val="TableContents"/>
+              <w:rPr/>
+            </w:pPr>
+            <w:r>
+              <w:rPr/>
+              <w:t>0</w:t>
+            </w:r>
+          </w:p>
+        </w:tc>
+      </w:tr>
+      <w:tr>
+        <w:trPr/>
         <w:tc>
           <w:tcPr>
             <w:tcW w:w="1606" w:type="dxa"/>
@@ -9584,7 +9730,6 @@
             <w:tcBorders>
               <w:start w:val="single" w:sz="4" w:space="0" w:color="000000"/>
               <w:bottom w:val="single" w:sz="4" w:space="0" w:color="000000"/>
-              <w:end w:val="single" w:sz="4" w:space="0" w:color="000000"/>
             </w:tcBorders>
           </w:tcPr>
           <w:p>
@@ -9594,13 +9739,10 @@
             </w:pPr>
             <w:r>
               <w:rPr/>
-              <w:t>0</w:t>
-            </w:r>
-          </w:p>
-        </w:tc>
-      </w:tr>
-      <w:tr>
-        <w:trPr/>
+              <w:t>1</w:t>
+            </w:r>
+          </w:p>
+        </w:tc>
         <w:tc>
           <w:tcPr>
             <w:tcW w:w="1606" w:type="dxa"/>
@@ -9622,44 +9764,6 @@
         </w:tc>
         <w:tc>
           <w:tcPr>
-            <w:tcW w:w="1606" w:type="dxa"/>
-            <w:tcBorders>
-              <w:start w:val="single" w:sz="4" w:space="0" w:color="000000"/>
-              <w:bottom w:val="single" w:sz="4" w:space="0" w:color="000000"/>
-            </w:tcBorders>
-          </w:tcPr>
-          <w:p>
-            <w:pPr>
-              <w:pStyle w:val="TableContents"/>
-              <w:rPr/>
-            </w:pPr>
-            <w:r>
-              <w:rPr/>
-              <w:t>0</w:t>
-            </w:r>
-          </w:p>
-        </w:tc>
-        <w:tc>
-          <w:tcPr>
-            <w:tcW w:w="1606" w:type="dxa"/>
-            <w:tcBorders>
-              <w:start w:val="single" w:sz="4" w:space="0" w:color="000000"/>
-              <w:bottom w:val="single" w:sz="4" w:space="0" w:color="000000"/>
-            </w:tcBorders>
-          </w:tcPr>
-          <w:p>
-            <w:pPr>
-              <w:pStyle w:val="TableContents"/>
-              <w:rPr/>
-            </w:pPr>
-            <w:r>
-              <w:rPr/>
-              <w:t>0</w:t>
-            </w:r>
-          </w:p>
-        </w:tc>
-        <w:tc>
-          <w:tcPr>
             <w:tcW w:w="1607" w:type="dxa"/>
             <w:tcBorders>
               <w:start w:val="single" w:sz="4" w:space="0" w:color="000000"/>
@@ -9673,106 +9777,7 @@
             </w:pPr>
             <w:r>
               <w:rPr/>
-              <w:t>1</w:t>
-            </w:r>
-          </w:p>
-        </w:tc>
-        <w:tc>
-          <w:tcPr>
-            <w:tcW w:w="1606" w:type="dxa"/>
-            <w:tcBorders>
-              <w:start w:val="single" w:sz="4" w:space="0" w:color="000000"/>
-              <w:bottom w:val="single" w:sz="4" w:space="0" w:color="000000"/>
-            </w:tcBorders>
-          </w:tcPr>
-          <w:p>
-            <w:pPr>
-              <w:pStyle w:val="TableContents"/>
-              <w:rPr/>
-            </w:pPr>
-            <w:r>
-              <w:rPr/>
               <w:t>0</w:t>
-            </w:r>
-          </w:p>
-        </w:tc>
-        <w:tc>
-          <w:tcPr>
-            <w:tcW w:w="1606" w:type="dxa"/>
-            <w:tcBorders>
-              <w:start w:val="single" w:sz="4" w:space="0" w:color="000000"/>
-              <w:bottom w:val="single" w:sz="4" w:space="0" w:color="000000"/>
-              <w:end w:val="single" w:sz="4" w:space="0" w:color="000000"/>
-            </w:tcBorders>
-          </w:tcPr>
-          <w:p>
-            <w:pPr>
-              <w:pStyle w:val="TableContents"/>
-              <w:rPr/>
-            </w:pPr>
-            <w:r>
-              <w:rPr/>
-              <w:t>0</w:t>
-            </w:r>
-          </w:p>
-        </w:tc>
-      </w:tr>
-      <w:tr>
-        <w:trPr/>
-        <w:tc>
-          <w:tcPr>
-            <w:tcW w:w="1606" w:type="dxa"/>
-            <w:tcBorders>
-              <w:start w:val="single" w:sz="4" w:space="0" w:color="000000"/>
-              <w:bottom w:val="single" w:sz="4" w:space="0" w:color="000000"/>
-            </w:tcBorders>
-          </w:tcPr>
-          <w:p>
-            <w:pPr>
-              <w:pStyle w:val="TableContents"/>
-              <w:rPr/>
-            </w:pPr>
-            <w:r>
-              <w:rPr/>
-              <w:t>1</w:t>
-            </w:r>
-          </w:p>
-        </w:tc>
-        <w:tc>
-          <w:tcPr>
-            <w:tcW w:w="1606" w:type="dxa"/>
-            <w:tcBorders>
-              <w:start w:val="single" w:sz="4" w:space="0" w:color="000000"/>
-              <w:bottom w:val="single" w:sz="4" w:space="0" w:color="000000"/>
-            </w:tcBorders>
-          </w:tcPr>
-          <w:p>
-            <w:pPr>
-              <w:pStyle w:val="TableContents"/>
-              <w:rPr/>
-            </w:pPr>
-            <w:r>
-              <w:rPr/>
-              <w:t>1</w:t>
-            </w:r>
-          </w:p>
-        </w:tc>
-        <w:tc>
-          <w:tcPr>
-            <w:tcW w:w="1606" w:type="dxa"/>
-            <w:tcBorders>
-              <w:start w:val="single" w:sz="4" w:space="0" w:color="000000"/>
-              <w:bottom w:val="single" w:sz="4" w:space="0" w:color="000000"/>
-            </w:tcBorders>
-          </w:tcPr>
-          <w:p>
-            <w:pPr>
-              <w:pStyle w:val="TableContents"/>
-              <w:rPr/>
-            </w:pPr>
-            <w:r>
-              <w:rPr/>
-              <w:t>1</w:t>
             </w:r>
           </w:p>
         </w:tc>
@@ -9797,26 +9802,7 @@
         </w:tc>
         <w:tc>
           <w:tcPr>
-            <w:tcW w:w="1606" w:type="dxa"/>
-            <w:tcBorders>
-              <w:start w:val="single" w:sz="4" w:space="0" w:color="000000"/>
-              <w:bottom w:val="single" w:sz="4" w:space="0" w:color="000000"/>
-            </w:tcBorders>
-          </w:tcPr>
-          <w:p>
-            <w:pPr>
-              <w:pStyle w:val="TableContents"/>
-              <w:rPr/>
-            </w:pPr>
-            <w:r>
-              <w:rPr/>
-              <w:t>0</w:t>
-            </w:r>
-          </w:p>
-        </w:tc>
-        <w:tc>
-          <w:tcPr>
-            <w:tcW w:w="1606" w:type="dxa"/>
+            <w:tcW w:w="1605" w:type="dxa"/>
             <w:tcBorders>
               <w:start w:val="single" w:sz="4" w:space="0" w:color="000000"/>
               <w:bottom w:val="single" w:sz="4" w:space="0" w:color="000000"/>
@@ -9855,8 +9841,8 @@
         <w:spacing w:before="200" w:after="120"/>
         <w:rPr/>
       </w:pPr>
-      <w:bookmarkStart w:id="74" w:name="__RefHeading___Toc1391_1846826748"/>
-      <w:bookmarkEnd w:id="74"/>
+      <w:bookmarkStart w:id="75" w:name="__RefHeading___Toc1391_1846826748"/>
+      <w:bookmarkEnd w:id="75"/>
       <w:r>
         <w:rPr/>
         <w:t xml:space="preserve">Viết bằng </w:t>
@@ -10033,8 +10019,8 @@
         <w:spacing w:before="200" w:after="120"/>
         <w:rPr/>
       </w:pPr>
-      <w:bookmarkStart w:id="75" w:name="__RefHeading___Toc1393_1846826748"/>
-      <w:bookmarkEnd w:id="75"/>
+      <w:bookmarkStart w:id="76" w:name="__RefHeading___Toc1393_1846826748"/>
+      <w:bookmarkEnd w:id="76"/>
       <w:r>
         <w:rPr/>
         <w:t xml:space="preserve">Viết bằng </w:t>
@@ -10064,8 +10050,8 @@
         <w:ind w:hanging="0" w:start="0" w:end="0"/>
         <w:rPr/>
       </w:pPr>
-      <w:bookmarkStart w:id="76" w:name="code-block-viewer_Copy_1_Copy_1"/>
-      <w:bookmarkEnd w:id="76"/>
+      <w:bookmarkStart w:id="77" w:name="code-block-viewer_Copy_1_Copy_1_Copy_1"/>
+      <w:bookmarkEnd w:id="77"/>
       <w:r>
         <w:rPr>
           <w:rStyle w:val="SourceText"/>
@@ -10315,8 +10301,8 @@
         <w:spacing w:before="200" w:after="120"/>
         <w:rPr/>
       </w:pPr>
-      <w:bookmarkStart w:id="77" w:name="__RefHeading___Toc1395_1846826748"/>
-      <w:bookmarkEnd w:id="77"/>
+      <w:bookmarkStart w:id="78" w:name="__RefHeading___Toc1395_1846826748"/>
+      <w:bookmarkEnd w:id="78"/>
       <w:r>
         <w:rPr/>
         <w:t>Decoder có Enable</w:t>
@@ -10350,8 +10336,8 @@
         <w:ind w:hanging="0" w:start="0" w:end="0"/>
         <w:rPr/>
       </w:pPr>
-      <w:bookmarkStart w:id="78" w:name="code-block-viewer_Copy_2_Copy_1"/>
-      <w:bookmarkEnd w:id="78"/>
+      <w:bookmarkStart w:id="79" w:name="code-block-viewer_Copy_2_Copy_1_Copy_1"/>
+      <w:bookmarkEnd w:id="79"/>
       <w:r>
         <w:rPr>
           <w:rStyle w:val="SourceText"/>
@@ -10547,8 +10533,8 @@
         <w:ind w:hanging="0" w:start="0"/>
         <w:rPr/>
       </w:pPr>
-      <w:bookmarkStart w:id="79" w:name="__RefHeading___Toc1397_1846826748"/>
-      <w:bookmarkEnd w:id="79"/>
+      <w:bookmarkStart w:id="80" w:name="__RefHeading___Toc1397_1846826748"/>
+      <w:bookmarkEnd w:id="80"/>
       <w:r>
         <w:rPr/>
         <w:t>Encoder</w:t>
@@ -10571,7 +10557,315 @@
       </w:r>
       <w:r>
         <w:rPr/>
+        <w:t xml:space="preserve">. Encoder thường có </w:t>
+      </w:r>
+      <w:r>
+        <w:rPr>
+          <w:rStyle w:val="Strong"/>
+        </w:rPr>
+        <w:t>một luật</w:t>
+      </w:r>
+      <w:r>
+        <w:rPr/>
+        <w:t>:</w:t>
+      </w:r>
+      <w:r>
+        <w:rPr>
+          <w:rStyle w:val="Strong"/>
+        </w:rPr>
+        <w:t>Chỉ được phép có đúng 1 công tắc ON.</w:t>
+      </w:r>
+    </w:p>
+    <w:p>
+      <w:pPr>
+        <w:pStyle w:val="BodyText"/>
+        <w:rPr/>
+      </w:pPr>
+      <w:r>
+        <w:rPr/>
+        <w:t>Ví dụ:</w:t>
+      </w:r>
+    </w:p>
+    <w:p>
+      <w:pPr>
+        <w:sectPr>
+          <w:type w:val="continuous"/>
+          <w:pgSz w:w="11906" w:h="16838"/>
+          <w:pgMar w:left="1134" w:right="1134" w:gutter="0" w:header="0" w:top="1134" w:footer="1134" w:bottom="1693"/>
+          <w:formProt w:val="false"/>
+          <w:textDirection w:val="lrTb"/>
+          <w:docGrid w:type="default" w:linePitch="100" w:charSpace="0"/>
+        </w:sectPr>
+      </w:pPr>
+    </w:p>
+    <w:p>
+      <w:pPr>
+        <w:pStyle w:val="PreformattedText"/>
+        <w:spacing w:before="0" w:after="283"/>
+        <w:ind w:hanging="0" w:start="0" w:end="0"/>
+        <w:rPr/>
+      </w:pPr>
+      <w:r>
+        <w:rPr>
+          <w:rStyle w:val="SourceText"/>
+        </w:rPr>
+        <w:t>00001000</w:t>
+      </w:r>
+    </w:p>
+    <w:p>
+      <w:pPr>
+        <w:sectPr>
+          <w:type w:val="continuous"/>
+          <w:pgSz w:w="11906" w:h="16838"/>
+          <w:pgMar w:left="1134" w:right="1134" w:gutter="0" w:header="0" w:top="1134" w:footer="1134" w:bottom="1693"/>
+          <w:formProt w:val="false"/>
+          <w:textDirection w:val="lrTb"/>
+          <w:docGrid w:type="default" w:linePitch="100" w:charSpace="0"/>
+        </w:sectPr>
+      </w:pPr>
+    </w:p>
+    <w:p>
+      <w:pPr>
+        <w:pStyle w:val="BodyText"/>
+        <w:rPr/>
+      </w:pPr>
+      <w:r>
+        <w:rPr/>
+        <w:t xml:space="preserve">Chỉ có </w:t>
+      </w:r>
+      <w:r>
+        <w:rPr>
+          <w:rStyle w:val="SourceText"/>
+        </w:rPr>
+        <w:t>a3 = 1</w:t>
+      </w:r>
+      <w:r>
+        <w:rPr/>
         <w:t>.</w:t>
+      </w:r>
+    </w:p>
+    <w:p>
+      <w:pPr>
+        <w:pStyle w:val="BodyText"/>
+        <w:rPr/>
+      </w:pPr>
+      <w:r>
+        <w:rPr/>
+        <w:t>Encoder trả về:</w:t>
+      </w:r>
+    </w:p>
+    <w:p>
+      <w:pPr>
+        <w:sectPr>
+          <w:type w:val="continuous"/>
+          <w:pgSz w:w="11906" w:h="16838"/>
+          <w:pgMar w:left="1134" w:right="1134" w:gutter="0" w:header="0" w:top="1134" w:footer="1134" w:bottom="1693"/>
+          <w:formProt w:val="false"/>
+          <w:textDirection w:val="lrTb"/>
+          <w:docGrid w:type="default" w:linePitch="100" w:charSpace="0"/>
+        </w:sectPr>
+      </w:pPr>
+    </w:p>
+    <w:p>
+      <w:pPr>
+        <w:pStyle w:val="PreformattedText"/>
+        <w:spacing w:before="0" w:after="283"/>
+        <w:ind w:hanging="0" w:start="0" w:end="0"/>
+        <w:rPr/>
+      </w:pPr>
+      <w:bookmarkStart w:id="81" w:name="code-block-viewer_Copy_1"/>
+      <w:bookmarkEnd w:id="81"/>
+      <w:r>
+        <w:rPr>
+          <w:rStyle w:val="SourceText"/>
+        </w:rPr>
+        <w:t>011</w:t>
+      </w:r>
+    </w:p>
+    <w:p>
+      <w:pPr>
+        <w:sectPr>
+          <w:type w:val="continuous"/>
+          <w:pgSz w:w="11906" w:h="16838"/>
+          <w:pgMar w:left="1134" w:right="1134" w:gutter="0" w:header="0" w:top="1134" w:footer="1134" w:bottom="1693"/>
+          <w:formProt w:val="false"/>
+          <w:textDirection w:val="lrTb"/>
+          <w:docGrid w:type="default" w:linePitch="100" w:charSpace="0"/>
+        </w:sectPr>
+      </w:pPr>
+    </w:p>
+    <w:p>
+      <w:pPr>
+        <w:pStyle w:val="BodyText"/>
+        <w:rPr/>
+      </w:pPr>
+      <w:r>
+        <w:rPr/>
+        <w:t xml:space="preserve">vì </w:t>
+      </w:r>
+      <w:r>
+        <w:rPr>
+          <w:rStyle w:val="SourceText"/>
+        </w:rPr>
+        <w:t>3</w:t>
+      </w:r>
+      <w:r>
+        <w:rPr/>
+        <w:t xml:space="preserve"> trong nhị phân là </w:t>
+      </w:r>
+      <w:r>
+        <w:rPr>
+          <w:rStyle w:val="SourceText"/>
+        </w:rPr>
+        <w:t>011</w:t>
+      </w:r>
+      <w:r>
+        <w:rPr/>
+        <w:t>.</w:t>
+      </w:r>
+    </w:p>
+    <w:p>
+      <w:pPr>
+        <w:pStyle w:val="Heading2"/>
+        <w:numPr>
+          <w:ilvl w:val="1"/>
+          <w:numId w:val="1"/>
+        </w:numPr>
+        <w:spacing w:before="200" w:after="120"/>
+        <w:rPr/>
+      </w:pPr>
+      <w:r>
+        <w:rPr/>
+        <w:t>Nếu vi phạm luật thì sao?</w:t>
+      </w:r>
+    </w:p>
+    <w:p>
+      <w:pPr>
+        <w:pStyle w:val="BodyText"/>
+        <w:rPr/>
+      </w:pPr>
+      <w:r>
+        <w:rPr/>
+        <w:t>Ví dụ:</w:t>
+      </w:r>
+    </w:p>
+    <w:p>
+      <w:pPr>
+        <w:sectPr>
+          <w:type w:val="continuous"/>
+          <w:pgSz w:w="11906" w:h="16838"/>
+          <w:pgMar w:left="1134" w:right="1134" w:gutter="0" w:header="0" w:top="1134" w:footer="1134" w:bottom="1693"/>
+          <w:formProt w:val="false"/>
+          <w:textDirection w:val="lrTb"/>
+          <w:docGrid w:type="default" w:linePitch="100" w:charSpace="0"/>
+        </w:sectPr>
+      </w:pPr>
+    </w:p>
+    <w:p>
+      <w:pPr>
+        <w:pStyle w:val="PreformattedText"/>
+        <w:spacing w:before="0" w:after="283"/>
+        <w:ind w:hanging="0" w:start="0" w:end="0"/>
+        <w:rPr/>
+      </w:pPr>
+      <w:bookmarkStart w:id="82" w:name="code-block-viewer_Copy_2"/>
+      <w:bookmarkEnd w:id="82"/>
+      <w:r>
+        <w:rPr>
+          <w:rStyle w:val="SourceText"/>
+        </w:rPr>
+        <w:t>00101000</w:t>
+      </w:r>
+    </w:p>
+    <w:p>
+      <w:pPr>
+        <w:sectPr>
+          <w:type w:val="continuous"/>
+          <w:pgSz w:w="11906" w:h="16838"/>
+          <w:pgMar w:left="1134" w:right="1134" w:gutter="0" w:header="0" w:top="1134" w:footer="1134" w:bottom="1693"/>
+          <w:formProt w:val="false"/>
+          <w:textDirection w:val="lrTb"/>
+          <w:docGrid w:type="default" w:linePitch="100" w:charSpace="0"/>
+        </w:sectPr>
+      </w:pPr>
+    </w:p>
+    <w:p>
+      <w:pPr>
+        <w:pStyle w:val="BodyText"/>
+        <w:rPr/>
+      </w:pPr>
+      <w:r>
+        <w:rPr/>
+        <w:t xml:space="preserve">Có cả </w:t>
+      </w:r>
+      <w:r>
+        <w:rPr>
+          <w:rStyle w:val="SourceText"/>
+        </w:rPr>
+        <w:t>a5 = 1</w:t>
+      </w:r>
+      <w:r>
+        <w:rPr/>
+        <w:t xml:space="preserve"> và </w:t>
+      </w:r>
+      <w:r>
+        <w:rPr>
+          <w:rStyle w:val="SourceText"/>
+        </w:rPr>
+        <w:t>a3 = 1</w:t>
+      </w:r>
+      <w:r>
+        <w:rPr/>
+        <w:t>.</w:t>
+      </w:r>
+    </w:p>
+    <w:p>
+      <w:pPr>
+        <w:pStyle w:val="BodyText"/>
+        <w:rPr/>
+      </w:pPr>
+      <w:r>
+        <w:rPr/>
+        <w:t>Lúc này encoder bị "rối":</w:t>
+      </w:r>
+    </w:p>
+    <w:p>
+      <w:pPr>
+        <w:pStyle w:val="BlockQuotation"/>
+        <w:rPr/>
+      </w:pPr>
+      <w:r>
+        <w:rPr/>
+        <w:t>"Ủa, tao phải trả về 5 hay 3?"</w:t>
+      </w:r>
+    </w:p>
+    <w:p>
+      <w:pPr>
+        <w:pStyle w:val="BodyText"/>
+        <w:rPr/>
+      </w:pPr>
+      <w:r>
+        <w:rPr/>
+        <w:t xml:space="preserve">Nó không được thiết kế để xử lý trường hợp này nên kết quả </w:t>
+      </w:r>
+      <w:r>
+        <w:rPr>
+          <w:rStyle w:val="Strong"/>
+        </w:rPr>
+        <w:t>không đáng tin</w:t>
+      </w:r>
+      <w:r>
+        <w:rPr/>
+        <w:t>.</w:t>
+      </w:r>
+    </w:p>
+    <w:p>
+      <w:pPr>
+        <w:pStyle w:val="BodyText"/>
+        <w:rPr/>
+      </w:pPr>
+      <w:r>
+        <w:rPr/>
       </w:r>
     </w:p>
     <w:p>
@@ -10608,7 +10902,7 @@
         </w:tblCellMar>
       </w:tblPr>
       <w:tblGrid>
-        <w:gridCol w:w="1081"/>
+        <w:gridCol w:w="1080"/>
         <w:gridCol w:w="898"/>
       </w:tblGrid>
       <w:tr>
@@ -10617,7 +10911,7 @@
         </w:trPr>
         <w:tc>
           <w:tcPr>
-            <w:tcW w:w="1081" w:type="dxa"/>
+            <w:tcW w:w="1080" w:type="dxa"/>
             <w:tcBorders/>
             <w:vAlign w:val="center"/>
           </w:tcPr>
@@ -10654,7 +10948,7 @@
         <w:trPr/>
         <w:tc>
           <w:tcPr>
-            <w:tcW w:w="1081" w:type="dxa"/>
+            <w:tcW w:w="1080" w:type="dxa"/>
             <w:tcBorders/>
             <w:vAlign w:val="center"/>
           </w:tcPr>
@@ -10691,7 +10985,7 @@
         <w:trPr/>
         <w:tc>
           <w:tcPr>
-            <w:tcW w:w="1081" w:type="dxa"/>
+            <w:tcW w:w="1080" w:type="dxa"/>
             <w:tcBorders/>
             <w:vAlign w:val="center"/>
           </w:tcPr>
@@ -10728,7 +11022,7 @@
         <w:trPr/>
         <w:tc>
           <w:tcPr>
-            <w:tcW w:w="1081" w:type="dxa"/>
+            <w:tcW w:w="1080" w:type="dxa"/>
             <w:tcBorders/>
             <w:vAlign w:val="center"/>
           </w:tcPr>
@@ -10765,7 +11059,7 @@
         <w:trPr/>
         <w:tc>
           <w:tcPr>
-            <w:tcW w:w="1081" w:type="dxa"/>
+            <w:tcW w:w="1080" w:type="dxa"/>
             <w:tcBorders/>
             <w:vAlign w:val="center"/>
           </w:tcPr>
@@ -10802,7 +11096,7 @@
         <w:trPr/>
         <w:tc>
           <w:tcPr>
-            <w:tcW w:w="1081" w:type="dxa"/>
+            <w:tcW w:w="1080" w:type="dxa"/>
             <w:tcBorders/>
             <w:vAlign w:val="center"/>
           </w:tcPr>
@@ -10839,7 +11133,7 @@
         <w:trPr/>
         <w:tc>
           <w:tcPr>
-            <w:tcW w:w="1081" w:type="dxa"/>
+            <w:tcW w:w="1080" w:type="dxa"/>
             <w:tcBorders/>
             <w:vAlign w:val="center"/>
           </w:tcPr>
@@ -10876,7 +11170,7 @@
         <w:trPr/>
         <w:tc>
           <w:tcPr>
-            <w:tcW w:w="1081" w:type="dxa"/>
+            <w:tcW w:w="1080" w:type="dxa"/>
             <w:tcBorders/>
             <w:vAlign w:val="center"/>
           </w:tcPr>
@@ -10913,7 +11207,7 @@
         <w:trPr/>
         <w:tc>
           <w:tcPr>
-            <w:tcW w:w="1081" w:type="dxa"/>
+            <w:tcW w:w="1080" w:type="dxa"/>
             <w:tcBorders/>
             <w:vAlign w:val="center"/>
           </w:tcPr>
@@ -11119,8 +11413,8 @@
         <w:ind w:hanging="0" w:start="0" w:end="0"/>
         <w:rPr/>
       </w:pPr>
-      <w:bookmarkStart w:id="80" w:name="code-block-viewer_Copy_1"/>
-      <w:bookmarkEnd w:id="80"/>
+      <w:bookmarkStart w:id="83" w:name="code-block-viewer_Copy_1_Copy_1"/>
+      <w:bookmarkEnd w:id="83"/>
       <w:r>
         <w:rPr>
           <w:rStyle w:val="SourceText"/>
@@ -11169,8 +11463,8 @@
         <w:ind w:hanging="0" w:start="0" w:end="0"/>
         <w:rPr/>
       </w:pPr>
-      <w:bookmarkStart w:id="81" w:name="code-block-viewer_Copy_2"/>
-      <w:bookmarkEnd w:id="81"/>
+      <w:bookmarkStart w:id="84" w:name="code-block-viewer_Copy_2_Copy_1"/>
+      <w:bookmarkEnd w:id="84"/>
       <w:r>
         <w:rPr>
           <w:rStyle w:val="SourceText"/>
@@ -11238,8 +11532,8 @@
         <w:ind w:hanging="0" w:start="0" w:end="0"/>
         <w:rPr/>
       </w:pPr>
-      <w:bookmarkStart w:id="82" w:name="code-block-viewer_Copy_3"/>
-      <w:bookmarkEnd w:id="82"/>
+      <w:bookmarkStart w:id="85" w:name="code-block-viewer_Copy_3_Copy_1"/>
+      <w:bookmarkEnd w:id="85"/>
       <w:r>
         <w:rPr>
           <w:rStyle w:val="SourceText"/>
@@ -11524,6 +11818,1309 @@
     </w:p>
     <w:p>
       <w:pPr>
+        <w:pStyle w:val="Heading1"/>
+        <w:numPr>
+          <w:ilvl w:val="0"/>
+          <w:numId w:val="1"/>
+        </w:numPr>
+        <w:spacing w:before="240" w:after="120"/>
+        <w:rPr/>
+      </w:pPr>
+      <w:r>
+        <w:rPr/>
+        <w:t>Priority Encoder</w:t>
+      </w:r>
+    </w:p>
+    <w:p>
+      <w:pPr>
+        <w:pStyle w:val="Heading3"/>
+        <w:rPr/>
+      </w:pPr>
+      <w:r>
+        <w:rPr/>
+        <w:t>Tưởng tượng có 8 công tắc</w:t>
+      </w:r>
+    </w:p>
+    <w:p>
+      <w:pPr>
+        <w:sectPr>
+          <w:type w:val="continuous"/>
+          <w:pgSz w:w="11906" w:h="16838"/>
+          <w:pgMar w:left="1134" w:right="1134" w:gutter="0" w:header="0" w:top="1134" w:footer="1134" w:bottom="1693"/>
+          <w:formProt w:val="false"/>
+          <w:textDirection w:val="lrTb"/>
+          <w:docGrid w:type="default" w:linePitch="100" w:charSpace="0"/>
+        </w:sectPr>
+      </w:pPr>
+    </w:p>
+    <w:p>
+      <w:pPr>
+        <w:pStyle w:val="PreformattedText"/>
+        <w:spacing w:before="0" w:after="283"/>
+        <w:ind w:hanging="0" w:start="0" w:end="0"/>
+        <w:rPr/>
+      </w:pPr>
+      <w:bookmarkStart w:id="86" w:name="code-block-viewer_Copy_3"/>
+      <w:bookmarkEnd w:id="86"/>
+      <w:r>
+        <w:rPr>
+          <w:rStyle w:val="SourceText"/>
+        </w:rPr>
+        <w:t>a7 a6 a5 a4 a3 a2 a1 a0</w:t>
+      </w:r>
+    </w:p>
+    <w:p>
+      <w:pPr>
+        <w:sectPr>
+          <w:type w:val="continuous"/>
+          <w:pgSz w:w="11906" w:h="16838"/>
+          <w:pgMar w:left="1134" w:right="1134" w:gutter="0" w:header="0" w:top="1134" w:footer="1134" w:bottom="1693"/>
+          <w:formProt w:val="false"/>
+          <w:textDirection w:val="lrTb"/>
+          <w:docGrid w:type="default" w:linePitch="100" w:charSpace="0"/>
+        </w:sectPr>
+      </w:pPr>
+    </w:p>
+    <w:p>
+      <w:pPr>
+        <w:pStyle w:val="BodyText"/>
+        <w:rPr/>
+      </w:pPr>
+      <w:r>
+        <w:rPr/>
+        <w:t xml:space="preserve">Mỗi công tắc có thể là </w:t>
+      </w:r>
+      <w:r>
+        <w:rPr>
+          <w:rStyle w:val="Strong"/>
+        </w:rPr>
+        <w:t>0 (OFF)</w:t>
+      </w:r>
+      <w:r>
+        <w:rPr/>
+        <w:t xml:space="preserve"> hoặc </w:t>
+      </w:r>
+      <w:r>
+        <w:rPr>
+          <w:rStyle w:val="Strong"/>
+        </w:rPr>
+        <w:t>1 (ON)</w:t>
+      </w:r>
+      <w:r>
+        <w:rPr/>
+        <w:t>.</w:t>
+      </w:r>
+    </w:p>
+    <w:p>
+      <w:pPr>
+        <w:pStyle w:val="HorizontalLine"/>
+        <w:rPr/>
+      </w:pPr>
+      <w:r>
+        <w:rPr/>
+      </w:r>
+    </w:p>
+    <w:p>
+      <w:pPr>
+        <w:pStyle w:val="Heading2"/>
+        <w:numPr>
+          <w:ilvl w:val="1"/>
+          <w:numId w:val="1"/>
+        </w:numPr>
+        <w:spacing w:before="200" w:after="120"/>
+        <w:rPr/>
+      </w:pPr>
+      <w:r>
+        <w:rPr/>
+        <w:t>1. Encoder thường</w:t>
+      </w:r>
+    </w:p>
+    <w:p>
+      <w:pPr>
+        <w:pStyle w:val="BodyText"/>
+        <w:rPr/>
+      </w:pPr>
+      <w:r>
+        <w:rPr/>
+        <w:t xml:space="preserve">Encoder thường có </w:t>
+      </w:r>
+      <w:r>
+        <w:rPr>
+          <w:rStyle w:val="Strong"/>
+        </w:rPr>
+        <w:t>một luật</w:t>
+      </w:r>
+      <w:r>
+        <w:rPr/>
+        <w:t>:</w:t>
+      </w:r>
+    </w:p>
+    <w:p>
+      <w:pPr>
+        <w:pStyle w:val="BlockQuotation"/>
+        <w:rPr/>
+      </w:pPr>
+      <w:r>
+        <w:rPr>
+          <w:rStyle w:val="Strong"/>
+        </w:rPr>
+        <w:t>Chỉ được phép có đúng 1 công tắc ON.</w:t>
+      </w:r>
+    </w:p>
+    <w:p>
+      <w:pPr>
+        <w:pStyle w:val="BodyText"/>
+        <w:rPr/>
+      </w:pPr>
+      <w:r>
+        <w:rPr/>
+        <w:t>Ví dụ:</w:t>
+      </w:r>
+    </w:p>
+    <w:p>
+      <w:pPr>
+        <w:sectPr>
+          <w:type w:val="continuous"/>
+          <w:pgSz w:w="11906" w:h="16838"/>
+          <w:pgMar w:left="1134" w:right="1134" w:gutter="0" w:header="0" w:top="1134" w:footer="1134" w:bottom="1693"/>
+          <w:formProt w:val="false"/>
+          <w:textDirection w:val="lrTb"/>
+          <w:docGrid w:type="default" w:linePitch="100" w:charSpace="0"/>
+        </w:sectPr>
+      </w:pPr>
+    </w:p>
+    <w:p>
+      <w:pPr>
+        <w:pStyle w:val="PreformattedText"/>
+        <w:spacing w:before="0" w:after="283"/>
+        <w:ind w:hanging="0" w:start="0" w:end="0"/>
+        <w:rPr/>
+      </w:pPr>
+      <w:bookmarkStart w:id="87" w:name="code-block-viewer_Copy_4"/>
+      <w:bookmarkEnd w:id="87"/>
+      <w:r>
+        <w:rPr>
+          <w:rStyle w:val="SourceText"/>
+        </w:rPr>
+        <w:t>00001000</w:t>
+      </w:r>
+    </w:p>
+    <w:p>
+      <w:pPr>
+        <w:sectPr>
+          <w:type w:val="continuous"/>
+          <w:pgSz w:w="11906" w:h="16838"/>
+          <w:pgMar w:left="1134" w:right="1134" w:gutter="0" w:header="0" w:top="1134" w:footer="1134" w:bottom="1693"/>
+          <w:formProt w:val="false"/>
+          <w:textDirection w:val="lrTb"/>
+          <w:docGrid w:type="default" w:linePitch="100" w:charSpace="0"/>
+        </w:sectPr>
+      </w:pPr>
+    </w:p>
+    <w:p>
+      <w:pPr>
+        <w:pStyle w:val="BodyText"/>
+        <w:rPr/>
+      </w:pPr>
+      <w:r>
+        <w:rPr/>
+        <w:t xml:space="preserve">Chỉ có </w:t>
+      </w:r>
+      <w:r>
+        <w:rPr>
+          <w:rStyle w:val="SourceText"/>
+        </w:rPr>
+        <w:t>a3 = 1</w:t>
+      </w:r>
+      <w:r>
+        <w:rPr/>
+        <w:t>.</w:t>
+      </w:r>
+    </w:p>
+    <w:p>
+      <w:pPr>
+        <w:pStyle w:val="BodyText"/>
+        <w:rPr/>
+      </w:pPr>
+      <w:r>
+        <w:rPr/>
+        <w:t>Encoder trả về:</w:t>
+      </w:r>
+    </w:p>
+    <w:p>
+      <w:pPr>
+        <w:sectPr>
+          <w:type w:val="continuous"/>
+          <w:pgSz w:w="11906" w:h="16838"/>
+          <w:pgMar w:left="1134" w:right="1134" w:gutter="0" w:header="0" w:top="1134" w:footer="1134" w:bottom="1693"/>
+          <w:formProt w:val="false"/>
+          <w:textDirection w:val="lrTb"/>
+          <w:docGrid w:type="default" w:linePitch="100" w:charSpace="0"/>
+        </w:sectPr>
+      </w:pPr>
+    </w:p>
+    <w:p>
+      <w:pPr>
+        <w:pStyle w:val="PreformattedText"/>
+        <w:spacing w:before="0" w:after="283"/>
+        <w:ind w:hanging="0" w:start="0" w:end="0"/>
+        <w:rPr/>
+      </w:pPr>
+      <w:bookmarkStart w:id="88" w:name="code-block-viewer_Copy_5"/>
+      <w:bookmarkEnd w:id="88"/>
+      <w:r>
+        <w:rPr>
+          <w:rStyle w:val="SourceText"/>
+        </w:rPr>
+        <w:t>011</w:t>
+      </w:r>
+    </w:p>
+    <w:p>
+      <w:pPr>
+        <w:sectPr>
+          <w:type w:val="continuous"/>
+          <w:pgSz w:w="11906" w:h="16838"/>
+          <w:pgMar w:left="1134" w:right="1134" w:gutter="0" w:header="0" w:top="1134" w:footer="1134" w:bottom="1693"/>
+          <w:formProt w:val="false"/>
+          <w:textDirection w:val="lrTb"/>
+          <w:docGrid w:type="default" w:linePitch="100" w:charSpace="0"/>
+        </w:sectPr>
+      </w:pPr>
+    </w:p>
+    <w:p>
+      <w:pPr>
+        <w:pStyle w:val="BodyText"/>
+        <w:rPr/>
+      </w:pPr>
+      <w:r>
+        <w:rPr/>
+        <w:t xml:space="preserve">vì </w:t>
+      </w:r>
+      <w:r>
+        <w:rPr>
+          <w:rStyle w:val="SourceText"/>
+        </w:rPr>
+        <w:t>3</w:t>
+      </w:r>
+      <w:r>
+        <w:rPr/>
+        <w:t xml:space="preserve"> trong nhị phân là </w:t>
+      </w:r>
+      <w:r>
+        <w:rPr>
+          <w:rStyle w:val="SourceText"/>
+        </w:rPr>
+        <w:t>011</w:t>
+      </w:r>
+      <w:r>
+        <w:rPr/>
+        <w:t>.</w:t>
+      </w:r>
+    </w:p>
+    <w:p>
+      <w:pPr>
+        <w:pStyle w:val="HorizontalLine"/>
+        <w:rPr/>
+      </w:pPr>
+      <w:r>
+        <w:rPr/>
+      </w:r>
+    </w:p>
+    <w:p>
+      <w:pPr>
+        <w:pStyle w:val="Heading3"/>
+        <w:rPr/>
+      </w:pPr>
+      <w:r>
+        <w:rPr/>
+        <w:t>Nếu vi phạm luật thì sao?</w:t>
+      </w:r>
+    </w:p>
+    <w:p>
+      <w:pPr>
+        <w:pStyle w:val="BodyText"/>
+        <w:rPr/>
+      </w:pPr>
+      <w:r>
+        <w:rPr/>
+        <w:t>Ví dụ:</w:t>
+      </w:r>
+    </w:p>
+    <w:p>
+      <w:pPr>
+        <w:sectPr>
+          <w:type w:val="continuous"/>
+          <w:pgSz w:w="11906" w:h="16838"/>
+          <w:pgMar w:left="1134" w:right="1134" w:gutter="0" w:header="0" w:top="1134" w:footer="1134" w:bottom="1693"/>
+          <w:formProt w:val="false"/>
+          <w:textDirection w:val="lrTb"/>
+          <w:docGrid w:type="default" w:linePitch="100" w:charSpace="0"/>
+        </w:sectPr>
+      </w:pPr>
+    </w:p>
+    <w:p>
+      <w:pPr>
+        <w:pStyle w:val="PreformattedText"/>
+        <w:spacing w:before="0" w:after="283"/>
+        <w:ind w:hanging="0" w:start="0" w:end="0"/>
+        <w:rPr/>
+      </w:pPr>
+      <w:bookmarkStart w:id="89" w:name="code-block-viewer_Copy_6"/>
+      <w:bookmarkEnd w:id="89"/>
+      <w:r>
+        <w:rPr>
+          <w:rStyle w:val="SourceText"/>
+        </w:rPr>
+        <w:t>00101000</w:t>
+      </w:r>
+    </w:p>
+    <w:p>
+      <w:pPr>
+        <w:sectPr>
+          <w:type w:val="continuous"/>
+          <w:pgSz w:w="11906" w:h="16838"/>
+          <w:pgMar w:left="1134" w:right="1134" w:gutter="0" w:header="0" w:top="1134" w:footer="1134" w:bottom="1693"/>
+          <w:formProt w:val="false"/>
+          <w:textDirection w:val="lrTb"/>
+          <w:docGrid w:type="default" w:linePitch="100" w:charSpace="0"/>
+        </w:sectPr>
+      </w:pPr>
+    </w:p>
+    <w:p>
+      <w:pPr>
+        <w:pStyle w:val="BodyText"/>
+        <w:rPr/>
+      </w:pPr>
+      <w:r>
+        <w:rPr/>
+        <w:t xml:space="preserve">Có cả </w:t>
+      </w:r>
+      <w:r>
+        <w:rPr>
+          <w:rStyle w:val="SourceText"/>
+        </w:rPr>
+        <w:t>a5 = 1</w:t>
+      </w:r>
+      <w:r>
+        <w:rPr/>
+        <w:t xml:space="preserve"> và </w:t>
+      </w:r>
+      <w:r>
+        <w:rPr>
+          <w:rStyle w:val="SourceText"/>
+        </w:rPr>
+        <w:t>a3 = 1</w:t>
+      </w:r>
+      <w:r>
+        <w:rPr/>
+        <w:t>.</w:t>
+      </w:r>
+    </w:p>
+    <w:p>
+      <w:pPr>
+        <w:pStyle w:val="BodyText"/>
+        <w:rPr/>
+      </w:pPr>
+      <w:r>
+        <w:rPr/>
+        <w:t>Lúc này encoder bị "rối":</w:t>
+      </w:r>
+    </w:p>
+    <w:p>
+      <w:pPr>
+        <w:pStyle w:val="BlockQuotation"/>
+        <w:rPr/>
+      </w:pPr>
+      <w:r>
+        <w:rPr/>
+        <w:t>"Ủa, tao phải trả về 5 hay 3?"</w:t>
+      </w:r>
+    </w:p>
+    <w:p>
+      <w:pPr>
+        <w:pStyle w:val="BodyText"/>
+        <w:rPr/>
+      </w:pPr>
+      <w:r>
+        <w:rPr/>
+        <w:t xml:space="preserve">Nó không được thiết kế để xử lý trường hợp này nên kết quả </w:t>
+      </w:r>
+      <w:r>
+        <w:rPr>
+          <w:rStyle w:val="Strong"/>
+        </w:rPr>
+        <w:t>không đáng tin</w:t>
+      </w:r>
+      <w:r>
+        <w:rPr/>
+        <w:t>.</w:t>
+      </w:r>
+    </w:p>
+    <w:p>
+      <w:pPr>
+        <w:pStyle w:val="BodyText"/>
+        <w:rPr/>
+      </w:pPr>
+      <w:r>
+        <w:rPr/>
+        <w:t>=&gt; Priority Encoder ra đời</w:t>
+      </w:r>
+    </w:p>
+    <w:p>
+      <w:pPr>
+        <w:pStyle w:val="BodyText"/>
+        <w:rPr>
+          <w:b/>
+          <w:bCs/>
+          <w:u w:val="single"/>
+        </w:rPr>
+      </w:pPr>
+      <w:r>
+        <w:rPr>
+          <w:b/>
+          <w:bCs/>
+          <w:u w:val="single"/>
+        </w:rPr>
+        <w:t>Priority encoder thêm một luật nữa:</w:t>
+      </w:r>
+    </w:p>
+    <w:p>
+      <w:pPr>
+        <w:pStyle w:val="BlockQuotation"/>
+        <w:rPr/>
+      </w:pPr>
+      <w:r>
+        <w:rPr/>
+        <w:t xml:space="preserve">Nếu nhiều bit cùng bằng 1 thì </w:t>
+      </w:r>
+      <w:r>
+        <w:rPr>
+          <w:rStyle w:val="Strong"/>
+        </w:rPr>
+        <w:t>chọn bit có ưu tiên cao nhất</w:t>
+      </w:r>
+      <w:r>
+        <w:rPr/>
+        <w:t>.</w:t>
+      </w:r>
+    </w:p>
+    <w:p>
+      <w:pPr>
+        <w:pStyle w:val="BodyText"/>
+        <w:rPr/>
+      </w:pPr>
+      <w:r>
+        <w:rPr/>
+        <w:t>Ví dụ ưu tiên từ trái sang phải:</w:t>
+      </w:r>
+    </w:p>
+    <w:p>
+      <w:pPr>
+        <w:sectPr>
+          <w:type w:val="continuous"/>
+          <w:pgSz w:w="11906" w:h="16838"/>
+          <w:pgMar w:left="1134" w:right="1134" w:gutter="0" w:header="0" w:top="1134" w:footer="1134" w:bottom="1693"/>
+          <w:formProt w:val="false"/>
+          <w:textDirection w:val="lrTb"/>
+          <w:docGrid w:type="default" w:linePitch="100" w:charSpace="0"/>
+        </w:sectPr>
+      </w:pPr>
+    </w:p>
+    <w:p>
+      <w:pPr>
+        <w:pStyle w:val="PreformattedText"/>
+        <w:spacing w:before="0" w:after="283"/>
+        <w:ind w:hanging="0" w:start="0" w:end="0"/>
+        <w:rPr/>
+      </w:pPr>
+      <w:bookmarkStart w:id="90" w:name="code-block-viewer_Copy_7"/>
+      <w:bookmarkEnd w:id="90"/>
+      <w:r>
+        <w:rPr>
+          <w:rStyle w:val="SourceText"/>
+        </w:rPr>
+        <w:t>a7 &gt; a6 &gt; a5 &gt; a4 &gt; a3 &gt; a2 &gt; a1 &gt; a0</w:t>
+      </w:r>
+    </w:p>
+    <w:p>
+      <w:pPr>
+        <w:sectPr>
+          <w:type w:val="continuous"/>
+          <w:pgSz w:w="11906" w:h="16838"/>
+          <w:pgMar w:left="1134" w:right="1134" w:gutter="0" w:header="0" w:top="1134" w:footer="1134" w:bottom="1693"/>
+          <w:formProt w:val="false"/>
+          <w:textDirection w:val="lrTb"/>
+          <w:docGrid w:type="default" w:linePitch="100" w:charSpace="0"/>
+        </w:sectPr>
+      </w:pPr>
+    </w:p>
+    <w:p>
+      <w:pPr>
+        <w:pStyle w:val="BodyText"/>
+        <w:rPr/>
+      </w:pPr>
+      <w:r>
+        <w:rPr/>
+        <w:t>Nếu đầu vào là:</w:t>
+      </w:r>
+    </w:p>
+    <w:p>
+      <w:pPr>
+        <w:sectPr>
+          <w:type w:val="continuous"/>
+          <w:pgSz w:w="11906" w:h="16838"/>
+          <w:pgMar w:left="1134" w:right="1134" w:gutter="0" w:header="0" w:top="1134" w:footer="1134" w:bottom="1693"/>
+          <w:formProt w:val="false"/>
+          <w:textDirection w:val="lrTb"/>
+          <w:docGrid w:type="default" w:linePitch="100" w:charSpace="0"/>
+        </w:sectPr>
+      </w:pPr>
+    </w:p>
+    <w:p>
+      <w:pPr>
+        <w:pStyle w:val="PreformattedText"/>
+        <w:spacing w:before="0" w:after="283"/>
+        <w:ind w:hanging="0" w:start="0" w:end="0"/>
+        <w:rPr/>
+      </w:pPr>
+      <w:bookmarkStart w:id="91" w:name="code-block-viewer_Copy_8"/>
+      <w:bookmarkEnd w:id="91"/>
+      <w:r>
+        <w:rPr>
+          <w:rStyle w:val="SourceText"/>
+        </w:rPr>
+        <w:t>00101000</w:t>
+      </w:r>
+    </w:p>
+    <w:p>
+      <w:pPr>
+        <w:sectPr>
+          <w:type w:val="continuous"/>
+          <w:pgSz w:w="11906" w:h="16838"/>
+          <w:pgMar w:left="1134" w:right="1134" w:gutter="0" w:header="0" w:top="1134" w:footer="1134" w:bottom="1693"/>
+          <w:formProt w:val="false"/>
+          <w:textDirection w:val="lrTb"/>
+          <w:docGrid w:type="default" w:linePitch="100" w:charSpace="0"/>
+        </w:sectPr>
+      </w:pPr>
+    </w:p>
+    <w:p>
+      <w:pPr>
+        <w:pStyle w:val="BodyText"/>
+        <w:rPr/>
+      </w:pPr>
+      <w:r>
+        <w:rPr/>
+        <w:t>thì:</w:t>
+      </w:r>
+    </w:p>
+    <w:p>
+      <w:pPr>
+        <w:pStyle w:val="BodyText"/>
+        <w:numPr>
+          <w:ilvl w:val="0"/>
+          <w:numId w:val="8"/>
+        </w:numPr>
+        <w:tabs>
+          <w:tab w:val="clear" w:pos="709"/>
+          <w:tab w:val="left" w:pos="0" w:leader="none"/>
+        </w:tabs>
+        <w:spacing w:before="0" w:after="0"/>
+        <w:ind w:hanging="283" w:start="709"/>
+        <w:rPr/>
+      </w:pPr>
+      <w:r>
+        <w:rPr>
+          <w:rStyle w:val="SourceText"/>
+        </w:rPr>
+        <w:t>a5 = 1</w:t>
+      </w:r>
+      <w:r>
+        <w:rPr/>
+        <w:t xml:space="preserve"> </w:t>
+      </w:r>
+    </w:p>
+    <w:p>
+      <w:pPr>
+        <w:pStyle w:val="BodyText"/>
+        <w:numPr>
+          <w:ilvl w:val="0"/>
+          <w:numId w:val="8"/>
+        </w:numPr>
+        <w:tabs>
+          <w:tab w:val="clear" w:pos="709"/>
+          <w:tab w:val="left" w:pos="0" w:leader="none"/>
+        </w:tabs>
+        <w:ind w:hanging="283" w:start="709"/>
+        <w:rPr/>
+      </w:pPr>
+      <w:r>
+        <w:rPr>
+          <w:rStyle w:val="SourceText"/>
+        </w:rPr>
+        <w:t>a3 = 1</w:t>
+      </w:r>
+      <w:r>
+        <w:rPr/>
+        <w:t xml:space="preserve"> </w:t>
+      </w:r>
+    </w:p>
+    <w:p>
+      <w:pPr>
+        <w:pStyle w:val="BodyText"/>
+        <w:rPr/>
+      </w:pPr>
+      <w:r>
+        <w:rPr/>
+        <w:t xml:space="preserve">Vì </w:t>
+      </w:r>
+      <w:r>
+        <w:rPr>
+          <w:rStyle w:val="SourceText"/>
+        </w:rPr>
+        <w:t>a5</w:t>
+      </w:r>
+      <w:r>
+        <w:rPr/>
+        <w:t xml:space="preserve"> có ưu tiên cao hơn </w:t>
+      </w:r>
+      <w:r>
+        <w:rPr>
+          <w:rStyle w:val="SourceText"/>
+        </w:rPr>
+        <w:t>a3</w:t>
+      </w:r>
+      <w:r>
+        <w:rPr/>
+        <w:t>, nên kết quả là:</w:t>
+      </w:r>
+    </w:p>
+    <w:p>
+      <w:pPr>
+        <w:sectPr>
+          <w:type w:val="continuous"/>
+          <w:pgSz w:w="11906" w:h="16838"/>
+          <w:pgMar w:left="1134" w:right="1134" w:gutter="0" w:header="0" w:top="1134" w:footer="1134" w:bottom="1693"/>
+          <w:formProt w:val="false"/>
+          <w:textDirection w:val="lrTb"/>
+          <w:docGrid w:type="default" w:linePitch="100" w:charSpace="0"/>
+        </w:sectPr>
+      </w:pPr>
+    </w:p>
+    <w:p>
+      <w:pPr>
+        <w:pStyle w:val="PreformattedText"/>
+        <w:spacing w:before="0" w:after="283"/>
+        <w:ind w:hanging="0" w:start="0" w:end="0"/>
+        <w:rPr/>
+      </w:pPr>
+      <w:bookmarkStart w:id="92" w:name="code-block-viewer_Copy_9"/>
+      <w:bookmarkEnd w:id="92"/>
+      <w:r>
+        <w:rPr>
+          <w:rStyle w:val="SourceText"/>
+        </w:rPr>
+        <w:t>101</w:t>
+      </w:r>
+    </w:p>
+    <w:p>
+      <w:pPr>
+        <w:sectPr>
+          <w:type w:val="continuous"/>
+          <w:pgSz w:w="11906" w:h="16838"/>
+          <w:pgMar w:left="1134" w:right="1134" w:gutter="0" w:header="0" w:top="1134" w:footer="1134" w:bottom="1693"/>
+          <w:formProt w:val="false"/>
+          <w:textDirection w:val="lrTb"/>
+          <w:docGrid w:type="default" w:linePitch="100" w:charSpace="0"/>
+        </w:sectPr>
+      </w:pPr>
+    </w:p>
+    <w:p>
+      <w:pPr>
+        <w:pStyle w:val="BodyText"/>
+        <w:rPr/>
+      </w:pPr>
+      <w:r>
+        <w:rPr/>
+        <w:t>(tức là số 5)</w:t>
+      </w:r>
+    </w:p>
+    <w:p>
+      <w:pPr>
+        <w:pStyle w:val="HorizontalLine"/>
+        <w:rPr/>
+      </w:pPr>
+      <w:r>
+        <w:rPr/>
+      </w:r>
+    </w:p>
+    <w:p>
+      <w:pPr>
+        <w:pStyle w:val="BodyText"/>
+        <w:rPr/>
+      </w:pPr>
+      <w:r>
+        <w:rPr/>
+        <w:t>Ví dụ khác:</w:t>
+      </w:r>
+    </w:p>
+    <w:p>
+      <w:pPr>
+        <w:sectPr>
+          <w:type w:val="continuous"/>
+          <w:pgSz w:w="11906" w:h="16838"/>
+          <w:pgMar w:left="1134" w:right="1134" w:gutter="0" w:header="0" w:top="1134" w:footer="1134" w:bottom="1693"/>
+          <w:formProt w:val="false"/>
+          <w:textDirection w:val="lrTb"/>
+          <w:docGrid w:type="default" w:linePitch="100" w:charSpace="0"/>
+        </w:sectPr>
+      </w:pPr>
+    </w:p>
+    <w:p>
+      <w:pPr>
+        <w:pStyle w:val="PreformattedText"/>
+        <w:spacing w:before="0" w:after="283"/>
+        <w:ind w:hanging="0" w:start="0" w:end="0"/>
+        <w:rPr/>
+      </w:pPr>
+      <w:bookmarkStart w:id="93" w:name="code-block-viewer_Copy_10"/>
+      <w:bookmarkEnd w:id="93"/>
+      <w:r>
+        <w:rPr>
+          <w:rStyle w:val="SourceText"/>
+        </w:rPr>
+        <w:t>11010000</w:t>
+      </w:r>
+    </w:p>
+    <w:p>
+      <w:pPr>
+        <w:sectPr>
+          <w:type w:val="continuous"/>
+          <w:pgSz w:w="11906" w:h="16838"/>
+          <w:pgMar w:left="1134" w:right="1134" w:gutter="0" w:header="0" w:top="1134" w:footer="1134" w:bottom="1693"/>
+          <w:formProt w:val="false"/>
+          <w:textDirection w:val="lrTb"/>
+          <w:docGrid w:type="default" w:linePitch="100" w:charSpace="0"/>
+        </w:sectPr>
+      </w:pPr>
+    </w:p>
+    <w:p>
+      <w:pPr>
+        <w:pStyle w:val="BodyText"/>
+        <w:rPr/>
+      </w:pPr>
+      <w:r>
+        <w:rPr/>
+        <w:t>Có:</w:t>
+      </w:r>
+    </w:p>
+    <w:p>
+      <w:pPr>
+        <w:pStyle w:val="BodyText"/>
+        <w:numPr>
+          <w:ilvl w:val="0"/>
+          <w:numId w:val="9"/>
+        </w:numPr>
+        <w:tabs>
+          <w:tab w:val="clear" w:pos="709"/>
+          <w:tab w:val="left" w:pos="0" w:leader="none"/>
+        </w:tabs>
+        <w:spacing w:before="0" w:after="0"/>
+        <w:ind w:hanging="283" w:start="709"/>
+        <w:rPr/>
+      </w:pPr>
+      <w:r>
+        <w:rPr>
+          <w:rStyle w:val="SourceText"/>
+        </w:rPr>
+        <w:t>a7 = 1</w:t>
+      </w:r>
+      <w:r>
+        <w:rPr/>
+        <w:t xml:space="preserve"> </w:t>
+      </w:r>
+    </w:p>
+    <w:p>
+      <w:pPr>
+        <w:pStyle w:val="BodyText"/>
+        <w:numPr>
+          <w:ilvl w:val="0"/>
+          <w:numId w:val="9"/>
+        </w:numPr>
+        <w:tabs>
+          <w:tab w:val="clear" w:pos="709"/>
+          <w:tab w:val="left" w:pos="0" w:leader="none"/>
+        </w:tabs>
+        <w:spacing w:before="0" w:after="0"/>
+        <w:ind w:hanging="283" w:start="709"/>
+        <w:rPr/>
+      </w:pPr>
+      <w:r>
+        <w:rPr>
+          <w:rStyle w:val="SourceText"/>
+        </w:rPr>
+        <w:t>a6 = 1</w:t>
+      </w:r>
+      <w:r>
+        <w:rPr/>
+        <w:t xml:space="preserve"> </w:t>
+      </w:r>
+    </w:p>
+    <w:p>
+      <w:pPr>
+        <w:pStyle w:val="BodyText"/>
+        <w:numPr>
+          <w:ilvl w:val="0"/>
+          <w:numId w:val="9"/>
+        </w:numPr>
+        <w:tabs>
+          <w:tab w:val="clear" w:pos="709"/>
+          <w:tab w:val="left" w:pos="0" w:leader="none"/>
+        </w:tabs>
+        <w:ind w:hanging="283" w:start="709"/>
+        <w:rPr/>
+      </w:pPr>
+      <w:r>
+        <w:rPr>
+          <w:rStyle w:val="SourceText"/>
+        </w:rPr>
+        <w:t>a4 = 1</w:t>
+      </w:r>
+      <w:r>
+        <w:rPr/>
+        <w:t xml:space="preserve"> </w:t>
+      </w:r>
+    </w:p>
+    <w:p>
+      <w:pPr>
+        <w:pStyle w:val="BodyText"/>
+        <w:rPr/>
+      </w:pPr>
+      <w:r>
+        <w:rPr/>
+        <w:t>Priority encoder nói:</w:t>
+      </w:r>
+    </w:p>
+    <w:p>
+      <w:pPr>
+        <w:pStyle w:val="BlockQuotation"/>
+        <w:rPr/>
+      </w:pPr>
+      <w:r>
+        <w:rPr/>
+        <w:t xml:space="preserve">"Trong ba bit này, </w:t>
+      </w:r>
+      <w:r>
+        <w:rPr>
+          <w:rStyle w:val="SourceText"/>
+        </w:rPr>
+        <w:t>a7</w:t>
+      </w:r>
+      <w:r>
+        <w:rPr/>
+        <w:t xml:space="preserve"> ưu tiên cao nhất."</w:t>
+      </w:r>
+    </w:p>
+    <w:p>
+      <w:pPr>
+        <w:pStyle w:val="BodyText"/>
+        <w:rPr/>
+      </w:pPr>
+      <w:r>
+        <w:rPr/>
+        <w:t>Nên output là:</w:t>
+      </w:r>
+    </w:p>
+    <w:p>
+      <w:pPr>
+        <w:sectPr>
+          <w:type w:val="continuous"/>
+          <w:pgSz w:w="11906" w:h="16838"/>
+          <w:pgMar w:left="1134" w:right="1134" w:gutter="0" w:header="0" w:top="1134" w:footer="1134" w:bottom="1693"/>
+          <w:formProt w:val="false"/>
+          <w:textDirection w:val="lrTb"/>
+          <w:docGrid w:type="default" w:linePitch="100" w:charSpace="0"/>
+        </w:sectPr>
+      </w:pPr>
+    </w:p>
+    <w:p>
+      <w:pPr>
+        <w:pStyle w:val="PreformattedText"/>
+        <w:spacing w:before="0" w:after="283"/>
+        <w:ind w:hanging="0" w:start="0" w:end="0"/>
+        <w:rPr/>
+      </w:pPr>
+      <w:bookmarkStart w:id="94" w:name="code-block-viewer_Copy_11"/>
+      <w:bookmarkEnd w:id="94"/>
+      <w:r>
+        <w:rPr>
+          <w:rStyle w:val="SourceText"/>
+        </w:rPr>
+        <w:t>111</w:t>
+      </w:r>
+    </w:p>
+    <w:p>
+      <w:pPr>
+        <w:sectPr>
+          <w:type w:val="continuous"/>
+          <w:pgSz w:w="11906" w:h="16838"/>
+          <w:pgMar w:left="1134" w:right="1134" w:gutter="0" w:header="0" w:top="1134" w:footer="1134" w:bottom="1693"/>
+          <w:formProt w:val="false"/>
+          <w:textDirection w:val="lrTb"/>
+          <w:docGrid w:type="default" w:linePitch="100" w:charSpace="0"/>
+        </w:sectPr>
+      </w:pPr>
+    </w:p>
+    <w:p>
+      <w:pPr>
+        <w:pStyle w:val="BodyText"/>
+        <w:rPr/>
+      </w:pPr>
+      <w:r>
+        <w:rPr/>
+        <w:t>(tức là số 7)</w:t>
+      </w:r>
+    </w:p>
+    <w:p>
+      <w:pPr>
+        <w:pStyle w:val="HorizontalLine"/>
+        <w:rPr/>
+      </w:pPr>
+      <w:r>
+        <w:rPr/>
+      </w:r>
+    </w:p>
+    <w:p>
+      <w:pPr>
+        <w:pStyle w:val="Heading2"/>
+        <w:numPr>
+          <w:ilvl w:val="1"/>
+          <w:numId w:val="1"/>
+        </w:numPr>
+        <w:ind w:hanging="0" w:start="0"/>
+        <w:rPr/>
+      </w:pPr>
+      <w:r>
+        <w:rPr/>
+        <w:t>Liên hệ với TCAM</w:t>
+      </w:r>
+    </w:p>
+    <w:p>
+      <w:pPr>
+        <w:pStyle w:val="BodyText"/>
+        <w:rPr/>
+      </w:pPr>
+      <w:r>
+        <w:rPr/>
+        <w:t>Giả sử TCAM có 8 dòng:</w:t>
+      </w:r>
+    </w:p>
+    <w:p>
+      <w:pPr>
+        <w:sectPr>
+          <w:type w:val="continuous"/>
+          <w:pgSz w:w="11906" w:h="16838"/>
+          <w:pgMar w:left="1134" w:right="1134" w:gutter="0" w:header="0" w:top="1134" w:footer="1134" w:bottom="1693"/>
+          <w:formProt w:val="false"/>
+          <w:textDirection w:val="lrTb"/>
+          <w:docGrid w:type="default" w:linePitch="100" w:charSpace="0"/>
+        </w:sectPr>
+      </w:pPr>
+    </w:p>
+    <w:p>
+      <w:pPr>
+        <w:pStyle w:val="PreformattedText"/>
+        <w:ind w:hanging="0" w:start="0" w:end="0"/>
+        <w:rPr/>
+      </w:pPr>
+      <w:bookmarkStart w:id="95" w:name="code-block-viewer_Copy_12"/>
+      <w:bookmarkEnd w:id="95"/>
+      <w:r>
+        <w:rPr>
+          <w:rStyle w:val="SourceText"/>
+        </w:rPr>
+        <w:t>Dòng 0  ✔ Match</w:t>
+      </w:r>
+    </w:p>
+    <w:p>
+      <w:pPr>
+        <w:pStyle w:val="PreformattedText"/>
+        <w:rPr/>
+      </w:pPr>
+      <w:r>
+        <w:rPr>
+          <w:rStyle w:val="SourceText"/>
+        </w:rPr>
+        <w:t>Dòng 1</w:t>
+      </w:r>
+    </w:p>
+    <w:p>
+      <w:pPr>
+        <w:pStyle w:val="PreformattedText"/>
+        <w:rPr/>
+      </w:pPr>
+      <w:r>
+        <w:rPr>
+          <w:rStyle w:val="SourceText"/>
+        </w:rPr>
+        <w:t>Dòng 2</w:t>
+      </w:r>
+    </w:p>
+    <w:p>
+      <w:pPr>
+        <w:pStyle w:val="PreformattedText"/>
+        <w:rPr/>
+      </w:pPr>
+      <w:r>
+        <w:rPr>
+          <w:rStyle w:val="SourceText"/>
+        </w:rPr>
+        <w:t>Dòng 3  ✔ Match</w:t>
+      </w:r>
+    </w:p>
+    <w:p>
+      <w:pPr>
+        <w:pStyle w:val="PreformattedText"/>
+        <w:rPr/>
+      </w:pPr>
+      <w:r>
+        <w:rPr>
+          <w:rStyle w:val="SourceText"/>
+        </w:rPr>
+        <w:t>Dòng 4</w:t>
+      </w:r>
+    </w:p>
+    <w:p>
+      <w:pPr>
+        <w:pStyle w:val="PreformattedText"/>
+        <w:rPr/>
+      </w:pPr>
+      <w:r>
+        <w:rPr>
+          <w:rStyle w:val="SourceText"/>
+        </w:rPr>
+        <w:t>Dòng 5  ✔ Match</w:t>
+      </w:r>
+    </w:p>
+    <w:p>
+      <w:pPr>
+        <w:pStyle w:val="PreformattedText"/>
+        <w:rPr/>
+      </w:pPr>
+      <w:r>
+        <w:rPr>
+          <w:rStyle w:val="SourceText"/>
+        </w:rPr>
+        <w:t>Dòng 6</w:t>
+      </w:r>
+    </w:p>
+    <w:p>
+      <w:pPr>
+        <w:pStyle w:val="PreformattedText"/>
+        <w:spacing w:before="0" w:after="283"/>
+        <w:rPr/>
+      </w:pPr>
+      <w:r>
+        <w:rPr>
+          <w:rStyle w:val="SourceText"/>
+        </w:rPr>
+        <w:t>Dòng 7</w:t>
+      </w:r>
+    </w:p>
+    <w:p>
+      <w:pPr>
+        <w:sectPr>
+          <w:type w:val="continuous"/>
+          <w:pgSz w:w="11906" w:h="16838"/>
+          <w:pgMar w:left="1134" w:right="1134" w:gutter="0" w:header="0" w:top="1134" w:footer="1134" w:bottom="1693"/>
+          <w:formProt w:val="false"/>
+          <w:textDirection w:val="lrTb"/>
+          <w:docGrid w:type="default" w:linePitch="100" w:charSpace="0"/>
+        </w:sectPr>
+      </w:pPr>
+    </w:p>
+    <w:p>
+      <w:pPr>
+        <w:pStyle w:val="BodyText"/>
+        <w:rPr/>
+      </w:pPr>
+      <w:r>
+        <w:rPr/>
+        <w:t>Tín hiệu match là:</w:t>
+      </w:r>
+    </w:p>
+    <w:p>
+      <w:pPr>
+        <w:sectPr>
+          <w:type w:val="continuous"/>
+          <w:pgSz w:w="11906" w:h="16838"/>
+          <w:pgMar w:left="1134" w:right="1134" w:gutter="0" w:header="0" w:top="1134" w:footer="1134" w:bottom="1693"/>
+          <w:formProt w:val="false"/>
+          <w:textDirection w:val="lrTb"/>
+          <w:docGrid w:type="default" w:linePitch="100" w:charSpace="0"/>
+        </w:sectPr>
+      </w:pPr>
+    </w:p>
+    <w:p>
+      <w:pPr>
+        <w:pStyle w:val="PreformattedText"/>
+        <w:spacing w:before="0" w:after="283"/>
+        <w:ind w:hanging="0" w:start="0" w:end="0"/>
+        <w:rPr/>
+      </w:pPr>
+      <w:bookmarkStart w:id="96" w:name="code-block-viewer_Copy_13"/>
+      <w:bookmarkEnd w:id="96"/>
+      <w:r>
+        <w:rPr>
+          <w:rStyle w:val="SourceText"/>
+        </w:rPr>
+        <w:t>00101001</w:t>
+      </w:r>
+    </w:p>
+    <w:p>
+      <w:pPr>
+        <w:sectPr>
+          <w:type w:val="continuous"/>
+          <w:pgSz w:w="11906" w:h="16838"/>
+          <w:pgMar w:left="1134" w:right="1134" w:gutter="0" w:header="0" w:top="1134" w:footer="1134" w:bottom="1693"/>
+          <w:formProt w:val="false"/>
+          <w:textDirection w:val="lrTb"/>
+          <w:docGrid w:type="default" w:linePitch="100" w:charSpace="0"/>
+        </w:sectPr>
+      </w:pPr>
+    </w:p>
+    <w:p>
+      <w:pPr>
+        <w:pStyle w:val="BodyText"/>
+        <w:rPr/>
+      </w:pPr>
+      <w:r>
+        <w:rPr/>
+        <w:t xml:space="preserve">Có </w:t>
+      </w:r>
+      <w:r>
+        <w:rPr>
+          <w:rStyle w:val="Strong"/>
+        </w:rPr>
+        <w:t>3 dòng cùng khớp</w:t>
+      </w:r>
+      <w:r>
+        <w:rPr/>
+        <w:t>.</w:t>
+      </w:r>
+    </w:p>
+    <w:p>
+      <w:pPr>
+        <w:pStyle w:val="BodyText"/>
+        <w:rPr/>
+      </w:pPr>
+      <w:r>
+        <w:rPr/>
+        <w:t>Nếu không có priority encoder thì mạch sẽ không biết trả về dòng nào.</w:t>
+      </w:r>
+    </w:p>
+    <w:p>
+      <w:pPr>
+        <w:pStyle w:val="BodyText"/>
+        <w:rPr/>
+      </w:pPr>
+      <w:r>
+        <w:rPr/>
+        <w:t>Nếu dùng priority encoder (ưu tiên chỉ số lớn nhất), nó sẽ chọn:</w:t>
+      </w:r>
+    </w:p>
+    <w:p>
+      <w:pPr>
+        <w:sectPr>
+          <w:type w:val="continuous"/>
+          <w:pgSz w:w="11906" w:h="16838"/>
+          <w:pgMar w:left="1134" w:right="1134" w:gutter="0" w:header="0" w:top="1134" w:footer="1134" w:bottom="1693"/>
+          <w:formProt w:val="false"/>
+          <w:textDirection w:val="lrTb"/>
+          <w:docGrid w:type="default" w:linePitch="100" w:charSpace="0"/>
+        </w:sectPr>
+      </w:pPr>
+    </w:p>
+    <w:p>
+      <w:pPr>
+        <w:pStyle w:val="PreformattedText"/>
+        <w:spacing w:before="0" w:after="283"/>
+        <w:ind w:hanging="0" w:start="0" w:end="0"/>
+        <w:rPr/>
+      </w:pPr>
+      <w:bookmarkStart w:id="97" w:name="code-block-viewer_Copy_14"/>
+      <w:bookmarkEnd w:id="97"/>
+      <w:r>
+        <w:rPr>
+          <w:rStyle w:val="SourceText"/>
+        </w:rPr>
+        <w:t>Dòng 5</w:t>
+      </w:r>
+    </w:p>
+    <w:p>
+      <w:pPr>
+        <w:sectPr>
+          <w:type w:val="continuous"/>
+          <w:pgSz w:w="11906" w:h="16838"/>
+          <w:pgMar w:left="1134" w:right="1134" w:gutter="0" w:header="0" w:top="1134" w:footer="1134" w:bottom="1693"/>
+          <w:formProt w:val="false"/>
+          <w:textDirection w:val="lrTb"/>
+          <w:docGrid w:type="default" w:linePitch="100" w:charSpace="0"/>
+        </w:sectPr>
+      </w:pPr>
+    </w:p>
+    <w:p>
+      <w:pPr>
+        <w:pStyle w:val="BodyText"/>
+        <w:rPr/>
+      </w:pPr>
+      <w:r>
+        <w:rPr/>
+        <w:t>và xuất:</w:t>
+      </w:r>
+    </w:p>
+    <w:p>
+      <w:pPr>
+        <w:sectPr>
+          <w:type w:val="continuous"/>
+          <w:pgSz w:w="11906" w:h="16838"/>
+          <w:pgMar w:left="1134" w:right="1134" w:gutter="0" w:header="0" w:top="1134" w:footer="1134" w:bottom="1693"/>
+          <w:formProt w:val="false"/>
+          <w:textDirection w:val="lrTb"/>
+          <w:docGrid w:type="default" w:linePitch="100" w:charSpace="0"/>
+        </w:sectPr>
+      </w:pPr>
+    </w:p>
+    <w:p>
+      <w:pPr>
+        <w:pStyle w:val="PreformattedText"/>
+        <w:spacing w:before="0" w:after="283"/>
+        <w:ind w:hanging="0" w:start="0" w:end="0"/>
+        <w:rPr/>
+      </w:pPr>
+      <w:bookmarkStart w:id="98" w:name="code-block-viewer_Copy_15"/>
+      <w:bookmarkEnd w:id="98"/>
+      <w:r>
+        <w:rPr>
+          <w:rStyle w:val="SourceText"/>
+        </w:rPr>
+        <w:t>101</w:t>
+      </w:r>
+    </w:p>
+    <w:p>
+      <w:pPr>
+        <w:sectPr>
+          <w:type w:val="continuous"/>
+          <w:pgSz w:w="11906" w:h="16838"/>
+          <w:pgMar w:left="1134" w:right="1134" w:gutter="0" w:header="0" w:top="1134" w:footer="1134" w:bottom="1693"/>
+          <w:formProt w:val="false"/>
+          <w:textDirection w:val="lrTb"/>
+          <w:docGrid w:type="default" w:linePitch="100" w:charSpace="0"/>
+        </w:sectPr>
+      </w:pPr>
+    </w:p>
+    <w:p>
+      <w:pPr>
         <w:pStyle w:val="BodyText"/>
         <w:rPr/>
       </w:pPr>
@@ -11541,8 +13138,8 @@
         <w:ind w:hanging="0" w:start="0"/>
         <w:rPr/>
       </w:pPr>
-      <w:bookmarkStart w:id="83" w:name="__RefHeading___Toc1399_1846826748"/>
-      <w:bookmarkEnd w:id="83"/>
+      <w:bookmarkStart w:id="99" w:name="__RefHeading___Toc1399_1846826748"/>
+      <w:bookmarkEnd w:id="99"/>
       <w:r>
         <w:rPr/>
         <w:t>Comparator</w:t>
@@ -11572,6 +13169,20 @@
 </file>
 
 <file path=word/footer1.xml><?xml version="1.0" encoding="utf-8"?>
+<w:ftr xmlns:o="urn:schemas-microsoft-com:office:office" xmlns:r="http://schemas.openxmlformats.org/officeDocument/2006/relationships" xmlns:v="urn:schemas-microsoft-com:vml" xmlns:w="http://schemas.openxmlformats.org/wordprocessingml/2006/main" xmlns:w10="urn:schemas-microsoft-com:office:word" xmlns:wp="http://schemas.openxmlformats.org/drawingml/2006/wordprocessingDrawing" xmlns:wps="http://schemas.microsoft.com/office/word/2010/wordprocessingShape" xmlns:wpg="http://schemas.microsoft.com/office/word/2010/wordprocessingGroup" xmlns:mc="http://schemas.openxmlformats.org/markup-compatibility/2006" xmlns:wp14="http://schemas.microsoft.com/office/word/2010/wordprocessingDrawing" xmlns:w14="http://schemas.microsoft.com/office/word/2010/wordml" xmlns:w15="http://schemas.microsoft.com/office/word/2012/wordml" mc:Ignorable="w14 wp14 w15">
+  <w:p>
+    <w:pPr>
+      <w:pStyle w:val="Footer"/>
+      <w:rPr/>
+    </w:pPr>
+    <w:r>
+      <w:rPr/>
+    </w:r>
+  </w:p>
+</w:ftr>
+</file>
+
+<file path=word/footer2.xml><?xml version="1.0" encoding="utf-8"?>
 <w:ftr xmlns:o="urn:schemas-microsoft-com:office:office" xmlns:r="http://schemas.openxmlformats.org/officeDocument/2006/relationships" xmlns:v="urn:schemas-microsoft-com:vml" xmlns:w="http://schemas.openxmlformats.org/wordprocessingml/2006/main" xmlns:w10="urn:schemas-microsoft-com:office:word" xmlns:wp="http://schemas.openxmlformats.org/drawingml/2006/wordprocessingDrawing" xmlns:wps="http://schemas.microsoft.com/office/word/2010/wordprocessingShape" xmlns:wpg="http://schemas.microsoft.com/office/word/2010/wordprocessingGroup" xmlns:mc="http://schemas.openxmlformats.org/markup-compatibility/2006" xmlns:wp14="http://schemas.microsoft.com/office/word/2010/wordprocessingDrawing" xmlns:w14="http://schemas.microsoft.com/office/word/2010/wordml" xmlns:w15="http://schemas.microsoft.com/office/word/2012/wordml" mc:Ignorable="w14 wp14 w15">
   <w:p>
     <w:pPr>
@@ -11594,13 +13205,47 @@
     </w:r>
     <w:r>
       <w:rPr/>
-      <w:t>17</w:t>
+      <w:t>19</w:t>
     </w:r>
     <w:r>
       <w:rPr/>
       <w:fldChar w:fldCharType="end"/>
     </w:r>
     <w:bookmarkEnd w:id="5"/>
+  </w:p>
+</w:ftr>
+</file>
+
+<file path=word/footer3.xml><?xml version="1.0" encoding="utf-8"?>
+<w:ftr xmlns:o="urn:schemas-microsoft-com:office:office" xmlns:r="http://schemas.openxmlformats.org/officeDocument/2006/relationships" xmlns:v="urn:schemas-microsoft-com:vml" xmlns:w="http://schemas.openxmlformats.org/wordprocessingml/2006/main" xmlns:w10="urn:schemas-microsoft-com:office:word" xmlns:wp="http://schemas.openxmlformats.org/drawingml/2006/wordprocessingDrawing" xmlns:wps="http://schemas.microsoft.com/office/word/2010/wordprocessingShape" xmlns:wpg="http://schemas.microsoft.com/office/word/2010/wordprocessingGroup" xmlns:mc="http://schemas.openxmlformats.org/markup-compatibility/2006" xmlns:wp14="http://schemas.microsoft.com/office/word/2010/wordprocessingDrawing" xmlns:w14="http://schemas.microsoft.com/office/word/2010/wordml" xmlns:w15="http://schemas.microsoft.com/office/word/2012/wordml" mc:Ignorable="w14 wp14 w15">
+  <w:p>
+    <w:pPr>
+      <w:pStyle w:val="Footer"/>
+      <w:jc w:val="center"/>
+      <w:rPr/>
+    </w:pPr>
+    <w:bookmarkStart w:id="6" w:name="PageNumWizard_FOOTER_Default_Page_Style1"/>
+    <w:r>
+      <w:rPr/>
+      <w:fldChar w:fldCharType="begin"/>
+    </w:r>
+    <w:r>
+      <w:rPr/>
+      <w:instrText xml:space="preserve"> PAGE </w:instrText>
+    </w:r>
+    <w:r>
+      <w:rPr/>
+      <w:fldChar w:fldCharType="separate"/>
+    </w:r>
+    <w:r>
+      <w:rPr/>
+      <w:t>19</w:t>
+    </w:r>
+    <w:r>
+      <w:rPr/>
+      <w:fldChar w:fldCharType="end"/>
+    </w:r>
+    <w:bookmarkEnd w:id="6"/>
   </w:p>
 </w:ftr>
 </file>
@@ -12557,6 +14202,280 @@
     </w:lvl>
   </w:abstractNum>
   <w:abstractNum w:abstractNumId="8">
+    <w:lvl w:ilvl="0">
+      <w:start w:val="1"/>
+      <w:numFmt w:val="bullet"/>
+      <w:lvlText w:val=""/>
+      <w:lvlJc w:val="start"/>
+      <w:pPr>
+        <w:tabs>
+          <w:tab w:val="num" w:pos="709"/>
+        </w:tabs>
+        <w:ind w:start="709" w:hanging="283"/>
+      </w:pPr>
+      <w:rPr>
+        <w:rFonts w:ascii="Symbol" w:hAnsi="Symbol" w:cs="Symbol" w:hint="default"/>
+      </w:rPr>
+    </w:lvl>
+    <w:lvl w:ilvl="1">
+      <w:start w:val="1"/>
+      <w:numFmt w:val="bullet"/>
+      <w:lvlText w:val=""/>
+      <w:lvlJc w:val="start"/>
+      <w:pPr>
+        <w:tabs>
+          <w:tab w:val="num" w:pos="1418"/>
+        </w:tabs>
+        <w:ind w:start="1418" w:hanging="283"/>
+      </w:pPr>
+      <w:rPr>
+        <w:rFonts w:ascii="Symbol" w:hAnsi="Symbol" w:cs="Symbol" w:hint="default"/>
+      </w:rPr>
+    </w:lvl>
+    <w:lvl w:ilvl="2">
+      <w:start w:val="1"/>
+      <w:numFmt w:val="bullet"/>
+      <w:lvlText w:val=""/>
+      <w:lvlJc w:val="start"/>
+      <w:pPr>
+        <w:tabs>
+          <w:tab w:val="num" w:pos="2127"/>
+        </w:tabs>
+        <w:ind w:start="2127" w:hanging="283"/>
+      </w:pPr>
+      <w:rPr>
+        <w:rFonts w:ascii="Symbol" w:hAnsi="Symbol" w:cs="Symbol" w:hint="default"/>
+      </w:rPr>
+    </w:lvl>
+    <w:lvl w:ilvl="3">
+      <w:start w:val="1"/>
+      <w:numFmt w:val="bullet"/>
+      <w:lvlText w:val=""/>
+      <w:lvlJc w:val="start"/>
+      <w:pPr>
+        <w:tabs>
+          <w:tab w:val="num" w:pos="2836"/>
+        </w:tabs>
+        <w:ind w:start="2836" w:hanging="283"/>
+      </w:pPr>
+      <w:rPr>
+        <w:rFonts w:ascii="Symbol" w:hAnsi="Symbol" w:cs="Symbol" w:hint="default"/>
+      </w:rPr>
+    </w:lvl>
+    <w:lvl w:ilvl="4">
+      <w:start w:val="1"/>
+      <w:numFmt w:val="bullet"/>
+      <w:lvlText w:val=""/>
+      <w:lvlJc w:val="start"/>
+      <w:pPr>
+        <w:tabs>
+          <w:tab w:val="num" w:pos="3545"/>
+        </w:tabs>
+        <w:ind w:start="3545" w:hanging="283"/>
+      </w:pPr>
+      <w:rPr>
+        <w:rFonts w:ascii="Symbol" w:hAnsi="Symbol" w:cs="Symbol" w:hint="default"/>
+      </w:rPr>
+    </w:lvl>
+    <w:lvl w:ilvl="5">
+      <w:start w:val="1"/>
+      <w:numFmt w:val="bullet"/>
+      <w:lvlText w:val=""/>
+      <w:lvlJc w:val="start"/>
+      <w:pPr>
+        <w:tabs>
+          <w:tab w:val="num" w:pos="4254"/>
+        </w:tabs>
+        <w:ind w:start="4254" w:hanging="283"/>
+      </w:pPr>
+      <w:rPr>
+        <w:rFonts w:ascii="Symbol" w:hAnsi="Symbol" w:cs="Symbol" w:hint="default"/>
+      </w:rPr>
+    </w:lvl>
+    <w:lvl w:ilvl="6">
+      <w:start w:val="1"/>
+      <w:numFmt w:val="bullet"/>
+      <w:lvlText w:val=""/>
+      <w:lvlJc w:val="start"/>
+      <w:pPr>
+        <w:tabs>
+          <w:tab w:val="num" w:pos="4963"/>
+        </w:tabs>
+        <w:ind w:start="4963" w:hanging="283"/>
+      </w:pPr>
+      <w:rPr>
+        <w:rFonts w:ascii="Symbol" w:hAnsi="Symbol" w:cs="Symbol" w:hint="default"/>
+      </w:rPr>
+    </w:lvl>
+    <w:lvl w:ilvl="7">
+      <w:start w:val="1"/>
+      <w:numFmt w:val="bullet"/>
+      <w:lvlText w:val=""/>
+      <w:lvlJc w:val="start"/>
+      <w:pPr>
+        <w:tabs>
+          <w:tab w:val="num" w:pos="5672"/>
+        </w:tabs>
+        <w:ind w:start="5672" w:hanging="283"/>
+      </w:pPr>
+      <w:rPr>
+        <w:rFonts w:ascii="Symbol" w:hAnsi="Symbol" w:cs="Symbol" w:hint="default"/>
+      </w:rPr>
+    </w:lvl>
+    <w:lvl w:ilvl="8">
+      <w:start w:val="1"/>
+      <w:numFmt w:val="bullet"/>
+      <w:lvlText w:val=""/>
+      <w:lvlJc w:val="start"/>
+      <w:pPr>
+        <w:tabs>
+          <w:tab w:val="num" w:pos="6381"/>
+        </w:tabs>
+        <w:ind w:start="6381" w:hanging="283"/>
+      </w:pPr>
+      <w:rPr>
+        <w:rFonts w:ascii="Symbol" w:hAnsi="Symbol" w:cs="Symbol" w:hint="default"/>
+      </w:rPr>
+    </w:lvl>
+  </w:abstractNum>
+  <w:abstractNum w:abstractNumId="9">
+    <w:lvl w:ilvl="0">
+      <w:start w:val="1"/>
+      <w:numFmt w:val="bullet"/>
+      <w:lvlText w:val=""/>
+      <w:lvlJc w:val="start"/>
+      <w:pPr>
+        <w:tabs>
+          <w:tab w:val="num" w:pos="709"/>
+        </w:tabs>
+        <w:ind w:start="709" w:hanging="283"/>
+      </w:pPr>
+      <w:rPr>
+        <w:rFonts w:ascii="Symbol" w:hAnsi="Symbol" w:cs="Symbol" w:hint="default"/>
+      </w:rPr>
+    </w:lvl>
+    <w:lvl w:ilvl="1">
+      <w:start w:val="1"/>
+      <w:numFmt w:val="bullet"/>
+      <w:lvlText w:val=""/>
+      <w:lvlJc w:val="start"/>
+      <w:pPr>
+        <w:tabs>
+          <w:tab w:val="num" w:pos="1418"/>
+        </w:tabs>
+        <w:ind w:start="1418" w:hanging="283"/>
+      </w:pPr>
+      <w:rPr>
+        <w:rFonts w:ascii="Symbol" w:hAnsi="Symbol" w:cs="Symbol" w:hint="default"/>
+      </w:rPr>
+    </w:lvl>
+    <w:lvl w:ilvl="2">
+      <w:start w:val="1"/>
+      <w:numFmt w:val="bullet"/>
+      <w:lvlText w:val=""/>
+      <w:lvlJc w:val="start"/>
+      <w:pPr>
+        <w:tabs>
+          <w:tab w:val="num" w:pos="2127"/>
+        </w:tabs>
+        <w:ind w:start="2127" w:hanging="283"/>
+      </w:pPr>
+      <w:rPr>
+        <w:rFonts w:ascii="Symbol" w:hAnsi="Symbol" w:cs="Symbol" w:hint="default"/>
+      </w:rPr>
+    </w:lvl>
+    <w:lvl w:ilvl="3">
+      <w:start w:val="1"/>
+      <w:numFmt w:val="bullet"/>
+      <w:lvlText w:val=""/>
+      <w:lvlJc w:val="start"/>
+      <w:pPr>
+        <w:tabs>
+          <w:tab w:val="num" w:pos="2836"/>
+        </w:tabs>
+        <w:ind w:start="2836" w:hanging="283"/>
+      </w:pPr>
+      <w:rPr>
+        <w:rFonts w:ascii="Symbol" w:hAnsi="Symbol" w:cs="Symbol" w:hint="default"/>
+      </w:rPr>
+    </w:lvl>
+    <w:lvl w:ilvl="4">
+      <w:start w:val="1"/>
+      <w:numFmt w:val="bullet"/>
+      <w:lvlText w:val=""/>
+      <w:lvlJc w:val="start"/>
+      <w:pPr>
+        <w:tabs>
+          <w:tab w:val="num" w:pos="3545"/>
+        </w:tabs>
+        <w:ind w:start="3545" w:hanging="283"/>
+      </w:pPr>
+      <w:rPr>
+        <w:rFonts w:ascii="Symbol" w:hAnsi="Symbol" w:cs="Symbol" w:hint="default"/>
+      </w:rPr>
+    </w:lvl>
+    <w:lvl w:ilvl="5">
+      <w:start w:val="1"/>
+      <w:numFmt w:val="bullet"/>
+      <w:lvlText w:val=""/>
+      <w:lvlJc w:val="start"/>
+      <w:pPr>
+        <w:tabs>
+          <w:tab w:val="num" w:pos="4254"/>
+        </w:tabs>
+        <w:ind w:start="4254" w:hanging="283"/>
+      </w:pPr>
+      <w:rPr>
+        <w:rFonts w:ascii="Symbol" w:hAnsi="Symbol" w:cs="Symbol" w:hint="default"/>
+      </w:rPr>
+    </w:lvl>
+    <w:lvl w:ilvl="6">
+      <w:start w:val="1"/>
+      <w:numFmt w:val="bullet"/>
+      <w:lvlText w:val=""/>
+      <w:lvlJc w:val="start"/>
+      <w:pPr>
+        <w:tabs>
+          <w:tab w:val="num" w:pos="4963"/>
+        </w:tabs>
+        <w:ind w:start="4963" w:hanging="283"/>
+      </w:pPr>
+      <w:rPr>
+        <w:rFonts w:ascii="Symbol" w:hAnsi="Symbol" w:cs="Symbol" w:hint="default"/>
+      </w:rPr>
+    </w:lvl>
+    <w:lvl w:ilvl="7">
+      <w:start w:val="1"/>
+      <w:numFmt w:val="bullet"/>
+      <w:lvlText w:val=""/>
+      <w:lvlJc w:val="start"/>
+      <w:pPr>
+        <w:tabs>
+          <w:tab w:val="num" w:pos="5672"/>
+        </w:tabs>
+        <w:ind w:start="5672" w:hanging="283"/>
+      </w:pPr>
+      <w:rPr>
+        <w:rFonts w:ascii="Symbol" w:hAnsi="Symbol" w:cs="Symbol" w:hint="default"/>
+      </w:rPr>
+    </w:lvl>
+    <w:lvl w:ilvl="8">
+      <w:start w:val="1"/>
+      <w:numFmt w:val="bullet"/>
+      <w:lvlText w:val=""/>
+      <w:lvlJc w:val="start"/>
+      <w:pPr>
+        <w:tabs>
+          <w:tab w:val="num" w:pos="6381"/>
+        </w:tabs>
+        <w:ind w:start="6381" w:hanging="283"/>
+      </w:pPr>
+      <w:rPr>
+        <w:rFonts w:ascii="Symbol" w:hAnsi="Symbol" w:cs="Symbol" w:hint="default"/>
+      </w:rPr>
+    </w:lvl>
+  </w:abstractNum>
+  <w:abstractNum w:abstractNumId="10">
     <w:lvl w:ilvl="0">
       <w:start w:val="1"/>
       <w:numFmt w:val="none"/>
@@ -12698,6 +14617,12 @@
   </w:num>
   <w:num w:numId="8">
     <w:abstractNumId w:val="8"/>
+  </w:num>
+  <w:num w:numId="9">
+    <w:abstractNumId w:val="9"/>
+  </w:num>
+  <w:num w:numId="10">
+    <w:abstractNumId w:val="10"/>
   </w:num>
 </w:numbering>
 </file>
@@ -13033,6 +14958,16 @@
     </w:pPr>
     <w:rPr/>
   </w:style>
+  <w:style w:type="paragraph" w:styleId="BlockQuotation">
+    <w:name w:val="Block Quotation"/>
+    <w:basedOn w:val="Normal"/>
+    <w:qFormat/>
+    <w:pPr>
+      <w:spacing w:before="0" w:after="283"/>
+      <w:ind w:hanging="0" w:start="567" w:end="567"/>
+    </w:pPr>
+    <w:rPr/>
+  </w:style>
 </w:styles>
 </file>
 

</xml_diff>

<commit_message>
comparator 1 bit wave
</commit_message>
<xml_diff>
--- a/Doc/OnTap/3_Verilog Mạch tổ hợp (Combinational Circuit).docx
+++ b/Doc/OnTap/3_Verilog Mạch tổ hợp (Combinational Circuit).docx
@@ -746,21 +746,6 @@
         <w:pStyle w:val="Heading1"/>
         <w:numPr>
           <w:ilvl w:val="0"/>
-          <w:numId w:val="0"/>
-        </w:numPr>
-        <w:spacing w:before="240" w:after="120"/>
-        <w:ind w:hanging="0" w:start="0"/>
-        <w:rPr/>
-      </w:pPr>
-      <w:r>
-        <w:rPr/>
-      </w:r>
-    </w:p>
-    <w:p>
-      <w:pPr>
-        <w:pStyle w:val="Heading1"/>
-        <w:numPr>
-          <w:ilvl w:val="0"/>
           <w:numId w:val="1"/>
         </w:numPr>
         <w:spacing w:before="240" w:after="120"/>
@@ -9222,8 +9207,8 @@
         <w:gridCol w:w="1606"/>
         <w:gridCol w:w="1606"/>
         <w:gridCol w:w="1607"/>
-        <w:gridCol w:w="1607"/>
-        <w:gridCol w:w="1605"/>
+        <w:gridCol w:w="1608"/>
+        <w:gridCol w:w="1604"/>
       </w:tblGrid>
       <w:tr>
         <w:trPr/>
@@ -9309,7 +9294,7 @@
         </w:tc>
         <w:tc>
           <w:tcPr>
-            <w:tcW w:w="1607" w:type="dxa"/>
+            <w:tcW w:w="1608" w:type="dxa"/>
             <w:tcBorders>
               <w:top w:val="single" w:sz="4" w:space="0" w:color="000000"/>
               <w:start w:val="single" w:sz="4" w:space="0" w:color="000000"/>
@@ -9329,7 +9314,7 @@
         </w:tc>
         <w:tc>
           <w:tcPr>
-            <w:tcW w:w="1605" w:type="dxa"/>
+            <w:tcW w:w="1604" w:type="dxa"/>
             <w:tcBorders>
               <w:top w:val="single" w:sz="4" w:space="0" w:color="000000"/>
               <w:start w:val="single" w:sz="4" w:space="0" w:color="000000"/>
@@ -9429,6 +9414,105 @@
         </w:tc>
         <w:tc>
           <w:tcPr>
+            <w:tcW w:w="1608" w:type="dxa"/>
+            <w:tcBorders>
+              <w:start w:val="single" w:sz="4" w:space="0" w:color="000000"/>
+              <w:bottom w:val="single" w:sz="4" w:space="0" w:color="000000"/>
+            </w:tcBorders>
+          </w:tcPr>
+          <w:p>
+            <w:pPr>
+              <w:pStyle w:val="TableContents"/>
+              <w:rPr/>
+            </w:pPr>
+            <w:r>
+              <w:rPr/>
+              <w:t>0</w:t>
+            </w:r>
+          </w:p>
+        </w:tc>
+        <w:tc>
+          <w:tcPr>
+            <w:tcW w:w="1604" w:type="dxa"/>
+            <w:tcBorders>
+              <w:start w:val="single" w:sz="4" w:space="0" w:color="000000"/>
+              <w:bottom w:val="single" w:sz="4" w:space="0" w:color="000000"/>
+              <w:end w:val="single" w:sz="4" w:space="0" w:color="000000"/>
+            </w:tcBorders>
+          </w:tcPr>
+          <w:p>
+            <w:pPr>
+              <w:pStyle w:val="TableContents"/>
+              <w:rPr/>
+            </w:pPr>
+            <w:r>
+              <w:rPr/>
+              <w:t>1</w:t>
+            </w:r>
+          </w:p>
+        </w:tc>
+      </w:tr>
+      <w:tr>
+        <w:trPr/>
+        <w:tc>
+          <w:tcPr>
+            <w:tcW w:w="1606" w:type="dxa"/>
+            <w:tcBorders>
+              <w:start w:val="single" w:sz="4" w:space="0" w:color="000000"/>
+              <w:bottom w:val="single" w:sz="4" w:space="0" w:color="000000"/>
+            </w:tcBorders>
+          </w:tcPr>
+          <w:p>
+            <w:pPr>
+              <w:pStyle w:val="TableContents"/>
+              <w:rPr/>
+            </w:pPr>
+            <w:r>
+              <w:rPr/>
+              <w:t>0</w:t>
+            </w:r>
+          </w:p>
+        </w:tc>
+        <w:tc>
+          <w:tcPr>
+            <w:tcW w:w="1606" w:type="dxa"/>
+            <w:tcBorders>
+              <w:start w:val="single" w:sz="4" w:space="0" w:color="000000"/>
+              <w:bottom w:val="single" w:sz="4" w:space="0" w:color="000000"/>
+            </w:tcBorders>
+          </w:tcPr>
+          <w:p>
+            <w:pPr>
+              <w:pStyle w:val="TableContents"/>
+              <w:rPr/>
+            </w:pPr>
+            <w:r>
+              <w:rPr/>
+              <w:t>1</w:t>
+            </w:r>
+          </w:p>
+        </w:tc>
+        <w:tc>
+          <w:tcPr>
+            <w:tcW w:w="1606" w:type="dxa"/>
+            <w:tcBorders>
+              <w:start w:val="single" w:sz="4" w:space="0" w:color="000000"/>
+              <w:bottom w:val="single" w:sz="4" w:space="0" w:color="000000"/>
+            </w:tcBorders>
+          </w:tcPr>
+          <w:p>
+            <w:pPr>
+              <w:pStyle w:val="TableContents"/>
+              <w:rPr/>
+            </w:pPr>
+            <w:r>
+              <w:rPr/>
+              <w:t>0</w:t>
+            </w:r>
+          </w:p>
+        </w:tc>
+        <w:tc>
+          <w:tcPr>
             <w:tcW w:w="1607" w:type="dxa"/>
             <w:tcBorders>
               <w:start w:val="single" w:sz="4" w:space="0" w:color="000000"/>
@@ -9448,7 +9532,26 @@
         </w:tc>
         <w:tc>
           <w:tcPr>
-            <w:tcW w:w="1605" w:type="dxa"/>
+            <w:tcW w:w="1608" w:type="dxa"/>
+            <w:tcBorders>
+              <w:start w:val="single" w:sz="4" w:space="0" w:color="000000"/>
+              <w:bottom w:val="single" w:sz="4" w:space="0" w:color="000000"/>
+            </w:tcBorders>
+          </w:tcPr>
+          <w:p>
+            <w:pPr>
+              <w:pStyle w:val="TableContents"/>
+              <w:rPr/>
+            </w:pPr>
+            <w:r>
+              <w:rPr/>
+              <w:t>1</w:t>
+            </w:r>
+          </w:p>
+        </w:tc>
+        <w:tc>
+          <w:tcPr>
+            <w:tcW w:w="1604" w:type="dxa"/>
             <w:tcBorders>
               <w:start w:val="single" w:sz="4" w:space="0" w:color="000000"/>
               <w:bottom w:val="single" w:sz="4" w:space="0" w:color="000000"/>
@@ -9462,7 +9565,7 @@
             </w:pPr>
             <w:r>
               <w:rPr/>
-              <w:t>1</w:t>
+              <w:t>0</w:t>
             </w:r>
           </w:p>
         </w:tc>
@@ -9484,7 +9587,7 @@
             </w:pPr>
             <w:r>
               <w:rPr/>
-              <w:t>0</w:t>
+              <w:t>1</w:t>
             </w:r>
           </w:p>
         </w:tc>
@@ -9503,7 +9606,7 @@
             </w:pPr>
             <w:r>
               <w:rPr/>
-              <w:t>1</w:t>
+              <w:t>0</w:t>
             </w:r>
           </w:p>
         </w:tc>
@@ -9541,7 +9644,106 @@
             </w:pPr>
             <w:r>
               <w:rPr/>
+              <w:t>1</w:t>
+            </w:r>
+          </w:p>
+        </w:tc>
+        <w:tc>
+          <w:tcPr>
+            <w:tcW w:w="1608" w:type="dxa"/>
+            <w:tcBorders>
+              <w:start w:val="single" w:sz="4" w:space="0" w:color="000000"/>
+              <w:bottom w:val="single" w:sz="4" w:space="0" w:color="000000"/>
+            </w:tcBorders>
+          </w:tcPr>
+          <w:p>
+            <w:pPr>
+              <w:pStyle w:val="TableContents"/>
+              <w:rPr/>
+            </w:pPr>
+            <w:r>
+              <w:rPr/>
               <w:t>0</w:t>
+            </w:r>
+          </w:p>
+        </w:tc>
+        <w:tc>
+          <w:tcPr>
+            <w:tcW w:w="1604" w:type="dxa"/>
+            <w:tcBorders>
+              <w:start w:val="single" w:sz="4" w:space="0" w:color="000000"/>
+              <w:bottom w:val="single" w:sz="4" w:space="0" w:color="000000"/>
+              <w:end w:val="single" w:sz="4" w:space="0" w:color="000000"/>
+            </w:tcBorders>
+          </w:tcPr>
+          <w:p>
+            <w:pPr>
+              <w:pStyle w:val="TableContents"/>
+              <w:rPr/>
+            </w:pPr>
+            <w:r>
+              <w:rPr/>
+              <w:t>0</w:t>
+            </w:r>
+          </w:p>
+        </w:tc>
+      </w:tr>
+      <w:tr>
+        <w:trPr/>
+        <w:tc>
+          <w:tcPr>
+            <w:tcW w:w="1606" w:type="dxa"/>
+            <w:tcBorders>
+              <w:start w:val="single" w:sz="4" w:space="0" w:color="000000"/>
+              <w:bottom w:val="single" w:sz="4" w:space="0" w:color="000000"/>
+            </w:tcBorders>
+          </w:tcPr>
+          <w:p>
+            <w:pPr>
+              <w:pStyle w:val="TableContents"/>
+              <w:rPr/>
+            </w:pPr>
+            <w:r>
+              <w:rPr/>
+              <w:t>1</w:t>
+            </w:r>
+          </w:p>
+        </w:tc>
+        <w:tc>
+          <w:tcPr>
+            <w:tcW w:w="1606" w:type="dxa"/>
+            <w:tcBorders>
+              <w:start w:val="single" w:sz="4" w:space="0" w:color="000000"/>
+              <w:bottom w:val="single" w:sz="4" w:space="0" w:color="000000"/>
+            </w:tcBorders>
+          </w:tcPr>
+          <w:p>
+            <w:pPr>
+              <w:pStyle w:val="TableContents"/>
+              <w:rPr/>
+            </w:pPr>
+            <w:r>
+              <w:rPr/>
+              <w:t>1</w:t>
+            </w:r>
+          </w:p>
+        </w:tc>
+        <w:tc>
+          <w:tcPr>
+            <w:tcW w:w="1606" w:type="dxa"/>
+            <w:tcBorders>
+              <w:start w:val="single" w:sz="4" w:space="0" w:color="000000"/>
+              <w:bottom w:val="single" w:sz="4" w:space="0" w:color="000000"/>
+            </w:tcBorders>
+          </w:tcPr>
+          <w:p>
+            <w:pPr>
+              <w:pStyle w:val="TableContents"/>
+              <w:rPr/>
+            </w:pPr>
+            <w:r>
+              <w:rPr/>
+              <w:t>1</w:t>
             </w:r>
           </w:p>
         </w:tc>
@@ -9560,36 +9762,13 @@
             </w:pPr>
             <w:r>
               <w:rPr/>
-              <w:t>1</w:t>
-            </w:r>
-          </w:p>
-        </w:tc>
-        <w:tc>
-          <w:tcPr>
-            <w:tcW w:w="1605" w:type="dxa"/>
-            <w:tcBorders>
-              <w:start w:val="single" w:sz="4" w:space="0" w:color="000000"/>
-              <w:bottom w:val="single" w:sz="4" w:space="0" w:color="000000"/>
-              <w:end w:val="single" w:sz="4" w:space="0" w:color="000000"/>
-            </w:tcBorders>
-          </w:tcPr>
-          <w:p>
-            <w:pPr>
-              <w:pStyle w:val="TableContents"/>
-              <w:rPr/>
-            </w:pPr>
-            <w:r>
-              <w:rPr/>
               <w:t>0</w:t>
             </w:r>
           </w:p>
         </w:tc>
-      </w:tr>
-      <w:tr>
-        <w:trPr/>
-        <w:tc>
-          <w:tcPr>
-            <w:tcW w:w="1606" w:type="dxa"/>
+        <w:tc>
+          <w:tcPr>
+            <w:tcW w:w="1608" w:type="dxa"/>
             <w:tcBorders>
               <w:start w:val="single" w:sz="4" w:space="0" w:color="000000"/>
               <w:bottom w:val="single" w:sz="4" w:space="0" w:color="000000"/>
@@ -9602,207 +9781,13 @@
             </w:pPr>
             <w:r>
               <w:rPr/>
-              <w:t>1</w:t>
-            </w:r>
-          </w:p>
-        </w:tc>
-        <w:tc>
-          <w:tcPr>
-            <w:tcW w:w="1606" w:type="dxa"/>
-            <w:tcBorders>
-              <w:start w:val="single" w:sz="4" w:space="0" w:color="000000"/>
-              <w:bottom w:val="single" w:sz="4" w:space="0" w:color="000000"/>
-            </w:tcBorders>
-          </w:tcPr>
-          <w:p>
-            <w:pPr>
-              <w:pStyle w:val="TableContents"/>
-              <w:rPr/>
-            </w:pPr>
-            <w:r>
-              <w:rPr/>
               <w:t>0</w:t>
             </w:r>
           </w:p>
         </w:tc>
         <w:tc>
           <w:tcPr>
-            <w:tcW w:w="1606" w:type="dxa"/>
-            <w:tcBorders>
-              <w:start w:val="single" w:sz="4" w:space="0" w:color="000000"/>
-              <w:bottom w:val="single" w:sz="4" w:space="0" w:color="000000"/>
-            </w:tcBorders>
-          </w:tcPr>
-          <w:p>
-            <w:pPr>
-              <w:pStyle w:val="TableContents"/>
-              <w:rPr/>
-            </w:pPr>
-            <w:r>
-              <w:rPr/>
-              <w:t>0</w:t>
-            </w:r>
-          </w:p>
-        </w:tc>
-        <w:tc>
-          <w:tcPr>
-            <w:tcW w:w="1607" w:type="dxa"/>
-            <w:tcBorders>
-              <w:start w:val="single" w:sz="4" w:space="0" w:color="000000"/>
-              <w:bottom w:val="single" w:sz="4" w:space="0" w:color="000000"/>
-            </w:tcBorders>
-          </w:tcPr>
-          <w:p>
-            <w:pPr>
-              <w:pStyle w:val="TableContents"/>
-              <w:rPr/>
-            </w:pPr>
-            <w:r>
-              <w:rPr/>
-              <w:t>1</w:t>
-            </w:r>
-          </w:p>
-        </w:tc>
-        <w:tc>
-          <w:tcPr>
-            <w:tcW w:w="1607" w:type="dxa"/>
-            <w:tcBorders>
-              <w:start w:val="single" w:sz="4" w:space="0" w:color="000000"/>
-              <w:bottom w:val="single" w:sz="4" w:space="0" w:color="000000"/>
-            </w:tcBorders>
-          </w:tcPr>
-          <w:p>
-            <w:pPr>
-              <w:pStyle w:val="TableContents"/>
-              <w:rPr/>
-            </w:pPr>
-            <w:r>
-              <w:rPr/>
-              <w:t>0</w:t>
-            </w:r>
-          </w:p>
-        </w:tc>
-        <w:tc>
-          <w:tcPr>
-            <w:tcW w:w="1605" w:type="dxa"/>
-            <w:tcBorders>
-              <w:start w:val="single" w:sz="4" w:space="0" w:color="000000"/>
-              <w:bottom w:val="single" w:sz="4" w:space="0" w:color="000000"/>
-              <w:end w:val="single" w:sz="4" w:space="0" w:color="000000"/>
-            </w:tcBorders>
-          </w:tcPr>
-          <w:p>
-            <w:pPr>
-              <w:pStyle w:val="TableContents"/>
-              <w:rPr/>
-            </w:pPr>
-            <w:r>
-              <w:rPr/>
-              <w:t>0</w:t>
-            </w:r>
-          </w:p>
-        </w:tc>
-      </w:tr>
-      <w:tr>
-        <w:trPr/>
-        <w:tc>
-          <w:tcPr>
-            <w:tcW w:w="1606" w:type="dxa"/>
-            <w:tcBorders>
-              <w:start w:val="single" w:sz="4" w:space="0" w:color="000000"/>
-              <w:bottom w:val="single" w:sz="4" w:space="0" w:color="000000"/>
-            </w:tcBorders>
-          </w:tcPr>
-          <w:p>
-            <w:pPr>
-              <w:pStyle w:val="TableContents"/>
-              <w:rPr/>
-            </w:pPr>
-            <w:r>
-              <w:rPr/>
-              <w:t>1</w:t>
-            </w:r>
-          </w:p>
-        </w:tc>
-        <w:tc>
-          <w:tcPr>
-            <w:tcW w:w="1606" w:type="dxa"/>
-            <w:tcBorders>
-              <w:start w:val="single" w:sz="4" w:space="0" w:color="000000"/>
-              <w:bottom w:val="single" w:sz="4" w:space="0" w:color="000000"/>
-            </w:tcBorders>
-          </w:tcPr>
-          <w:p>
-            <w:pPr>
-              <w:pStyle w:val="TableContents"/>
-              <w:rPr/>
-            </w:pPr>
-            <w:r>
-              <w:rPr/>
-              <w:t>1</w:t>
-            </w:r>
-          </w:p>
-        </w:tc>
-        <w:tc>
-          <w:tcPr>
-            <w:tcW w:w="1606" w:type="dxa"/>
-            <w:tcBorders>
-              <w:start w:val="single" w:sz="4" w:space="0" w:color="000000"/>
-              <w:bottom w:val="single" w:sz="4" w:space="0" w:color="000000"/>
-            </w:tcBorders>
-          </w:tcPr>
-          <w:p>
-            <w:pPr>
-              <w:pStyle w:val="TableContents"/>
-              <w:rPr/>
-            </w:pPr>
-            <w:r>
-              <w:rPr/>
-              <w:t>1</w:t>
-            </w:r>
-          </w:p>
-        </w:tc>
-        <w:tc>
-          <w:tcPr>
-            <w:tcW w:w="1607" w:type="dxa"/>
-            <w:tcBorders>
-              <w:start w:val="single" w:sz="4" w:space="0" w:color="000000"/>
-              <w:bottom w:val="single" w:sz="4" w:space="0" w:color="000000"/>
-            </w:tcBorders>
-          </w:tcPr>
-          <w:p>
-            <w:pPr>
-              <w:pStyle w:val="TableContents"/>
-              <w:rPr/>
-            </w:pPr>
-            <w:r>
-              <w:rPr/>
-              <w:t>0</w:t>
-            </w:r>
-          </w:p>
-        </w:tc>
-        <w:tc>
-          <w:tcPr>
-            <w:tcW w:w="1607" w:type="dxa"/>
-            <w:tcBorders>
-              <w:start w:val="single" w:sz="4" w:space="0" w:color="000000"/>
-              <w:bottom w:val="single" w:sz="4" w:space="0" w:color="000000"/>
-            </w:tcBorders>
-          </w:tcPr>
-          <w:p>
-            <w:pPr>
-              <w:pStyle w:val="TableContents"/>
-              <w:rPr/>
-            </w:pPr>
-            <w:r>
-              <w:rPr/>
-              <w:t>0</w:t>
-            </w:r>
-          </w:p>
-        </w:tc>
-        <w:tc>
-          <w:tcPr>
-            <w:tcW w:w="1605" w:type="dxa"/>
+            <w:tcW w:w="1604" w:type="dxa"/>
             <w:tcBorders>
               <w:start w:val="single" w:sz="4" w:space="0" w:color="000000"/>
               <w:bottom w:val="single" w:sz="4" w:space="0" w:color="000000"/>
@@ -10050,7 +10035,7 @@
         <w:ind w:hanging="0" w:start="0" w:end="0"/>
         <w:rPr/>
       </w:pPr>
-      <w:bookmarkStart w:id="77" w:name="code-block-viewer_Copy_1_Copy_1_Copy_1"/>
+      <w:bookmarkStart w:id="77" w:name="code-block-viewer_Copy_1_Copy_1_Copy_1_C"/>
       <w:bookmarkEnd w:id="77"/>
       <w:r>
         <w:rPr>
@@ -10336,7 +10321,7 @@
         <w:ind w:hanging="0" w:start="0" w:end="0"/>
         <w:rPr/>
       </w:pPr>
-      <w:bookmarkStart w:id="79" w:name="code-block-viewer_Copy_2_Copy_1_Copy_1"/>
+      <w:bookmarkStart w:id="79" w:name="code-block-viewer_Copy_2_Copy_1_Copy_1_1"/>
       <w:bookmarkEnd w:id="79"/>
       <w:r>
         <w:rPr>
@@ -10673,7 +10658,7 @@
         <w:ind w:hanging="0" w:start="0" w:end="0"/>
         <w:rPr/>
       </w:pPr>
-      <w:bookmarkStart w:id="81" w:name="code-block-viewer_Copy_1"/>
+      <w:bookmarkStart w:id="81" w:name="code-block-viewer_Copy_1_Copy_1"/>
       <w:bookmarkEnd w:id="81"/>
       <w:r>
         <w:rPr>
@@ -10768,7 +10753,7 @@
         <w:ind w:hanging="0" w:start="0" w:end="0"/>
         <w:rPr/>
       </w:pPr>
-      <w:bookmarkStart w:id="82" w:name="code-block-viewer_Copy_2"/>
+      <w:bookmarkStart w:id="82" w:name="code-block-viewer_Copy_2_Copy_1"/>
       <w:bookmarkEnd w:id="82"/>
       <w:r>
         <w:rPr>
@@ -11413,7 +11398,7 @@
         <w:ind w:hanging="0" w:start="0" w:end="0"/>
         <w:rPr/>
       </w:pPr>
-      <w:bookmarkStart w:id="83" w:name="code-block-viewer_Copy_1_Copy_1"/>
+      <w:bookmarkStart w:id="83" w:name="code-block-viewer_Copy_1_Copy_1_Copy_1"/>
       <w:bookmarkEnd w:id="83"/>
       <w:r>
         <w:rPr>
@@ -11463,7 +11448,7 @@
         <w:ind w:hanging="0" w:start="0" w:end="0"/>
         <w:rPr/>
       </w:pPr>
-      <w:bookmarkStart w:id="84" w:name="code-block-viewer_Copy_2_Copy_1"/>
+      <w:bookmarkStart w:id="84" w:name="code-block-viewer_Copy_2_Copy_1_Copy_1"/>
       <w:bookmarkEnd w:id="84"/>
       <w:r>
         <w:rPr>
@@ -11532,7 +11517,7 @@
         <w:ind w:hanging="0" w:start="0" w:end="0"/>
         <w:rPr/>
       </w:pPr>
-      <w:bookmarkStart w:id="85" w:name="code-block-viewer_Copy_3_Copy_1"/>
+      <w:bookmarkStart w:id="85" w:name="code-block-viewer_Copy_3_Copy_1_Copy_1"/>
       <w:bookmarkEnd w:id="85"/>
       <w:r>
         <w:rPr>
@@ -11860,7 +11845,7 @@
         <w:ind w:hanging="0" w:start="0" w:end="0"/>
         <w:rPr/>
       </w:pPr>
-      <w:bookmarkStart w:id="86" w:name="code-block-viewer_Copy_3"/>
+      <w:bookmarkStart w:id="86" w:name="code-block-viewer_Copy_3_Copy_1"/>
       <w:bookmarkEnd w:id="86"/>
       <w:r>
         <w:rPr>
@@ -11996,7 +11981,7 @@
         <w:ind w:hanging="0" w:start="0" w:end="0"/>
         <w:rPr/>
       </w:pPr>
-      <w:bookmarkStart w:id="87" w:name="code-block-viewer_Copy_4"/>
+      <w:bookmarkStart w:id="87" w:name="code-block-viewer_Copy_4_Copy_1"/>
       <w:bookmarkEnd w:id="87"/>
       <w:r>
         <w:rPr>
@@ -12066,7 +12051,7 @@
         <w:ind w:hanging="0" w:start="0" w:end="0"/>
         <w:rPr/>
       </w:pPr>
-      <w:bookmarkStart w:id="88" w:name="code-block-viewer_Copy_5"/>
+      <w:bookmarkStart w:id="88" w:name="code-block-viewer_Copy_5_Copy_1"/>
       <w:bookmarkEnd w:id="88"/>
       <w:r>
         <w:rPr>
@@ -12165,7 +12150,7 @@
         <w:ind w:hanging="0" w:start="0" w:end="0"/>
         <w:rPr/>
       </w:pPr>
-      <w:bookmarkStart w:id="89" w:name="code-block-viewer_Copy_6"/>
+      <w:bookmarkStart w:id="89" w:name="code-block-viewer_Copy_6_Copy_1"/>
       <w:bookmarkEnd w:id="89"/>
       <w:r>
         <w:rPr>
@@ -12333,7 +12318,7 @@
         <w:ind w:hanging="0" w:start="0" w:end="0"/>
         <w:rPr/>
       </w:pPr>
-      <w:bookmarkStart w:id="90" w:name="code-block-viewer_Copy_7"/>
+      <w:bookmarkStart w:id="90" w:name="code-block-viewer_Copy_7_Copy_1"/>
       <w:bookmarkEnd w:id="90"/>
       <w:r>
         <w:rPr>
@@ -12383,7 +12368,7 @@
         <w:ind w:hanging="0" w:start="0" w:end="0"/>
         <w:rPr/>
       </w:pPr>
-      <w:bookmarkStart w:id="91" w:name="code-block-viewer_Copy_8"/>
+      <w:bookmarkStart w:id="91" w:name="code-block-viewer_Copy_8_Copy_1"/>
       <w:bookmarkEnd w:id="91"/>
       <w:r>
         <w:rPr>
@@ -12514,7 +12499,7 @@
         <w:ind w:hanging="0" w:start="0" w:end="0"/>
         <w:rPr/>
       </w:pPr>
-      <w:bookmarkStart w:id="92" w:name="code-block-viewer_Copy_9"/>
+      <w:bookmarkStart w:id="92" w:name="code-block-viewer_Copy_9_Copy_1"/>
       <w:bookmarkEnd w:id="92"/>
       <w:r>
         <w:rPr>
@@ -12583,7 +12568,7 @@
         <w:ind w:hanging="0" w:start="0" w:end="0"/>
         <w:rPr/>
       </w:pPr>
-      <w:bookmarkStart w:id="93" w:name="code-block-viewer_Copy_10"/>
+      <w:bookmarkStart w:id="93" w:name="code-block-viewer_Copy_10_Copy_1"/>
       <w:bookmarkEnd w:id="93"/>
       <w:r>
         <w:rPr>
@@ -12750,7 +12735,7 @@
         <w:ind w:hanging="0" w:start="0" w:end="0"/>
         <w:rPr/>
       </w:pPr>
-      <w:bookmarkStart w:id="94" w:name="code-block-viewer_Copy_11"/>
+      <w:bookmarkStart w:id="94" w:name="code-block-viewer_Copy_11_Copy_1"/>
       <w:bookmarkEnd w:id="94"/>
       <w:r>
         <w:rPr>
@@ -12833,7 +12818,7 @@
         <w:ind w:hanging="0" w:start="0" w:end="0"/>
         <w:rPr/>
       </w:pPr>
-      <w:bookmarkStart w:id="95" w:name="code-block-viewer_Copy_12"/>
+      <w:bookmarkStart w:id="95" w:name="code-block-viewer_Copy_12_Copy_1"/>
       <w:bookmarkEnd w:id="95"/>
       <w:r>
         <w:rPr>
@@ -12968,7 +12953,7 @@
         <w:ind w:hanging="0" w:start="0" w:end="0"/>
         <w:rPr/>
       </w:pPr>
-      <w:bookmarkStart w:id="96" w:name="code-block-viewer_Copy_13"/>
+      <w:bookmarkStart w:id="96" w:name="code-block-viewer_Copy_13_Copy_1"/>
       <w:bookmarkEnd w:id="96"/>
       <w:r>
         <w:rPr>
@@ -13048,7 +13033,7 @@
         <w:ind w:hanging="0" w:start="0" w:end="0"/>
         <w:rPr/>
       </w:pPr>
-      <w:bookmarkStart w:id="97" w:name="code-block-viewer_Copy_14"/>
+      <w:bookmarkStart w:id="97" w:name="code-block-viewer_Copy_14_Copy_1"/>
       <w:bookmarkEnd w:id="97"/>
       <w:r>
         <w:rPr>
@@ -13098,7 +13083,7 @@
         <w:ind w:hanging="0" w:start="0" w:end="0"/>
         <w:rPr/>
       </w:pPr>
-      <w:bookmarkStart w:id="98" w:name="code-block-viewer_Copy_15"/>
+      <w:bookmarkStart w:id="98" w:name="code-block-viewer_Copy_15_Copy_1"/>
       <w:bookmarkEnd w:id="98"/>
       <w:r>
         <w:rPr>
@@ -13147,13 +13132,1557 @@
     </w:p>
     <w:p>
       <w:pPr>
+        <w:pStyle w:val="Heading2"/>
+        <w:numPr>
+          <w:ilvl w:val="1"/>
+          <w:numId w:val="1"/>
+        </w:numPr>
+        <w:ind w:hanging="0" w:start="0"/>
+        <w:rPr/>
+      </w:pPr>
+      <w:r>
+        <w:rPr/>
+        <w:t>Bước 1: Comparator 1 bit</w:t>
+      </w:r>
+    </w:p>
+    <w:p>
+      <w:pPr>
+        <w:pStyle w:val="BodyText"/>
+        <w:rPr/>
+      </w:pPr>
+      <w:r>
+        <w:rPr/>
+        <w:t>Có hai đầu vào:</w:t>
+      </w:r>
+    </w:p>
+    <w:p>
+      <w:pPr>
+        <w:sectPr>
+          <w:type w:val="continuous"/>
+          <w:pgSz w:w="11906" w:h="16838"/>
+          <w:pgMar w:left="1134" w:right="1134" w:gutter="0" w:header="0" w:top="1134" w:footer="1134" w:bottom="1693"/>
+          <w:formProt w:val="false"/>
+          <w:textDirection w:val="lrTb"/>
+          <w:docGrid w:type="default" w:linePitch="100" w:charSpace="0"/>
+        </w:sectPr>
+      </w:pPr>
+    </w:p>
+    <w:p>
+      <w:pPr>
+        <w:pStyle w:val="PreformattedText"/>
+        <w:spacing w:before="0" w:after="283"/>
+        <w:ind w:hanging="0" w:start="0" w:end="0"/>
+        <w:rPr/>
+      </w:pPr>
+      <w:r>
+        <w:rPr>
+          <w:rStyle w:val="SourceText"/>
+        </w:rPr>
+        <w:t>a   b</w:t>
+      </w:r>
+    </w:p>
+    <w:p>
+      <w:pPr>
+        <w:sectPr>
+          <w:type w:val="continuous"/>
+          <w:pgSz w:w="11906" w:h="16838"/>
+          <w:pgMar w:left="1134" w:right="1134" w:gutter="0" w:header="0" w:top="1134" w:footer="1134" w:bottom="1693"/>
+          <w:formProt w:val="false"/>
+          <w:textDirection w:val="lrTb"/>
+          <w:docGrid w:type="default" w:linePitch="100" w:charSpace="0"/>
+        </w:sectPr>
+      </w:pPr>
+    </w:p>
+    <w:p>
+      <w:pPr>
+        <w:pStyle w:val="BodyText"/>
+        <w:rPr/>
+      </w:pPr>
+      <w:r>
+        <w:rPr/>
+        <w:t>Muốn biết chúng có bằng nhau không.</w:t>
+      </w:r>
+    </w:p>
+    <w:p>
+      <w:pPr>
+        <w:pStyle w:val="BodyText"/>
+        <w:rPr/>
+      </w:pPr>
+      <w:r>
+        <w:rPr/>
+        <w:t>Bảng chân trị:</w:t>
+      </w:r>
+    </w:p>
+    <w:tbl>
+      <w:tblPr>
+        <w:tblW w:w="5000" w:type="pct"/>
+        <w:jc w:val="start"/>
+        <w:tblInd w:w="-5" w:type="dxa"/>
+        <w:tblLayout w:type="fixed"/>
+        <w:tblCellMar>
+          <w:top w:w="55" w:type="dxa"/>
+          <w:start w:w="55" w:type="dxa"/>
+          <w:bottom w:w="55" w:type="dxa"/>
+          <w:end w:w="55" w:type="dxa"/>
+        </w:tblCellMar>
+      </w:tblPr>
+      <w:tblGrid>
+        <w:gridCol w:w="3212"/>
+        <w:gridCol w:w="3213"/>
+        <w:gridCol w:w="3213"/>
+      </w:tblGrid>
+      <w:tr>
+        <w:trPr/>
+        <w:tc>
+          <w:tcPr>
+            <w:tcW w:w="3212" w:type="dxa"/>
+            <w:tcBorders>
+              <w:top w:val="single" w:sz="4" w:space="0" w:color="000000"/>
+              <w:start w:val="single" w:sz="4" w:space="0" w:color="000000"/>
+              <w:bottom w:val="single" w:sz="4" w:space="0" w:color="000000"/>
+            </w:tcBorders>
+          </w:tcPr>
+          <w:p>
+            <w:pPr>
+              <w:pStyle w:val="TableContents"/>
+              <w:jc w:val="center"/>
+              <w:rPr>
+                <w:b/>
+                <w:bCs/>
+              </w:rPr>
+            </w:pPr>
+            <w:r>
+              <w:rPr>
+                <w:b/>
+                <w:bCs/>
+              </w:rPr>
+              <w:t>a</w:t>
+            </w:r>
+          </w:p>
+        </w:tc>
+        <w:tc>
+          <w:tcPr>
+            <w:tcW w:w="3213" w:type="dxa"/>
+            <w:tcBorders>
+              <w:top w:val="single" w:sz="4" w:space="0" w:color="000000"/>
+              <w:start w:val="single" w:sz="4" w:space="0" w:color="000000"/>
+              <w:bottom w:val="single" w:sz="4" w:space="0" w:color="000000"/>
+            </w:tcBorders>
+          </w:tcPr>
+          <w:p>
+            <w:pPr>
+              <w:pStyle w:val="TableContents"/>
+              <w:jc w:val="center"/>
+              <w:rPr>
+                <w:b/>
+                <w:bCs/>
+              </w:rPr>
+            </w:pPr>
+            <w:r>
+              <w:rPr>
+                <w:b/>
+                <w:bCs/>
+              </w:rPr>
+              <w:t>b</w:t>
+            </w:r>
+          </w:p>
+        </w:tc>
+        <w:tc>
+          <w:tcPr>
+            <w:tcW w:w="3213" w:type="dxa"/>
+            <w:tcBorders>
+              <w:top w:val="single" w:sz="4" w:space="0" w:color="000000"/>
+              <w:start w:val="single" w:sz="4" w:space="0" w:color="000000"/>
+              <w:bottom w:val="single" w:sz="4" w:space="0" w:color="000000"/>
+              <w:end w:val="single" w:sz="4" w:space="0" w:color="000000"/>
+            </w:tcBorders>
+          </w:tcPr>
+          <w:p>
+            <w:pPr>
+              <w:pStyle w:val="TableContents"/>
+              <w:jc w:val="center"/>
+              <w:rPr>
+                <w:b/>
+                <w:bCs/>
+              </w:rPr>
+            </w:pPr>
+            <w:r>
+              <w:rPr>
+                <w:b/>
+                <w:bCs/>
+              </w:rPr>
+              <w:t>equal</w:t>
+            </w:r>
+          </w:p>
+        </w:tc>
+      </w:tr>
+      <w:tr>
+        <w:trPr/>
+        <w:tc>
+          <w:tcPr>
+            <w:tcW w:w="3212" w:type="dxa"/>
+            <w:tcBorders>
+              <w:start w:val="single" w:sz="4" w:space="0" w:color="000000"/>
+              <w:bottom w:val="single" w:sz="4" w:space="0" w:color="000000"/>
+            </w:tcBorders>
+          </w:tcPr>
+          <w:p>
+            <w:pPr>
+              <w:pStyle w:val="TableContents"/>
+              <w:rPr/>
+            </w:pPr>
+            <w:r>
+              <w:rPr/>
+              <w:t>0</w:t>
+            </w:r>
+          </w:p>
+        </w:tc>
+        <w:tc>
+          <w:tcPr>
+            <w:tcW w:w="3213" w:type="dxa"/>
+            <w:tcBorders>
+              <w:start w:val="single" w:sz="4" w:space="0" w:color="000000"/>
+              <w:bottom w:val="single" w:sz="4" w:space="0" w:color="000000"/>
+            </w:tcBorders>
+          </w:tcPr>
+          <w:p>
+            <w:pPr>
+              <w:pStyle w:val="TableContents"/>
+              <w:rPr/>
+            </w:pPr>
+            <w:r>
+              <w:rPr/>
+              <w:t>0</w:t>
+            </w:r>
+          </w:p>
+        </w:tc>
+        <w:tc>
+          <w:tcPr>
+            <w:tcW w:w="3213" w:type="dxa"/>
+            <w:tcBorders>
+              <w:start w:val="single" w:sz="4" w:space="0" w:color="000000"/>
+              <w:bottom w:val="single" w:sz="4" w:space="0" w:color="000000"/>
+              <w:end w:val="single" w:sz="4" w:space="0" w:color="000000"/>
+            </w:tcBorders>
+          </w:tcPr>
+          <w:p>
+            <w:pPr>
+              <w:pStyle w:val="TableContents"/>
+              <w:rPr/>
+            </w:pPr>
+            <w:r>
+              <w:rPr/>
+              <w:t>1</w:t>
+            </w:r>
+          </w:p>
+        </w:tc>
+      </w:tr>
+      <w:tr>
+        <w:trPr/>
+        <w:tc>
+          <w:tcPr>
+            <w:tcW w:w="3212" w:type="dxa"/>
+            <w:tcBorders>
+              <w:start w:val="single" w:sz="4" w:space="0" w:color="000000"/>
+              <w:bottom w:val="single" w:sz="4" w:space="0" w:color="000000"/>
+            </w:tcBorders>
+          </w:tcPr>
+          <w:p>
+            <w:pPr>
+              <w:pStyle w:val="TableContents"/>
+              <w:rPr/>
+            </w:pPr>
+            <w:r>
+              <w:rPr/>
+              <w:t>0</w:t>
+            </w:r>
+          </w:p>
+        </w:tc>
+        <w:tc>
+          <w:tcPr>
+            <w:tcW w:w="3213" w:type="dxa"/>
+            <w:tcBorders>
+              <w:start w:val="single" w:sz="4" w:space="0" w:color="000000"/>
+              <w:bottom w:val="single" w:sz="4" w:space="0" w:color="000000"/>
+            </w:tcBorders>
+          </w:tcPr>
+          <w:p>
+            <w:pPr>
+              <w:pStyle w:val="TableContents"/>
+              <w:rPr/>
+            </w:pPr>
+            <w:r>
+              <w:rPr/>
+              <w:t>1</w:t>
+            </w:r>
+          </w:p>
+        </w:tc>
+        <w:tc>
+          <w:tcPr>
+            <w:tcW w:w="3213" w:type="dxa"/>
+            <w:tcBorders>
+              <w:start w:val="single" w:sz="4" w:space="0" w:color="000000"/>
+              <w:bottom w:val="single" w:sz="4" w:space="0" w:color="000000"/>
+              <w:end w:val="single" w:sz="4" w:space="0" w:color="000000"/>
+            </w:tcBorders>
+          </w:tcPr>
+          <w:p>
+            <w:pPr>
+              <w:pStyle w:val="TableContents"/>
+              <w:rPr/>
+            </w:pPr>
+            <w:r>
+              <w:rPr/>
+              <w:t>0</w:t>
+            </w:r>
+          </w:p>
+        </w:tc>
+      </w:tr>
+      <w:tr>
+        <w:trPr/>
+        <w:tc>
+          <w:tcPr>
+            <w:tcW w:w="3212" w:type="dxa"/>
+            <w:tcBorders>
+              <w:start w:val="single" w:sz="4" w:space="0" w:color="000000"/>
+              <w:bottom w:val="single" w:sz="4" w:space="0" w:color="000000"/>
+            </w:tcBorders>
+          </w:tcPr>
+          <w:p>
+            <w:pPr>
+              <w:pStyle w:val="TableContents"/>
+              <w:rPr/>
+            </w:pPr>
+            <w:r>
+              <w:rPr/>
+              <w:t>1</w:t>
+            </w:r>
+          </w:p>
+        </w:tc>
+        <w:tc>
+          <w:tcPr>
+            <w:tcW w:w="3213" w:type="dxa"/>
+            <w:tcBorders>
+              <w:start w:val="single" w:sz="4" w:space="0" w:color="000000"/>
+              <w:bottom w:val="single" w:sz="4" w:space="0" w:color="000000"/>
+            </w:tcBorders>
+          </w:tcPr>
+          <w:p>
+            <w:pPr>
+              <w:pStyle w:val="TableContents"/>
+              <w:rPr/>
+            </w:pPr>
+            <w:r>
+              <w:rPr/>
+              <w:t>0</w:t>
+            </w:r>
+          </w:p>
+        </w:tc>
+        <w:tc>
+          <w:tcPr>
+            <w:tcW w:w="3213" w:type="dxa"/>
+            <w:tcBorders>
+              <w:start w:val="single" w:sz="4" w:space="0" w:color="000000"/>
+              <w:bottom w:val="single" w:sz="4" w:space="0" w:color="000000"/>
+              <w:end w:val="single" w:sz="4" w:space="0" w:color="000000"/>
+            </w:tcBorders>
+          </w:tcPr>
+          <w:p>
+            <w:pPr>
+              <w:pStyle w:val="TableContents"/>
+              <w:rPr/>
+            </w:pPr>
+            <w:r>
+              <w:rPr/>
+              <w:t>0</w:t>
+            </w:r>
+          </w:p>
+        </w:tc>
+      </w:tr>
+      <w:tr>
+        <w:trPr/>
+        <w:tc>
+          <w:tcPr>
+            <w:tcW w:w="3212" w:type="dxa"/>
+            <w:tcBorders>
+              <w:start w:val="single" w:sz="4" w:space="0" w:color="000000"/>
+              <w:bottom w:val="single" w:sz="4" w:space="0" w:color="000000"/>
+            </w:tcBorders>
+          </w:tcPr>
+          <w:p>
+            <w:pPr>
+              <w:pStyle w:val="TableContents"/>
+              <w:rPr/>
+            </w:pPr>
+            <w:r>
+              <w:rPr/>
+              <w:t>1</w:t>
+            </w:r>
+          </w:p>
+        </w:tc>
+        <w:tc>
+          <w:tcPr>
+            <w:tcW w:w="3213" w:type="dxa"/>
+            <w:tcBorders>
+              <w:start w:val="single" w:sz="4" w:space="0" w:color="000000"/>
+              <w:bottom w:val="single" w:sz="4" w:space="0" w:color="000000"/>
+            </w:tcBorders>
+          </w:tcPr>
+          <w:p>
+            <w:pPr>
+              <w:pStyle w:val="TableContents"/>
+              <w:rPr/>
+            </w:pPr>
+            <w:r>
+              <w:rPr/>
+              <w:t>1</w:t>
+            </w:r>
+          </w:p>
+        </w:tc>
+        <w:tc>
+          <w:tcPr>
+            <w:tcW w:w="3213" w:type="dxa"/>
+            <w:tcBorders>
+              <w:start w:val="single" w:sz="4" w:space="0" w:color="000000"/>
+              <w:bottom w:val="single" w:sz="4" w:space="0" w:color="000000"/>
+              <w:end w:val="single" w:sz="4" w:space="0" w:color="000000"/>
+            </w:tcBorders>
+          </w:tcPr>
+          <w:p>
+            <w:pPr>
+              <w:pStyle w:val="TableContents"/>
+              <w:rPr/>
+            </w:pPr>
+            <w:r>
+              <w:rPr/>
+              <w:t>1</w:t>
+            </w:r>
+          </w:p>
+        </w:tc>
+      </w:tr>
+    </w:tbl>
+    <w:p>
+      <w:pPr>
         <w:pStyle w:val="BodyText"/>
         <w:spacing w:before="0" w:after="140"/>
         <w:rPr/>
       </w:pPr>
       <w:r>
         <w:rPr/>
-        <w:t>todo</w:t>
+      </w:r>
+    </w:p>
+    <w:p>
+      <w:pPr>
+        <w:pStyle w:val="BodyText"/>
+        <w:spacing w:before="0" w:after="140"/>
+        <w:rPr/>
+      </w:pPr>
+      <w:r>
+        <w:rPr/>
+        <w:t>Nhìn bảng này, bạn có nhận ra cổng logic nào cho kết quả giống hệt không?</w:t>
+      </w:r>
+    </w:p>
+    <w:p>
+      <w:pPr>
+        <w:pStyle w:val="BodyText"/>
+        <w:rPr/>
+      </w:pPr>
+      <w:r>
+        <w:rPr/>
+        <w:t xml:space="preserve">👉 </w:t>
+      </w:r>
+      <w:r>
+        <w:rPr/>
+        <w:t xml:space="preserve">Chính là </w:t>
+      </w:r>
+      <w:r>
+        <w:rPr>
+          <w:rStyle w:val="Strong"/>
+        </w:rPr>
+        <w:t>XNOR</w:t>
+      </w:r>
+      <w:r>
+        <w:rPr/>
+        <w:t>.</w:t>
+      </w:r>
+    </w:p>
+    <w:p>
+      <w:pPr>
+        <w:pStyle w:val="BodyText"/>
+        <w:rPr/>
+      </w:pPr>
+      <w:r>
+        <w:rPr/>
+        <w:t>Công thức:</w:t>
+      </w:r>
+    </w:p>
+    <w:p>
+      <w:pPr>
+        <w:sectPr>
+          <w:type w:val="continuous"/>
+          <w:pgSz w:w="11906" w:h="16838"/>
+          <w:pgMar w:left="1134" w:right="1134" w:gutter="0" w:header="0" w:top="1134" w:footer="1134" w:bottom="1693"/>
+          <w:formProt w:val="false"/>
+          <w:textDirection w:val="lrTb"/>
+          <w:docGrid w:type="default" w:linePitch="100" w:charSpace="0"/>
+        </w:sectPr>
+      </w:pPr>
+    </w:p>
+    <w:p>
+      <w:pPr>
+        <w:pStyle w:val="PreformattedText"/>
+        <w:spacing w:before="0" w:after="283"/>
+        <w:ind w:hanging="0" w:start="0" w:end="0"/>
+        <w:rPr/>
+      </w:pPr>
+      <w:bookmarkStart w:id="100" w:name="code-block-viewer_Copy_1"/>
+      <w:bookmarkEnd w:id="100"/>
+      <w:r>
+        <w:rPr>
+          <w:rStyle w:val="SourceText"/>
+        </w:rPr>
+        <w:t>equal = ~(a ^ b)</w:t>
+      </w:r>
+    </w:p>
+    <w:p>
+      <w:pPr>
+        <w:sectPr>
+          <w:type w:val="continuous"/>
+          <w:pgSz w:w="11906" w:h="16838"/>
+          <w:pgMar w:left="1134" w:right="1134" w:gutter="0" w:header="0" w:top="1134" w:footer="1134" w:bottom="1693"/>
+          <w:formProt w:val="false"/>
+          <w:textDirection w:val="lrTb"/>
+          <w:docGrid w:type="default" w:linePitch="100" w:charSpace="0"/>
+        </w:sectPr>
+      </w:pPr>
+    </w:p>
+    <w:p>
+      <w:pPr>
+        <w:pStyle w:val="HorizontalLine"/>
+        <w:rPr/>
+      </w:pPr>
+      <w:r>
+        <w:rPr/>
+      </w:r>
+    </w:p>
+    <w:p>
+      <w:pPr>
+        <w:pStyle w:val="Heading2"/>
+        <w:numPr>
+          <w:ilvl w:val="1"/>
+          <w:numId w:val="1"/>
+        </w:numPr>
+        <w:ind w:hanging="0" w:start="0"/>
+        <w:rPr/>
+      </w:pPr>
+      <w:r>
+        <w:rPr/>
+        <w:t>Bước 2: Comparator 2 bit</w:t>
+      </w:r>
+    </w:p>
+    <w:p>
+      <w:pPr>
+        <w:pStyle w:val="BodyText"/>
+        <w:rPr/>
+      </w:pPr>
+      <w:r>
+        <w:rPr/>
+        <w:t>So sánh:</w:t>
+      </w:r>
+    </w:p>
+    <w:p>
+      <w:pPr>
+        <w:sectPr>
+          <w:type w:val="continuous"/>
+          <w:pgSz w:w="11906" w:h="16838"/>
+          <w:pgMar w:left="1134" w:right="1134" w:gutter="0" w:header="0" w:top="1134" w:footer="1134" w:bottom="1693"/>
+          <w:formProt w:val="false"/>
+          <w:textDirection w:val="lrTb"/>
+          <w:docGrid w:type="default" w:linePitch="100" w:charSpace="0"/>
+        </w:sectPr>
+      </w:pPr>
+    </w:p>
+    <w:p>
+      <w:pPr>
+        <w:pStyle w:val="PreformattedText"/>
+        <w:ind w:hanging="0" w:start="0" w:end="0"/>
+        <w:rPr/>
+      </w:pPr>
+      <w:bookmarkStart w:id="101" w:name="code-block-viewer_Copy_2"/>
+      <w:bookmarkEnd w:id="101"/>
+      <w:r>
+        <w:rPr>
+          <w:rStyle w:val="SourceText"/>
+        </w:rPr>
+        <w:t>a = a1 a0</w:t>
+      </w:r>
+    </w:p>
+    <w:p>
+      <w:pPr>
+        <w:pStyle w:val="PreformattedText"/>
+        <w:spacing w:before="0" w:after="283"/>
+        <w:rPr/>
+      </w:pPr>
+      <w:r>
+        <w:rPr>
+          <w:rStyle w:val="SourceText"/>
+        </w:rPr>
+        <w:t>b = b1 b0</w:t>
+      </w:r>
+    </w:p>
+    <w:p>
+      <w:pPr>
+        <w:sectPr>
+          <w:type w:val="continuous"/>
+          <w:pgSz w:w="11906" w:h="16838"/>
+          <w:pgMar w:left="1134" w:right="1134" w:gutter="0" w:header="0" w:top="1134" w:footer="1134" w:bottom="1693"/>
+          <w:formProt w:val="false"/>
+          <w:textDirection w:val="lrTb"/>
+          <w:docGrid w:type="default" w:linePitch="100" w:charSpace="0"/>
+        </w:sectPr>
+      </w:pPr>
+    </w:p>
+    <w:p>
+      <w:pPr>
+        <w:pStyle w:val="BodyText"/>
+        <w:rPr/>
+      </w:pPr>
+      <w:r>
+        <w:rPr/>
+        <w:t>Điều kiện để bằng nhau:</w:t>
+      </w:r>
+    </w:p>
+    <w:p>
+      <w:pPr>
+        <w:pStyle w:val="BodyText"/>
+        <w:numPr>
+          <w:ilvl w:val="0"/>
+          <w:numId w:val="10"/>
+        </w:numPr>
+        <w:tabs>
+          <w:tab w:val="clear" w:pos="709"/>
+          <w:tab w:val="left" w:pos="0" w:leader="none"/>
+        </w:tabs>
+        <w:spacing w:before="0" w:after="0"/>
+        <w:ind w:hanging="283" w:start="709"/>
+        <w:rPr/>
+      </w:pPr>
+      <w:r>
+        <w:rPr/>
+        <w:t xml:space="preserve">bit 1 bằng nhau </w:t>
+      </w:r>
+    </w:p>
+    <w:p>
+      <w:pPr>
+        <w:pStyle w:val="BodyText"/>
+        <w:numPr>
+          <w:ilvl w:val="0"/>
+          <w:numId w:val="10"/>
+        </w:numPr>
+        <w:tabs>
+          <w:tab w:val="clear" w:pos="709"/>
+          <w:tab w:val="left" w:pos="0" w:leader="none"/>
+        </w:tabs>
+        <w:ind w:hanging="283" w:start="709"/>
+        <w:rPr/>
+      </w:pPr>
+      <w:r>
+        <w:rPr>
+          <w:rStyle w:val="Strong"/>
+        </w:rPr>
+        <w:t>và</w:t>
+      </w:r>
+      <w:r>
+        <w:rPr/>
+        <w:t xml:space="preserve"> bit 0 bằng nhau </w:t>
+      </w:r>
+    </w:p>
+    <w:p>
+      <w:pPr>
+        <w:pStyle w:val="BodyText"/>
+        <w:rPr/>
+      </w:pPr>
+      <w:r>
+        <w:rPr/>
+        <w:t>Tức là:</w:t>
+      </w:r>
+    </w:p>
+    <w:p>
+      <w:pPr>
+        <w:sectPr>
+          <w:type w:val="continuous"/>
+          <w:pgSz w:w="11906" w:h="16838"/>
+          <w:pgMar w:left="1134" w:right="1134" w:gutter="0" w:header="0" w:top="1134" w:footer="1134" w:bottom="1693"/>
+          <w:formProt w:val="false"/>
+          <w:textDirection w:val="lrTb"/>
+          <w:docGrid w:type="default" w:linePitch="100" w:charSpace="0"/>
+        </w:sectPr>
+      </w:pPr>
+    </w:p>
+    <w:p>
+      <w:pPr>
+        <w:pStyle w:val="PreformattedText"/>
+        <w:spacing w:before="0" w:after="283"/>
+        <w:ind w:hanging="0" w:start="0" w:end="0"/>
+        <w:rPr/>
+      </w:pPr>
+      <w:bookmarkStart w:id="102" w:name="code-block-viewer_Copy_3"/>
+      <w:bookmarkEnd w:id="102"/>
+      <w:r>
+        <w:rPr>
+          <w:rStyle w:val="SourceText"/>
+        </w:rPr>
+        <w:t>equal = equal1 AND equal0</w:t>
+      </w:r>
+    </w:p>
+    <w:p>
+      <w:pPr>
+        <w:sectPr>
+          <w:type w:val="continuous"/>
+          <w:pgSz w:w="11906" w:h="16838"/>
+          <w:pgMar w:left="1134" w:right="1134" w:gutter="0" w:header="0" w:top="1134" w:footer="1134" w:bottom="1693"/>
+          <w:formProt w:val="false"/>
+          <w:textDirection w:val="lrTb"/>
+          <w:docGrid w:type="default" w:linePitch="100" w:charSpace="0"/>
+        </w:sectPr>
+      </w:pPr>
+    </w:p>
+    <w:p>
+      <w:pPr>
+        <w:pStyle w:val="BodyText"/>
+        <w:rPr/>
+      </w:pPr>
+      <w:r>
+        <w:rPr/>
+        <w:t>Trong đó:</w:t>
+      </w:r>
+    </w:p>
+    <w:p>
+      <w:pPr>
+        <w:sectPr>
+          <w:type w:val="continuous"/>
+          <w:pgSz w:w="11906" w:h="16838"/>
+          <w:pgMar w:left="1134" w:right="1134" w:gutter="0" w:header="0" w:top="1134" w:footer="1134" w:bottom="1693"/>
+          <w:formProt w:val="false"/>
+          <w:textDirection w:val="lrTb"/>
+          <w:docGrid w:type="default" w:linePitch="100" w:charSpace="0"/>
+        </w:sectPr>
+      </w:pPr>
+    </w:p>
+    <w:p>
+      <w:pPr>
+        <w:pStyle w:val="PreformattedText"/>
+        <w:ind w:hanging="0" w:start="0" w:end="0"/>
+        <w:rPr/>
+      </w:pPr>
+      <w:bookmarkStart w:id="103" w:name="code-block-viewer_Copy_4"/>
+      <w:bookmarkEnd w:id="103"/>
+      <w:r>
+        <w:rPr>
+          <w:rStyle w:val="SourceText"/>
+        </w:rPr>
+        <w:t>equal1 = ~(a1 ^ b1)</w:t>
+      </w:r>
+    </w:p>
+    <w:p>
+      <w:pPr>
+        <w:pStyle w:val="PreformattedText"/>
+        <w:spacing w:before="0" w:after="283"/>
+        <w:rPr/>
+      </w:pPr>
+      <w:r>
+        <w:rPr>
+          <w:rStyle w:val="SourceText"/>
+        </w:rPr>
+        <w:t>equal0 = ~(a0 ^ b0)</w:t>
+      </w:r>
+    </w:p>
+    <w:p>
+      <w:pPr>
+        <w:sectPr>
+          <w:type w:val="continuous"/>
+          <w:pgSz w:w="11906" w:h="16838"/>
+          <w:pgMar w:left="1134" w:right="1134" w:gutter="0" w:header="0" w:top="1134" w:footer="1134" w:bottom="1693"/>
+          <w:formProt w:val="false"/>
+          <w:textDirection w:val="lrTb"/>
+          <w:docGrid w:type="default" w:linePitch="100" w:charSpace="0"/>
+        </w:sectPr>
+      </w:pPr>
+    </w:p>
+    <w:p>
+      <w:pPr>
+        <w:pStyle w:val="HorizontalLine"/>
+        <w:rPr/>
+      </w:pPr>
+      <w:r>
+        <w:rPr/>
+      </w:r>
+    </w:p>
+    <w:p>
+      <w:pPr>
+        <w:pStyle w:val="Heading2"/>
+        <w:numPr>
+          <w:ilvl w:val="1"/>
+          <w:numId w:val="1"/>
+        </w:numPr>
+        <w:ind w:hanging="0" w:start="0"/>
+        <w:rPr/>
+      </w:pPr>
+      <w:r>
+        <w:rPr/>
+        <w:t>Bước 3: Comparator 4 bit</w:t>
+      </w:r>
+    </w:p>
+    <w:p>
+      <w:pPr>
+        <w:pStyle w:val="BodyText"/>
+        <w:rPr/>
+      </w:pPr>
+      <w:r>
+        <w:rPr/>
+        <w:t>Tương tự:</w:t>
+      </w:r>
+    </w:p>
+    <w:p>
+      <w:pPr>
+        <w:sectPr>
+          <w:type w:val="continuous"/>
+          <w:pgSz w:w="11906" w:h="16838"/>
+          <w:pgMar w:left="1134" w:right="1134" w:gutter="0" w:header="0" w:top="1134" w:footer="1134" w:bottom="1693"/>
+          <w:formProt w:val="false"/>
+          <w:textDirection w:val="lrTb"/>
+          <w:docGrid w:type="default" w:linePitch="100" w:charSpace="0"/>
+        </w:sectPr>
+      </w:pPr>
+    </w:p>
+    <w:p>
+      <w:pPr>
+        <w:pStyle w:val="PreformattedText"/>
+        <w:ind w:hanging="0" w:start="0" w:end="0"/>
+        <w:rPr/>
+      </w:pPr>
+      <w:bookmarkStart w:id="104" w:name="code-block-viewer_Copy_5"/>
+      <w:bookmarkEnd w:id="104"/>
+      <w:r>
+        <w:rPr>
+          <w:rStyle w:val="SourceText"/>
+        </w:rPr>
+        <w:t>a3 a2 a1 a0</w:t>
+      </w:r>
+    </w:p>
+    <w:p>
+      <w:pPr>
+        <w:pStyle w:val="PreformattedText"/>
+        <w:spacing w:before="0" w:after="283"/>
+        <w:rPr/>
+      </w:pPr>
+      <w:r>
+        <w:rPr>
+          <w:rStyle w:val="SourceText"/>
+        </w:rPr>
+        <w:t>b3 b2 b1 b0</w:t>
+      </w:r>
+    </w:p>
+    <w:p>
+      <w:pPr>
+        <w:sectPr>
+          <w:type w:val="continuous"/>
+          <w:pgSz w:w="11906" w:h="16838"/>
+          <w:pgMar w:left="1134" w:right="1134" w:gutter="0" w:header="0" w:top="1134" w:footer="1134" w:bottom="1693"/>
+          <w:formProt w:val="false"/>
+          <w:textDirection w:val="lrTb"/>
+          <w:docGrid w:type="default" w:linePitch="100" w:charSpace="0"/>
+        </w:sectPr>
+      </w:pPr>
+    </w:p>
+    <w:p>
+      <w:pPr>
+        <w:pStyle w:val="BodyText"/>
+        <w:rPr/>
+      </w:pPr>
+      <w:r>
+        <w:rPr/>
+        <w:t>Mỗi bit đi qua một XNOR:</w:t>
+      </w:r>
+    </w:p>
+    <w:p>
+      <w:pPr>
+        <w:sectPr>
+          <w:type w:val="continuous"/>
+          <w:pgSz w:w="11906" w:h="16838"/>
+          <w:pgMar w:left="1134" w:right="1134" w:gutter="0" w:header="0" w:top="1134" w:footer="1134" w:bottom="1693"/>
+          <w:formProt w:val="false"/>
+          <w:textDirection w:val="lrTb"/>
+          <w:docGrid w:type="default" w:linePitch="100" w:charSpace="0"/>
+        </w:sectPr>
+      </w:pPr>
+    </w:p>
+    <w:p>
+      <w:pPr>
+        <w:pStyle w:val="PreformattedText"/>
+        <w:ind w:hanging="0" w:start="0" w:end="0"/>
+        <w:rPr/>
+      </w:pPr>
+      <w:bookmarkStart w:id="105" w:name="code-block-viewer_Copy_6"/>
+      <w:bookmarkEnd w:id="105"/>
+      <w:r>
+        <w:rPr>
+          <w:rStyle w:val="SourceText"/>
+        </w:rPr>
+        <w:t>XNOR</w:t>
+      </w:r>
+    </w:p>
+    <w:p>
+      <w:pPr>
+        <w:pStyle w:val="PreformattedText"/>
+        <w:rPr/>
+      </w:pPr>
+      <w:r>
+        <w:rPr>
+          <w:rStyle w:val="SourceText"/>
+        </w:rPr>
+        <w:t>XNOR</w:t>
+      </w:r>
+    </w:p>
+    <w:p>
+      <w:pPr>
+        <w:pStyle w:val="PreformattedText"/>
+        <w:rPr/>
+      </w:pPr>
+      <w:r>
+        <w:rPr>
+          <w:rStyle w:val="SourceText"/>
+        </w:rPr>
+        <w:t>XNOR</w:t>
+      </w:r>
+    </w:p>
+    <w:p>
+      <w:pPr>
+        <w:pStyle w:val="PreformattedText"/>
+        <w:spacing w:before="0" w:after="283"/>
+        <w:rPr/>
+      </w:pPr>
+      <w:r>
+        <w:rPr>
+          <w:rStyle w:val="SourceText"/>
+        </w:rPr>
+        <w:t>XNOR</w:t>
+      </w:r>
+    </w:p>
+    <w:p>
+      <w:pPr>
+        <w:sectPr>
+          <w:type w:val="continuous"/>
+          <w:pgSz w:w="11906" w:h="16838"/>
+          <w:pgMar w:left="1134" w:right="1134" w:gutter="0" w:header="0" w:top="1134" w:footer="1134" w:bottom="1693"/>
+          <w:formProt w:val="false"/>
+          <w:textDirection w:val="lrTb"/>
+          <w:docGrid w:type="default" w:linePitch="100" w:charSpace="0"/>
+        </w:sectPr>
+      </w:pPr>
+    </w:p>
+    <w:p>
+      <w:pPr>
+        <w:pStyle w:val="BodyText"/>
+        <w:rPr/>
+      </w:pPr>
+      <w:r>
+        <w:rPr/>
+        <w:t>Sau đó:</w:t>
+      </w:r>
+    </w:p>
+    <w:p>
+      <w:pPr>
+        <w:sectPr>
+          <w:type w:val="continuous"/>
+          <w:pgSz w:w="11906" w:h="16838"/>
+          <w:pgMar w:left="1134" w:right="1134" w:gutter="0" w:header="0" w:top="1134" w:footer="1134" w:bottom="1693"/>
+          <w:formProt w:val="false"/>
+          <w:textDirection w:val="lrTb"/>
+          <w:docGrid w:type="default" w:linePitch="100" w:charSpace="0"/>
+        </w:sectPr>
+      </w:pPr>
+    </w:p>
+    <w:p>
+      <w:pPr>
+        <w:pStyle w:val="PreformattedText"/>
+        <w:spacing w:before="0" w:after="283"/>
+        <w:ind w:hanging="0" w:start="0" w:end="0"/>
+        <w:rPr/>
+      </w:pPr>
+      <w:bookmarkStart w:id="106" w:name="code-block-viewer_Copy_7"/>
+      <w:bookmarkEnd w:id="106"/>
+      <w:r>
+        <w:rPr>
+          <w:rStyle w:val="SourceText"/>
+        </w:rPr>
+        <w:t>equal = x0 &amp; x1 &amp; x2 &amp; x3</w:t>
+      </w:r>
+    </w:p>
+    <w:p>
+      <w:pPr>
+        <w:sectPr>
+          <w:type w:val="continuous"/>
+          <w:pgSz w:w="11906" w:h="16838"/>
+          <w:pgMar w:left="1134" w:right="1134" w:gutter="0" w:header="0" w:top="1134" w:footer="1134" w:bottom="1693"/>
+          <w:formProt w:val="false"/>
+          <w:textDirection w:val="lrTb"/>
+          <w:docGrid w:type="default" w:linePitch="100" w:charSpace="0"/>
+        </w:sectPr>
+      </w:pPr>
+    </w:p>
+    <w:p>
+      <w:pPr>
+        <w:pStyle w:val="HorizontalLine"/>
+        <w:rPr/>
+      </w:pPr>
+      <w:r>
+        <w:rPr/>
+      </w:r>
+    </w:p>
+    <w:p>
+      <w:pPr>
+        <w:pStyle w:val="Heading2"/>
+        <w:numPr>
+          <w:ilvl w:val="1"/>
+          <w:numId w:val="1"/>
+        </w:numPr>
+        <w:ind w:hanging="0" w:start="0"/>
+        <w:rPr/>
+      </w:pPr>
+      <w:r>
+        <w:rPr/>
+        <w:t>Bước 4: Comparator 8 bit</w:t>
+      </w:r>
+    </w:p>
+    <w:p>
+      <w:pPr>
+        <w:pStyle w:val="BodyText"/>
+        <w:rPr/>
+      </w:pPr>
+      <w:r>
+        <w:rPr/>
+        <w:t>Y hệt.</w:t>
+      </w:r>
+    </w:p>
+    <w:p>
+      <w:pPr>
+        <w:sectPr>
+          <w:type w:val="continuous"/>
+          <w:pgSz w:w="11906" w:h="16838"/>
+          <w:pgMar w:left="1134" w:right="1134" w:gutter="0" w:header="0" w:top="1134" w:footer="1134" w:bottom="1693"/>
+          <w:formProt w:val="false"/>
+          <w:textDirection w:val="lrTb"/>
+          <w:docGrid w:type="default" w:linePitch="100" w:charSpace="0"/>
+        </w:sectPr>
+      </w:pPr>
+    </w:p>
+    <w:p>
+      <w:pPr>
+        <w:pStyle w:val="PreformattedText"/>
+        <w:ind w:hanging="0" w:start="0" w:end="0"/>
+        <w:rPr/>
+      </w:pPr>
+      <w:bookmarkStart w:id="107" w:name="code-block-viewer_Copy_8"/>
+      <w:bookmarkEnd w:id="107"/>
+      <w:r>
+        <w:rPr>
+          <w:rStyle w:val="SourceText"/>
+        </w:rPr>
+        <w:t>a7 ─ XNOR ─┐</w:t>
+      </w:r>
+    </w:p>
+    <w:p>
+      <w:pPr>
+        <w:pStyle w:val="PreformattedText"/>
+        <w:rPr/>
+      </w:pPr>
+      <w:r>
+        <w:rPr>
+          <w:rStyle w:val="SourceText"/>
+        </w:rPr>
+        <w:t>a6 ─ XNOR ─┤</w:t>
+      </w:r>
+    </w:p>
+    <w:p>
+      <w:pPr>
+        <w:pStyle w:val="PreformattedText"/>
+        <w:rPr/>
+      </w:pPr>
+      <w:r>
+        <w:rPr>
+          <w:rStyle w:val="SourceText"/>
+        </w:rPr>
+        <w:t>a5 ─ XNOR ─┤</w:t>
+      </w:r>
+    </w:p>
+    <w:p>
+      <w:pPr>
+        <w:pStyle w:val="PreformattedText"/>
+        <w:rPr/>
+      </w:pPr>
+      <w:r>
+        <w:rPr>
+          <w:rStyle w:val="SourceText"/>
+        </w:rPr>
+        <w:t>...</w:t>
+      </w:r>
+    </w:p>
+    <w:p>
+      <w:pPr>
+        <w:pStyle w:val="PreformattedText"/>
+        <w:rPr/>
+      </w:pPr>
+      <w:r>
+        <w:rPr>
+          <w:rStyle w:val="SourceText"/>
+        </w:rPr>
+        <w:t>a0 ─ XNOR ─┘</w:t>
+      </w:r>
+    </w:p>
+    <w:p>
+      <w:pPr>
+        <w:pStyle w:val="PreformattedText"/>
+        <w:rPr/>
+      </w:pPr>
+      <w:r>
+        <w:rPr>
+          <w:rStyle w:val="SourceText"/>
+        </w:rPr>
+        <w:t xml:space="preserve">           </w:t>
+      </w:r>
+      <w:r>
+        <w:rPr>
+          <w:rStyle w:val="SourceText"/>
+        </w:rPr>
+        <w:t>AND</w:t>
+      </w:r>
+    </w:p>
+    <w:p>
+      <w:pPr>
+        <w:pStyle w:val="PreformattedText"/>
+        <w:rPr/>
+      </w:pPr>
+      <w:r>
+        <w:rPr>
+          <w:rStyle w:val="SourceText"/>
+        </w:rPr>
+        <w:t xml:space="preserve">            │</w:t>
+      </w:r>
+    </w:p>
+    <w:p>
+      <w:pPr>
+        <w:pStyle w:val="PreformattedText"/>
+        <w:spacing w:before="0" w:after="283"/>
+        <w:rPr/>
+      </w:pPr>
+      <w:r>
+        <w:rPr>
+          <w:rStyle w:val="SourceText"/>
+        </w:rPr>
+        <w:t xml:space="preserve">         </w:t>
+      </w:r>
+      <w:r>
+        <w:rPr>
+          <w:rStyle w:val="SourceText"/>
+        </w:rPr>
+        <w:t>equal</w:t>
+      </w:r>
+    </w:p>
+    <w:p>
+      <w:pPr>
+        <w:sectPr>
+          <w:type w:val="continuous"/>
+          <w:pgSz w:w="11906" w:h="16838"/>
+          <w:pgMar w:left="1134" w:right="1134" w:gutter="0" w:header="0" w:top="1134" w:footer="1134" w:bottom="1693"/>
+          <w:formProt w:val="false"/>
+          <w:textDirection w:val="lrTb"/>
+          <w:docGrid w:type="default" w:linePitch="100" w:charSpace="0"/>
+        </w:sectPr>
+      </w:pPr>
+    </w:p>
+    <w:p>
+      <w:pPr>
+        <w:pStyle w:val="HorizontalLine"/>
+        <w:rPr/>
+      </w:pPr>
+      <w:r>
+        <w:rPr/>
+      </w:r>
+    </w:p>
+    <w:p>
+      <w:pPr>
+        <w:pStyle w:val="Heading2"/>
+        <w:numPr>
+          <w:ilvl w:val="1"/>
+          <w:numId w:val="1"/>
+        </w:numPr>
+        <w:ind w:hanging="0" w:start="0"/>
+        <w:rPr/>
+      </w:pPr>
+      <w:r>
+        <w:rPr/>
+        <w:t>Đây chính là TCAM</w:t>
+      </w:r>
+    </w:p>
+    <w:p>
+      <w:pPr>
+        <w:pStyle w:val="BodyText"/>
+        <w:rPr/>
+      </w:pPr>
+      <w:r>
+        <w:rPr/>
+        <w:t>Giả sử Search Key là:</w:t>
+      </w:r>
+    </w:p>
+    <w:p>
+      <w:pPr>
+        <w:sectPr>
+          <w:type w:val="continuous"/>
+          <w:pgSz w:w="11906" w:h="16838"/>
+          <w:pgMar w:left="1134" w:right="1134" w:gutter="0" w:header="0" w:top="1134" w:footer="1134" w:bottom="1693"/>
+          <w:formProt w:val="false"/>
+          <w:textDirection w:val="lrTb"/>
+          <w:docGrid w:type="default" w:linePitch="100" w:charSpace="0"/>
+        </w:sectPr>
+      </w:pPr>
+    </w:p>
+    <w:p>
+      <w:pPr>
+        <w:pStyle w:val="PreformattedText"/>
+        <w:spacing w:before="0" w:after="283"/>
+        <w:ind w:hanging="0" w:start="0" w:end="0"/>
+        <w:rPr/>
+      </w:pPr>
+      <w:bookmarkStart w:id="108" w:name="code-block-viewer_Copy_9"/>
+      <w:bookmarkEnd w:id="108"/>
+      <w:r>
+        <w:rPr>
+          <w:rStyle w:val="SourceText"/>
+        </w:rPr>
+        <w:t>10110010</w:t>
+      </w:r>
+    </w:p>
+    <w:p>
+      <w:pPr>
+        <w:sectPr>
+          <w:type w:val="continuous"/>
+          <w:pgSz w:w="11906" w:h="16838"/>
+          <w:pgMar w:left="1134" w:right="1134" w:gutter="0" w:header="0" w:top="1134" w:footer="1134" w:bottom="1693"/>
+          <w:formProt w:val="false"/>
+          <w:textDirection w:val="lrTb"/>
+          <w:docGrid w:type="default" w:linePitch="100" w:charSpace="0"/>
+        </w:sectPr>
+      </w:pPr>
+    </w:p>
+    <w:p>
+      <w:pPr>
+        <w:pStyle w:val="BodyText"/>
+        <w:rPr/>
+      </w:pPr>
+      <w:r>
+        <w:rPr/>
+        <w:t>Có 8 dòng SRAM:</w:t>
+      </w:r>
+    </w:p>
+    <w:p>
+      <w:pPr>
+        <w:sectPr>
+          <w:type w:val="continuous"/>
+          <w:pgSz w:w="11906" w:h="16838"/>
+          <w:pgMar w:left="1134" w:right="1134" w:gutter="0" w:header="0" w:top="1134" w:footer="1134" w:bottom="1693"/>
+          <w:formProt w:val="false"/>
+          <w:textDirection w:val="lrTb"/>
+          <w:docGrid w:type="default" w:linePitch="100" w:charSpace="0"/>
+        </w:sectPr>
+      </w:pPr>
+    </w:p>
+    <w:p>
+      <w:pPr>
+        <w:pStyle w:val="PreformattedText"/>
+        <w:ind w:hanging="0" w:start="0" w:end="0"/>
+        <w:rPr/>
+      </w:pPr>
+      <w:bookmarkStart w:id="109" w:name="code-block-viewer_Copy_10"/>
+      <w:bookmarkEnd w:id="109"/>
+      <w:r>
+        <w:rPr>
+          <w:rStyle w:val="SourceText"/>
+        </w:rPr>
+        <w:t>Entry0</w:t>
+      </w:r>
+    </w:p>
+    <w:p>
+      <w:pPr>
+        <w:pStyle w:val="PreformattedText"/>
+        <w:rPr/>
+      </w:pPr>
+      <w:r>
+        <w:rPr>
+          <w:rStyle w:val="SourceText"/>
+        </w:rPr>
+        <w:t>Entry1</w:t>
+      </w:r>
+    </w:p>
+    <w:p>
+      <w:pPr>
+        <w:pStyle w:val="PreformattedText"/>
+        <w:rPr/>
+      </w:pPr>
+      <w:r>
+        <w:rPr>
+          <w:rStyle w:val="SourceText"/>
+        </w:rPr>
+        <w:t>Entry2</w:t>
+      </w:r>
+    </w:p>
+    <w:p>
+      <w:pPr>
+        <w:pStyle w:val="PreformattedText"/>
+        <w:rPr/>
+      </w:pPr>
+      <w:r>
+        <w:rPr>
+          <w:rStyle w:val="SourceText"/>
+        </w:rPr>
+        <w:t>...</w:t>
+      </w:r>
+    </w:p>
+    <w:p>
+      <w:pPr>
+        <w:pStyle w:val="PreformattedText"/>
+        <w:spacing w:before="0" w:after="283"/>
+        <w:rPr/>
+      </w:pPr>
+      <w:r>
+        <w:rPr>
+          <w:rStyle w:val="SourceText"/>
+        </w:rPr>
+        <w:t>Entry7</w:t>
+      </w:r>
+    </w:p>
+    <w:p>
+      <w:pPr>
+        <w:sectPr>
+          <w:type w:val="continuous"/>
+          <w:pgSz w:w="11906" w:h="16838"/>
+          <w:pgMar w:left="1134" w:right="1134" w:gutter="0" w:header="0" w:top="1134" w:footer="1134" w:bottom="1693"/>
+          <w:formProt w:val="false"/>
+          <w:textDirection w:val="lrTb"/>
+          <w:docGrid w:type="default" w:linePitch="100" w:charSpace="0"/>
+        </w:sectPr>
+      </w:pPr>
+    </w:p>
+    <w:p>
+      <w:pPr>
+        <w:pStyle w:val="BodyText"/>
+        <w:rPr/>
+      </w:pPr>
+      <w:r>
+        <w:rPr/>
+        <w:t xml:space="preserve">Mỗi dòng đều có </w:t>
+      </w:r>
+      <w:r>
+        <w:rPr>
+          <w:rStyle w:val="Strong"/>
+        </w:rPr>
+        <w:t>một comparator</w:t>
+      </w:r>
+      <w:r>
+        <w:rPr/>
+        <w:t>.</w:t>
+      </w:r>
+    </w:p>
+    <w:p>
+      <w:pPr>
+        <w:sectPr>
+          <w:type w:val="continuous"/>
+          <w:pgSz w:w="11906" w:h="16838"/>
+          <w:pgMar w:left="1134" w:right="1134" w:gutter="0" w:header="0" w:top="1134" w:footer="1134" w:bottom="1693"/>
+          <w:formProt w:val="false"/>
+          <w:textDirection w:val="lrTb"/>
+          <w:docGrid w:type="default" w:linePitch="100" w:charSpace="0"/>
+        </w:sectPr>
+      </w:pPr>
+    </w:p>
+    <w:p>
+      <w:pPr>
+        <w:pStyle w:val="PreformattedText"/>
+        <w:ind w:hanging="0" w:start="0" w:end="0"/>
+        <w:rPr/>
+      </w:pPr>
+      <w:bookmarkStart w:id="110" w:name="code-block-viewer_Copy_11"/>
+      <w:bookmarkEnd w:id="110"/>
+      <w:r>
+        <w:rPr>
+          <w:rStyle w:val="SourceText"/>
+        </w:rPr>
+        <w:t>Search Key</w:t>
+      </w:r>
+    </w:p>
+    <w:p>
+      <w:pPr>
+        <w:pStyle w:val="PreformattedText"/>
+        <w:rPr/>
+      </w:pPr>
+      <w:r>
+        <w:rPr>
+          <w:rStyle w:val="SourceText"/>
+        </w:rPr>
+        <w:t xml:space="preserve">      │</w:t>
+      </w:r>
+    </w:p>
+    <w:p>
+      <w:pPr>
+        <w:pStyle w:val="PreformattedText"/>
+        <w:rPr/>
+      </w:pPr>
+      <w:r>
+        <w:rPr>
+          <w:rStyle w:val="SourceText"/>
+        </w:rPr>
+        <w:t xml:space="preserve"> ┌────┼────┐</w:t>
+      </w:r>
+    </w:p>
+    <w:p>
+      <w:pPr>
+        <w:pStyle w:val="PreformattedText"/>
+        <w:rPr/>
+      </w:pPr>
+      <w:r>
+        <w:rPr>
+          <w:rStyle w:val="SourceText"/>
+        </w:rPr>
+        <w:t xml:space="preserve"> │    │    │</w:t>
+      </w:r>
+    </w:p>
+    <w:p>
+      <w:pPr>
+        <w:pStyle w:val="PreformattedText"/>
+        <w:rPr/>
+      </w:pPr>
+      <w:r>
+        <w:rPr>
+          <w:rStyle w:val="SourceText"/>
+        </w:rPr>
+        <w:t>CMP0 CMP1 CMP2 ...</w:t>
+      </w:r>
+    </w:p>
+    <w:p>
+      <w:pPr>
+        <w:pStyle w:val="PreformattedText"/>
+        <w:rPr/>
+      </w:pPr>
+      <w:r>
+        <w:rPr>
+          <w:rStyle w:val="SourceText"/>
+        </w:rPr>
+        <w:t xml:space="preserve"> │    │    │</w:t>
+      </w:r>
+    </w:p>
+    <w:p>
+      <w:pPr>
+        <w:pStyle w:val="PreformattedText"/>
+        <w:spacing w:before="0" w:after="283"/>
+        <w:rPr/>
+      </w:pPr>
+      <w:r>
+        <w:rPr>
+          <w:rStyle w:val="SourceText"/>
+        </w:rPr>
+        <w:t>match0 match1 ...</w:t>
+      </w:r>
+    </w:p>
+    <w:p>
+      <w:pPr>
+        <w:sectPr>
+          <w:type w:val="continuous"/>
+          <w:pgSz w:w="11906" w:h="16838"/>
+          <w:pgMar w:left="1134" w:right="1134" w:gutter="0" w:header="0" w:top="1134" w:footer="1134" w:bottom="1693"/>
+          <w:formProt w:val="false"/>
+          <w:textDirection w:val="lrTb"/>
+          <w:docGrid w:type="default" w:linePitch="100" w:charSpace="0"/>
+        </w:sectPr>
+      </w:pPr>
+    </w:p>
+    <w:p>
+      <w:pPr>
+        <w:pStyle w:val="BodyText"/>
+        <w:rPr/>
+      </w:pPr>
+      <w:r>
+        <w:rPr/>
+        <w:t>Cuối cùng sinh ra:</w:t>
+      </w:r>
+    </w:p>
+    <w:p>
+      <w:pPr>
+        <w:sectPr>
+          <w:type w:val="continuous"/>
+          <w:pgSz w:w="11906" w:h="16838"/>
+          <w:pgMar w:left="1134" w:right="1134" w:gutter="0" w:header="0" w:top="1134" w:footer="1134" w:bottom="1693"/>
+          <w:formProt w:val="false"/>
+          <w:textDirection w:val="lrTb"/>
+          <w:docGrid w:type="default" w:linePitch="100" w:charSpace="0"/>
+        </w:sectPr>
+      </w:pPr>
+    </w:p>
+    <w:p>
+      <w:pPr>
+        <w:pStyle w:val="PreformattedText"/>
+        <w:spacing w:before="0" w:after="283"/>
+        <w:ind w:hanging="0" w:start="0" w:end="0"/>
+        <w:rPr/>
+      </w:pPr>
+      <w:bookmarkStart w:id="111" w:name="code-block-viewer_Copy_12"/>
+      <w:bookmarkEnd w:id="111"/>
+      <w:r>
+        <w:rPr>
+          <w:rStyle w:val="SourceText"/>
+        </w:rPr>
+        <w:t>match = 00101000</w:t>
+      </w:r>
+    </w:p>
+    <w:p>
+      <w:pPr>
+        <w:sectPr>
+          <w:type w:val="continuous"/>
+          <w:pgSz w:w="11906" w:h="16838"/>
+          <w:pgMar w:left="1134" w:right="1134" w:gutter="0" w:header="0" w:top="1134" w:footer="1134" w:bottom="1693"/>
+          <w:formProt w:val="false"/>
+          <w:textDirection w:val="lrTb"/>
+          <w:docGrid w:type="default" w:linePitch="100" w:charSpace="0"/>
+        </w:sectPr>
+      </w:pPr>
+    </w:p>
+    <w:p>
+      <w:pPr>
+        <w:pStyle w:val="BodyText"/>
+        <w:rPr/>
+      </w:pPr>
+      <w:r>
+        <w:rPr/>
+        <w:t xml:space="preserve">Rồi đưa vào </w:t>
+      </w:r>
+      <w:r>
+        <w:rPr>
+          <w:rStyle w:val="Strong"/>
+        </w:rPr>
+        <w:t>Priority Encoder</w:t>
+      </w:r>
+      <w:r>
+        <w:rPr/>
+        <w:t xml:space="preserve"> mà bạn vừa học.</w:t>
+      </w:r>
+    </w:p>
+    <w:p>
+      <w:pPr>
+        <w:pStyle w:val="BodyText"/>
+        <w:spacing w:before="0" w:after="140"/>
+        <w:rPr/>
+      </w:pPr>
+      <w:r>
+        <w:rPr/>
       </w:r>
     </w:p>
     <w:sectPr>
@@ -13205,7 +14734,7 @@
     </w:r>
     <w:r>
       <w:rPr/>
-      <w:t>19</w:t>
+      <w:t>21</w:t>
     </w:r>
     <w:r>
       <w:rPr/>
@@ -13239,7 +14768,7 @@
     </w:r>
     <w:r>
       <w:rPr/>
-      <w:t>19</w:t>
+      <w:t>21</w:t>
     </w:r>
     <w:r>
       <w:rPr/>
@@ -14476,6 +16005,143 @@
     </w:lvl>
   </w:abstractNum>
   <w:abstractNum w:abstractNumId="10">
+    <w:lvl w:ilvl="0">
+      <w:start w:val="1"/>
+      <w:numFmt w:val="bullet"/>
+      <w:lvlText w:val=""/>
+      <w:lvlJc w:val="start"/>
+      <w:pPr>
+        <w:tabs>
+          <w:tab w:val="num" w:pos="709"/>
+        </w:tabs>
+        <w:ind w:start="709" w:hanging="283"/>
+      </w:pPr>
+      <w:rPr>
+        <w:rFonts w:ascii="Symbol" w:hAnsi="Symbol" w:cs="Symbol" w:hint="default"/>
+      </w:rPr>
+    </w:lvl>
+    <w:lvl w:ilvl="1">
+      <w:start w:val="1"/>
+      <w:numFmt w:val="bullet"/>
+      <w:lvlText w:val=""/>
+      <w:lvlJc w:val="start"/>
+      <w:pPr>
+        <w:tabs>
+          <w:tab w:val="num" w:pos="1418"/>
+        </w:tabs>
+        <w:ind w:start="1418" w:hanging="283"/>
+      </w:pPr>
+      <w:rPr>
+        <w:rFonts w:ascii="Symbol" w:hAnsi="Symbol" w:cs="Symbol" w:hint="default"/>
+      </w:rPr>
+    </w:lvl>
+    <w:lvl w:ilvl="2">
+      <w:start w:val="1"/>
+      <w:numFmt w:val="bullet"/>
+      <w:lvlText w:val=""/>
+      <w:lvlJc w:val="start"/>
+      <w:pPr>
+        <w:tabs>
+          <w:tab w:val="num" w:pos="2127"/>
+        </w:tabs>
+        <w:ind w:start="2127" w:hanging="283"/>
+      </w:pPr>
+      <w:rPr>
+        <w:rFonts w:ascii="Symbol" w:hAnsi="Symbol" w:cs="Symbol" w:hint="default"/>
+      </w:rPr>
+    </w:lvl>
+    <w:lvl w:ilvl="3">
+      <w:start w:val="1"/>
+      <w:numFmt w:val="bullet"/>
+      <w:lvlText w:val=""/>
+      <w:lvlJc w:val="start"/>
+      <w:pPr>
+        <w:tabs>
+          <w:tab w:val="num" w:pos="2836"/>
+        </w:tabs>
+        <w:ind w:start="2836" w:hanging="283"/>
+      </w:pPr>
+      <w:rPr>
+        <w:rFonts w:ascii="Symbol" w:hAnsi="Symbol" w:cs="Symbol" w:hint="default"/>
+      </w:rPr>
+    </w:lvl>
+    <w:lvl w:ilvl="4">
+      <w:start w:val="1"/>
+      <w:numFmt w:val="bullet"/>
+      <w:lvlText w:val=""/>
+      <w:lvlJc w:val="start"/>
+      <w:pPr>
+        <w:tabs>
+          <w:tab w:val="num" w:pos="3545"/>
+        </w:tabs>
+        <w:ind w:start="3545" w:hanging="283"/>
+      </w:pPr>
+      <w:rPr>
+        <w:rFonts w:ascii="Symbol" w:hAnsi="Symbol" w:cs="Symbol" w:hint="default"/>
+      </w:rPr>
+    </w:lvl>
+    <w:lvl w:ilvl="5">
+      <w:start w:val="1"/>
+      <w:numFmt w:val="bullet"/>
+      <w:lvlText w:val=""/>
+      <w:lvlJc w:val="start"/>
+      <w:pPr>
+        <w:tabs>
+          <w:tab w:val="num" w:pos="4254"/>
+        </w:tabs>
+        <w:ind w:start="4254" w:hanging="283"/>
+      </w:pPr>
+      <w:rPr>
+        <w:rFonts w:ascii="Symbol" w:hAnsi="Symbol" w:cs="Symbol" w:hint="default"/>
+      </w:rPr>
+    </w:lvl>
+    <w:lvl w:ilvl="6">
+      <w:start w:val="1"/>
+      <w:numFmt w:val="bullet"/>
+      <w:lvlText w:val=""/>
+      <w:lvlJc w:val="start"/>
+      <w:pPr>
+        <w:tabs>
+          <w:tab w:val="num" w:pos="4963"/>
+        </w:tabs>
+        <w:ind w:start="4963" w:hanging="283"/>
+      </w:pPr>
+      <w:rPr>
+        <w:rFonts w:ascii="Symbol" w:hAnsi="Symbol" w:cs="Symbol" w:hint="default"/>
+      </w:rPr>
+    </w:lvl>
+    <w:lvl w:ilvl="7">
+      <w:start w:val="1"/>
+      <w:numFmt w:val="bullet"/>
+      <w:lvlText w:val=""/>
+      <w:lvlJc w:val="start"/>
+      <w:pPr>
+        <w:tabs>
+          <w:tab w:val="num" w:pos="5672"/>
+        </w:tabs>
+        <w:ind w:start="5672" w:hanging="283"/>
+      </w:pPr>
+      <w:rPr>
+        <w:rFonts w:ascii="Symbol" w:hAnsi="Symbol" w:cs="Symbol" w:hint="default"/>
+      </w:rPr>
+    </w:lvl>
+    <w:lvl w:ilvl="8">
+      <w:start w:val="1"/>
+      <w:numFmt w:val="bullet"/>
+      <w:lvlText w:val=""/>
+      <w:lvlJc w:val="start"/>
+      <w:pPr>
+        <w:tabs>
+          <w:tab w:val="num" w:pos="6381"/>
+        </w:tabs>
+        <w:ind w:start="6381" w:hanging="283"/>
+      </w:pPr>
+      <w:rPr>
+        <w:rFonts w:ascii="Symbol" w:hAnsi="Symbol" w:cs="Symbol" w:hint="default"/>
+      </w:rPr>
+    </w:lvl>
+  </w:abstractNum>
+  <w:abstractNum w:abstractNumId="11">
     <w:lvl w:ilvl="0">
       <w:start w:val="1"/>
       <w:numFmt w:val="none"/>
@@ -14623,6 +16289,9 @@
   </w:num>
   <w:num w:numId="10">
     <w:abstractNumId w:val="10"/>
+  </w:num>
+  <w:num w:numId="11">
+    <w:abstractNumId w:val="11"/>
   </w:num>
 </w:numbering>
 </file>

</xml_diff>